<commit_message>
Add benchmark Day 1 acoustic draft notes
</commit_message>
<xml_diff>
--- a/docs/JMWG-Benchmark-Meeting-report-2026.docx
+++ b/docs/JMWG-Benchmark-Meeting-report-2026.docx
@@ -139,7 +139,7 @@
         <w:pStyle w:val="BodyText"/>
       </w:pPr>
       <w:r>
-        <w:t xml:space="preserve">18 May 2026</w:t>
+        <w:t xml:space="preserve">19 May 2026</w:t>
       </w:r>
     </w:p>
     <w:bookmarkStart w:id="12" w:name="summary"/>
@@ -536,7 +536,7 @@
       </w:r>
     </w:p>
     <w:bookmarkEnd w:id="18"/>
-    <w:bookmarkStart w:id="24" w:name="key-discussion-summary"/>
+    <w:bookmarkStart w:id="28" w:name="key-discussion-summary"/>
     <w:p>
       <w:pPr>
         <w:pStyle w:val="Heading1"/>
@@ -545,7 +545,7 @@
         <w:t xml:space="preserve">Key Discussion Summary</w:t>
       </w:r>
     </w:p>
-    <w:bookmarkStart w:id="19" w:name="acoustic-indices"/>
+    <w:bookmarkStart w:id="23" w:name="acoustic-indices"/>
     <w:p>
       <w:pPr>
         <w:pStyle w:val="Heading2"/>
@@ -578,8 +578,1330 @@
         <w:t xml:space="preserve">A Day 1 presentation crosswalk is provided in Appendix D. That table should be updated as presenters confirm titles, authors, and whether each presentation should be cited as a working paper, supporting presentation, or meeting-record item.</w:t>
       </w:r>
     </w:p>
-    <w:bookmarkEnd w:id="19"/>
-    <w:bookmarkStart w:id="20" w:name="cpue-indices"/>
+    <w:tbl>
+      <w:tblPr>
+        <w:tblStyle w:val="Table"/>
+        <w:tblLook w:firstRow="0" w:lastRow="0" w:firstColumn="0" w:lastColumn="0" w:noHBand="0" w:noVBand="0" w:val="0000"/>
+        <w:tblBorders>
+          <w:top w:val="single" w:sz="4" w:space="0" w:color="0758E5"/>
+          <w:left w:val="single" w:sz="24" w:space="0" w:color="0758E5"/>
+          <w:bottom w:val="single" w:sz="4" w:space="0" w:color="0758E5"/>
+          <w:right w:val="single" w:sz="4" w:space="0" w:color="0758E5"/>
+        </w:tblBorders>
+        <w:tblCellMar>
+          <w:left w:w="144" w:type="dxa"/>
+          <w:right w:w="144" w:type="dxa"/>
+        </w:tblCellMar>
+        <w:tblLook w:firstRow="0" w:lastRow="0" w:firstColumn="0" w:lastColumn="0" w:noHBand="0" w:noVBand="0" w:val="0000"/>
+      </w:tblPr>
+      <w:tr>
+        <w:trPr>
+          <w:cantSplit/>
+        </w:trPr>
+        <w:tc>
+          <w:tcPr>
+            <w:shd w:color="auto" w:fill="dae6fb" w:val="clear"/>
+            <w:tcMar>
+              <w:top w:w="92" w:type="dxa"/>
+              <w:bottom w:w="92" w:type="dxa"/>
+            </w:tcMar>
+          </w:tcPr>
+          <w:p>
+            <w:pPr>
+              <w:pStyle w:val="BodyText"/>
+            </w:pPr>
+            <w:pPr>
+              <w:spacing w:before="0" w:after="0"/>
+              <w:textAlignment w:val="center"/>
+            </w:pPr>
+            <w:r>
+              <w:drawing>
+                <wp:inline>
+                  <wp:extent cx="152400" cy="152400"/>
+                  <wp:effectExtent b="0" l="0" r="0" t="0"/>
+                  <wp:docPr descr="" title="" id="20" name="Picture"/>
+                  <a:graphic>
+                    <a:graphicData uri="http://schemas.openxmlformats.org/drawingml/2006/picture">
+                      <pic:pic>
+                        <pic:nvPicPr>
+                          <pic:cNvPr descr="/Applications/quarto/share/formats/docx/note.png" id="21" name="Picture"/>
+                          <pic:cNvPicPr>
+                            <a:picLocks noChangeArrowheads="1" noChangeAspect="1"/>
+                          </pic:cNvPicPr>
+                        </pic:nvPicPr>
+                        <pic:blipFill>
+                          <a:blip r:embed="rId19"/>
+                          <a:stretch>
+                            <a:fillRect/>
+                          </a:stretch>
+                        </pic:blipFill>
+                        <pic:spPr bwMode="auto">
+                          <a:xfrm>
+                            <a:off x="0" y="0"/>
+                            <a:ext cx="152400" cy="152400"/>
+                          </a:xfrm>
+                          <a:prstGeom prst="rect">
+                            <a:avLst/>
+                          </a:prstGeom>
+                          <a:noFill/>
+                          <a:ln w="9525">
+                            <a:noFill/>
+                            <a:headEnd/>
+                            <a:tailEnd/>
+                          </a:ln>
+                        </pic:spPr>
+                      </pic:pic>
+                    </a:graphicData>
+                  </a:graphic>
+                </wp:inline>
+              </w:drawing>
+            </w:r>
+            <w:r>
+              <w:t xml:space="preserve"> </w:t>
+            </w:r>
+            <w:r>
+              <w:t xml:space="preserve"> </w:t>
+            </w:r>
+            <w:r>
+              <w:t xml:space="preserve">New draft material: Day 1 acoustic session summary</w:t>
+            </w:r>
+          </w:p>
+        </w:tc>
+      </w:tr>
+      <w:tr>
+        <w:trPr>
+          <w:cantSplit/>
+        </w:trPr>
+        <w:tc>
+          <w:tcPr>
+            <w:tcMar>
+              <w:top w:w="108" w:type="dxa"/>
+              <w:bottom w:w="108" w:type="dxa"/>
+            </w:tcMar>
+          </w:tcPr>
+          <w:p>
+            <w:pPr>
+              <w:pStyle w:val="BodyText"/>
+            </w:pPr>
+            <w:pPr>
+              <w:spacing w:before="16"/>
+            </w:pPr>
+            <w:r>
+              <w:t xml:space="preserve">The meeting noted that many working papers and presentations analysed important</w:t>
+            </w:r>
+            <w:r>
+              <w:t xml:space="preserve"> </w:t>
+            </w:r>
+            <w:r>
+              <w:t xml:space="preserve">abundance-index data, but did not consistently document the extent of the data</w:t>
+            </w:r>
+            <w:r>
+              <w:t xml:space="preserve"> </w:t>
+            </w:r>
+            <w:r>
+              <w:t xml:space="preserve">used in each analysis. This limited the group’s ability to evaluate</w:t>
+            </w:r>
+            <w:r>
+              <w:t xml:space="preserve"> </w:t>
+            </w:r>
+            <w:r>
+              <w:t xml:space="preserve">representativeness, sample support, survey coverage, and whether uncertainty was</w:t>
+            </w:r>
+            <w:r>
+              <w:t xml:space="preserve"> </w:t>
+            </w:r>
+            <w:r>
+              <w:t xml:space="preserve">adequately propagated. Members were requested to provide concise metadata for</w:t>
+            </w:r>
+            <w:r>
+              <w:t xml:space="preserve"> </w:t>
+            </w:r>
+            <w:r>
+              <w:t xml:space="preserve">each candidate index or supporting analysis, including years covered, spatial</w:t>
+            </w:r>
+            <w:r>
+              <w:t xml:space="preserve"> </w:t>
+            </w:r>
+            <w:r>
+              <w:t xml:space="preserve">extent, survey or fleet coverage, observation unit, number of observations or</w:t>
+            </w:r>
+            <w:r>
+              <w:t xml:space="preserve"> </w:t>
+            </w:r>
+            <w:r>
+              <w:t xml:space="preserve">transects, number of biological samples or tows, expansion methods, whether</w:t>
+            </w:r>
+            <w:r>
+              <w:t xml:space="preserve"> </w:t>
+            </w:r>
+            <w:r>
+              <w:t xml:space="preserve">lengths are fork length or total length, and the uncertainty available for</w:t>
+            </w:r>
+            <w:r>
+              <w:t xml:space="preserve"> </w:t>
+            </w:r>
+            <w:r>
+              <w:t xml:space="preserve">assessment use.</w:t>
+            </w:r>
+          </w:p>
+          <w:p>
+            <w:pPr>
+              <w:pStyle w:val="BodyText"/>
+            </w:pPr>
+            <w:r>
+              <w:t xml:space="preserve">For the north-central Chile acoustic survey programme, the meeting requested a</w:t>
+            </w:r>
+            <w:r>
+              <w:t xml:space="preserve"> </w:t>
+            </w:r>
+            <w:r>
+              <w:t xml:space="preserve">summary table giving, by year where possible, the number of transects, area</w:t>
+            </w:r>
+            <w:r>
+              <w:t xml:space="preserve"> </w:t>
+            </w:r>
+            <w:r>
+              <w:t xml:space="preserve">covered, number of trawls or biological samples used to interpret backscatter,</w:t>
+            </w:r>
+            <w:r>
+              <w:t xml:space="preserve"> </w:t>
+            </w:r>
+            <w:r>
+              <w:t xml:space="preserve">available length-frequency information, and how biological samples were expanded.</w:t>
+            </w:r>
+            <w:r>
+              <w:t xml:space="preserve"> </w:t>
+            </w:r>
+            <w:r>
+              <w:t xml:space="preserve">This table is needed to compare the 2024-2026 surveys against earlier years and</w:t>
+            </w:r>
+            <w:r>
+              <w:t xml:space="preserve"> </w:t>
+            </w:r>
+            <w:r>
+              <w:t xml:space="preserve">to distinguish changes in abundance from changes in survey extent or data</w:t>
+            </w:r>
+            <w:r>
+              <w:t xml:space="preserve"> </w:t>
+            </w:r>
+            <w:r>
+              <w:t xml:space="preserve">support. Members also requested clarification of the table presented for the 2026</w:t>
+            </w:r>
+            <w:r>
+              <w:t xml:space="preserve"> </w:t>
+            </w:r>
+            <w:r>
+              <w:t xml:space="preserve">survey, particularly the distinction between total survey area, area containing</w:t>
+            </w:r>
+            <w:r>
+              <w:t xml:space="preserve"> </w:t>
+            </w:r>
+            <w:r>
+              <w:t xml:space="preserve">jack mackerel, NASC density, and biomass-related quantities.</w:t>
+            </w:r>
+          </w:p>
+          <w:p>
+            <w:pPr>
+              <w:pStyle w:val="BodyText"/>
+            </w:pPr>
+            <w:r>
+              <w:t xml:space="preserve">The historical review of hydroacoustic surveys in north-central Chile emphasized</w:t>
+            </w:r>
+            <w:r>
+              <w:t xml:space="preserve"> </w:t>
+            </w:r>
+            <w:r>
+              <w:t xml:space="preserve">large interannual changes in jack mackerel distribution. Participants discussed</w:t>
+            </w:r>
+            <w:r>
+              <w:t xml:space="preserve"> </w:t>
+            </w:r>
+            <w:r>
+              <w:t xml:space="preserve">whether the recent decline and distribution in 2026 resembled earlier periods,</w:t>
+            </w:r>
+            <w:r>
+              <w:t xml:space="preserve"> </w:t>
+            </w:r>
+            <w:r>
+              <w:t xml:space="preserve">including 1997 and the years when jack mackerel were not detected in one or more</w:t>
+            </w:r>
+            <w:r>
+              <w:t xml:space="preserve"> </w:t>
+            </w:r>
+            <w:r>
+              <w:t xml:space="preserve">surveys. The meeting noted that the 2003-2004 period involved movement away from</w:t>
+            </w:r>
+            <w:r>
+              <w:t xml:space="preserve"> </w:t>
+            </w:r>
+            <w:r>
+              <w:t xml:space="preserve">the survey area and that 2010 marked a return of fish to the survey area. The</w:t>
+            </w:r>
+            <w:r>
+              <w:t xml:space="preserve"> </w:t>
+            </w:r>
+            <w:r>
+              <w:t xml:space="preserve">2026 information suggested a different recent pattern, with limited movement from</w:t>
+            </w:r>
+            <w:r>
+              <w:t xml:space="preserve"> </w:t>
+            </w:r>
+            <w:r>
+              <w:t xml:space="preserve">the open ocean towards the coast and an increased presence of juveniles in</w:t>
+            </w:r>
+            <w:r>
+              <w:t xml:space="preserve"> </w:t>
+            </w:r>
+            <w:r>
+              <w:t xml:space="preserve">northern coastal areas relative to recent years.</w:t>
+            </w:r>
+          </w:p>
+          <w:p>
+            <w:pPr>
+              <w:pStyle w:val="BodyText"/>
+            </w:pPr>
+            <w:r>
+              <w:t xml:space="preserve">The preliminary 2026 Chile acoustic results raised questions about vertical</w:t>
+            </w:r>
+            <w:r>
+              <w:t xml:space="preserve"> </w:t>
+            </w:r>
+            <w:r>
+              <w:t xml:space="preserve">distribution, detectability near the surface, and school structure. The meeting</w:t>
+            </w:r>
+            <w:r>
+              <w:t xml:space="preserve"> </w:t>
+            </w:r>
+            <w:r>
+              <w:t xml:space="preserve">noted that a high proportion of individuals was observed in the upper 30 m in</w:t>
+            </w:r>
+            <w:r>
+              <w:t xml:space="preserve"> </w:t>
+            </w:r>
+            <w:r>
+              <w:t xml:space="preserve">2025 and 2026, but that participants did not identify a survey dead-zone issue</w:t>
+            </w:r>
+            <w:r>
+              <w:t xml:space="preserve"> </w:t>
+            </w:r>
+            <w:r>
+              <w:t xml:space="preserve">for these observations. Participants discussed whether fish close to the surface</w:t>
+            </w:r>
+            <w:r>
+              <w:t xml:space="preserve"> </w:t>
+            </w:r>
+            <w:r>
+              <w:t xml:space="preserve">or more dispersed schools could affect detectability. The presentation indicated</w:t>
+            </w:r>
+            <w:r>
+              <w:t xml:space="preserve"> </w:t>
+            </w:r>
+            <w:r>
+              <w:t xml:space="preserve">that fish were more dispersed in 2026 than in 2025 and that acoustic-trawl</w:t>
+            </w:r>
+            <w:r>
+              <w:t xml:space="preserve"> </w:t>
+            </w:r>
+            <w:r>
+              <w:t xml:space="preserve">operations were most effective around dawn, when jack mackerel tended to</w:t>
+            </w:r>
+            <w:r>
+              <w:t xml:space="preserve"> </w:t>
+            </w:r>
+            <w:r>
+              <w:t xml:space="preserve">concentrate.</w:t>
+            </w:r>
+          </w:p>
+          <w:p>
+            <w:pPr>
+              <w:pStyle w:val="BodyText"/>
+            </w:pPr>
+            <w:r>
+              <w:t xml:space="preserve">The oceanographic presentation proposed that large jack mackerel may have moved</w:t>
+            </w:r>
+            <w:r>
+              <w:t xml:space="preserve"> </w:t>
+            </w:r>
+            <w:r>
+              <w:t xml:space="preserve">offshore and dispersed in response to reduced coastal food concentration</w:t>
+            </w:r>
+            <w:r>
+              <w:t xml:space="preserve"> </w:t>
+            </w:r>
+            <w:r>
+              <w:t xml:space="preserve">associated with ENSO-related inhibition of coastal upwelling. The meeting noted</w:t>
+            </w:r>
+            <w:r>
+              <w:t xml:space="preserve"> </w:t>
+            </w:r>
+            <w:r>
+              <w:t xml:space="preserve">that this hypothesis should be compared directly with the acoustic observations,</w:t>
+            </w:r>
+            <w:r>
+              <w:t xml:space="preserve"> </w:t>
+            </w:r>
+            <w:r>
+              <w:t xml:space="preserve">because some survey evidence appeared to suggest coastal or near-coastal</w:t>
+            </w:r>
+            <w:r>
+              <w:t xml:space="preserve"> </w:t>
+            </w:r>
+            <w:r>
+              <w:t xml:space="preserve">concentrations rather than offshore displacement. The report should therefore</w:t>
+            </w:r>
+            <w:r>
+              <w:t xml:space="preserve"> </w:t>
+            </w:r>
+            <w:r>
+              <w:t xml:space="preserve">treat the oceanographic explanation as a working hypothesis that requires</w:t>
+            </w:r>
+            <w:r>
+              <w:t xml:space="preserve"> </w:t>
+            </w:r>
+            <w:r>
+              <w:t xml:space="preserve">reconciliation with the acoustic distribution, chlorophyll-a information, and</w:t>
+            </w:r>
+            <w:r>
+              <w:t xml:space="preserve"> </w:t>
+            </w:r>
+            <w:r>
+              <w:t xml:space="preserve">fishery-dependent observations.</w:t>
+            </w:r>
+          </w:p>
+          <w:p>
+            <w:pPr>
+              <w:pStyle w:val="BodyText"/>
+            </w:pPr>
+            <w:r>
+              <w:t xml:space="preserve">Two spatio-temporal acoustic standardization approaches for northern Chile were</w:t>
+            </w:r>
+            <w:r>
+              <w:t xml:space="preserve"> </w:t>
+            </w:r>
+            <w:r>
+              <w:t xml:space="preserve">reviewed. The</w:t>
+            </w:r>
+            <w:r>
+              <w:t xml:space="preserve"> </w:t>
+            </w:r>
+            <w:r>
+              <w:rPr>
+                <w:rStyle w:val="VerbatimChar"/>
+              </w:rPr>
+              <w:t xml:space="preserve">sdmTMB</w:t>
+            </w:r>
+            <w:r>
+              <w:t xml:space="preserve"> </w:t>
+            </w:r>
+            <w:r>
+              <w:t xml:space="preserve">acoustic-density analysis based on NASC used zero-included</w:t>
+            </w:r>
+            <w:r>
+              <w:t xml:space="preserve"> </w:t>
+            </w:r>
+            <w:r>
+              <w:t xml:space="preserve">spatio-temporal modelling and was presented as a complementary index. The meeting</w:t>
+            </w:r>
+            <w:r>
+              <w:t xml:space="preserve"> </w:t>
+            </w:r>
+            <w:r>
+              <w:t xml:space="preserve">discussed whether the Tweedie model adequately captured the very high proportion</w:t>
+            </w:r>
+            <w:r>
+              <w:t xml:space="preserve"> </w:t>
+            </w:r>
+            <w:r>
+              <w:t xml:space="preserve">of zeros, whether the survey design and spatial mesh could absorb abundance</w:t>
+            </w:r>
+            <w:r>
+              <w:t xml:space="preserve"> </w:t>
+            </w:r>
+            <w:r>
+              <w:t xml:space="preserve">signal, and how uncertainty in extrapolated areas should be carried through to</w:t>
+            </w:r>
+            <w:r>
+              <w:t xml:space="preserve"> </w:t>
+            </w:r>
+            <w:r>
+              <w:t xml:space="preserve">the final index. Participants cautioned that summing median predictions across</w:t>
+            </w:r>
+            <w:r>
+              <w:t xml:space="preserve"> </w:t>
+            </w:r>
+            <w:r>
+              <w:t xml:space="preserve">areas may understate uncertainty if spatially extrapolated cells are weakly</w:t>
+            </w:r>
+            <w:r>
+              <w:t xml:space="preserve"> </w:t>
+            </w:r>
+            <w:r>
+              <w:t xml:space="preserve">informed. The INLA-based northern Chile analysis used acoustic information</w:t>
+            </w:r>
+            <w:r>
+              <w:t xml:space="preserve"> </w:t>
+            </w:r>
+            <w:r>
+              <w:t xml:space="preserve">converted to biomass with biological data, and participants discussed the roles</w:t>
+            </w:r>
+            <w:r>
+              <w:t xml:space="preserve"> </w:t>
+            </w:r>
+            <w:r>
+              <w:t xml:space="preserve">of occurrence, positive density, anisotropy, and environmental covariates. The</w:t>
+            </w:r>
+            <w:r>
+              <w:t xml:space="preserve"> </w:t>
+            </w:r>
+            <w:r>
+              <w:t xml:space="preserve">meeting noted that these two acoustic products use related data and should be</w:t>
+            </w:r>
+            <w:r>
+              <w:t xml:space="preserve"> </w:t>
+            </w:r>
+            <w:r>
+              <w:t xml:space="preserve">compared for complementarity, redundancy, uncertainty, and sensitivity to survey</w:t>
+            </w:r>
+            <w:r>
+              <w:t xml:space="preserve"> </w:t>
+            </w:r>
+            <w:r>
+              <w:t xml:space="preserve">coverage.</w:t>
+            </w:r>
+          </w:p>
+          <w:p>
+            <w:pPr>
+              <w:pStyle w:val="BodyText"/>
+            </w:pPr>
+            <w:r>
+              <w:t xml:space="preserve">The fishery-dependent acoustic presentation for south-central Chile was viewed as</w:t>
+            </w:r>
+            <w:r>
+              <w:t xml:space="preserve"> </w:t>
+            </w:r>
+            <w:r>
+              <w:t xml:space="preserve">potentially useful but not yet ready for direct assessment use without further</w:t>
+            </w:r>
+            <w:r>
+              <w:t xml:space="preserve"> </w:t>
+            </w:r>
+            <w:r>
+              <w:t xml:space="preserve">work. Participants noted the high temporal resolution and lower cost of</w:t>
+            </w:r>
+            <w:r>
+              <w:t xml:space="preserve"> </w:t>
+            </w:r>
+            <w:r>
+              <w:t xml:space="preserve">commercial-vessel acoustic information, but also discussed preferential sampling,</w:t>
+            </w:r>
+            <w:r>
+              <w:t xml:space="preserve"> </w:t>
+            </w:r>
+            <w:r>
+              <w:t xml:space="preserve">changes in fishing behaviour, possible technology effects, seasonal shifts, and</w:t>
+            </w:r>
+            <w:r>
+              <w:t xml:space="preserve"> </w:t>
+            </w:r>
+            <w:r>
+              <w:t xml:space="preserve">correlation with CPUE from the same fleet. The meeting discussed whether</w:t>
+            </w:r>
+            <w:r>
+              <w:t xml:space="preserve"> </w:t>
+            </w:r>
+            <w:r>
+              <w:t xml:space="preserve">fishery-dependent and fishery-independent acoustic data could eventually be</w:t>
+            </w:r>
+            <w:r>
+              <w:t xml:space="preserve"> </w:t>
+            </w:r>
+            <w:r>
+              <w:t xml:space="preserve">combined, but noted that the fishery-dependent product may be more appropriate as</w:t>
+            </w:r>
+            <w:r>
+              <w:t xml:space="preserve"> </w:t>
+            </w:r>
+            <w:r>
+              <w:t xml:space="preserve">a diagnostic or future sensitivity until the effects of seasonality, vessel</w:t>
+            </w:r>
+            <w:r>
+              <w:t xml:space="preserve"> </w:t>
+            </w:r>
+            <w:r>
+              <w:t xml:space="preserve">coverage, fleet behaviour, and sampling design are better understood.</w:t>
+            </w:r>
+          </w:p>
+          <w:p>
+            <w:pPr>
+              <w:pStyle w:val="BodyText"/>
+            </w:pPr>
+            <w:r>
+              <w:t xml:space="preserve">For the Chile central-south acoustic survey series, participants requested a</w:t>
+            </w:r>
+            <w:r>
+              <w:t xml:space="preserve"> </w:t>
+            </w:r>
+            <w:r>
+              <w:t xml:space="preserve">short paragraph explaining why the historical central-south acoustic data have</w:t>
+            </w:r>
+            <w:r>
+              <w:t xml:space="preserve"> </w:t>
+            </w:r>
+            <w:r>
+              <w:t xml:space="preserve">not been used in the assessment in recent years, including specific reference to</w:t>
+            </w:r>
+            <w:r>
+              <w:t xml:space="preserve"> </w:t>
+            </w:r>
+            <w:r>
+              <w:t xml:space="preserve">available survey years such as 2012, 2015, 2017, 2020, 2021, and 2023. The</w:t>
+            </w:r>
+            <w:r>
+              <w:t xml:space="preserve"> </w:t>
+            </w:r>
+            <w:r>
+              <w:t xml:space="preserve">paragraph should state whether the exclusion is due to survey design, data</w:t>
+            </w:r>
+            <w:r>
+              <w:t xml:space="preserve"> </w:t>
+            </w:r>
+            <w:r>
+              <w:t xml:space="preserve">quality, representativeness, inconsistency with other indices, model behaviour,</w:t>
+            </w:r>
+            <w:r>
+              <w:t xml:space="preserve"> </w:t>
+            </w:r>
+            <w:r>
+              <w:t xml:space="preserve">or lack of documentation, and whether any sensitivity run should be considered</w:t>
+            </w:r>
+            <w:r>
+              <w:t xml:space="preserve"> </w:t>
+            </w:r>
+            <w:r>
+              <w:t xml:space="preserve">for the benchmark.</w:t>
+            </w:r>
+          </w:p>
+          <w:p>
+            <w:pPr>
+              <w:pStyle w:val="BodyText"/>
+            </w:pPr>
+            <w:r>
+              <w:t xml:space="preserve">The Peruvian acoustic discussion emphasized that the acoustic survey programme</w:t>
+            </w:r>
+            <w:r>
+              <w:t xml:space="preserve"> </w:t>
+            </w:r>
+            <w:r>
+              <w:t xml:space="preserve">was primarily designed for anchovy, and that jack mackerel may occur outside the</w:t>
+            </w:r>
+            <w:r>
+              <w:t xml:space="preserve"> </w:t>
+            </w:r>
+            <w:r>
+              <w:t xml:space="preserve">surveyed area in some years. Participants discussed the large decline after the</w:t>
+            </w:r>
+            <w:r>
+              <w:t xml:space="preserve"> </w:t>
+            </w:r>
+            <w:r>
+              <w:t xml:space="preserve">1997/1998 El Nino event, possible ecological regime changes, changes in spatial</w:t>
+            </w:r>
+            <w:r>
+              <w:t xml:space="preserve"> </w:t>
+            </w:r>
+            <w:r>
+              <w:t xml:space="preserve">distribution from nearshore to more offshore areas, and whether the existing Peru</w:t>
+            </w:r>
+            <w:r>
+              <w:t xml:space="preserve"> </w:t>
+            </w:r>
+            <w:r>
+              <w:t xml:space="preserve">acoustic series in the assessment adequately reflects those changes. The meeting</w:t>
+            </w:r>
+            <w:r>
+              <w:t xml:space="preserve"> </w:t>
+            </w:r>
+            <w:r>
+              <w:t xml:space="preserve">requested Peruvian acoustic survey backscatter data and associated length</w:t>
+            </w:r>
+            <w:r>
+              <w:t xml:space="preserve"> </w:t>
+            </w:r>
+            <w:r>
+              <w:t xml:space="preserve">composition data, including survey timing, spatial extent, transect coverage,</w:t>
+            </w:r>
+            <w:r>
+              <w:t xml:space="preserve"> </w:t>
+            </w:r>
+            <w:r>
+              <w:t xml:space="preserve">biological sampling, length type, and uncertainty. The meeting also noted that</w:t>
+            </w:r>
+            <w:r>
+              <w:t xml:space="preserve"> </w:t>
+            </w:r>
+            <w:r>
+              <w:t xml:space="preserve">summer and winter surveys may need to be treated separately because seasonal</w:t>
+            </w:r>
+            <w:r>
+              <w:t xml:space="preserve"> </w:t>
+            </w:r>
+            <w:r>
+              <w:t xml:space="preserve">differences and contrasting within-year values may contain useful information.</w:t>
+            </w:r>
+          </w:p>
+          <w:p>
+            <w:pPr>
+              <w:pStyle w:val="BodyText"/>
+            </w:pPr>
+            <w:r>
+              <w:t xml:space="preserve">The sonar and fishing-vessel acoustic presentations provided methodological</w:t>
+            </w:r>
+            <w:r>
+              <w:t xml:space="preserve"> </w:t>
+            </w:r>
+            <w:r>
+              <w:t xml:space="preserve">context rather than immediate assessment inputs. Sonar may improve information on</w:t>
+            </w:r>
+            <w:r>
+              <w:t xml:space="preserve"> </w:t>
+            </w:r>
+            <w:r>
+              <w:t xml:space="preserve">presence, school behaviour, swimming direction, and fish outside the echosounder</w:t>
+            </w:r>
+            <w:r>
+              <w:t xml:space="preserve"> </w:t>
+            </w:r>
+            <w:r>
+              <w:t xml:space="preserve">beam, but was not considered ready to provide quantitative biomass estimates for</w:t>
+            </w:r>
+            <w:r>
+              <w:t xml:space="preserve"> </w:t>
+            </w:r>
+            <w:r>
+              <w:t xml:space="preserve">jack mackerel. Fishing-vessel acoustic data in Peru may provide useful context,</w:t>
+            </w:r>
+            <w:r>
+              <w:t xml:space="preserve"> </w:t>
+            </w:r>
+            <w:r>
+              <w:t xml:space="preserve">but additional work is needed to understand juvenile avoidance, vessel behaviour,</w:t>
+            </w:r>
+            <w:r>
+              <w:t xml:space="preserve"> </w:t>
+            </w:r>
+            <w:r>
+              <w:t xml:space="preserve">calibration, and how fishery-dependent acoustic observations relate to</w:t>
+            </w:r>
+            <w:r>
+              <w:t xml:space="preserve"> </w:t>
+            </w:r>
+            <w:r>
+              <w:t xml:space="preserve">fishery-independent survey information.</w:t>
+            </w:r>
+          </w:p>
+          <w:p>
+            <w:pPr>
+              <w:pStyle w:val="BodyText"/>
+            </w:pPr>
+            <w:r>
+              <w:t xml:space="preserve">The meeting identified a need for a dedicated analysis that compares acoustic</w:t>
+            </w:r>
+            <w:r>
+              <w:t xml:space="preserve"> </w:t>
+            </w:r>
+            <w:r>
+              <w:t xml:space="preserve">survey extent, backscatter, biological sampling, length-frequency data, and</w:t>
+            </w:r>
+            <w:r>
+              <w:t xml:space="preserve"> </w:t>
+            </w:r>
+            <w:r>
+              <w:t xml:space="preserve">numbers-at-age across years and regions. This analysis should include northern</w:t>
+            </w:r>
+            <w:r>
+              <w:t xml:space="preserve"> </w:t>
+            </w:r>
+            <w:r>
+              <w:t xml:space="preserve">Chile, central-south Chile, Peru, and fishery-dependent acoustic products where</w:t>
+            </w:r>
+            <w:r>
+              <w:t xml:space="preserve"> </w:t>
+            </w:r>
+            <w:r>
+              <w:t xml:space="preserve">available. The objective is to determine which acoustic information is suitable</w:t>
+            </w:r>
+            <w:r>
+              <w:t xml:space="preserve"> </w:t>
+            </w:r>
+            <w:r>
+              <w:t xml:space="preserve">for direct assessment likelihood use, which is suitable for operating-model</w:t>
+            </w:r>
+            <w:r>
+              <w:t xml:space="preserve"> </w:t>
+            </w:r>
+            <w:r>
+              <w:t xml:space="preserve">conditioning or management-procedure diagnostics, and which should remain</w:t>
+            </w:r>
+            <w:r>
+              <w:t xml:space="preserve"> </w:t>
+            </w:r>
+            <w:r>
+              <w:t xml:space="preserve">supporting context.</w:t>
+            </w:r>
+          </w:p>
+          <w:bookmarkStart w:id="22" w:name="day-1-requests"/>
+          <w:p>
+            <w:pPr>
+              <w:pStyle w:val="Heading3"/>
+            </w:pPr>
+            <w:r>
+              <w:t xml:space="preserve">Day 1 Requests</w:t>
+            </w:r>
+          </w:p>
+          <w:p>
+            <w:pPr>
+              <w:pStyle w:val="FirstParagraph"/>
+            </w:pPr>
+            <w:r>
+              <w:t xml:space="preserve">The following requests were identified during the Day 1 acoustic session and</w:t>
+            </w:r>
+            <w:r>
+              <w:t xml:space="preserve"> </w:t>
+            </w:r>
+            <w:r>
+              <w:t xml:space="preserve">should be tracked separately from general discussion notes.</w:t>
+            </w:r>
+          </w:p>
+          <w:tbl>
+            <w:tblPr>
+              <w:tblStyle w:val="Table"/>
+              <w:tblW w:type="pct" w:w="5000"/>
+              <w:tblLayout w:type="fixed"/>
+              <w:tblLook w:firstRow="1" w:lastRow="0" w:firstColumn="0" w:lastColumn="0" w:noHBand="0" w:noVBand="0" w:val="0020"/>
+            </w:tblPr>
+            <w:tblGrid>
+              <w:gridCol w:w="1980"/>
+              <w:gridCol w:w="1980"/>
+              <w:gridCol w:w="1980"/>
+              <w:gridCol w:w="1980"/>
+            </w:tblGrid>
+            <w:tr>
+              <w:trPr>
+                <w:tblHeader w:val="on"/>
+              </w:trPr>
+              <w:tc>
+                <w:tcPr/>
+                <w:p>
+                  <w:pPr>
+                    <w:pStyle w:val="Compact"/>
+                  </w:pPr>
+                  <w:r>
+                    <w:t xml:space="preserve">Request</w:t>
+                  </w:r>
+                </w:p>
+              </w:tc>
+              <w:tc>
+                <w:tcPr/>
+                <w:p>
+                  <w:pPr>
+                    <w:pStyle w:val="Compact"/>
+                  </w:pPr>
+                  <w:r>
+                    <w:t xml:space="preserve">Requested product</w:t>
+                  </w:r>
+                </w:p>
+              </w:tc>
+              <w:tc>
+                <w:tcPr/>
+                <w:p>
+                  <w:pPr>
+                    <w:pStyle w:val="Compact"/>
+                  </w:pPr>
+                  <w:r>
+                    <w:t xml:space="preserve">Lead / source</w:t>
+                  </w:r>
+                </w:p>
+              </w:tc>
+              <w:tc>
+                <w:tcPr/>
+                <w:p>
+                  <w:pPr>
+                    <w:pStyle w:val="Compact"/>
+                  </w:pPr>
+                  <w:r>
+                    <w:t xml:space="preserve">Purpose</w:t>
+                  </w:r>
+                </w:p>
+              </w:tc>
+            </w:tr>
+            <w:tr>
+              <w:tc>
+                <w:tcPr/>
+                <w:p>
+                  <w:pPr>
+                    <w:pStyle w:val="Compact"/>
+                  </w:pPr>
+                  <w:r>
+                    <w:t xml:space="preserve">Data extent for all index analyses</w:t>
+                  </w:r>
+                </w:p>
+              </w:tc>
+              <w:tc>
+                <w:tcPr/>
+                <w:p>
+                  <w:pPr>
+                    <w:pStyle w:val="Compact"/>
+                  </w:pPr>
+                  <w:r>
+                    <w:t xml:space="preserve">For each acoustic and CPUE analysis, provide years covered, spatial extent, fleet or survey coverage, observation unit, sample sizes, treatment of missing data, uncertainty, and expansion method.</w:t>
+                  </w:r>
+                </w:p>
+              </w:tc>
+              <w:tc>
+                <w:tcPr/>
+                <w:p>
+                  <w:pPr>
+                    <w:pStyle w:val="Compact"/>
+                  </w:pPr>
+                  <w:r>
+                    <w:t xml:space="preserve">All index contributors</w:t>
+                  </w:r>
+                </w:p>
+              </w:tc>
+              <w:tc>
+                <w:tcPr/>
+                <w:p>
+                  <w:pPr>
+                    <w:pStyle w:val="Compact"/>
+                  </w:pPr>
+                  <w:r>
+                    <w:t xml:space="preserve">Allow the benchmark to evaluate representativeness, data support, and suitability for assessment, OM conditioning, or MP use.</w:t>
+                  </w:r>
+                </w:p>
+              </w:tc>
+            </w:tr>
+            <w:tr>
+              <w:tc>
+                <w:tcPr/>
+                <w:p>
+                  <w:pPr>
+                    <w:pStyle w:val="Compact"/>
+                  </w:pPr>
+                  <w:r>
+                    <w:t xml:space="preserve">Presentation/report summaries</w:t>
+                  </w:r>
+                </w:p>
+              </w:tc>
+              <w:tc>
+                <w:tcPr/>
+                <w:p>
+                  <w:pPr>
+                    <w:pStyle w:val="Compact"/>
+                  </w:pPr>
+                  <w:r>
+                    <w:t xml:space="preserve">Each technical discussion should leave short report-ready text summarizing decisions, unresolved issues, data requests, and follow-up tasks.</w:t>
+                  </w:r>
+                </w:p>
+              </w:tc>
+              <w:tc>
+                <w:tcPr/>
+                <w:p>
+                  <w:pPr>
+                    <w:pStyle w:val="Compact"/>
+                  </w:pPr>
+                  <w:r>
+                    <w:t xml:space="preserve">Session leads / rapporteurs</w:t>
+                  </w:r>
+                </w:p>
+              </w:tc>
+              <w:tc>
+                <w:tcPr/>
+                <w:p>
+                  <w:pPr>
+                    <w:pStyle w:val="Compact"/>
+                  </w:pPr>
+                  <w:r>
+                    <w:t xml:space="preserve">Keep the benchmark report current enough to support intersessional Scientific Committee approval and the June MSE workshop.</w:t>
+                  </w:r>
+                </w:p>
+              </w:tc>
+            </w:tr>
+            <w:tr>
+              <w:tc>
+                <w:tcPr/>
+                <w:p>
+                  <w:pPr>
+                    <w:pStyle w:val="Compact"/>
+                  </w:pPr>
+                  <w:r>
+                    <w:t xml:space="preserve">Public access to presentations</w:t>
+                  </w:r>
+                </w:p>
+              </w:tc>
+              <w:tc>
+                <w:tcPr/>
+                <w:p>
+                  <w:pPr>
+                    <w:pStyle w:val="Compact"/>
+                  </w:pPr>
+                  <w:r>
+                    <w:t xml:space="preserve">Clarify whether presentations can be made available to the full Scientific Committee.</w:t>
+                  </w:r>
+                </w:p>
+              </w:tc>
+              <w:tc>
+                <w:tcPr/>
+                <w:p>
+                  <w:pPr>
+                    <w:pStyle w:val="Compact"/>
+                  </w:pPr>
+                  <w:r>
+                    <w:t xml:space="preserve">Secretariat / presenters</w:t>
+                  </w:r>
+                </w:p>
+              </w:tc>
+              <w:tc>
+                <w:tcPr/>
+                <w:p>
+                  <w:pPr>
+                    <w:pStyle w:val="Compact"/>
+                  </w:pPr>
+                  <w:r>
+                    <w:t xml:space="preserve">Ensure the Scientific Committee can review the evidence base supporting benchmark recommendations.</w:t>
+                  </w:r>
+                </w:p>
+              </w:tc>
+            </w:tr>
+            <w:tr>
+              <w:tc>
+                <w:tcPr/>
+                <w:p>
+                  <w:pPr>
+                    <w:pStyle w:val="Compact"/>
+                  </w:pPr>
+                  <w:r>
+                    <w:t xml:space="preserve">Chile north acoustic survey metadata</w:t>
+                  </w:r>
+                </w:p>
+              </w:tc>
+              <w:tc>
+                <w:tcPr/>
+                <w:p>
+                  <w:pPr>
+                    <w:pStyle w:val="Compact"/>
+                  </w:pPr>
+                  <w:r>
+                    <w:t xml:space="preserve">Provide a table by year, where possible, with number of transects, area covered, number of trawls or biological samples used for backscatter interpretation, length-frequency data, and expansion information.</w:t>
+                  </w:r>
+                </w:p>
+              </w:tc>
+              <w:tc>
+                <w:tcPr/>
+                <w:p>
+                  <w:pPr>
+                    <w:pStyle w:val="Compact"/>
+                  </w:pPr>
+                  <w:r>
+                    <w:t xml:space="preserve">Chile acoustic contributors</w:t>
+                  </w:r>
+                </w:p>
+              </w:tc>
+              <w:tc>
+                <w:tcPr/>
+                <w:p>
+                  <w:pPr>
+                    <w:pStyle w:val="Compact"/>
+                  </w:pPr>
+                  <w:r>
+                    <w:t xml:space="preserve">Compare 2024-2026 survey data extent with previous years and evaluate survey support for candidate acoustic indices.</w:t>
+                  </w:r>
+                </w:p>
+              </w:tc>
+            </w:tr>
+            <w:tr>
+              <w:tc>
+                <w:tcPr/>
+                <w:p>
+                  <w:pPr>
+                    <w:pStyle w:val="Compact"/>
+                  </w:pPr>
+                  <w:r>
+                    <w:t xml:space="preserve">Chile north acoustic table clarification</w:t>
+                  </w:r>
+                </w:p>
+              </w:tc>
+              <w:tc>
+                <w:tcPr/>
+                <w:p>
+                  <w:pPr>
+                    <w:pStyle w:val="Compact"/>
+                  </w:pPr>
+                  <w:r>
+                    <w:t xml:space="preserve">Clarify the distinction between total survey area, area containing jack mackerel, NASC density, and biomass-related quantities in the presented survey table.</w:t>
+                  </w:r>
+                </w:p>
+              </w:tc>
+              <w:tc>
+                <w:tcPr/>
+                <w:p>
+                  <w:pPr>
+                    <w:pStyle w:val="Compact"/>
+                  </w:pPr>
+                  <w:r>
+                    <w:t xml:space="preserve">Chile acoustic contributors</w:t>
+                  </w:r>
+                </w:p>
+              </w:tc>
+              <w:tc>
+                <w:tcPr/>
+                <w:p>
+                  <w:pPr>
+                    <w:pStyle w:val="Compact"/>
+                  </w:pPr>
+                  <w:r>
+                    <w:t xml:space="preserve">Avoid confusion between survey domain, occupied area, density, and biomass interpretation.</w:t>
+                  </w:r>
+                </w:p>
+              </w:tc>
+            </w:tr>
+            <w:tr>
+              <w:tc>
+                <w:tcPr/>
+                <w:p>
+                  <w:pPr>
+                    <w:pStyle w:val="Compact"/>
+                  </w:pPr>
+                  <w:r>
+                    <w:t xml:space="preserve">Chile central-south acoustic exclusion rationale</w:t>
+                  </w:r>
+                </w:p>
+              </w:tc>
+              <w:tc>
+                <w:tcPr/>
+                <w:p>
+                  <w:pPr>
+                    <w:pStyle w:val="Compact"/>
+                  </w:pPr>
+                  <w:r>
+                    <w:t xml:space="preserve">Draft a paragraph explaining why central-south acoustic data, including 2012, 2015, 2017, 2020, 2021, and 2023, have not been used in the assessment and whether a benchmark sensitivity is warranted.</w:t>
+                  </w:r>
+                </w:p>
+              </w:tc>
+              <w:tc>
+                <w:tcPr/>
+                <w:p>
+                  <w:pPr>
+                    <w:pStyle w:val="Compact"/>
+                  </w:pPr>
+                  <w:r>
+                    <w:t xml:space="preserve">Chile acoustic / assessment contributors</w:t>
+                  </w:r>
+                </w:p>
+              </w:tc>
+              <w:tc>
+                <w:tcPr/>
+                <w:p>
+                  <w:pPr>
+                    <w:pStyle w:val="Compact"/>
+                  </w:pPr>
+                  <w:r>
+                    <w:t xml:space="preserve">Document whether exclusion is due to survey design, representativeness, data quality, model behaviour, or insufficient documentation.</w:t>
+                  </w:r>
+                </w:p>
+              </w:tc>
+            </w:tr>
+            <w:tr>
+              <w:tc>
+                <w:tcPr/>
+                <w:p>
+                  <w:pPr>
+                    <w:pStyle w:val="Compact"/>
+                  </w:pPr>
+                  <w:r>
+                    <w:t xml:space="preserve">Cross-year acoustic data comparison</w:t>
+                  </w:r>
+                </w:p>
+              </w:tc>
+              <w:tc>
+                <w:tcPr/>
+                <w:p>
+                  <w:pPr>
+                    <w:pStyle w:val="Compact"/>
+                  </w:pPr>
+                  <w:r>
+                    <w:t xml:space="preserve">Prepare a dedicated analysis comparing survey extent, backscatter, biological sampling, length-frequency data, and numbers-at-age across years and regions.</w:t>
+                  </w:r>
+                </w:p>
+              </w:tc>
+              <w:tc>
+                <w:tcPr/>
+                <w:p>
+                  <w:pPr>
+                    <w:pStyle w:val="Compact"/>
+                  </w:pPr>
+                  <w:r>
+                    <w:t xml:space="preserve">Acoustic/index subgroup</w:t>
+                  </w:r>
+                </w:p>
+              </w:tc>
+              <w:tc>
+                <w:tcPr/>
+                <w:p>
+                  <w:pPr>
+                    <w:pStyle w:val="Compact"/>
+                  </w:pPr>
+                  <w:r>
+                    <w:t xml:space="preserve">Put northern Chile, central-south Chile, Peru, and fishery-dependent acoustic products on a common evidence basis.</w:t>
+                  </w:r>
+                </w:p>
+              </w:tc>
+            </w:tr>
+            <w:tr>
+              <w:tc>
+                <w:tcPr/>
+                <w:p>
+                  <w:pPr>
+                    <w:pStyle w:val="Compact"/>
+                  </w:pPr>
+                  <w:r>
+                    <w:t xml:space="preserve">Peru acoustic backscatter and length composition</w:t>
+                  </w:r>
+                </w:p>
+              </w:tc>
+              <w:tc>
+                <w:tcPr/>
+                <w:p>
+                  <w:pPr>
+                    <w:pStyle w:val="Compact"/>
+                  </w:pPr>
+                  <w:r>
+                    <w:t xml:space="preserve">Provide acoustic survey backscatter and associated length-composition data, with metadata on survey timing, spatial extent, transect coverage, biological sampling, length type, and uncertainty.</w:t>
+                  </w:r>
+                </w:p>
+              </w:tc>
+              <w:tc>
+                <w:tcPr/>
+                <w:p>
+                  <w:pPr>
+                    <w:pStyle w:val="Compact"/>
+                  </w:pPr>
+                  <w:r>
+                    <w:t xml:space="preserve">Peru acoustic contributors</w:t>
+                  </w:r>
+                </w:p>
+              </w:tc>
+              <w:tc>
+                <w:tcPr/>
+                <w:p>
+                  <w:pPr>
+                    <w:pStyle w:val="Compact"/>
+                  </w:pPr>
+                  <w:r>
+                    <w:t xml:space="preserve">Evaluate whether Peru acoustic information can be used as an index, sensitivity, OM input, or diagnostic.</w:t>
+                  </w:r>
+                </w:p>
+              </w:tc>
+            </w:tr>
+            <w:tr>
+              <w:tc>
+                <w:tcPr/>
+                <w:p>
+                  <w:pPr>
+                    <w:pStyle w:val="Compact"/>
+                  </w:pPr>
+                  <w:r>
+                    <w:t xml:space="preserve">Peru acoustic assessment treatment check</w:t>
+                  </w:r>
+                </w:p>
+              </w:tc>
+              <w:tc>
+                <w:tcPr/>
+                <w:p>
+                  <w:pPr>
+                    <w:pStyle w:val="Compact"/>
+                  </w:pPr>
+                  <w:r>
+                    <w:t xml:space="preserve">Check current assessment treatment of the Peru acoustic index, including selectivity, catchability, CV assumptions, relationship to Peru CPUE, and possible pre-/post-1997/1998 treatment.</w:t>
+                  </w:r>
+                </w:p>
+              </w:tc>
+              <w:tc>
+                <w:tcPr/>
+                <w:p>
+                  <w:pPr>
+                    <w:pStyle w:val="Compact"/>
+                  </w:pPr>
+                  <w:r>
+                    <w:t xml:space="preserve">Assessment subgroup</w:t>
+                  </w:r>
+                </w:p>
+              </w:tc>
+              <w:tc>
+                <w:tcPr/>
+                <w:p>
+                  <w:pPr>
+                    <w:pStyle w:val="Compact"/>
+                  </w:pPr>
+                  <w:r>
+                    <w:t xml:space="preserve">Determine whether the current model treatment is defensible and whether reintroduction or split-index treatment should be tested.</w:t>
+                  </w:r>
+                </w:p>
+              </w:tc>
+            </w:tr>
+            <w:tr>
+              <w:tc>
+                <w:tcPr/>
+                <w:p>
+                  <w:pPr>
+                    <w:pStyle w:val="Compact"/>
+                  </w:pPr>
+                  <w:r>
+                    <w:t xml:space="preserve">Chile central-south acoustic sensitivity</w:t>
+                  </w:r>
+                </w:p>
+              </w:tc>
+              <w:tc>
+                <w:tcPr/>
+                <w:p>
+                  <w:pPr>
+                    <w:pStyle w:val="Compact"/>
+                  </w:pPr>
+                  <w:r>
+                    <w:t xml:space="preserve">Evaluate whether updated central-south acoustic data through 2023 should be included as a sensitivity or retained as diagnostic information.</w:t>
+                  </w:r>
+                </w:p>
+              </w:tc>
+              <w:tc>
+                <w:tcPr/>
+                <w:p>
+                  <w:pPr>
+                    <w:pStyle w:val="Compact"/>
+                  </w:pPr>
+                  <w:r>
+                    <w:t xml:space="preserve">Assessment subgroup / Chile contributors</w:t>
+                  </w:r>
+                </w:p>
+              </w:tc>
+              <w:tc>
+                <w:tcPr/>
+                <w:p>
+                  <w:pPr>
+                    <w:pStyle w:val="Compact"/>
+                  </w:pPr>
+                  <w:r>
+                    <w:t xml:space="preserve">Decide whether unused central-south acoustic information should be tested in the benchmark model set.</w:t>
+                  </w:r>
+                </w:p>
+              </w:tc>
+            </w:tr>
+          </w:tbl>
+          <w:p/>
+        </w:tc>
+      </w:tr>
+    </w:tbl>
+    <w:bookmarkEnd w:id="22"/>
+    <w:bookmarkEnd w:id="23"/>
+    <w:bookmarkStart w:id="24" w:name="cpue-indices"/>
     <w:p>
       <w:pPr>
         <w:pStyle w:val="Heading2"/>
@@ -596,8 +1918,8 @@
         <w:t xml:space="preserve">Text to be added during the meeting. This section should summarize the CPUE coordination discussion, historical CPUE synthesis, effort-creep treatment, spatio-temporal CPUE alternatives, Peruvian CPUE standardization, index-weighting questions, and whether separate or combined CPUE products should be carried forward.</w:t>
       </w:r>
     </w:p>
-    <w:bookmarkEnd w:id="20"/>
-    <w:bookmarkStart w:id="21" w:name="biological-inputs"/>
+    <w:bookmarkEnd w:id="24"/>
+    <w:bookmarkStart w:id="25" w:name="biological-inputs"/>
     <w:p>
       <w:pPr>
         <w:pStyle w:val="Heading2"/>
@@ -614,8 +1936,8 @@
         <w:t xml:space="preserve">Text to be added during the meeting. This section should summarize biological assumptions and data inputs, including maturity, natural mortality, weight-at-age, length-weight relationships, length-frequency composition data, and implications for assessment and operating-model conditioning.</w:t>
       </w:r>
     </w:p>
-    <w:bookmarkEnd w:id="21"/>
-    <w:bookmarkStart w:id="22" w:name="assessment-model-development"/>
+    <w:bookmarkEnd w:id="25"/>
+    <w:bookmarkStart w:id="26" w:name="assessment-model-development"/>
     <w:p>
       <w:pPr>
         <w:pStyle w:val="Heading2"/>
@@ -632,8 +1954,8 @@
         <w:t xml:space="preserve">Text to be added during the meeting. This section should summarize the SC13 base-model developments, candidate simplifications, single-stock and two-stock alternatives, reduced-index configurations, selectivity assumptions, recruitment scenarios, and model diagnostics.</w:t>
       </w:r>
     </w:p>
-    <w:bookmarkEnd w:id="22"/>
-    <w:bookmarkStart w:id="23" w:name="operating-models-and-mse-linkages"/>
+    <w:bookmarkEnd w:id="26"/>
+    <w:bookmarkStart w:id="27" w:name="operating-models-and-mse-linkages"/>
     <w:p>
       <w:pPr>
         <w:pStyle w:val="Heading2"/>
@@ -650,9 +1972,9 @@
         <w:t xml:space="preserve">Text to be added during the meeting. This section should summarize operating-model specifications, reference-set and robustness-set uncertainties, MCMC feasibility, management-procedure input diagnostics, and workflow needs for the June 2026 MSE workshop.</w:t>
       </w:r>
     </w:p>
-    <w:bookmarkEnd w:id="23"/>
-    <w:bookmarkEnd w:id="24"/>
-    <w:bookmarkStart w:id="25" w:name="decisions-and-agreements"/>
+    <w:bookmarkEnd w:id="27"/>
+    <w:bookmarkEnd w:id="28"/>
+    <w:bookmarkStart w:id="29" w:name="decisions-and-agreements"/>
     <w:p>
       <w:pPr>
         <w:pStyle w:val="Heading1"/>
@@ -779,8 +2101,8 @@
         </w:tc>
       </w:tr>
     </w:tbl>
-    <w:bookmarkEnd w:id="25"/>
-    <w:bookmarkStart w:id="26" w:name="action-items"/>
+    <w:bookmarkEnd w:id="29"/>
+    <w:bookmarkStart w:id="30" w:name="action-items"/>
     <w:p>
       <w:pPr>
         <w:pStyle w:val="Heading1"/>
@@ -1043,9 +2365,331 @@
           </w:p>
         </w:tc>
       </w:tr>
+      <w:tr>
+        <w:tc>
+          <w:tcPr/>
+          <w:p>
+            <w:pPr>
+              <w:pStyle w:val="Compact"/>
+            </w:pPr>
+            <w:r>
+              <w:t xml:space="preserve">Provide data-extent metadata for each acoustic and CPUE analysis, including years, area, observation units, sample sizes, survey or fleet coverage, biological samples, uncertainty, and expansion methods</w:t>
+            </w:r>
+          </w:p>
+        </w:tc>
+        <w:tc>
+          <w:tcPr/>
+          <w:p>
+            <w:pPr>
+              <w:pStyle w:val="Compact"/>
+            </w:pPr>
+            <w:r>
+              <w:t xml:space="preserve">All index contributors</w:t>
+            </w:r>
+          </w:p>
+        </w:tc>
+        <w:tc>
+          <w:tcPr/>
+          <w:p>
+            <w:pPr>
+              <w:pStyle w:val="Compact"/>
+            </w:pPr>
+            <w:r>
+              <w:t xml:space="preserve">Secretariat / rapporteurs</w:t>
+            </w:r>
+          </w:p>
+        </w:tc>
+        <w:tc>
+          <w:tcPr/>
+          <w:p>
+            <w:pPr>
+              <w:pStyle w:val="Compact"/>
+            </w:pPr>
+            <w:r>
+              <w:t xml:space="preserve">Before report adoption</w:t>
+            </w:r>
+          </w:p>
+        </w:tc>
+      </w:tr>
+      <w:tr>
+        <w:tc>
+          <w:tcPr/>
+          <w:p>
+            <w:pPr>
+              <w:pStyle w:val="Compact"/>
+            </w:pPr>
+            <w:r>
+              <w:t xml:space="preserve">Prepare a north-central Chile acoustic data-extent table with transects, area covered, trawls or biological samples, length-frequency data, and expansion information by year</w:t>
+            </w:r>
+          </w:p>
+        </w:tc>
+        <w:tc>
+          <w:tcPr/>
+          <w:p>
+            <w:pPr>
+              <w:pStyle w:val="Compact"/>
+            </w:pPr>
+            <w:r>
+              <w:t xml:space="preserve">Chile acoustic contributors</w:t>
+            </w:r>
+          </w:p>
+        </w:tc>
+        <w:tc>
+          <w:tcPr/>
+          <w:p>
+            <w:pPr>
+              <w:pStyle w:val="Compact"/>
+            </w:pPr>
+            <w:r>
+              <w:t xml:space="preserve">Assessment/index subgroup</w:t>
+            </w:r>
+          </w:p>
+        </w:tc>
+        <w:tc>
+          <w:tcPr/>
+          <w:p>
+            <w:pPr>
+              <w:pStyle w:val="Compact"/>
+            </w:pPr>
+            <w:r>
+              <w:t xml:space="preserve">Before report adoption</w:t>
+            </w:r>
+          </w:p>
+        </w:tc>
+      </w:tr>
+      <w:tr>
+        <w:tc>
+          <w:tcPr/>
+          <w:p>
+            <w:pPr>
+              <w:pStyle w:val="Compact"/>
+            </w:pPr>
+            <w:r>
+              <w:t xml:space="preserve">Draft a paragraph explaining why the Chile central-south acoustic survey series has not been used in the assessment, and whether any benchmark sensitivity should be run</w:t>
+            </w:r>
+          </w:p>
+        </w:tc>
+        <w:tc>
+          <w:tcPr/>
+          <w:p>
+            <w:pPr>
+              <w:pStyle w:val="Compact"/>
+            </w:pPr>
+            <w:r>
+              <w:t xml:space="preserve">Chile acoustic contributors</w:t>
+            </w:r>
+          </w:p>
+        </w:tc>
+        <w:tc>
+          <w:tcPr/>
+          <w:p>
+            <w:pPr>
+              <w:pStyle w:val="Compact"/>
+            </w:pPr>
+            <w:r>
+              <w:t xml:space="preserve">Assessment subgroup</w:t>
+            </w:r>
+          </w:p>
+        </w:tc>
+        <w:tc>
+          <w:tcPr/>
+          <w:p>
+            <w:pPr>
+              <w:pStyle w:val="Compact"/>
+            </w:pPr>
+            <w:r>
+              <w:t xml:space="preserve">Before report adoption</w:t>
+            </w:r>
+          </w:p>
+        </w:tc>
+      </w:tr>
+      <w:tr>
+        <w:tc>
+          <w:tcPr/>
+          <w:p>
+            <w:pPr>
+              <w:pStyle w:val="Compact"/>
+            </w:pPr>
+            <w:r>
+              <w:t xml:space="preserve">Provide Peru acoustic backscatter and associated length-composition metadata, including survey timing, spatial extent, length type, biological sampling, and uncertainty</w:t>
+            </w:r>
+          </w:p>
+        </w:tc>
+        <w:tc>
+          <w:tcPr/>
+          <w:p>
+            <w:pPr>
+              <w:pStyle w:val="Compact"/>
+            </w:pPr>
+            <w:r>
+              <w:t xml:space="preserve">Peru acoustic contributors</w:t>
+            </w:r>
+          </w:p>
+        </w:tc>
+        <w:tc>
+          <w:tcPr/>
+          <w:p>
+            <w:pPr>
+              <w:pStyle w:val="Compact"/>
+            </w:pPr>
+            <w:r>
+              <w:t xml:space="preserve">Assessment/index subgroup</w:t>
+            </w:r>
+          </w:p>
+        </w:tc>
+        <w:tc>
+          <w:tcPr/>
+          <w:p>
+            <w:pPr>
+              <w:pStyle w:val="Compact"/>
+            </w:pPr>
+            <w:r>
+              <w:t xml:space="preserve">Before report adoption</w:t>
+            </w:r>
+          </w:p>
+        </w:tc>
+      </w:tr>
+      <w:tr>
+        <w:tc>
+          <w:tcPr/>
+          <w:p>
+            <w:pPr>
+              <w:pStyle w:val="Compact"/>
+            </w:pPr>
+            <w:r>
+              <w:t xml:space="preserve">Compare acoustic survey extent, biological sampling, length-frequency data, and numbers-at-age across northern Chile, central-south Chile, Peru, and fishery-dependent acoustic products</w:t>
+            </w:r>
+          </w:p>
+        </w:tc>
+        <w:tc>
+          <w:tcPr/>
+          <w:p>
+            <w:pPr>
+              <w:pStyle w:val="Compact"/>
+            </w:pPr>
+            <w:r>
+              <w:t xml:space="preserve">Acoustic/index subgroup</w:t>
+            </w:r>
+          </w:p>
+        </w:tc>
+        <w:tc>
+          <w:tcPr/>
+          <w:p>
+            <w:pPr>
+              <w:pStyle w:val="Compact"/>
+            </w:pPr>
+            <w:r>
+              <w:t xml:space="preserve">Chile and Peru contributors</w:t>
+            </w:r>
+          </w:p>
+        </w:tc>
+        <w:tc>
+          <w:tcPr/>
+          <w:p>
+            <w:pPr>
+              <w:pStyle w:val="Compact"/>
+            </w:pPr>
+            <w:r>
+              <w:t xml:space="preserve">Before final index recommendations</w:t>
+            </w:r>
+          </w:p>
+        </w:tc>
+      </w:tr>
+      <w:tr>
+        <w:tc>
+          <w:tcPr/>
+          <w:p>
+            <w:pPr>
+              <w:pStyle w:val="Compact"/>
+            </w:pPr>
+            <w:r>
+              <w:t xml:space="preserve">Check current assessment treatment of the Peru acoustic index, including selectivity, catchability, CV assumptions, relationship to Peru CPUE, and whether pre-/post-1997/1998 treatment should be considered</w:t>
+            </w:r>
+          </w:p>
+        </w:tc>
+        <w:tc>
+          <w:tcPr/>
+          <w:p>
+            <w:pPr>
+              <w:pStyle w:val="Compact"/>
+            </w:pPr>
+            <w:r>
+              <w:t xml:space="preserve">Assessment subgroup</w:t>
+            </w:r>
+          </w:p>
+        </w:tc>
+        <w:tc>
+          <w:tcPr/>
+          <w:p>
+            <w:pPr>
+              <w:pStyle w:val="Compact"/>
+            </w:pPr>
+            <w:r>
+              <w:t xml:space="preserve">Peru contributors</w:t>
+            </w:r>
+          </w:p>
+        </w:tc>
+        <w:tc>
+          <w:tcPr/>
+          <w:p>
+            <w:pPr>
+              <w:pStyle w:val="Compact"/>
+            </w:pPr>
+            <w:r>
+              <w:t xml:space="preserve">Before model-run decisions</w:t>
+            </w:r>
+          </w:p>
+        </w:tc>
+      </w:tr>
+      <w:tr>
+        <w:tc>
+          <w:tcPr/>
+          <w:p>
+            <w:pPr>
+              <w:pStyle w:val="Compact"/>
+            </w:pPr>
+            <w:r>
+              <w:t xml:space="preserve">Evaluate whether updated Chile central-south acoustic data through 2023 should be included as an assessment sensitivity or retained as diagnostic information</w:t>
+            </w:r>
+          </w:p>
+        </w:tc>
+        <w:tc>
+          <w:tcPr/>
+          <w:p>
+            <w:pPr>
+              <w:pStyle w:val="Compact"/>
+            </w:pPr>
+            <w:r>
+              <w:t xml:space="preserve">Assessment subgroup</w:t>
+            </w:r>
+          </w:p>
+        </w:tc>
+        <w:tc>
+          <w:tcPr/>
+          <w:p>
+            <w:pPr>
+              <w:pStyle w:val="Compact"/>
+            </w:pPr>
+            <w:r>
+              <w:t xml:space="preserve">Chile contributors</w:t>
+            </w:r>
+          </w:p>
+        </w:tc>
+        <w:tc>
+          <w:tcPr/>
+          <w:p>
+            <w:pPr>
+              <w:pStyle w:val="Compact"/>
+            </w:pPr>
+            <w:r>
+              <w:t xml:space="preserve">Before final model-run list</w:t>
+            </w:r>
+          </w:p>
+        </w:tc>
+      </w:tr>
     </w:tbl>
-    <w:bookmarkEnd w:id="26"/>
-    <w:bookmarkStart w:id="27" w:name="open-issues-risks-to-track"/>
+    <w:bookmarkEnd w:id="30"/>
+    <w:bookmarkStart w:id="31" w:name="open-issues-risks-to-track"/>
     <w:p>
       <w:pPr>
         <w:pStyle w:val="Heading1"/>
@@ -1114,8 +2758,44 @@
         <w:t xml:space="preserve">Report writing must keep pace with the technical discussion so that decisions are not lost before adoption.</w:t>
       </w:r>
     </w:p>
-    <w:bookmarkEnd w:id="27"/>
-    <w:bookmarkStart w:id="33" w:name="appendix-a.-shortened-draft-agenda"/>
+    <w:p>
+      <w:pPr>
+        <w:pStyle w:val="Compact"/>
+        <w:numPr>
+          <w:ilvl w:val="0"/>
+          <w:numId w:val="1004"/>
+        </w:numPr>
+      </w:pPr>
+      <w:r>
+        <w:t xml:space="preserve">Several acoustic and CPUE analyses currently lack enough data-extent metadata to evaluate representativeness and sample support.</w:t>
+      </w:r>
+    </w:p>
+    <w:p>
+      <w:pPr>
+        <w:pStyle w:val="Compact"/>
+        <w:numPr>
+          <w:ilvl w:val="0"/>
+          <w:numId w:val="1004"/>
+        </w:numPr>
+      </w:pPr>
+      <w:r>
+        <w:t xml:space="preserve">Peru acoustic information may contain useful historical and seasonal signal, but its assessment use depends on survey coverage relative to jack mackerel distribution, biological sampling, and possible pre-/post-1997/1998 changes.</w:t>
+      </w:r>
+    </w:p>
+    <w:p>
+      <w:pPr>
+        <w:pStyle w:val="Compact"/>
+        <w:numPr>
+          <w:ilvl w:val="0"/>
+          <w:numId w:val="1004"/>
+        </w:numPr>
+      </w:pPr>
+      <w:r>
+        <w:t xml:space="preserve">Fishery-dependent acoustic products may add spatial and seasonal information, but preferential sampling, fishing behaviour, technology effects, and correlation with CPUE must be evaluated before direct assessment use.</w:t>
+      </w:r>
+    </w:p>
+    <w:bookmarkEnd w:id="31"/>
+    <w:bookmarkStart w:id="37" w:name="appendix-a.-shortened-draft-agenda"/>
     <w:p>
       <w:pPr>
         <w:pStyle w:val="Heading1"/>
@@ -1132,7 +2812,7 @@
         <w:t xml:space="preserve">This appendix summarizes the draft agenda from SCW16-Doc00. It should be updated if the adopted meeting agenda differs materially.</w:t>
       </w:r>
     </w:p>
-    <w:bookmarkStart w:id="28" w:name="day-1-acoustic-session"/>
+    <w:bookmarkStart w:id="32" w:name="day-1-acoustic-session"/>
     <w:p>
       <w:pPr>
         <w:pStyle w:val="Heading2"/>
@@ -1261,8 +2941,8 @@
         <w:t xml:space="preserve">General discussion and technical recommendations.</w:t>
       </w:r>
     </w:p>
-    <w:bookmarkEnd w:id="28"/>
-    <w:bookmarkStart w:id="29" w:name="day-2-cpue-session"/>
+    <w:bookmarkEnd w:id="32"/>
+    <w:bookmarkStart w:id="33" w:name="day-2-cpue-session"/>
     <w:p>
       <w:pPr>
         <w:pStyle w:val="Heading2"/>
@@ -1367,8 +3047,8 @@
         <w:t xml:space="preserve">Separate versus combined index products for HCR or management-procedure use.</w:t>
       </w:r>
     </w:p>
-    <w:bookmarkEnd w:id="29"/>
-    <w:bookmarkStart w:id="30" w:name="Xe19488a9e250f8a1b1acbf6bd27cb1809ccf6dd"/>
+    <w:bookmarkEnd w:id="33"/>
+    <w:bookmarkStart w:id="34" w:name="Xe19488a9e250f8a1b1acbf6bd27cb1809ccf6dd"/>
     <w:p>
       <w:pPr>
         <w:pStyle w:val="Heading2"/>
@@ -1437,8 +3117,8 @@
         <w:t xml:space="preserve">Review of Peru length-weight and length-frequency information, including SCW16-Doc13 and SCW16-Doc14.</w:t>
       </w:r>
     </w:p>
-    <w:bookmarkEnd w:id="30"/>
-    <w:bookmarkStart w:id="31" w:name="X093770a539d959c93333ac261f9d7f2c82f1662"/>
+    <w:bookmarkEnd w:id="34"/>
+    <w:bookmarkStart w:id="35" w:name="X093770a539d959c93333ac261f9d7f2c82f1662"/>
     <w:p>
       <w:pPr>
         <w:pStyle w:val="Heading2"/>
@@ -1495,8 +3175,8 @@
         <w:t xml:space="preserve">MCMC evaluations, convergence diagnostics, run-time constraints, and feasibility.</w:t>
       </w:r>
     </w:p>
-    <w:bookmarkEnd w:id="31"/>
-    <w:bookmarkStart w:id="32" w:name="X0e50bbd5976cb17edeb25ef5bfa4ced02afb38c"/>
+    <w:bookmarkEnd w:id="35"/>
+    <w:bookmarkStart w:id="36" w:name="X0e50bbd5976cb17edeb25ef5bfa4ced02afb38c"/>
     <w:p>
       <w:pPr>
         <w:pStyle w:val="Heading2"/>
@@ -1541,9 +3221,9 @@
         <w:t xml:space="preserve">Report drafting, review, and adoption.</w:t>
       </w:r>
     </w:p>
-    <w:bookmarkEnd w:id="32"/>
-    <w:bookmarkEnd w:id="33"/>
-    <w:bookmarkStart w:id="34" w:name="appendix-b.-participants"/>
+    <w:bookmarkEnd w:id="36"/>
+    <w:bookmarkEnd w:id="37"/>
+    <w:bookmarkStart w:id="38" w:name="appendix-b.-participants"/>
     <w:p>
       <w:pPr>
         <w:pStyle w:val="Heading1"/>
@@ -3357,8 +5037,8 @@
         </w:tc>
       </w:tr>
     </w:tbl>
-    <w:bookmarkEnd w:id="34"/>
-    <w:bookmarkStart w:id="73" w:name="appendix-c.-document-summary-by-topic"/>
+    <w:bookmarkEnd w:id="38"/>
+    <w:bookmarkStart w:id="77" w:name="appendix-c.-document-summary-by-topic"/>
     <w:p>
       <w:pPr>
         <w:pStyle w:val="Heading1"/>
@@ -3375,7 +5055,7 @@
         <w:t xml:space="preserve">This appendix summarizes SCW16-Doc01 through SCW16-Doc16. The organization is by topic rather than document number so that related evidence can be reviewed together.</w:t>
       </w:r>
     </w:p>
-    <w:bookmarkStart w:id="37" w:name="assessment-and-model-structure"/>
+    <w:bookmarkStart w:id="41" w:name="assessment-and-model-structure"/>
     <w:p>
       <w:pPr>
         <w:pStyle w:val="Heading2"/>
@@ -3384,7 +5064,7 @@
         <w:t xml:space="preserve">Assessment and Model Structure</w:t>
       </w:r>
     </w:p>
-    <w:bookmarkStart w:id="36" w:name="developments-of-the-base-sc13-model"/>
+    <w:bookmarkStart w:id="40" w:name="developments-of-the-base-sc13-model"/>
     <w:p>
       <w:pPr>
         <w:pStyle w:val="Heading3"/>
@@ -3397,7 +5077,7 @@
       <w:pPr>
         <w:pStyle w:val="FirstParagraph"/>
       </w:pPr>
-      <w:hyperlink r:id="rId35">
+      <w:hyperlink r:id="rId39">
         <w:r>
           <w:rPr>
             <w:rStyle w:val="Hyperlink"/>
@@ -3420,9 +5100,9 @@
         <w:t xml:space="preserve">Key report use: summarize accepted base-model structure, candidate simplifications, retained sensitivities, and any model configurations to carry into OM conditioning.</w:t>
       </w:r>
     </w:p>
-    <w:bookmarkEnd w:id="36"/>
-    <w:bookmarkEnd w:id="37"/>
-    <w:bookmarkStart w:id="40" w:name="operating-models-and-mse"/>
+    <w:bookmarkEnd w:id="40"/>
+    <w:bookmarkEnd w:id="41"/>
+    <w:bookmarkStart w:id="44" w:name="operating-models-and-mse"/>
     <w:p>
       <w:pPr>
         <w:pStyle w:val="Heading2"/>
@@ -3431,7 +5111,7 @@
         <w:t xml:space="preserve">Operating Models and MSE</w:t>
       </w:r>
     </w:p>
-    <w:bookmarkStart w:id="39" w:name="operating-models-for-jack-mackerel-mse"/>
+    <w:bookmarkStart w:id="43" w:name="operating-models-for-jack-mackerel-mse"/>
     <w:p>
       <w:pPr>
         <w:pStyle w:val="Heading3"/>
@@ -3444,7 +5124,7 @@
       <w:pPr>
         <w:pStyle w:val="FirstParagraph"/>
       </w:pPr>
-      <w:hyperlink r:id="rId38">
+      <w:hyperlink r:id="rId42">
         <w:r>
           <w:rPr>
             <w:rStyle w:val="Hyperlink"/>
@@ -3467,9 +5147,9 @@
         <w:t xml:space="preserve">Key report use: define the operating-model grid or equivalent uncertainty table that will feed the June 2026 MSE workshop.</w:t>
       </w:r>
     </w:p>
-    <w:bookmarkEnd w:id="39"/>
-    <w:bookmarkEnd w:id="40"/>
-    <w:bookmarkStart w:id="53" w:name="cpue"/>
+    <w:bookmarkEnd w:id="43"/>
+    <w:bookmarkEnd w:id="44"/>
+    <w:bookmarkStart w:id="57" w:name="cpue"/>
     <w:p>
       <w:pPr>
         <w:pStyle w:val="Heading2"/>
@@ -3478,7 +5158,7 @@
         <w:t xml:space="preserve">CPUE</w:t>
       </w:r>
     </w:p>
-    <w:bookmarkStart w:id="42" w:name="X78655e90d273c2174e3dc08eb7d53678355183a"/>
+    <w:bookmarkStart w:id="46" w:name="X78655e90d273c2174e3dc08eb7d53678355183a"/>
     <w:p>
       <w:pPr>
         <w:pStyle w:val="Heading3"/>
@@ -3491,7 +5171,7 @@
       <w:pPr>
         <w:pStyle w:val="FirstParagraph"/>
       </w:pPr>
-      <w:hyperlink r:id="rId41">
+      <w:hyperlink r:id="rId45">
         <w:r>
           <w:rPr>
             <w:rStyle w:val="Hyperlink"/>
@@ -3514,8 +5194,8 @@
         <w:t xml:space="preserve">Key report use: structure the CPUE session and make sure each candidate CPUE product is classified for assessment, OM conditioning, MP input, diagnostic use, or hold.</w:t>
       </w:r>
     </w:p>
-    <w:bookmarkEnd w:id="42"/>
-    <w:bookmarkStart w:id="44" w:name="X55aa1326c783fdba0a32cb00d5dd3d2612f78d5"/>
+    <w:bookmarkEnd w:id="46"/>
+    <w:bookmarkStart w:id="48" w:name="X55aa1326c783fdba0a32cb00d5dd3d2612f78d5"/>
     <w:p>
       <w:pPr>
         <w:pStyle w:val="Heading3"/>
@@ -3528,7 +5208,7 @@
       <w:pPr>
         <w:pStyle w:val="FirstParagraph"/>
       </w:pPr>
-      <w:hyperlink r:id="rId43">
+      <w:hyperlink r:id="rId47">
         <w:r>
           <w:rPr>
             <w:rStyle w:val="Hyperlink"/>
@@ -3551,8 +5231,8 @@
         <w:t xml:space="preserve">Key report use: provide background for interpreting new CPUE papers and avoid repeating previously identified unresolved issues.</w:t>
       </w:r>
     </w:p>
-    <w:bookmarkEnd w:id="44"/>
-    <w:bookmarkStart w:id="46" w:name="chile-cpue-effort-creep"/>
+    <w:bookmarkEnd w:id="48"/>
+    <w:bookmarkStart w:id="50" w:name="chile-cpue-effort-creep"/>
     <w:p>
       <w:pPr>
         <w:pStyle w:val="Heading3"/>
@@ -3565,7 +5245,7 @@
       <w:pPr>
         <w:pStyle w:val="FirstParagraph"/>
       </w:pPr>
-      <w:hyperlink r:id="rId45">
+      <w:hyperlink r:id="rId49">
         <w:r>
           <w:rPr>
             <w:rStyle w:val="Hyperlink"/>
@@ -3588,8 +5268,8 @@
         <w:t xml:space="preserve">Key report use: document whether effort-creep treatment is accepted, treated as a sensitivity, or deferred pending additional diagnostics.</w:t>
       </w:r>
     </w:p>
-    <w:bookmarkEnd w:id="46"/>
-    <w:bookmarkStart w:id="48" w:name="chile-cpue-with-sdmtmbspde"/>
+    <w:bookmarkEnd w:id="50"/>
+    <w:bookmarkStart w:id="52" w:name="chile-cpue-with-sdmtmbspde"/>
     <w:p>
       <w:pPr>
         <w:pStyle w:val="Heading3"/>
@@ -3602,7 +5282,7 @@
       <w:pPr>
         <w:pStyle w:val="FirstParagraph"/>
       </w:pPr>
-      <w:hyperlink r:id="rId47">
+      <w:hyperlink r:id="rId51">
         <w:r>
           <w:rPr>
             <w:rStyle w:val="Hyperlink"/>
@@ -3637,8 +5317,8 @@
         <w:t xml:space="preserve">Key report use: evaluate whether the spatio-temporal CPUE product should replace, supplement, or diagnose the current assessment CPUE series.</w:t>
       </w:r>
     </w:p>
-    <w:bookmarkEnd w:id="48"/>
-    <w:bookmarkStart w:id="50" w:name="chile-cpue-with-inla"/>
+    <w:bookmarkEnd w:id="52"/>
+    <w:bookmarkStart w:id="54" w:name="chile-cpue-with-inla"/>
     <w:p>
       <w:pPr>
         <w:pStyle w:val="Heading3"/>
@@ -3651,7 +5331,7 @@
       <w:pPr>
         <w:pStyle w:val="FirstParagraph"/>
       </w:pPr>
-      <w:hyperlink r:id="rId49">
+      <w:hyperlink r:id="rId53">
         <w:r>
           <w:rPr>
             <w:rStyle w:val="Hyperlink"/>
@@ -3689,8 +5369,8 @@
         <w:t xml:space="preserve">CPUE product.</w:t>
       </w:r>
     </w:p>
-    <w:bookmarkEnd w:id="50"/>
-    <w:bookmarkStart w:id="52" w:name="peru-cpue"/>
+    <w:bookmarkEnd w:id="54"/>
+    <w:bookmarkStart w:id="56" w:name="peru-cpue"/>
     <w:p>
       <w:pPr>
         <w:pStyle w:val="Heading3"/>
@@ -3703,7 +5383,7 @@
       <w:pPr>
         <w:pStyle w:val="FirstParagraph"/>
       </w:pPr>
-      <w:hyperlink r:id="rId51">
+      <w:hyperlink r:id="rId55">
         <w:r>
           <w:rPr>
             <w:rStyle w:val="Hyperlink"/>
@@ -3726,9 +5406,9 @@
         <w:t xml:space="preserve">Key report use: evaluate whether the Peruvian CPUE product is suitable as a far-north abundance index, an assessment sensitivity, an OM-conditioning input, or a diagnostic series.</w:t>
       </w:r>
     </w:p>
-    <w:bookmarkEnd w:id="52"/>
-    <w:bookmarkEnd w:id="53"/>
-    <w:bookmarkStart w:id="62" w:name="acoustic-indices-1"/>
+    <w:bookmarkEnd w:id="56"/>
+    <w:bookmarkEnd w:id="57"/>
+    <w:bookmarkStart w:id="66" w:name="acoustic-indices-1"/>
     <w:p>
       <w:pPr>
         <w:pStyle w:val="Heading2"/>
@@ -3737,7 +5417,7 @@
         <w:t xml:space="preserve">Acoustic Indices</w:t>
       </w:r>
     </w:p>
-    <w:bookmarkStart w:id="55" w:name="Xb04805d959d92db344062f23c1d5fc65220cd11"/>
+    <w:bookmarkStart w:id="59" w:name="Xb04805d959d92db344062f23c1d5fc65220cd11"/>
     <w:p>
       <w:pPr>
         <w:pStyle w:val="Heading3"/>
@@ -3750,7 +5430,7 @@
       <w:pPr>
         <w:pStyle w:val="FirstParagraph"/>
       </w:pPr>
-      <w:hyperlink r:id="rId54">
+      <w:hyperlink r:id="rId58">
         <w:r>
           <w:rPr>
             <w:rStyle w:val="Hyperlink"/>
@@ -3773,8 +5453,8 @@
         <w:t xml:space="preserve">Key report use: evaluate acoustic index representativeness, uncertainty, spatial coverage, and suitability for assessment and OM use.</w:t>
       </w:r>
     </w:p>
-    <w:bookmarkEnd w:id="55"/>
-    <w:bookmarkStart w:id="57" w:name="fishery-dependent-acoustics"/>
+    <w:bookmarkEnd w:id="59"/>
+    <w:bookmarkStart w:id="61" w:name="fishery-dependent-acoustics"/>
     <w:p>
       <w:pPr>
         <w:pStyle w:val="Heading3"/>
@@ -3787,7 +5467,7 @@
       <w:pPr>
         <w:pStyle w:val="FirstParagraph"/>
       </w:pPr>
-      <w:hyperlink r:id="rId56">
+      <w:hyperlink r:id="rId60">
         <w:r>
           <w:rPr>
             <w:rStyle w:val="Hyperlink"/>
@@ -3810,8 +5490,8 @@
         <w:t xml:space="preserve">Key report use: decide whether fishery-dependent acoustic products provide a usable abundance signal or primarily diagnostic/context information.</w:t>
       </w:r>
     </w:p>
-    <w:bookmarkEnd w:id="57"/>
-    <w:bookmarkStart w:id="59" w:name="X8dcc86fd1c77a21ecd4bd2be0d11cc79550cb59"/>
+    <w:bookmarkEnd w:id="61"/>
+    <w:bookmarkStart w:id="63" w:name="X8dcc86fd1c77a21ecd4bd2be0d11cc79550cb59"/>
     <w:p>
       <w:pPr>
         <w:pStyle w:val="Heading3"/>
@@ -3824,7 +5504,7 @@
       <w:pPr>
         <w:pStyle w:val="FirstParagraph"/>
       </w:pPr>
-      <w:hyperlink r:id="rId58">
+      <w:hyperlink r:id="rId62">
         <w:r>
           <w:rPr>
             <w:rStyle w:val="Hyperlink"/>
@@ -3859,8 +5539,8 @@
         <w:t xml:space="preserve">Key report use: compare with Doc06 and other acoustic products to determine whether indices are complementary, redundant, or conflicting.</w:t>
       </w:r>
     </w:p>
-    <w:bookmarkEnd w:id="59"/>
-    <w:bookmarkStart w:id="61" w:name="peru-acoustic-index-considerations"/>
+    <w:bookmarkEnd w:id="63"/>
+    <w:bookmarkStart w:id="65" w:name="peru-acoustic-index-considerations"/>
     <w:p>
       <w:pPr>
         <w:pStyle w:val="Heading3"/>
@@ -3873,7 +5553,7 @@
       <w:pPr>
         <w:pStyle w:val="FirstParagraph"/>
       </w:pPr>
-      <w:hyperlink r:id="rId60">
+      <w:hyperlink r:id="rId64">
         <w:r>
           <w:rPr>
             <w:rStyle w:val="Hyperlink"/>
@@ -3896,9 +5576,9 @@
         <w:t xml:space="preserve">Key report use: classify the Peru acoustic information as a candidate index, supporting interpretation, or diagnostic evidence, depending on data extent, uncertainty, and assessment compatibility.</w:t>
       </w:r>
     </w:p>
-    <w:bookmarkEnd w:id="61"/>
-    <w:bookmarkEnd w:id="62"/>
-    <w:bookmarkStart w:id="69" w:name="biology-and-composition-inputs"/>
+    <w:bookmarkEnd w:id="65"/>
+    <w:bookmarkEnd w:id="66"/>
+    <w:bookmarkStart w:id="73" w:name="biology-and-composition-inputs"/>
     <w:p>
       <w:pPr>
         <w:pStyle w:val="Heading2"/>
@@ -3907,7 +5587,7 @@
         <w:t xml:space="preserve">Biology and Composition Inputs</w:t>
       </w:r>
     </w:p>
-    <w:bookmarkStart w:id="64" w:name="biology"/>
+    <w:bookmarkStart w:id="68" w:name="biology"/>
     <w:p>
       <w:pPr>
         <w:pStyle w:val="Heading3"/>
@@ -3920,7 +5600,7 @@
       <w:pPr>
         <w:pStyle w:val="FirstParagraph"/>
       </w:pPr>
-      <w:hyperlink r:id="rId63">
+      <w:hyperlink r:id="rId67">
         <w:r>
           <w:rPr>
             <w:rStyle w:val="Hyperlink"/>
@@ -3943,8 +5623,8 @@
         <w:t xml:space="preserve">Key report use: document accepted biological assumptions and identify sensitivity tests that should be carried into assessment or OM conditioning.</w:t>
       </w:r>
     </w:p>
-    <w:bookmarkEnd w:id="64"/>
-    <w:bookmarkStart w:id="66" w:name="peru-length-weight-relationship"/>
+    <w:bookmarkEnd w:id="68"/>
+    <w:bookmarkStart w:id="70" w:name="peru-length-weight-relationship"/>
     <w:p>
       <w:pPr>
         <w:pStyle w:val="Heading3"/>
@@ -3957,7 +5637,7 @@
       <w:pPr>
         <w:pStyle w:val="FirstParagraph"/>
       </w:pPr>
-      <w:hyperlink r:id="rId65">
+      <w:hyperlink r:id="rId69">
         <w:r>
           <w:rPr>
             <w:rStyle w:val="Hyperlink"/>
@@ -3980,8 +5660,8 @@
         <w:t xml:space="preserve">Key report use: evaluate whether Peru-specific length-weight information affects biomass conversion, biological assumptions, or regional differences in assessment inputs.</w:t>
       </w:r>
     </w:p>
-    <w:bookmarkEnd w:id="66"/>
-    <w:bookmarkStart w:id="68" w:name="peru-length-frequency-update"/>
+    <w:bookmarkEnd w:id="70"/>
+    <w:bookmarkStart w:id="72" w:name="peru-length-frequency-update"/>
     <w:p>
       <w:pPr>
         <w:pStyle w:val="Heading3"/>
@@ -3994,7 +5674,7 @@
       <w:pPr>
         <w:pStyle w:val="FirstParagraph"/>
       </w:pPr>
-      <w:hyperlink r:id="rId67">
+      <w:hyperlink r:id="rId71">
         <w:r>
           <w:rPr>
             <w:rStyle w:val="Hyperlink"/>
@@ -4017,9 +5697,9 @@
         <w:t xml:space="preserve">Key report use: document the composition-data evidence available for the far-north stock and decide how it should be used in assessment and stock-structure discussions.</w:t>
       </w:r>
     </w:p>
-    <w:bookmarkEnd w:id="68"/>
-    <w:bookmarkEnd w:id="69"/>
-    <w:bookmarkStart w:id="72" w:name="data-quality-and-supporting-evidence"/>
+    <w:bookmarkEnd w:id="72"/>
+    <w:bookmarkEnd w:id="73"/>
+    <w:bookmarkStart w:id="76" w:name="data-quality-and-supporting-evidence"/>
     <w:p>
       <w:pPr>
         <w:pStyle w:val="Heading2"/>
@@ -4028,7 +5708,7 @@
         <w:t xml:space="preserve">Data Quality and Supporting Evidence</w:t>
       </w:r>
     </w:p>
-    <w:bookmarkStart w:id="71" w:name="catchfishery-data-quality-checks"/>
+    <w:bookmarkStart w:id="75" w:name="catchfishery-data-quality-checks"/>
     <w:p>
       <w:pPr>
         <w:pStyle w:val="Heading3"/>
@@ -4041,7 +5721,7 @@
       <w:pPr>
         <w:pStyle w:val="FirstParagraph"/>
       </w:pPr>
-      <w:hyperlink r:id="rId70">
+      <w:hyperlink r:id="rId74">
         <w:r>
           <w:rPr>
             <w:rStyle w:val="Hyperlink"/>
@@ -4064,10 +5744,10 @@
         <w:t xml:space="preserve">Key report use: use as a support screen for catch- and fishery-dependent indices, and document any data-quality issues that affect benchmark decisions.</w:t>
       </w:r>
     </w:p>
-    <w:bookmarkEnd w:id="71"/>
-    <w:bookmarkEnd w:id="72"/>
-    <w:bookmarkEnd w:id="73"/>
-    <w:bookmarkStart w:id="82" w:name="appendix-d.-day-1-presentations"/>
+    <w:bookmarkEnd w:id="75"/>
+    <w:bookmarkEnd w:id="76"/>
+    <w:bookmarkEnd w:id="77"/>
+    <w:bookmarkStart w:id="86" w:name="appendix-d.-day-1-presentations"/>
     <w:p>
       <w:pPr>
         <w:pStyle w:val="Heading1"/>
@@ -4165,7 +5845,7 @@
             <w:pPr>
               <w:pStyle w:val="Compact"/>
             </w:pPr>
-            <w:hyperlink r:id="rId74">
+            <w:hyperlink r:id="rId78">
               <w:r>
                 <w:rPr>
                   <w:rStyle w:val="Hyperlink"/>
@@ -4216,7 +5896,7 @@
             <w:pPr>
               <w:pStyle w:val="Compact"/>
             </w:pPr>
-            <w:hyperlink r:id="rId75">
+            <w:hyperlink r:id="rId79">
               <w:r>
                 <w:rPr>
                   <w:rStyle w:val="Hyperlink"/>
@@ -4267,7 +5947,7 @@
             <w:pPr>
               <w:pStyle w:val="Compact"/>
             </w:pPr>
-            <w:hyperlink r:id="rId76">
+            <w:hyperlink r:id="rId80">
               <w:r>
                 <w:rPr>
                   <w:rStyle w:val="Hyperlink"/>
@@ -4318,7 +5998,7 @@
             <w:pPr>
               <w:pStyle w:val="Compact"/>
             </w:pPr>
-            <w:hyperlink r:id="rId77">
+            <w:hyperlink r:id="rId81">
               <w:r>
                 <w:rPr>
                   <w:rStyle w:val="Hyperlink"/>
@@ -4346,7 +6026,7 @@
             <w:pPr>
               <w:pStyle w:val="Compact"/>
             </w:pPr>
-            <w:hyperlink r:id="rId58">
+            <w:hyperlink r:id="rId62">
               <w:r>
                 <w:rPr>
                   <w:rStyle w:val="Hyperlink"/>
@@ -4386,7 +6066,7 @@
             <w:pPr>
               <w:pStyle w:val="Compact"/>
             </w:pPr>
-            <w:hyperlink r:id="rId78">
+            <w:hyperlink r:id="rId82">
               <w:r>
                 <w:rPr>
                   <w:rStyle w:val="Hyperlink"/>
@@ -4402,7 +6082,7 @@
             <w:pPr>
               <w:pStyle w:val="Compact"/>
             </w:pPr>
-            <w:hyperlink r:id="rId54">
+            <w:hyperlink r:id="rId58">
               <w:r>
                 <w:rPr>
                   <w:rStyle w:val="Hyperlink"/>
@@ -4442,7 +6122,7 @@
             <w:pPr>
               <w:pStyle w:val="Compact"/>
             </w:pPr>
-            <w:hyperlink r:id="rId79">
+            <w:hyperlink r:id="rId83">
               <w:r>
                 <w:rPr>
                   <w:rStyle w:val="Hyperlink"/>
@@ -4458,7 +6138,7 @@
             <w:pPr>
               <w:pStyle w:val="Compact"/>
             </w:pPr>
-            <w:hyperlink r:id="rId56">
+            <w:hyperlink r:id="rId60">
               <w:r>
                 <w:rPr>
                   <w:rStyle w:val="Hyperlink"/>
@@ -4498,7 +6178,7 @@
             <w:pPr>
               <w:pStyle w:val="Compact"/>
             </w:pPr>
-            <w:hyperlink r:id="rId80">
+            <w:hyperlink r:id="rId84">
               <w:r>
                 <w:rPr>
                   <w:rStyle w:val="Hyperlink"/>
@@ -4514,7 +6194,7 @@
             <w:pPr>
               <w:pStyle w:val="Compact"/>
             </w:pPr>
-            <w:hyperlink r:id="rId60">
+            <w:hyperlink r:id="rId64">
               <w:r>
                 <w:rPr>
                   <w:rStyle w:val="Hyperlink"/>
@@ -4554,7 +6234,7 @@
             <w:pPr>
               <w:pStyle w:val="Compact"/>
             </w:pPr>
-            <w:hyperlink r:id="rId81">
+            <w:hyperlink r:id="rId85">
               <w:r>
                 <w:rPr>
                   <w:rStyle w:val="Hyperlink"/>
@@ -4742,7 +6422,7 @@
         </w:tc>
       </w:tr>
     </w:tbl>
-    <w:bookmarkEnd w:id="82"/>
+    <w:bookmarkEnd w:id="86"/>
     <w:sectPr>
       <w:footnotePr>
         <w:numRestart w:val="eachSect"/>

</xml_diff>

<commit_message>
Add Peru fishing-vessel acoustics presentation
</commit_message>
<xml_diff>
--- a/docs/JMWG-Benchmark-Meeting-report-2026.docx
+++ b/docs/JMWG-Benchmark-Meeting-report-2026.docx
@@ -559,7 +559,7 @@
         <w:pStyle w:val="FirstParagraph"/>
       </w:pPr>
       <w:r>
-        <w:t xml:space="preserve">The Day 1 acoustic session combined formal SCW16 working papers with presentation-only material. The presentations covered the history of the north-central Chile acoustic survey programme, preliminary 2026 survey results, oceanographic conditions during the 2026 survey, spatio-temporal standardization of acoustic backscatter, fishery-dependent acoustic information, Peruvian acoustic assessment information, and sonar applications relevant to jack mackerel and anchoveta fisheries.</w:t>
+        <w:t xml:space="preserve">The Day 1 acoustic session combined formal SCW16 working papers with presentation-only material. The presentations covered the history of the north-central Chile acoustic survey programme, preliminary 2026 survey results, oceanographic conditions during the 2026 survey, spatio-temporal standardization of acoustic backscatter, fishery-dependent acoustic information, Peruvian acoustic assessment information, sonar applications relevant to jack mackerel and anchoveta fisheries, and acoustic information collected by fishing vessels in Peru.</w:t>
       </w:r>
     </w:p>
     <w:p>
@@ -2926,6 +2926,18 @@
         </w:numPr>
       </w:pPr>
       <w:r>
+        <w:t xml:space="preserve">Use of acoustic data collected by fishing vessels for estimating abundance/biomass in Peru.</w:t>
+      </w:r>
+    </w:p>
+    <w:p>
+      <w:pPr>
+        <w:pStyle w:val="Compact"/>
+        <w:numPr>
+          <w:ilvl w:val="0"/>
+          <w:numId w:val="1005"/>
+        </w:numPr>
+      </w:pPr>
+      <w:r>
         <w:t xml:space="preserve">Echogram examination and validation.</w:t>
       </w:r>
     </w:p>
@@ -5747,7 +5759,7 @@
     <w:bookmarkEnd w:id="75"/>
     <w:bookmarkEnd w:id="76"/>
     <w:bookmarkEnd w:id="77"/>
-    <w:bookmarkStart w:id="86" w:name="appendix-d.-day-1-presentations"/>
+    <w:bookmarkStart w:id="87" w:name="appendix-d.-day-1-presentations"/>
     <w:p>
       <w:pPr>
         <w:pStyle w:val="Heading1"/>
@@ -6278,6 +6290,57 @@
           </w:p>
         </w:tc>
       </w:tr>
+      <w:tr>
+        <w:tc>
+          <w:tcPr/>
+          <w:p>
+            <w:pPr>
+              <w:pStyle w:val="Compact"/>
+            </w:pPr>
+            <w:hyperlink r:id="rId86">
+              <w:r>
+                <w:rPr>
+                  <w:rStyle w:val="Hyperlink"/>
+                </w:rPr>
+                <w:t xml:space="preserve">Acoustic data collected by fishing vessels in Peru</w:t>
+              </w:r>
+            </w:hyperlink>
+          </w:p>
+        </w:tc>
+        <w:tc>
+          <w:tcPr/>
+          <w:p>
+            <w:pPr>
+              <w:pStyle w:val="Compact"/>
+            </w:pPr>
+            <w:r>
+              <w:t xml:space="preserve">Presentation only</w:t>
+            </w:r>
+          </w:p>
+        </w:tc>
+        <w:tc>
+          <w:tcPr/>
+          <w:p>
+            <w:pPr>
+              <w:pStyle w:val="Compact"/>
+            </w:pPr>
+            <w:r>
+              <w:t xml:space="preserve">Use of fishing-vessel acoustic data for estimating abundance or biomass of anchovy and Chilean jack mackerel in Peru.</w:t>
+            </w:r>
+          </w:p>
+        </w:tc>
+        <w:tc>
+          <w:tcPr/>
+          <w:p>
+            <w:pPr>
+              <w:pStyle w:val="Compact"/>
+            </w:pPr>
+            <w:r>
+              <w:t xml:space="preserve">Context / supporting methods</w:t>
+            </w:r>
+          </w:p>
+        </w:tc>
+      </w:tr>
     </w:tbl>
     <w:p>
       <w:pPr>
@@ -6422,7 +6485,7 @@
         </w:tc>
       </w:tr>
     </w:tbl>
-    <w:bookmarkEnd w:id="86"/>
+    <w:bookmarkEnd w:id="87"/>
     <w:sectPr>
       <w:footnotePr>
         <w:numRestart w:val="eachSect"/>

</xml_diff>

<commit_message>
Add Day 2 CPUE notes to benchmark report
</commit_message>
<xml_diff>
--- a/docs/JMWG-Benchmark-Meeting-report-2026.docx
+++ b/docs/JMWG-Benchmark-Meeting-report-2026.docx
@@ -536,7 +536,7 @@
       </w:r>
     </w:p>
     <w:bookmarkEnd w:id="18"/>
-    <w:bookmarkStart w:id="28" w:name="key-discussion-summary"/>
+    <w:bookmarkStart w:id="31" w:name="key-discussion-summary"/>
     <w:p>
       <w:pPr>
         <w:pStyle w:val="Heading1"/>
@@ -1901,7 +1901,7 @@
     </w:tbl>
     <w:bookmarkEnd w:id="22"/>
     <w:bookmarkEnd w:id="23"/>
-    <w:bookmarkStart w:id="24" w:name="cpue-indices"/>
+    <w:bookmarkStart w:id="27" w:name="cpue-indices"/>
     <w:p>
       <w:pPr>
         <w:pStyle w:val="Heading2"/>
@@ -1915,11 +1915,1309 @@
         <w:pStyle w:val="FirstParagraph"/>
       </w:pPr>
       <w:r>
-        <w:t xml:space="preserve">Text to be added during the meeting. This section should summarize the CPUE coordination discussion, historical CPUE synthesis, effort-creep treatment, spatio-temporal CPUE alternatives, Peruvian CPUE standardization, index-weighting questions, and whether separate or combined CPUE products should be carried forward.</w:t>
-      </w:r>
-    </w:p>
-    <w:bookmarkEnd w:id="24"/>
-    <w:bookmarkStart w:id="25" w:name="biological-inputs"/>
+        <w:t xml:space="preserve">The Day 2 CPUE session reviewed catch and fishery data quality checks, Chilean</w:t>
+      </w:r>
+      <w:r>
+        <w:t xml:space="preserve"> </w:t>
+      </w:r>
+      <w:r>
+        <w:t xml:space="preserve">effort-creep correction, spatio-temporal Chilean CPUE standardization using</w:t>
+      </w:r>
+      <w:r>
+        <w:t xml:space="preserve"> </w:t>
+      </w:r>
+      <w:r>
+        <w:rPr>
+          <w:rStyle w:val="VerbatimChar"/>
+        </w:rPr>
+        <w:t xml:space="preserve">sdmTMB</w:t>
+      </w:r>
+      <w:r>
+        <w:t xml:space="preserve"> </w:t>
+      </w:r>
+      <w:r>
+        <w:t xml:space="preserve">and INLA-based approaches, Peruvian CPUE standardization, and offshore</w:t>
+      </w:r>
+      <w:r>
+        <w:t xml:space="preserve"> </w:t>
+      </w:r>
+      <w:r>
+        <w:t xml:space="preserve">CPUE treatment. The discussion focused on whether candidate CPUE products are</w:t>
+      </w:r>
+      <w:r>
+        <w:t xml:space="preserve"> </w:t>
+      </w:r>
+      <w:r>
+        <w:t xml:space="preserve">ready for assessment use, what additional diagnostics are needed, and how to</w:t>
+      </w:r>
+      <w:r>
+        <w:t xml:space="preserve"> </w:t>
+      </w:r>
+      <w:r>
+        <w:t xml:space="preserve">document any change from the current assessment CPUE treatment.</w:t>
+      </w:r>
+    </w:p>
+    <w:tbl>
+      <w:tblPr>
+        <w:tblStyle w:val="Table"/>
+        <w:tblLook w:firstRow="0" w:lastRow="0" w:firstColumn="0" w:lastColumn="0" w:noHBand="0" w:noVBand="0" w:val="0000"/>
+        <w:tblBorders>
+          <w:top w:val="single" w:sz="4" w:space="0" w:color="0758E5"/>
+          <w:left w:val="single" w:sz="24" w:space="0" w:color="0758E5"/>
+          <w:bottom w:val="single" w:sz="4" w:space="0" w:color="0758E5"/>
+          <w:right w:val="single" w:sz="4" w:space="0" w:color="0758E5"/>
+        </w:tblBorders>
+        <w:tblCellMar>
+          <w:left w:w="144" w:type="dxa"/>
+          <w:right w:w="144" w:type="dxa"/>
+        </w:tblCellMar>
+        <w:tblLook w:firstRow="0" w:lastRow="0" w:firstColumn="0" w:lastColumn="0" w:noHBand="0" w:noVBand="0" w:val="0000"/>
+      </w:tblPr>
+      <w:tr>
+        <w:trPr>
+          <w:cantSplit/>
+        </w:trPr>
+        <w:tc>
+          <w:tcPr>
+            <w:shd w:color="auto" w:fill="dae6fb" w:val="clear"/>
+            <w:tcMar>
+              <w:top w:w="92" w:type="dxa"/>
+              <w:bottom w:w="92" w:type="dxa"/>
+            </w:tcMar>
+          </w:tcPr>
+          <w:p>
+            <w:pPr>
+              <w:pStyle w:val="BodyText"/>
+            </w:pPr>
+            <w:pPr>
+              <w:spacing w:before="0" w:after="0"/>
+              <w:textAlignment w:val="center"/>
+            </w:pPr>
+            <w:r>
+              <w:drawing>
+                <wp:inline>
+                  <wp:extent cx="152400" cy="152400"/>
+                  <wp:effectExtent b="0" l="0" r="0" t="0"/>
+                  <wp:docPr descr="" title="" id="24" name="Picture"/>
+                  <a:graphic>
+                    <a:graphicData uri="http://schemas.openxmlformats.org/drawingml/2006/picture">
+                      <pic:pic>
+                        <pic:nvPicPr>
+                          <pic:cNvPr descr="/Applications/quarto/share/formats/docx/note.png" id="25" name="Picture"/>
+                          <pic:cNvPicPr>
+                            <a:picLocks noChangeArrowheads="1" noChangeAspect="1"/>
+                          </pic:cNvPicPr>
+                        </pic:nvPicPr>
+                        <pic:blipFill>
+                          <a:blip r:embed="rId19"/>
+                          <a:stretch>
+                            <a:fillRect/>
+                          </a:stretch>
+                        </pic:blipFill>
+                        <pic:spPr bwMode="auto">
+                          <a:xfrm>
+                            <a:off x="0" y="0"/>
+                            <a:ext cx="152400" cy="152400"/>
+                          </a:xfrm>
+                          <a:prstGeom prst="rect">
+                            <a:avLst/>
+                          </a:prstGeom>
+                          <a:noFill/>
+                          <a:ln w="9525">
+                            <a:noFill/>
+                            <a:headEnd/>
+                            <a:tailEnd/>
+                          </a:ln>
+                        </pic:spPr>
+                      </pic:pic>
+                    </a:graphicData>
+                  </a:graphic>
+                </wp:inline>
+              </w:drawing>
+            </w:r>
+            <w:r>
+              <w:t xml:space="preserve"> </w:t>
+            </w:r>
+            <w:r>
+              <w:t xml:space="preserve"> </w:t>
+            </w:r>
+            <w:r>
+              <w:t xml:space="preserve">New draft material: Day 2 CPUE session summary</w:t>
+            </w:r>
+          </w:p>
+        </w:tc>
+      </w:tr>
+      <w:tr>
+        <w:trPr>
+          <w:cantSplit/>
+        </w:trPr>
+        <w:tc>
+          <w:tcPr>
+            <w:tcMar>
+              <w:top w:w="108" w:type="dxa"/>
+              <w:bottom w:w="108" w:type="dxa"/>
+            </w:tcMar>
+          </w:tcPr>
+          <w:p>
+            <w:pPr>
+              <w:pStyle w:val="BodyText"/>
+            </w:pPr>
+            <w:pPr>
+              <w:spacing w:before="16"/>
+            </w:pPr>
+            <w:r>
+              <w:t xml:space="preserve">The catch and fishery data quality-check presentation emphasized that the JMWG</w:t>
+            </w:r>
+            <w:r>
+              <w:t xml:space="preserve"> </w:t>
+            </w:r>
+            <w:r>
+              <w:t xml:space="preserve">has historically worked under a compressed assessment-data schedule. Members</w:t>
+            </w:r>
+            <w:r>
+              <w:t xml:space="preserve"> </w:t>
+            </w:r>
+            <w:r>
+              <w:t xml:space="preserve">noted that the current data-submission templates and associated processing</w:t>
+            </w:r>
+            <w:r>
+              <w:t xml:space="preserve"> </w:t>
+            </w:r>
+            <w:r>
+              <w:t xml:space="preserve">routines are pragmatic tools for meeting that schedule, and that development of</w:t>
+            </w:r>
+            <w:r>
+              <w:t xml:space="preserve"> </w:t>
+            </w:r>
+            <w:r>
+              <w:t xml:space="preserve">Secretariat database infrastructure would not by itself resolve the immediate</w:t>
+            </w:r>
+            <w:r>
+              <w:t xml:space="preserve"> </w:t>
+            </w:r>
+            <w:r>
+              <w:t xml:space="preserve">benchmark needs. The meeting requested that the quality-check work be posted to</w:t>
+            </w:r>
+            <w:r>
+              <w:t xml:space="preserve"> </w:t>
+            </w:r>
+            <w:r>
+              <w:t xml:space="preserve">the</w:t>
+            </w:r>
+            <w:r>
+              <w:t xml:space="preserve"> </w:t>
+            </w:r>
+            <w:r>
+              <w:rPr>
+                <w:rStyle w:val="VerbatimChar"/>
+              </w:rPr>
+              <w:t xml:space="preserve">jjmData</w:t>
+            </w:r>
+            <w:r>
+              <w:t xml:space="preserve"> </w:t>
+            </w:r>
+            <w:r>
+              <w:t xml:space="preserve">GitHub repository, and that the group clarify how members use terms</w:t>
+            </w:r>
+            <w:r>
+              <w:t xml:space="preserve"> </w:t>
+            </w:r>
+            <w:r>
+              <w:t xml:space="preserve">such as sampling, coverage, and sample size. In particular, the meeting requested</w:t>
+            </w:r>
+            <w:r>
+              <w:t xml:space="preserve"> </w:t>
+            </w:r>
+            <w:r>
+              <w:t xml:space="preserve">checks on the age-length-key sample-size reporting to identify discrepancies</w:t>
+            </w:r>
+            <w:r>
+              <w:t xml:space="preserve"> </w:t>
+            </w:r>
+            <w:r>
+              <w:t xml:space="preserve">between reported numbers of ages and numbers of length measurements.</w:t>
+            </w:r>
+          </w:p>
+          <w:p>
+            <w:pPr>
+              <w:pStyle w:val="BodyText"/>
+            </w:pPr>
+            <w:r>
+              <w:t xml:space="preserve">The Chilean effort-creep presentation showed that the number of active</w:t>
+            </w:r>
+            <w:r>
+              <w:t xml:space="preserve"> </w:t>
+            </w:r>
+            <w:r>
+              <w:t xml:space="preserve">industrial vessels has declined while average hold capacity has increased over</w:t>
+            </w:r>
+            <w:r>
+              <w:t xml:space="preserve"> </w:t>
+            </w:r>
+            <w:r>
+              <w:t xml:space="preserve">time. Participants discussed whether applying the creep factor as an effort</w:t>
+            </w:r>
+            <w:r>
+              <w:t xml:space="preserve"> </w:t>
+            </w:r>
+            <w:r>
+              <w:t xml:space="preserve">correction is equivalent to imposing a catchability change, and whether the</w:t>
+            </w:r>
+            <w:r>
+              <w:t xml:space="preserve"> </w:t>
+            </w:r>
+            <w:r>
+              <w:t xml:space="preserve">survey/interview information used to estimate creep can be maintained regularly.</w:t>
+            </w:r>
+            <w:r>
+              <w:t xml:space="preserve"> </w:t>
+            </w:r>
+            <w:r>
+              <w:t xml:space="preserve">The meeting also noted that the artisanal fleet now accounts for a larger share</w:t>
+            </w:r>
+            <w:r>
+              <w:t xml:space="preserve"> </w:t>
+            </w:r>
+            <w:r>
+              <w:t xml:space="preserve">of Chilean catch and may need to be considered in future effort-creep work. As a</w:t>
+            </w:r>
+            <w:r>
+              <w:t xml:space="preserve"> </w:t>
+            </w:r>
+            <w:r>
+              <w:t xml:space="preserve">diagnostic, the meeting requested a model run with no creep correction but with a</w:t>
+            </w:r>
+            <w:r>
+              <w:t xml:space="preserve"> </w:t>
+            </w:r>
+            <w:r>
+              <w:t xml:space="preserve">catchability step change in 2005, to evaluate whether the assessment estimates a</w:t>
+            </w:r>
+            <w:r>
+              <w:t xml:space="preserve"> </w:t>
+            </w:r>
+            <w:r>
+              <w:t xml:space="preserve">large catchability shift without imposing the creep correction directly.</w:t>
+            </w:r>
+          </w:p>
+          <w:p>
+            <w:pPr>
+              <w:pStyle w:val="BodyText"/>
+            </w:pPr>
+            <w:r>
+              <w:t xml:space="preserve">For the Chilean</w:t>
+            </w:r>
+            <w:r>
+              <w:t xml:space="preserve"> </w:t>
+            </w:r>
+            <w:r>
+              <w:rPr>
+                <w:rStyle w:val="VerbatimChar"/>
+              </w:rPr>
+              <w:t xml:space="preserve">sdmTMB</w:t>
+            </w:r>
+            <w:r>
+              <w:t xml:space="preserve"> </w:t>
+            </w:r>
+            <w:r>
+              <w:t xml:space="preserve">CPUE analysis, the meeting noted that the index was</w:t>
+            </w:r>
+            <w:r>
+              <w:t xml:space="preserve"> </w:t>
+            </w:r>
+            <w:r>
+              <w:t xml:space="preserve">updated through 2026 and is based on set-level data. Discussion focused on haul</w:t>
+            </w:r>
+            <w:r>
+              <w:t xml:space="preserve"> </w:t>
+            </w:r>
+            <w:r>
+              <w:t xml:space="preserve">capacity treatment, the use of a spline smoother versus vessel categories, the</w:t>
+            </w:r>
+            <w:r>
+              <w:t xml:space="preserve"> </w:t>
+            </w:r>
+            <w:r>
+              <w:t xml:space="preserve">large imbalance in early-year data coverage, and whether true zero catches are</w:t>
+            </w:r>
+            <w:r>
+              <w:t xml:space="preserve"> </w:t>
+            </w:r>
+            <w:r>
+              <w:t xml:space="preserve">available and should be incorporated. Participants noted that the early part of</w:t>
+            </w:r>
+            <w:r>
+              <w:t xml:space="preserve"> </w:t>
+            </w:r>
+            <w:r>
+              <w:t xml:space="preserve">the set-level data may represent a very small fraction of total catch, raising</w:t>
+            </w:r>
+            <w:r>
+              <w:t xml:space="preserve"> </w:t>
+            </w:r>
+            <w:r>
+              <w:t xml:space="preserve">questions about representativeness before about 2005. The meeting requested that</w:t>
+            </w:r>
+            <w:r>
+              <w:t xml:space="preserve"> </w:t>
+            </w:r>
+            <w:r>
+              <w:t xml:space="preserve">the data table include the number and proportion of sets by year, and that the</w:t>
+            </w:r>
+            <w:r>
+              <w:t xml:space="preserve"> </w:t>
+            </w:r>
+            <w:r>
+              <w:t xml:space="preserve">authors provide a clear explanation for why the new set-based CPUE series gives</w:t>
+            </w:r>
+            <w:r>
+              <w:t xml:space="preserve"> </w:t>
+            </w:r>
+            <w:r>
+              <w:t xml:space="preserve">lower CPUE in earlier years with high catches than the current trip-based</w:t>
+            </w:r>
+            <w:r>
+              <w:t xml:space="preserve"> </w:t>
+            </w:r>
+            <w:r>
+              <w:t xml:space="preserve">assessment series.</w:t>
+            </w:r>
+          </w:p>
+          <w:p>
+            <w:pPr>
+              <w:pStyle w:val="BodyText"/>
+            </w:pPr>
+            <w:r>
+              <w:t xml:space="preserve">The INLA-based Chilean CPUE analysis provided a complementary spatio-temporal</w:t>
+            </w:r>
+            <w:r>
+              <w:t xml:space="preserve"> </w:t>
+            </w:r>
+            <w:r>
+              <w:t xml:space="preserve">standardization. Participants discussed mesh resolution, the treatment of</w:t>
+            </w:r>
+            <w:r>
+              <w:t xml:space="preserve"> </w:t>
+            </w:r>
+            <w:r>
+              <w:t xml:space="preserve">northern fishing activity, whether assessment fleets should be defined primarily</w:t>
+            </w:r>
+            <w:r>
+              <w:t xml:space="preserve"> </w:t>
+            </w:r>
+            <w:r>
+              <w:t xml:space="preserve">by area or vessel behaviour, and whether CPUE weighting should be based on catch</w:t>
+            </w:r>
+            <w:r>
+              <w:t xml:space="preserve"> </w:t>
+            </w:r>
+            <w:r>
+              <w:t xml:space="preserve">rates rather than catch. The meeting noted that the model appeared sensitive to</w:t>
+            </w:r>
+            <w:r>
+              <w:t xml:space="preserve"> </w:t>
+            </w:r>
+            <w:r>
+              <w:t xml:space="preserve">data updates, with inclusion of 2026 data changing earlier predictions, and that</w:t>
+            </w:r>
+            <w:r>
+              <w:t xml:space="preserve"> </w:t>
+            </w:r>
+            <w:r>
+              <w:t xml:space="preserve">this sensitivity needs to be explained before replacing the existing assessment</w:t>
+            </w:r>
+            <w:r>
+              <w:t xml:space="preserve"> </w:t>
+            </w:r>
+            <w:r>
+              <w:t xml:space="preserve">index. Participants also discussed fixed versus random year effects, AR(1)</w:t>
+            </w:r>
+            <w:r>
+              <w:t xml:space="preserve"> </w:t>
+            </w:r>
+            <w:r>
+              <w:t xml:space="preserve">versus independent year effects, and the interpretation of the days-at-sea or</w:t>
+            </w:r>
+            <w:r>
+              <w:t xml:space="preserve"> </w:t>
+            </w:r>
+            <w:r>
+              <w:t xml:space="preserve">DFP coefficient. Because offshore movement can increase days at sea without</w:t>
+            </w:r>
+            <w:r>
+              <w:t xml:space="preserve"> </w:t>
+            </w:r>
+            <w:r>
+              <w:t xml:space="preserve">necessarily indicating reduced abundance, the meeting requested that the strength</w:t>
+            </w:r>
+            <w:r>
+              <w:t xml:space="preserve"> </w:t>
+            </w:r>
+            <w:r>
+              <w:t xml:space="preserve">and interpretation of this coefficient be checked, and that Sebastian, Ignacio,</w:t>
+            </w:r>
+            <w:r>
+              <w:t xml:space="preserve"> </w:t>
+            </w:r>
+            <w:r>
+              <w:t xml:space="preserve">and Niels summarize the model-comparison and year-effect discussion for the</w:t>
+            </w:r>
+            <w:r>
+              <w:t xml:space="preserve"> </w:t>
+            </w:r>
+            <w:r>
+              <w:t xml:space="preserve">report.</w:t>
+            </w:r>
+          </w:p>
+          <w:p>
+            <w:pPr>
+              <w:pStyle w:val="BodyText"/>
+            </w:pPr>
+            <w:r>
+              <w:t xml:space="preserve">The meeting did not reach a final decision on replacing the current Chilean CPUE</w:t>
+            </w:r>
+            <w:r>
+              <w:t xml:space="preserve"> </w:t>
+            </w:r>
+            <w:r>
+              <w:t xml:space="preserve">series. The group needs a defensible explanation for any move from the current</w:t>
+            </w:r>
+            <w:r>
+              <w:t xml:space="preserve"> </w:t>
+            </w:r>
+            <w:r>
+              <w:t xml:space="preserve">trip-based index to a new spatio-temporal set-based index, including how early</w:t>
+            </w:r>
+            <w:r>
+              <w:t xml:space="preserve"> </w:t>
+            </w:r>
+            <w:r>
+              <w:t xml:space="preserve">low coverage, model sensitivity, year-effect treatment, northern fishing</w:t>
+            </w:r>
+            <w:r>
+              <w:t xml:space="preserve"> </w:t>
+            </w:r>
+            <w:r>
+              <w:t xml:space="preserve">activity, catchability, and annual standard errors would be handled in the stock</w:t>
+            </w:r>
+            <w:r>
+              <w:t xml:space="preserve"> </w:t>
+            </w:r>
+            <w:r>
+              <w:t xml:space="preserve">assessment. If a new Chilean CPUE product is carried forward, the assessment</w:t>
+            </w:r>
+            <w:r>
+              <w:t xml:space="preserve"> </w:t>
+            </w:r>
+            <w:r>
+              <w:t xml:space="preserve">model should use the annual uncertainty estimates from that analysis.</w:t>
+            </w:r>
+          </w:p>
+          <w:p>
+            <w:pPr>
+              <w:pStyle w:val="BodyText"/>
+            </w:pPr>
+            <w:r>
+              <w:t xml:space="preserve">The Peruvian CPUE presentation covered a standardized CPUE series for 2015-2025</w:t>
+            </w:r>
+            <w:r>
+              <w:t xml:space="preserve"> </w:t>
+            </w:r>
+            <w:r>
+              <w:t xml:space="preserve">that combines industrial and artisanal fleets. The meeting noted this combined</w:t>
+            </w:r>
+            <w:r>
+              <w:t xml:space="preserve"> </w:t>
+            </w:r>
+            <w:r>
+              <w:t xml:space="preserve">fleet treatment as a strength, but also discussed the interpretation of trip</w:t>
+            </w:r>
+            <w:r>
+              <w:t xml:space="preserve"> </w:t>
+            </w:r>
+            <w:r>
+              <w:t xml:space="preserve">locations, haul-capacity and distance-to-coast smoothers, possible differences</w:t>
+            </w:r>
+            <w:r>
+              <w:t xml:space="preserve"> </w:t>
+            </w:r>
+            <w:r>
+              <w:t xml:space="preserve">between industrial and artisanal fleet effects, and changes in Peruvian fishing</w:t>
+            </w:r>
+            <w:r>
+              <w:t xml:space="preserve"> </w:t>
+            </w:r>
+            <w:r>
+              <w:t xml:space="preserve">operations. Members noted that jack mackerel has been used for direct human</w:t>
+            </w:r>
+            <w:r>
+              <w:t xml:space="preserve"> </w:t>
+            </w:r>
+            <w:r>
+              <w:t xml:space="preserve">consumption in Peru since 2002, and that the artisanal fishery has accounted for</w:t>
+            </w:r>
+            <w:r>
+              <w:t xml:space="preserve"> </w:t>
+            </w:r>
+            <w:r>
+              <w:t xml:space="preserve">a larger share of the quota since 2019. The updated CPUE series does not yet</w:t>
+            </w:r>
+            <w:r>
+              <w:t xml:space="preserve"> </w:t>
+            </w:r>
+            <w:r>
+              <w:t xml:space="preserve">extend back far enough to evaluate the full historical period, and extension to</w:t>
+            </w:r>
+            <w:r>
+              <w:t xml:space="preserve"> </w:t>
+            </w:r>
+            <w:r>
+              <w:t xml:space="preserve">earlier years is expected later in 2026. The meeting therefore noted that the</w:t>
+            </w:r>
+            <w:r>
+              <w:t xml:space="preserve"> </w:t>
+            </w:r>
+            <w:r>
+              <w:t xml:space="preserve">benchmark cannot make a final decision on using the new Peru CPUE series for the</w:t>
+            </w:r>
+            <w:r>
+              <w:t xml:space="preserve"> </w:t>
+            </w:r>
+            <w:r>
+              <w:t xml:space="preserve">June 2026 MSE work, because the full time series will not be available for</w:t>
+            </w:r>
+            <w:r>
+              <w:t xml:space="preserve"> </w:t>
+            </w:r>
+            <w:r>
+              <w:t xml:space="preserve">evaluation until later. The meeting requested additional diagnostics, including</w:t>
+            </w:r>
+            <w:r>
+              <w:t xml:space="preserve"> </w:t>
+            </w:r>
+            <w:r>
+              <w:t xml:space="preserve">the smoother on the year interaction, before deciding whether and how the new</w:t>
+            </w:r>
+            <w:r>
+              <w:t xml:space="preserve"> </w:t>
+            </w:r>
+            <w:r>
+              <w:t xml:space="preserve">series could be linked with the older Peru CPUE and acoustic information.</w:t>
+            </w:r>
+          </w:p>
+          <w:p>
+            <w:pPr>
+              <w:pStyle w:val="BodyText"/>
+            </w:pPr>
+            <w:r>
+              <w:t xml:space="preserve">The offshore CPUE discussion included the treatment of a catchability break in</w:t>
+            </w:r>
+            <w:r>
+              <w:t xml:space="preserve"> </w:t>
+            </w:r>
+            <w:r>
+              <w:t xml:space="preserve">2021 associated with movement of the offshore fleet to the north, and discussion</w:t>
+            </w:r>
+            <w:r>
+              <w:t xml:space="preserve"> </w:t>
+            </w:r>
+            <w:r>
+              <w:t xml:space="preserve">of how El Nino effects were represented relative to annual effects. The report</w:t>
+            </w:r>
+            <w:r>
+              <w:t xml:space="preserve"> </w:t>
+            </w:r>
+            <w:r>
+              <w:t xml:space="preserve">should document the rationale for any offshore catchability break and whether</w:t>
+            </w:r>
+            <w:r>
+              <w:t xml:space="preserve"> </w:t>
+            </w:r>
+            <w:r>
+              <w:t xml:space="preserve">environmental effects are interpreted as catchability effects, availability</w:t>
+            </w:r>
+            <w:r>
+              <w:t xml:space="preserve"> </w:t>
+            </w:r>
+            <w:r>
+              <w:t xml:space="preserve">effects, or residual year effects.</w:t>
+            </w:r>
+          </w:p>
+          <w:bookmarkStart w:id="26" w:name="day-2-requests"/>
+          <w:p>
+            <w:pPr>
+              <w:pStyle w:val="Heading3"/>
+            </w:pPr>
+            <w:r>
+              <w:t xml:space="preserve">Day 2 Requests</w:t>
+            </w:r>
+          </w:p>
+          <w:p>
+            <w:pPr>
+              <w:pStyle w:val="FirstParagraph"/>
+            </w:pPr>
+            <w:r>
+              <w:t xml:space="preserve">The following requests were identified during the Day 2 CPUE and data-quality</w:t>
+            </w:r>
+            <w:r>
+              <w:t xml:space="preserve"> </w:t>
+            </w:r>
+            <w:r>
+              <w:t xml:space="preserve">session and should be tracked separately from general discussion notes.</w:t>
+            </w:r>
+          </w:p>
+          <w:tbl>
+            <w:tblPr>
+              <w:tblStyle w:val="Table"/>
+              <w:tblW w:type="pct" w:w="5000"/>
+              <w:tblLayout w:type="fixed"/>
+              <w:tblLook w:firstRow="1" w:lastRow="0" w:firstColumn="0" w:lastColumn="0" w:noHBand="0" w:noVBand="0" w:val="0020"/>
+            </w:tblPr>
+            <w:tblGrid>
+              <w:gridCol w:w="1980"/>
+              <w:gridCol w:w="1980"/>
+              <w:gridCol w:w="1980"/>
+              <w:gridCol w:w="1980"/>
+            </w:tblGrid>
+            <w:tr>
+              <w:trPr>
+                <w:tblHeader w:val="on"/>
+              </w:trPr>
+              <w:tc>
+                <w:tcPr/>
+                <w:p>
+                  <w:pPr>
+                    <w:pStyle w:val="Compact"/>
+                  </w:pPr>
+                  <w:r>
+                    <w:t xml:space="preserve">Request</w:t>
+                  </w:r>
+                </w:p>
+              </w:tc>
+              <w:tc>
+                <w:tcPr/>
+                <w:p>
+                  <w:pPr>
+                    <w:pStyle w:val="Compact"/>
+                  </w:pPr>
+                  <w:r>
+                    <w:t xml:space="preserve">Requested product</w:t>
+                  </w:r>
+                </w:p>
+              </w:tc>
+              <w:tc>
+                <w:tcPr/>
+                <w:p>
+                  <w:pPr>
+                    <w:pStyle w:val="Compact"/>
+                  </w:pPr>
+                  <w:r>
+                    <w:t xml:space="preserve">Lead / source</w:t>
+                  </w:r>
+                </w:p>
+              </w:tc>
+              <w:tc>
+                <w:tcPr/>
+                <w:p>
+                  <w:pPr>
+                    <w:pStyle w:val="Compact"/>
+                  </w:pPr>
+                  <w:r>
+                    <w:t xml:space="preserve">Purpose</w:t>
+                  </w:r>
+                </w:p>
+              </w:tc>
+            </w:tr>
+            <w:tr>
+              <w:tc>
+                <w:tcPr/>
+                <w:p>
+                  <w:pPr>
+                    <w:pStyle w:val="Compact"/>
+                  </w:pPr>
+                  <w:r>
+                    <w:t xml:space="preserve">Catch/fishery data workflow statement</w:t>
+                  </w:r>
+                </w:p>
+              </w:tc>
+              <w:tc>
+                <w:tcPr/>
+                <w:p>
+                  <w:pPr>
+                    <w:pStyle w:val="Compact"/>
+                  </w:pPr>
+                  <w:r>
+                    <w:t xml:space="preserve">Draft a paragraph explaining the JMWG’s compressed data schedule, the current template-based submission routine, and why database development alone will not resolve near-term benchmark data needs.</w:t>
+                  </w:r>
+                </w:p>
+              </w:tc>
+              <w:tc>
+                <w:tcPr/>
+                <w:p>
+                  <w:pPr>
+                    <w:pStyle w:val="Compact"/>
+                  </w:pPr>
+                  <w:r>
+                    <w:t xml:space="preserve">Data-quality subgroup / Chair / Secretariat</w:t>
+                  </w:r>
+                </w:p>
+              </w:tc>
+              <w:tc>
+                <w:tcPr/>
+                <w:p>
+                  <w:pPr>
+                    <w:pStyle w:val="Compact"/>
+                  </w:pPr>
+                  <w:r>
+                    <w:t xml:space="preserve">Document why the current workflow is used and what should be improved without disrupting immediate assessment preparation.</w:t>
+                  </w:r>
+                </w:p>
+              </w:tc>
+            </w:tr>
+            <w:tr>
+              <w:tc>
+                <w:tcPr/>
+                <w:p>
+                  <w:pPr>
+                    <w:pStyle w:val="Compact"/>
+                  </w:pPr>
+                  <w:r>
+                    <w:t xml:space="preserve">Post data-quality checks</w:t>
+                  </w:r>
+                </w:p>
+              </w:tc>
+              <w:tc>
+                <w:tcPr/>
+                <w:p>
+                  <w:pPr>
+                    <w:pStyle w:val="Compact"/>
+                  </w:pPr>
+                  <w:r>
+                    <w:t xml:space="preserve">Post the catch and fishery data quality-check material to the</w:t>
+                  </w:r>
+                  <w:r>
+                    <w:t xml:space="preserve"> </w:t>
+                  </w:r>
+                  <w:r>
+                    <w:rPr>
+                      <w:rStyle w:val="VerbatimChar"/>
+                    </w:rPr>
+                    <w:t xml:space="preserve">jjmData</w:t>
+                  </w:r>
+                  <w:r>
+                    <w:t xml:space="preserve"> </w:t>
+                  </w:r>
+                  <w:r>
+                    <w:t xml:space="preserve">GitHub repository.</w:t>
+                  </w:r>
+                </w:p>
+              </w:tc>
+              <w:tc>
+                <w:tcPr/>
+                <w:p>
+                  <w:pPr>
+                    <w:pStyle w:val="Compact"/>
+                  </w:pPr>
+                  <w:r>
+                    <w:t xml:space="preserve">Data-quality subgroup</w:t>
+                  </w:r>
+                </w:p>
+              </w:tc>
+              <w:tc>
+                <w:tcPr/>
+                <w:p>
+                  <w:pPr>
+                    <w:pStyle w:val="Compact"/>
+                  </w:pPr>
+                  <w:r>
+                    <w:t xml:space="preserve">Make diagnostics and checks visible to members working on assessment inputs.</w:t>
+                  </w:r>
+                </w:p>
+              </w:tc>
+            </w:tr>
+            <w:tr>
+              <w:tc>
+                <w:tcPr/>
+                <w:p>
+                  <w:pPr>
+                    <w:pStyle w:val="Compact"/>
+                  </w:pPr>
+                  <w:r>
+                    <w:t xml:space="preserve">Clarify sampling and ALK sample sizes</w:t>
+                  </w:r>
+                </w:p>
+              </w:tc>
+              <w:tc>
+                <w:tcPr/>
+                <w:p>
+                  <w:pPr>
+                    <w:pStyle w:val="Compact"/>
+                  </w:pPr>
+                  <w:r>
+                    <w:t xml:space="preserve">Investigate reported sample sizes in age-length-key and composition data, including discrepancies between numbers of ages and numbers of length measurements.</w:t>
+                  </w:r>
+                </w:p>
+              </w:tc>
+              <w:tc>
+                <w:tcPr/>
+                <w:p>
+                  <w:pPr>
+                    <w:pStyle w:val="Compact"/>
+                  </w:pPr>
+                  <w:r>
+                    <w:t xml:space="preserve">Data-quality subgroup / Members</w:t>
+                  </w:r>
+                </w:p>
+              </w:tc>
+              <w:tc>
+                <w:tcPr/>
+                <w:p>
+                  <w:pPr>
+                    <w:pStyle w:val="Compact"/>
+                  </w:pPr>
+                  <w:r>
+                    <w:t xml:space="preserve">Improve interpretation of sample size, coverage, and uncertainty in composition inputs.</w:t>
+                  </w:r>
+                </w:p>
+              </w:tc>
+            </w:tr>
+            <w:tr>
+              <w:tc>
+                <w:tcPr/>
+                <w:p>
+                  <w:pPr>
+                    <w:pStyle w:val="Compact"/>
+                  </w:pPr>
+                  <w:r>
+                    <w:t xml:space="preserve">Effort-creep diagnostic run</w:t>
+                  </w:r>
+                </w:p>
+              </w:tc>
+              <w:tc>
+                <w:tcPr/>
+                <w:p>
+                  <w:pPr>
+                    <w:pStyle w:val="Compact"/>
+                  </w:pPr>
+                  <w:r>
+                    <w:t xml:space="preserve">Run an assessment configuration with no creep correction but with a catchability step change in 2005.</w:t>
+                  </w:r>
+                </w:p>
+              </w:tc>
+              <w:tc>
+                <w:tcPr/>
+                <w:p>
+                  <w:pPr>
+                    <w:pStyle w:val="Compact"/>
+                  </w:pPr>
+                  <w:r>
+                    <w:t xml:space="preserve">Assessment subgroup / Chile CPUE contributors</w:t>
+                  </w:r>
+                </w:p>
+              </w:tc>
+              <w:tc>
+                <w:tcPr/>
+                <w:p>
+                  <w:pPr>
+                    <w:pStyle w:val="Compact"/>
+                  </w:pPr>
+                  <w:r>
+                    <w:t xml:space="preserve">Test whether the model estimates a large catchability shift without directly imposing the effort-creep correction.</w:t>
+                  </w:r>
+                </w:p>
+              </w:tc>
+            </w:tr>
+            <w:tr>
+              <w:tc>
+                <w:tcPr/>
+                <w:p>
+                  <w:pPr>
+                    <w:pStyle w:val="Compact"/>
+                  </w:pPr>
+                  <w:r>
+                    <w:t xml:space="preserve">Chile CPUE early-period explanation</w:t>
+                  </w:r>
+                </w:p>
+              </w:tc>
+              <w:tc>
+                <w:tcPr/>
+                <w:p>
+                  <w:pPr>
+                    <w:pStyle w:val="Compact"/>
+                  </w:pPr>
+                  <w:r>
+                    <w:t xml:space="preserve">Provide a clear explanation for why the new set-based CPUE series gives lower CPUE in earlier years with high catches than the current trip-based assessment index.</w:t>
+                  </w:r>
+                </w:p>
+              </w:tc>
+              <w:tc>
+                <w:tcPr/>
+                <w:p>
+                  <w:pPr>
+                    <w:pStyle w:val="Compact"/>
+                  </w:pPr>
+                  <w:r>
+                    <w:t xml:space="preserve">Chile CPUE contributors</w:t>
+                  </w:r>
+                </w:p>
+              </w:tc>
+              <w:tc>
+                <w:tcPr/>
+                <w:p>
+                  <w:pPr>
+                    <w:pStyle w:val="Compact"/>
+                  </w:pPr>
+                  <w:r>
+                    <w:t xml:space="preserve">Support any defensible recommendation to replace, supplement, or retain the current Chile CPUE index.</w:t>
+                  </w:r>
+                </w:p>
+              </w:tc>
+            </w:tr>
+            <w:tr>
+              <w:tc>
+                <w:tcPr/>
+                <w:p>
+                  <w:pPr>
+                    <w:pStyle w:val="Compact"/>
+                  </w:pPr>
+                  <w:r>
+                    <w:t xml:space="preserve">Chile CPUE set coverage</w:t>
+                  </w:r>
+                </w:p>
+              </w:tc>
+              <w:tc>
+                <w:tcPr/>
+                <w:p>
+                  <w:pPr>
+                    <w:pStyle w:val="Compact"/>
+                  </w:pPr>
+                  <w:r>
+                    <w:t xml:space="preserve">Add number and proportion of sets by year to the CPUE data-summary table.</w:t>
+                  </w:r>
+                </w:p>
+              </w:tc>
+              <w:tc>
+                <w:tcPr/>
+                <w:p>
+                  <w:pPr>
+                    <w:pStyle w:val="Compact"/>
+                  </w:pPr>
+                  <w:r>
+                    <w:t xml:space="preserve">Chile CPUE contributors</w:t>
+                  </w:r>
+                </w:p>
+              </w:tc>
+              <w:tc>
+                <w:tcPr/>
+                <w:p>
+                  <w:pPr>
+                    <w:pStyle w:val="Compact"/>
+                  </w:pPr>
+                  <w:r>
+                    <w:t xml:space="preserve">Document representativeness and low early-period coverage.</w:t>
+                  </w:r>
+                </w:p>
+              </w:tc>
+            </w:tr>
+            <w:tr>
+              <w:tc>
+                <w:tcPr/>
+                <w:p>
+                  <w:pPr>
+                    <w:pStyle w:val="Compact"/>
+                  </w:pPr>
+                  <w:r>
+                    <w:t xml:space="preserve">Chile CPUE model-comparison summary</w:t>
+                  </w:r>
+                </w:p>
+              </w:tc>
+              <w:tc>
+                <w:tcPr/>
+                <w:p>
+                  <w:pPr>
+                    <w:pStyle w:val="Compact"/>
+                  </w:pPr>
+                  <w:r>
+                    <w:t xml:space="preserve">Summarize the</w:t>
+                  </w:r>
+                  <w:r>
+                    <w:t xml:space="preserve"> </w:t>
+                  </w:r>
+                  <w:r>
+                    <w:rPr>
+                      <w:rStyle w:val="VerbatimChar"/>
+                    </w:rPr>
+                    <w:t xml:space="preserve">sdmTMB</w:t>
+                  </w:r>
+                  <w:r>
+                    <w:t xml:space="preserve"> </w:t>
+                  </w:r>
+                  <w:r>
+                    <w:t xml:space="preserve">and INLA model-comparison discussion, including year-effect treatment, mesh sensitivity, northern fishing activity, and annual uncertainty.</w:t>
+                  </w:r>
+                </w:p>
+              </w:tc>
+              <w:tc>
+                <w:tcPr/>
+                <w:p>
+                  <w:pPr>
+                    <w:pStyle w:val="Compact"/>
+                  </w:pPr>
+                  <w:r>
+                    <w:t xml:space="preserve">Sebastian / Ignacio / Niels</w:t>
+                  </w:r>
+                </w:p>
+              </w:tc>
+              <w:tc>
+                <w:tcPr/>
+                <w:p>
+                  <w:pPr>
+                    <w:pStyle w:val="Compact"/>
+                  </w:pPr>
+                  <w:r>
+                    <w:t xml:space="preserve">Provide report-ready text for deciding whether a new Chile CPUE index can be used in the assessment.</w:t>
+                  </w:r>
+                </w:p>
+              </w:tc>
+            </w:tr>
+            <w:tr>
+              <w:tc>
+                <w:tcPr/>
+                <w:p>
+                  <w:pPr>
+                    <w:pStyle w:val="Compact"/>
+                  </w:pPr>
+                  <w:r>
+                    <w:t xml:space="preserve">Days-at-sea coefficient check</w:t>
+                  </w:r>
+                </w:p>
+              </w:tc>
+              <w:tc>
+                <w:tcPr/>
+                <w:p>
+                  <w:pPr>
+                    <w:pStyle w:val="Compact"/>
+                  </w:pPr>
+                  <w:r>
+                    <w:t xml:space="preserve">Check the strength and interpretation of the days-at-sea or DFP coefficient in the INLA-based CPUE analysis.</w:t>
+                  </w:r>
+                </w:p>
+              </w:tc>
+              <w:tc>
+                <w:tcPr/>
+                <w:p>
+                  <w:pPr>
+                    <w:pStyle w:val="Compact"/>
+                  </w:pPr>
+                  <w:r>
+                    <w:t xml:space="preserve">Sebastian / Chile CPUE contributors</w:t>
+                  </w:r>
+                </w:p>
+              </w:tc>
+              <w:tc>
+                <w:tcPr/>
+                <w:p>
+                  <w:pPr>
+                    <w:pStyle w:val="Compact"/>
+                  </w:pPr>
+                  <w:r>
+                    <w:t xml:space="preserve">Determine whether this covariate reflects fishing effort, spatial availability, or movement effects that could bias the abundance signal.</w:t>
+                  </w:r>
+                </w:p>
+              </w:tc>
+            </w:tr>
+            <w:tr>
+              <w:tc>
+                <w:tcPr/>
+                <w:p>
+                  <w:pPr>
+                    <w:pStyle w:val="Compact"/>
+                  </w:pPr>
+                  <w:r>
+                    <w:t xml:space="preserve">True-zero CPUE records</w:t>
+                  </w:r>
+                </w:p>
+              </w:tc>
+              <w:tc>
+                <w:tcPr/>
+                <w:p>
+                  <w:pPr>
+                    <w:pStyle w:val="Compact"/>
+                  </w:pPr>
+                  <w:r>
+                    <w:t xml:space="preserve">Check whether zero CPUE records are true fishing zeroes or technical/non-fishing records, and whether they should be included in the CPUE standardization.</w:t>
+                  </w:r>
+                </w:p>
+              </w:tc>
+              <w:tc>
+                <w:tcPr/>
+                <w:p>
+                  <w:pPr>
+                    <w:pStyle w:val="Compact"/>
+                  </w:pPr>
+                  <w:r>
+                    <w:t xml:space="preserve">Chile CPUE contributors</w:t>
+                  </w:r>
+                </w:p>
+              </w:tc>
+              <w:tc>
+                <w:tcPr/>
+                <w:p>
+                  <w:pPr>
+                    <w:pStyle w:val="Compact"/>
+                  </w:pPr>
+                  <w:r>
+                    <w:t xml:space="preserve">Decide whether positive-only models are adequate or whether zero-inflated/delta treatment should be evaluated.</w:t>
+                  </w:r>
+                </w:p>
+              </w:tc>
+            </w:tr>
+            <w:tr>
+              <w:tc>
+                <w:tcPr/>
+                <w:p>
+                  <w:pPr>
+                    <w:pStyle w:val="Compact"/>
+                  </w:pPr>
+                  <w:r>
+                    <w:t xml:space="preserve">Peru CPUE full-series evaluation</w:t>
+                  </w:r>
+                </w:p>
+              </w:tc>
+              <w:tc>
+                <w:tcPr/>
+                <w:p>
+                  <w:pPr>
+                    <w:pStyle w:val="Compact"/>
+                  </w:pPr>
+                  <w:r>
+                    <w:t xml:space="preserve">Extend and evaluate the Peru CPUE time series before using it as an assessment or MSE input.</w:t>
+                  </w:r>
+                </w:p>
+              </w:tc>
+              <w:tc>
+                <w:tcPr/>
+                <w:p>
+                  <w:pPr>
+                    <w:pStyle w:val="Compact"/>
+                  </w:pPr>
+                  <w:r>
+                    <w:t xml:space="preserve">Peru CPUE contributors / Assessment subgroup</w:t>
+                  </w:r>
+                </w:p>
+              </w:tc>
+              <w:tc>
+                <w:tcPr/>
+                <w:p>
+                  <w:pPr>
+                    <w:pStyle w:val="Compact"/>
+                  </w:pPr>
+                  <w:r>
+                    <w:t xml:space="preserve">Avoid adopting a truncated recent series before its relationship to the historical series can be evaluated.</w:t>
+                  </w:r>
+                </w:p>
+              </w:tc>
+            </w:tr>
+            <w:tr>
+              <w:tc>
+                <w:tcPr/>
+                <w:p>
+                  <w:pPr>
+                    <w:pStyle w:val="Compact"/>
+                  </w:pPr>
+                  <w:r>
+                    <w:t xml:space="preserve">Peru CPUE year-interaction diagnostic</w:t>
+                  </w:r>
+                </w:p>
+              </w:tc>
+              <w:tc>
+                <w:tcPr/>
+                <w:p>
+                  <w:pPr>
+                    <w:pStyle w:val="Compact"/>
+                  </w:pPr>
+                  <w:r>
+                    <w:t xml:space="preserve">Provide the smoother or effect plot for the year interaction in the Peru CPUE model.</w:t>
+                  </w:r>
+                </w:p>
+              </w:tc>
+              <w:tc>
+                <w:tcPr/>
+                <w:p>
+                  <w:pPr>
+                    <w:pStyle w:val="Compact"/>
+                  </w:pPr>
+                  <w:r>
+                    <w:t xml:space="preserve">Peru CPUE contributors</w:t>
+                  </w:r>
+                </w:p>
+              </w:tc>
+              <w:tc>
+                <w:tcPr/>
+                <w:p>
+                  <w:pPr>
+                    <w:pStyle w:val="Compact"/>
+                  </w:pPr>
+                  <w:r>
+                    <w:t xml:space="preserve">Help evaluate whether spatial or fleet changes are being absorbed by model smoothers.</w:t>
+                  </w:r>
+                </w:p>
+              </w:tc>
+            </w:tr>
+            <w:tr>
+              <w:tc>
+                <w:tcPr/>
+                <w:p>
+                  <w:pPr>
+                    <w:pStyle w:val="Compact"/>
+                  </w:pPr>
+                  <w:r>
+                    <w:t xml:space="preserve">Offshore CPUE catchability treatment</w:t>
+                  </w:r>
+                </w:p>
+              </w:tc>
+              <w:tc>
+                <w:tcPr/>
+                <w:p>
+                  <w:pPr>
+                    <w:pStyle w:val="Compact"/>
+                  </w:pPr>
+                  <w:r>
+                    <w:t xml:space="preserve">Document the rationale for the 2021 offshore catchability break and the interpretation of El Nino effects relative to annual effects.</w:t>
+                  </w:r>
+                </w:p>
+              </w:tc>
+              <w:tc>
+                <w:tcPr/>
+                <w:p>
+                  <w:pPr>
+                    <w:pStyle w:val="Compact"/>
+                  </w:pPr>
+                  <w:r>
+                    <w:t xml:space="preserve">Offshore CPUE contributor / Assessment subgroup</w:t>
+                  </w:r>
+                </w:p>
+              </w:tc>
+              <w:tc>
+                <w:tcPr/>
+                <w:p>
+                  <w:pPr>
+                    <w:pStyle w:val="Compact"/>
+                  </w:pPr>
+                  <w:r>
+                    <w:t xml:space="preserve">Clarify whether offshore CPUE changes represent abundance, catchability, availability, or environmental effects.</w:t>
+                  </w:r>
+                </w:p>
+              </w:tc>
+            </w:tr>
+          </w:tbl>
+          <w:p/>
+        </w:tc>
+      </w:tr>
+    </w:tbl>
+    <w:bookmarkEnd w:id="26"/>
+    <w:bookmarkEnd w:id="27"/>
+    <w:bookmarkStart w:id="28" w:name="biological-inputs"/>
     <w:p>
       <w:pPr>
         <w:pStyle w:val="Heading2"/>
@@ -1936,8 +3234,8 @@
         <w:t xml:space="preserve">Text to be added during the meeting. This section should summarize biological assumptions and data inputs, including maturity, natural mortality, weight-at-age, length-weight relationships, length-frequency composition data, and implications for assessment and operating-model conditioning.</w:t>
       </w:r>
     </w:p>
-    <w:bookmarkEnd w:id="25"/>
-    <w:bookmarkStart w:id="26" w:name="assessment-model-development"/>
+    <w:bookmarkEnd w:id="28"/>
+    <w:bookmarkStart w:id="29" w:name="assessment-model-development"/>
     <w:p>
       <w:pPr>
         <w:pStyle w:val="Heading2"/>
@@ -1954,8 +3252,8 @@
         <w:t xml:space="preserve">Text to be added during the meeting. This section should summarize the SC13 base-model developments, candidate simplifications, single-stock and two-stock alternatives, reduced-index configurations, selectivity assumptions, recruitment scenarios, and model diagnostics.</w:t>
       </w:r>
     </w:p>
-    <w:bookmarkEnd w:id="26"/>
-    <w:bookmarkStart w:id="27" w:name="operating-models-and-mse-linkages"/>
+    <w:bookmarkEnd w:id="29"/>
+    <w:bookmarkStart w:id="30" w:name="operating-models-and-mse-linkages"/>
     <w:p>
       <w:pPr>
         <w:pStyle w:val="Heading2"/>
@@ -1972,9 +3270,9 @@
         <w:t xml:space="preserve">Text to be added during the meeting. This section should summarize operating-model specifications, reference-set and robustness-set uncertainties, MCMC feasibility, management-procedure input diagnostics, and workflow needs for the June 2026 MSE workshop.</w:t>
       </w:r>
     </w:p>
-    <w:bookmarkEnd w:id="27"/>
-    <w:bookmarkEnd w:id="28"/>
-    <w:bookmarkStart w:id="29" w:name="decisions-and-agreements"/>
+    <w:bookmarkEnd w:id="30"/>
+    <w:bookmarkEnd w:id="31"/>
+    <w:bookmarkStart w:id="32" w:name="decisions-and-agreements"/>
     <w:p>
       <w:pPr>
         <w:pStyle w:val="Heading1"/>
@@ -2101,8 +3399,8 @@
         </w:tc>
       </w:tr>
     </w:tbl>
-    <w:bookmarkEnd w:id="29"/>
-    <w:bookmarkStart w:id="30" w:name="action-items"/>
+    <w:bookmarkEnd w:id="32"/>
+    <w:bookmarkStart w:id="33" w:name="action-items"/>
     <w:p>
       <w:pPr>
         <w:pStyle w:val="Heading1"/>
@@ -2687,9 +3985,484 @@
           </w:p>
         </w:tc>
       </w:tr>
+      <w:tr>
+        <w:tc>
+          <w:tcPr/>
+          <w:p>
+            <w:pPr>
+              <w:pStyle w:val="Compact"/>
+            </w:pPr>
+            <w:r>
+              <w:t xml:space="preserve">Draft text on the JMWG’s compressed data-submission workflow and post catch/fishery data quality-check material to the</w:t>
+            </w:r>
+            <w:r>
+              <w:t xml:space="preserve"> </w:t>
+            </w:r>
+            <w:r>
+              <w:rPr>
+                <w:rStyle w:val="VerbatimChar"/>
+              </w:rPr>
+              <w:t xml:space="preserve">jjmData</w:t>
+            </w:r>
+            <w:r>
+              <w:t xml:space="preserve"> </w:t>
+            </w:r>
+            <w:r>
+              <w:t xml:space="preserve">repository</w:t>
+            </w:r>
+          </w:p>
+        </w:tc>
+        <w:tc>
+          <w:tcPr/>
+          <w:p>
+            <w:pPr>
+              <w:pStyle w:val="Compact"/>
+            </w:pPr>
+            <w:r>
+              <w:t xml:space="preserve">Data-quality subgroup</w:t>
+            </w:r>
+          </w:p>
+        </w:tc>
+        <w:tc>
+          <w:tcPr/>
+          <w:p>
+            <w:pPr>
+              <w:pStyle w:val="Compact"/>
+            </w:pPr>
+            <w:r>
+              <w:t xml:space="preserve">Chair / Secretariat</w:t>
+            </w:r>
+          </w:p>
+        </w:tc>
+        <w:tc>
+          <w:tcPr/>
+          <w:p>
+            <w:pPr>
+              <w:pStyle w:val="Compact"/>
+            </w:pPr>
+            <w:r>
+              <w:t xml:space="preserve">Before report adoption</w:t>
+            </w:r>
+          </w:p>
+        </w:tc>
+      </w:tr>
+      <w:tr>
+        <w:tc>
+          <w:tcPr/>
+          <w:p>
+            <w:pPr>
+              <w:pStyle w:val="Compact"/>
+            </w:pPr>
+            <w:r>
+              <w:t xml:space="preserve">Investigate age-length-key and composition-data sample-size reporting, including discrepancies between numbers of ages and numbers of length measurements</w:t>
+            </w:r>
+          </w:p>
+        </w:tc>
+        <w:tc>
+          <w:tcPr/>
+          <w:p>
+            <w:pPr>
+              <w:pStyle w:val="Compact"/>
+            </w:pPr>
+            <w:r>
+              <w:t xml:space="preserve">Data-quality subgroup</w:t>
+            </w:r>
+          </w:p>
+        </w:tc>
+        <w:tc>
+          <w:tcPr/>
+          <w:p>
+            <w:pPr>
+              <w:pStyle w:val="Compact"/>
+            </w:pPr>
+            <w:r>
+              <w:t xml:space="preserve">Members</w:t>
+            </w:r>
+          </w:p>
+        </w:tc>
+        <w:tc>
+          <w:tcPr/>
+          <w:p>
+            <w:pPr>
+              <w:pStyle w:val="Compact"/>
+            </w:pPr>
+            <w:r>
+              <w:t xml:space="preserve">Before biological-input decisions</w:t>
+            </w:r>
+          </w:p>
+        </w:tc>
+      </w:tr>
+      <w:tr>
+        <w:tc>
+          <w:tcPr/>
+          <w:p>
+            <w:pPr>
+              <w:pStyle w:val="Compact"/>
+            </w:pPr>
+            <w:r>
+              <w:t xml:space="preserve">Run an assessment diagnostic with no Chilean effort-creep correction but with a catchability step change in 2005</w:t>
+            </w:r>
+          </w:p>
+        </w:tc>
+        <w:tc>
+          <w:tcPr/>
+          <w:p>
+            <w:pPr>
+              <w:pStyle w:val="Compact"/>
+            </w:pPr>
+            <w:r>
+              <w:t xml:space="preserve">Assessment subgroup</w:t>
+            </w:r>
+          </w:p>
+        </w:tc>
+        <w:tc>
+          <w:tcPr/>
+          <w:p>
+            <w:pPr>
+              <w:pStyle w:val="Compact"/>
+            </w:pPr>
+            <w:r>
+              <w:t xml:space="preserve">Chile CPUE contributors</w:t>
+            </w:r>
+          </w:p>
+        </w:tc>
+        <w:tc>
+          <w:tcPr/>
+          <w:p>
+            <w:pPr>
+              <w:pStyle w:val="Compact"/>
+            </w:pPr>
+            <w:r>
+              <w:t xml:space="preserve">Before CPUE index decisions</w:t>
+            </w:r>
+          </w:p>
+        </w:tc>
+      </w:tr>
+      <w:tr>
+        <w:tc>
+          <w:tcPr/>
+          <w:p>
+            <w:pPr>
+              <w:pStyle w:val="Compact"/>
+            </w:pPr>
+            <w:r>
+              <w:t xml:space="preserve">Add number and proportion of sets by year to the Chile CPUE data-summary table</w:t>
+            </w:r>
+          </w:p>
+        </w:tc>
+        <w:tc>
+          <w:tcPr/>
+          <w:p>
+            <w:pPr>
+              <w:pStyle w:val="Compact"/>
+            </w:pPr>
+            <w:r>
+              <w:t xml:space="preserve">Chile CPUE contributors</w:t>
+            </w:r>
+          </w:p>
+        </w:tc>
+        <w:tc>
+          <w:tcPr/>
+          <w:p>
+            <w:pPr>
+              <w:pStyle w:val="Compact"/>
+            </w:pPr>
+            <w:r>
+              <w:t xml:space="preserve">Assessment/index subgroup</w:t>
+            </w:r>
+          </w:p>
+        </w:tc>
+        <w:tc>
+          <w:tcPr/>
+          <w:p>
+            <w:pPr>
+              <w:pStyle w:val="Compact"/>
+            </w:pPr>
+            <w:r>
+              <w:t xml:space="preserve">Before CPUE index decisions</w:t>
+            </w:r>
+          </w:p>
+        </w:tc>
+      </w:tr>
+      <w:tr>
+        <w:tc>
+          <w:tcPr/>
+          <w:p>
+            <w:pPr>
+              <w:pStyle w:val="Compact"/>
+            </w:pPr>
+            <w:r>
+              <w:t xml:space="preserve">Prepare report-ready text explaining differences between the current trip-based Chile CPUE and the new set-based spatio-temporal CPUE products, especially in early high-catch years</w:t>
+            </w:r>
+          </w:p>
+        </w:tc>
+        <w:tc>
+          <w:tcPr/>
+          <w:p>
+            <w:pPr>
+              <w:pStyle w:val="Compact"/>
+            </w:pPr>
+            <w:r>
+              <w:t xml:space="preserve">Chile CPUE contributors</w:t>
+            </w:r>
+          </w:p>
+        </w:tc>
+        <w:tc>
+          <w:tcPr/>
+          <w:p>
+            <w:pPr>
+              <w:pStyle w:val="Compact"/>
+            </w:pPr>
+            <w:r>
+              <w:t xml:space="preserve">Sebastian / Ignacio / Niels</w:t>
+            </w:r>
+          </w:p>
+        </w:tc>
+        <w:tc>
+          <w:tcPr/>
+          <w:p>
+            <w:pPr>
+              <w:pStyle w:val="Compact"/>
+            </w:pPr>
+            <w:r>
+              <w:t xml:space="preserve">Before CPUE index decisions</w:t>
+            </w:r>
+          </w:p>
+        </w:tc>
+      </w:tr>
+      <w:tr>
+        <w:tc>
+          <w:tcPr/>
+          <w:p>
+            <w:pPr>
+              <w:pStyle w:val="Compact"/>
+            </w:pPr>
+            <w:r>
+              <w:t xml:space="preserve">Check the strength and interpretation of the days-at-sea or DFP coefficient in the INLA-based Chile CPUE analysis</w:t>
+            </w:r>
+          </w:p>
+        </w:tc>
+        <w:tc>
+          <w:tcPr/>
+          <w:p>
+            <w:pPr>
+              <w:pStyle w:val="Compact"/>
+            </w:pPr>
+            <w:r>
+              <w:t xml:space="preserve">Chile CPUE contributors</w:t>
+            </w:r>
+          </w:p>
+        </w:tc>
+        <w:tc>
+          <w:tcPr/>
+          <w:p>
+            <w:pPr>
+              <w:pStyle w:val="Compact"/>
+            </w:pPr>
+            <w:r>
+              <w:t xml:space="preserve">Assessment/index subgroup</w:t>
+            </w:r>
+          </w:p>
+        </w:tc>
+        <w:tc>
+          <w:tcPr/>
+          <w:p>
+            <w:pPr>
+              <w:pStyle w:val="Compact"/>
+            </w:pPr>
+            <w:r>
+              <w:t xml:space="preserve">Before CPUE index decisions</w:t>
+            </w:r>
+          </w:p>
+        </w:tc>
+      </w:tr>
+      <w:tr>
+        <w:tc>
+          <w:tcPr/>
+          <w:p>
+            <w:pPr>
+              <w:pStyle w:val="Compact"/>
+            </w:pPr>
+            <w:r>
+              <w:t xml:space="preserve">Check whether zero CPUE records are true fishing zeroes or technical/non-fishing records and whether zeroes should be included in Chile CPUE standardization</w:t>
+            </w:r>
+          </w:p>
+        </w:tc>
+        <w:tc>
+          <w:tcPr/>
+          <w:p>
+            <w:pPr>
+              <w:pStyle w:val="Compact"/>
+            </w:pPr>
+            <w:r>
+              <w:t xml:space="preserve">Chile CPUE contributors</w:t>
+            </w:r>
+          </w:p>
+        </w:tc>
+        <w:tc>
+          <w:tcPr/>
+          <w:p>
+            <w:pPr>
+              <w:pStyle w:val="Compact"/>
+            </w:pPr>
+            <w:r>
+              <w:t xml:space="preserve">Assessment/index subgroup</w:t>
+            </w:r>
+          </w:p>
+        </w:tc>
+        <w:tc>
+          <w:tcPr/>
+          <w:p>
+            <w:pPr>
+              <w:pStyle w:val="Compact"/>
+            </w:pPr>
+            <w:r>
+              <w:t xml:space="preserve">Before final model-run list</w:t>
+            </w:r>
+          </w:p>
+        </w:tc>
+      </w:tr>
+      <w:tr>
+        <w:tc>
+          <w:tcPr/>
+          <w:p>
+            <w:pPr>
+              <w:pStyle w:val="Compact"/>
+            </w:pPr>
+            <w:r>
+              <w:t xml:space="preserve">Extend and evaluate the Peru CPUE time series before deciding whether it can be used as an assessment or MSE input</w:t>
+            </w:r>
+          </w:p>
+        </w:tc>
+        <w:tc>
+          <w:tcPr/>
+          <w:p>
+            <w:pPr>
+              <w:pStyle w:val="Compact"/>
+            </w:pPr>
+            <w:r>
+              <w:t xml:space="preserve">Peru CPUE contributors</w:t>
+            </w:r>
+          </w:p>
+        </w:tc>
+        <w:tc>
+          <w:tcPr/>
+          <w:p>
+            <w:pPr>
+              <w:pStyle w:val="Compact"/>
+            </w:pPr>
+            <w:r>
+              <w:t xml:space="preserve">Assessment subgroup</w:t>
+            </w:r>
+          </w:p>
+        </w:tc>
+        <w:tc>
+          <w:tcPr/>
+          <w:p>
+            <w:pPr>
+              <w:pStyle w:val="Compact"/>
+            </w:pPr>
+            <w:r>
+              <w:t xml:space="preserve">Before future benchmark/model updates</w:t>
+            </w:r>
+          </w:p>
+        </w:tc>
+      </w:tr>
+      <w:tr>
+        <w:tc>
+          <w:tcPr/>
+          <w:p>
+            <w:pPr>
+              <w:pStyle w:val="Compact"/>
+            </w:pPr>
+            <w:r>
+              <w:t xml:space="preserve">Provide the year-interaction smoother or effect plot for the Peru CPUE model</w:t>
+            </w:r>
+          </w:p>
+        </w:tc>
+        <w:tc>
+          <w:tcPr/>
+          <w:p>
+            <w:pPr>
+              <w:pStyle w:val="Compact"/>
+            </w:pPr>
+            <w:r>
+              <w:t xml:space="preserve">Peru CPUE contributors</w:t>
+            </w:r>
+          </w:p>
+        </w:tc>
+        <w:tc>
+          <w:tcPr/>
+          <w:p>
+            <w:pPr>
+              <w:pStyle w:val="Compact"/>
+            </w:pPr>
+            <w:r>
+              <w:t xml:space="preserve">Assessment/index subgroup</w:t>
+            </w:r>
+          </w:p>
+        </w:tc>
+        <w:tc>
+          <w:tcPr/>
+          <w:p>
+            <w:pPr>
+              <w:pStyle w:val="Compact"/>
+            </w:pPr>
+            <w:r>
+              <w:t xml:space="preserve">Before final CPUE recommendations</w:t>
+            </w:r>
+          </w:p>
+        </w:tc>
+      </w:tr>
+      <w:tr>
+        <w:tc>
+          <w:tcPr/>
+          <w:p>
+            <w:pPr>
+              <w:pStyle w:val="Compact"/>
+            </w:pPr>
+            <w:r>
+              <w:t xml:space="preserve">Document the rationale for the 2021 offshore CPUE catchability break and the interpretation of El Nino effects relative to annual effects</w:t>
+            </w:r>
+          </w:p>
+        </w:tc>
+        <w:tc>
+          <w:tcPr/>
+          <w:p>
+            <w:pPr>
+              <w:pStyle w:val="Compact"/>
+            </w:pPr>
+            <w:r>
+              <w:t xml:space="preserve">Offshore CPUE contributor</w:t>
+            </w:r>
+          </w:p>
+        </w:tc>
+        <w:tc>
+          <w:tcPr/>
+          <w:p>
+            <w:pPr>
+              <w:pStyle w:val="Compact"/>
+            </w:pPr>
+            <w:r>
+              <w:t xml:space="preserve">Assessment subgroup</w:t>
+            </w:r>
+          </w:p>
+        </w:tc>
+        <w:tc>
+          <w:tcPr/>
+          <w:p>
+            <w:pPr>
+              <w:pStyle w:val="Compact"/>
+            </w:pPr>
+            <w:r>
+              <w:t xml:space="preserve">Before final model-run list</w:t>
+            </w:r>
+          </w:p>
+        </w:tc>
+      </w:tr>
     </w:tbl>
-    <w:bookmarkEnd w:id="30"/>
-    <w:bookmarkStart w:id="31" w:name="open-issues-risks-to-track"/>
+    <w:bookmarkEnd w:id="33"/>
+    <w:bookmarkStart w:id="34" w:name="open-issues-risks-to-track"/>
     <w:p>
       <w:pPr>
         <w:pStyle w:val="Heading1"/>
@@ -2794,8 +4567,68 @@
         <w:t xml:space="preserve">Fishery-dependent acoustic products may add spatial and seasonal information, but preferential sampling, fishing behaviour, technology effects, and correlation with CPUE must be evaluated before direct assessment use.</w:t>
       </w:r>
     </w:p>
-    <w:bookmarkEnd w:id="31"/>
-    <w:bookmarkStart w:id="37" w:name="appendix-a.-shortened-draft-agenda"/>
+    <w:p>
+      <w:pPr>
+        <w:pStyle w:val="Compact"/>
+        <w:numPr>
+          <w:ilvl w:val="0"/>
+          <w:numId w:val="1004"/>
+        </w:numPr>
+      </w:pPr>
+      <w:r>
+        <w:t xml:space="preserve">The current data-submission workflow is expedient but depends on consistent interpretation of sampling, coverage, and sample-size fields across members.</w:t>
+      </w:r>
+    </w:p>
+    <w:p>
+      <w:pPr>
+        <w:pStyle w:val="Compact"/>
+        <w:numPr>
+          <w:ilvl w:val="0"/>
+          <w:numId w:val="1004"/>
+        </w:numPr>
+      </w:pPr>
+      <w:r>
+        <w:t xml:space="preserve">The Chilean effort-creep correction may be confounded with catchability changes, and the assessment consequence should be tested before accepting the correction as a base input.</w:t>
+      </w:r>
+    </w:p>
+    <w:p>
+      <w:pPr>
+        <w:pStyle w:val="Compact"/>
+        <w:numPr>
+          <w:ilvl w:val="0"/>
+          <w:numId w:val="1004"/>
+        </w:numPr>
+      </w:pPr>
+      <w:r>
+        <w:t xml:space="preserve">A switch from the current trip-based Chile CPUE series to a set-based spatio-temporal series requires a clear explanation of early-period coverage, model sensitivity, year-effect treatment, northern fishing activity, and annual uncertainty.</w:t>
+      </w:r>
+    </w:p>
+    <w:p>
+      <w:pPr>
+        <w:pStyle w:val="Compact"/>
+        <w:numPr>
+          <w:ilvl w:val="0"/>
+          <w:numId w:val="1004"/>
+        </w:numPr>
+      </w:pPr>
+      <w:r>
+        <w:t xml:space="preserve">The Peru CPUE series is currently too short for June 2026 MSE use because the full historical extension has not yet been evaluated.</w:t>
+      </w:r>
+    </w:p>
+    <w:p>
+      <w:pPr>
+        <w:pStyle w:val="Compact"/>
+        <w:numPr>
+          <w:ilvl w:val="0"/>
+          <w:numId w:val="1004"/>
+        </w:numPr>
+      </w:pPr>
+      <w:r>
+        <w:t xml:space="preserve">Offshore CPUE catchability breaks and environmental effects need clear interpretation so that abundance, availability, and fishing-behaviour changes are not conflated.</w:t>
+      </w:r>
+    </w:p>
+    <w:bookmarkEnd w:id="34"/>
+    <w:bookmarkStart w:id="40" w:name="appendix-a.-shortened-draft-agenda"/>
     <w:p>
       <w:pPr>
         <w:pStyle w:val="Heading1"/>
@@ -2812,7 +4645,7 @@
         <w:t xml:space="preserve">This appendix summarizes the draft agenda from SCW16-Doc00. It should be updated if the adopted meeting agenda differs materially.</w:t>
       </w:r>
     </w:p>
-    <w:bookmarkStart w:id="32" w:name="day-1-acoustic-session"/>
+    <w:bookmarkStart w:id="35" w:name="day-1-acoustic-session"/>
     <w:p>
       <w:pPr>
         <w:pStyle w:val="Heading2"/>
@@ -2953,8 +4786,8 @@
         <w:t xml:space="preserve">General discussion and technical recommendations.</w:t>
       </w:r>
     </w:p>
-    <w:bookmarkEnd w:id="32"/>
-    <w:bookmarkStart w:id="33" w:name="day-2-cpue-session"/>
+    <w:bookmarkEnd w:id="35"/>
+    <w:bookmarkStart w:id="36" w:name="day-2-cpue-session"/>
     <w:p>
       <w:pPr>
         <w:pStyle w:val="Heading2"/>
@@ -3059,8 +4892,8 @@
         <w:t xml:space="preserve">Separate versus combined index products for HCR or management-procedure use.</w:t>
       </w:r>
     </w:p>
-    <w:bookmarkEnd w:id="33"/>
-    <w:bookmarkStart w:id="34" w:name="Xe19488a9e250f8a1b1acbf6bd27cb1809ccf6dd"/>
+    <w:bookmarkEnd w:id="36"/>
+    <w:bookmarkStart w:id="37" w:name="Xe19488a9e250f8a1b1acbf6bd27cb1809ccf6dd"/>
     <w:p>
       <w:pPr>
         <w:pStyle w:val="Heading2"/>
@@ -3129,8 +4962,8 @@
         <w:t xml:space="preserve">Review of Peru length-weight and length-frequency information, including SCW16-Doc13 and SCW16-Doc14.</w:t>
       </w:r>
     </w:p>
-    <w:bookmarkEnd w:id="34"/>
-    <w:bookmarkStart w:id="35" w:name="X093770a539d959c93333ac261f9d7f2c82f1662"/>
+    <w:bookmarkEnd w:id="37"/>
+    <w:bookmarkStart w:id="38" w:name="X093770a539d959c93333ac261f9d7f2c82f1662"/>
     <w:p>
       <w:pPr>
         <w:pStyle w:val="Heading2"/>
@@ -3187,8 +5020,8 @@
         <w:t xml:space="preserve">MCMC evaluations, convergence diagnostics, run-time constraints, and feasibility.</w:t>
       </w:r>
     </w:p>
-    <w:bookmarkEnd w:id="35"/>
-    <w:bookmarkStart w:id="36" w:name="X0e50bbd5976cb17edeb25ef5bfa4ced02afb38c"/>
+    <w:bookmarkEnd w:id="38"/>
+    <w:bookmarkStart w:id="39" w:name="X0e50bbd5976cb17edeb25ef5bfa4ced02afb38c"/>
     <w:p>
       <w:pPr>
         <w:pStyle w:val="Heading2"/>
@@ -3233,9 +5066,9 @@
         <w:t xml:space="preserve">Report drafting, review, and adoption.</w:t>
       </w:r>
     </w:p>
-    <w:bookmarkEnd w:id="36"/>
-    <w:bookmarkEnd w:id="37"/>
-    <w:bookmarkStart w:id="38" w:name="appendix-b.-participants"/>
+    <w:bookmarkEnd w:id="39"/>
+    <w:bookmarkEnd w:id="40"/>
+    <w:bookmarkStart w:id="41" w:name="appendix-b.-participants"/>
     <w:p>
       <w:pPr>
         <w:pStyle w:val="Heading1"/>
@@ -5049,8 +6882,8 @@
         </w:tc>
       </w:tr>
     </w:tbl>
-    <w:bookmarkEnd w:id="38"/>
-    <w:bookmarkStart w:id="77" w:name="appendix-c.-document-summary-by-topic"/>
+    <w:bookmarkEnd w:id="41"/>
+    <w:bookmarkStart w:id="80" w:name="appendix-c.-document-summary-by-topic"/>
     <w:p>
       <w:pPr>
         <w:pStyle w:val="Heading1"/>
@@ -5067,7 +6900,7 @@
         <w:t xml:space="preserve">This appendix summarizes SCW16-Doc01 through SCW16-Doc16. The organization is by topic rather than document number so that related evidence can be reviewed together.</w:t>
       </w:r>
     </w:p>
-    <w:bookmarkStart w:id="41" w:name="assessment-and-model-structure"/>
+    <w:bookmarkStart w:id="44" w:name="assessment-and-model-structure"/>
     <w:p>
       <w:pPr>
         <w:pStyle w:val="Heading2"/>
@@ -5076,7 +6909,7 @@
         <w:t xml:space="preserve">Assessment and Model Structure</w:t>
       </w:r>
     </w:p>
-    <w:bookmarkStart w:id="40" w:name="developments-of-the-base-sc13-model"/>
+    <w:bookmarkStart w:id="43" w:name="developments-of-the-base-sc13-model"/>
     <w:p>
       <w:pPr>
         <w:pStyle w:val="Heading3"/>
@@ -5089,7 +6922,7 @@
       <w:pPr>
         <w:pStyle w:val="FirstParagraph"/>
       </w:pPr>
-      <w:hyperlink r:id="rId39">
+      <w:hyperlink r:id="rId42">
         <w:r>
           <w:rPr>
             <w:rStyle w:val="Hyperlink"/>
@@ -5112,9 +6945,9 @@
         <w:t xml:space="preserve">Key report use: summarize accepted base-model structure, candidate simplifications, retained sensitivities, and any model configurations to carry into OM conditioning.</w:t>
       </w:r>
     </w:p>
-    <w:bookmarkEnd w:id="40"/>
-    <w:bookmarkEnd w:id="41"/>
-    <w:bookmarkStart w:id="44" w:name="operating-models-and-mse"/>
+    <w:bookmarkEnd w:id="43"/>
+    <w:bookmarkEnd w:id="44"/>
+    <w:bookmarkStart w:id="47" w:name="operating-models-and-mse"/>
     <w:p>
       <w:pPr>
         <w:pStyle w:val="Heading2"/>
@@ -5123,7 +6956,7 @@
         <w:t xml:space="preserve">Operating Models and MSE</w:t>
       </w:r>
     </w:p>
-    <w:bookmarkStart w:id="43" w:name="operating-models-for-jack-mackerel-mse"/>
+    <w:bookmarkStart w:id="46" w:name="operating-models-for-jack-mackerel-mse"/>
     <w:p>
       <w:pPr>
         <w:pStyle w:val="Heading3"/>
@@ -5136,7 +6969,7 @@
       <w:pPr>
         <w:pStyle w:val="FirstParagraph"/>
       </w:pPr>
-      <w:hyperlink r:id="rId42">
+      <w:hyperlink r:id="rId45">
         <w:r>
           <w:rPr>
             <w:rStyle w:val="Hyperlink"/>
@@ -5159,9 +6992,9 @@
         <w:t xml:space="preserve">Key report use: define the operating-model grid or equivalent uncertainty table that will feed the June 2026 MSE workshop.</w:t>
       </w:r>
     </w:p>
-    <w:bookmarkEnd w:id="43"/>
-    <w:bookmarkEnd w:id="44"/>
-    <w:bookmarkStart w:id="57" w:name="cpue"/>
+    <w:bookmarkEnd w:id="46"/>
+    <w:bookmarkEnd w:id="47"/>
+    <w:bookmarkStart w:id="60" w:name="cpue"/>
     <w:p>
       <w:pPr>
         <w:pStyle w:val="Heading2"/>
@@ -5170,7 +7003,7 @@
         <w:t xml:space="preserve">CPUE</w:t>
       </w:r>
     </w:p>
-    <w:bookmarkStart w:id="46" w:name="X78655e90d273c2174e3dc08eb7d53678355183a"/>
+    <w:bookmarkStart w:id="49" w:name="X78655e90d273c2174e3dc08eb7d53678355183a"/>
     <w:p>
       <w:pPr>
         <w:pStyle w:val="Heading3"/>
@@ -5183,7 +7016,7 @@
       <w:pPr>
         <w:pStyle w:val="FirstParagraph"/>
       </w:pPr>
-      <w:hyperlink r:id="rId45">
+      <w:hyperlink r:id="rId48">
         <w:r>
           <w:rPr>
             <w:rStyle w:val="Hyperlink"/>
@@ -5206,8 +7039,8 @@
         <w:t xml:space="preserve">Key report use: structure the CPUE session and make sure each candidate CPUE product is classified for assessment, OM conditioning, MP input, diagnostic use, or hold.</w:t>
       </w:r>
     </w:p>
-    <w:bookmarkEnd w:id="46"/>
-    <w:bookmarkStart w:id="48" w:name="X55aa1326c783fdba0a32cb00d5dd3d2612f78d5"/>
+    <w:bookmarkEnd w:id="49"/>
+    <w:bookmarkStart w:id="51" w:name="X55aa1326c783fdba0a32cb00d5dd3d2612f78d5"/>
     <w:p>
       <w:pPr>
         <w:pStyle w:val="Heading3"/>
@@ -5220,7 +7053,7 @@
       <w:pPr>
         <w:pStyle w:val="FirstParagraph"/>
       </w:pPr>
-      <w:hyperlink r:id="rId47">
+      <w:hyperlink r:id="rId50">
         <w:r>
           <w:rPr>
             <w:rStyle w:val="Hyperlink"/>
@@ -5243,8 +7076,8 @@
         <w:t xml:space="preserve">Key report use: provide background for interpreting new CPUE papers and avoid repeating previously identified unresolved issues.</w:t>
       </w:r>
     </w:p>
-    <w:bookmarkEnd w:id="48"/>
-    <w:bookmarkStart w:id="50" w:name="chile-cpue-effort-creep"/>
+    <w:bookmarkEnd w:id="51"/>
+    <w:bookmarkStart w:id="53" w:name="chile-cpue-effort-creep"/>
     <w:p>
       <w:pPr>
         <w:pStyle w:val="Heading3"/>
@@ -5257,7 +7090,7 @@
       <w:pPr>
         <w:pStyle w:val="FirstParagraph"/>
       </w:pPr>
-      <w:hyperlink r:id="rId49">
+      <w:hyperlink r:id="rId52">
         <w:r>
           <w:rPr>
             <w:rStyle w:val="Hyperlink"/>
@@ -5280,8 +7113,8 @@
         <w:t xml:space="preserve">Key report use: document whether effort-creep treatment is accepted, treated as a sensitivity, or deferred pending additional diagnostics.</w:t>
       </w:r>
     </w:p>
-    <w:bookmarkEnd w:id="50"/>
-    <w:bookmarkStart w:id="52" w:name="chile-cpue-with-sdmtmbspde"/>
+    <w:bookmarkEnd w:id="53"/>
+    <w:bookmarkStart w:id="55" w:name="chile-cpue-with-sdmtmbspde"/>
     <w:p>
       <w:pPr>
         <w:pStyle w:val="Heading3"/>
@@ -5294,7 +7127,7 @@
       <w:pPr>
         <w:pStyle w:val="FirstParagraph"/>
       </w:pPr>
-      <w:hyperlink r:id="rId51">
+      <w:hyperlink r:id="rId54">
         <w:r>
           <w:rPr>
             <w:rStyle w:val="Hyperlink"/>
@@ -5329,8 +7162,8 @@
         <w:t xml:space="preserve">Key report use: evaluate whether the spatio-temporal CPUE product should replace, supplement, or diagnose the current assessment CPUE series.</w:t>
       </w:r>
     </w:p>
-    <w:bookmarkEnd w:id="52"/>
-    <w:bookmarkStart w:id="54" w:name="chile-cpue-with-inla"/>
+    <w:bookmarkEnd w:id="55"/>
+    <w:bookmarkStart w:id="57" w:name="chile-cpue-with-inla"/>
     <w:p>
       <w:pPr>
         <w:pStyle w:val="Heading3"/>
@@ -5343,7 +7176,7 @@
       <w:pPr>
         <w:pStyle w:val="FirstParagraph"/>
       </w:pPr>
-      <w:hyperlink r:id="rId53">
+      <w:hyperlink r:id="rId56">
         <w:r>
           <w:rPr>
             <w:rStyle w:val="Hyperlink"/>
@@ -5381,8 +7214,8 @@
         <w:t xml:space="preserve">CPUE product.</w:t>
       </w:r>
     </w:p>
-    <w:bookmarkEnd w:id="54"/>
-    <w:bookmarkStart w:id="56" w:name="peru-cpue"/>
+    <w:bookmarkEnd w:id="57"/>
+    <w:bookmarkStart w:id="59" w:name="peru-cpue"/>
     <w:p>
       <w:pPr>
         <w:pStyle w:val="Heading3"/>
@@ -5395,7 +7228,7 @@
       <w:pPr>
         <w:pStyle w:val="FirstParagraph"/>
       </w:pPr>
-      <w:hyperlink r:id="rId55">
+      <w:hyperlink r:id="rId58">
         <w:r>
           <w:rPr>
             <w:rStyle w:val="Hyperlink"/>
@@ -5418,9 +7251,9 @@
         <w:t xml:space="preserve">Key report use: evaluate whether the Peruvian CPUE product is suitable as a far-north abundance index, an assessment sensitivity, an OM-conditioning input, or a diagnostic series.</w:t>
       </w:r>
     </w:p>
-    <w:bookmarkEnd w:id="56"/>
-    <w:bookmarkEnd w:id="57"/>
-    <w:bookmarkStart w:id="66" w:name="acoustic-indices-1"/>
+    <w:bookmarkEnd w:id="59"/>
+    <w:bookmarkEnd w:id="60"/>
+    <w:bookmarkStart w:id="69" w:name="acoustic-indices-1"/>
     <w:p>
       <w:pPr>
         <w:pStyle w:val="Heading2"/>
@@ -5429,7 +7262,7 @@
         <w:t xml:space="preserve">Acoustic Indices</w:t>
       </w:r>
     </w:p>
-    <w:bookmarkStart w:id="59" w:name="Xb04805d959d92db344062f23c1d5fc65220cd11"/>
+    <w:bookmarkStart w:id="62" w:name="Xb04805d959d92db344062f23c1d5fc65220cd11"/>
     <w:p>
       <w:pPr>
         <w:pStyle w:val="Heading3"/>
@@ -5442,7 +7275,7 @@
       <w:pPr>
         <w:pStyle w:val="FirstParagraph"/>
       </w:pPr>
-      <w:hyperlink r:id="rId58">
+      <w:hyperlink r:id="rId61">
         <w:r>
           <w:rPr>
             <w:rStyle w:val="Hyperlink"/>
@@ -5465,8 +7298,8 @@
         <w:t xml:space="preserve">Key report use: evaluate acoustic index representativeness, uncertainty, spatial coverage, and suitability for assessment and OM use.</w:t>
       </w:r>
     </w:p>
-    <w:bookmarkEnd w:id="59"/>
-    <w:bookmarkStart w:id="61" w:name="fishery-dependent-acoustics"/>
+    <w:bookmarkEnd w:id="62"/>
+    <w:bookmarkStart w:id="64" w:name="fishery-dependent-acoustics"/>
     <w:p>
       <w:pPr>
         <w:pStyle w:val="Heading3"/>
@@ -5479,7 +7312,7 @@
       <w:pPr>
         <w:pStyle w:val="FirstParagraph"/>
       </w:pPr>
-      <w:hyperlink r:id="rId60">
+      <w:hyperlink r:id="rId63">
         <w:r>
           <w:rPr>
             <w:rStyle w:val="Hyperlink"/>
@@ -5502,8 +7335,8 @@
         <w:t xml:space="preserve">Key report use: decide whether fishery-dependent acoustic products provide a usable abundance signal or primarily diagnostic/context information.</w:t>
       </w:r>
     </w:p>
-    <w:bookmarkEnd w:id="61"/>
-    <w:bookmarkStart w:id="63" w:name="X8dcc86fd1c77a21ecd4bd2be0d11cc79550cb59"/>
+    <w:bookmarkEnd w:id="64"/>
+    <w:bookmarkStart w:id="66" w:name="X8dcc86fd1c77a21ecd4bd2be0d11cc79550cb59"/>
     <w:p>
       <w:pPr>
         <w:pStyle w:val="Heading3"/>
@@ -5516,7 +7349,7 @@
       <w:pPr>
         <w:pStyle w:val="FirstParagraph"/>
       </w:pPr>
-      <w:hyperlink r:id="rId62">
+      <w:hyperlink r:id="rId65">
         <w:r>
           <w:rPr>
             <w:rStyle w:val="Hyperlink"/>
@@ -5551,8 +7384,8 @@
         <w:t xml:space="preserve">Key report use: compare with Doc06 and other acoustic products to determine whether indices are complementary, redundant, or conflicting.</w:t>
       </w:r>
     </w:p>
-    <w:bookmarkEnd w:id="63"/>
-    <w:bookmarkStart w:id="65" w:name="peru-acoustic-index-considerations"/>
+    <w:bookmarkEnd w:id="66"/>
+    <w:bookmarkStart w:id="68" w:name="peru-acoustic-index-considerations"/>
     <w:p>
       <w:pPr>
         <w:pStyle w:val="Heading3"/>
@@ -5565,7 +7398,7 @@
       <w:pPr>
         <w:pStyle w:val="FirstParagraph"/>
       </w:pPr>
-      <w:hyperlink r:id="rId64">
+      <w:hyperlink r:id="rId67">
         <w:r>
           <w:rPr>
             <w:rStyle w:val="Hyperlink"/>
@@ -5588,9 +7421,9 @@
         <w:t xml:space="preserve">Key report use: classify the Peru acoustic information as a candidate index, supporting interpretation, or diagnostic evidence, depending on data extent, uncertainty, and assessment compatibility.</w:t>
       </w:r>
     </w:p>
-    <w:bookmarkEnd w:id="65"/>
-    <w:bookmarkEnd w:id="66"/>
-    <w:bookmarkStart w:id="73" w:name="biology-and-composition-inputs"/>
+    <w:bookmarkEnd w:id="68"/>
+    <w:bookmarkEnd w:id="69"/>
+    <w:bookmarkStart w:id="76" w:name="biology-and-composition-inputs"/>
     <w:p>
       <w:pPr>
         <w:pStyle w:val="Heading2"/>
@@ -5599,7 +7432,7 @@
         <w:t xml:space="preserve">Biology and Composition Inputs</w:t>
       </w:r>
     </w:p>
-    <w:bookmarkStart w:id="68" w:name="biology"/>
+    <w:bookmarkStart w:id="71" w:name="biology"/>
     <w:p>
       <w:pPr>
         <w:pStyle w:val="Heading3"/>
@@ -5612,7 +7445,7 @@
       <w:pPr>
         <w:pStyle w:val="FirstParagraph"/>
       </w:pPr>
-      <w:hyperlink r:id="rId67">
+      <w:hyperlink r:id="rId70">
         <w:r>
           <w:rPr>
             <w:rStyle w:val="Hyperlink"/>
@@ -5635,8 +7468,8 @@
         <w:t xml:space="preserve">Key report use: document accepted biological assumptions and identify sensitivity tests that should be carried into assessment or OM conditioning.</w:t>
       </w:r>
     </w:p>
-    <w:bookmarkEnd w:id="68"/>
-    <w:bookmarkStart w:id="70" w:name="peru-length-weight-relationship"/>
+    <w:bookmarkEnd w:id="71"/>
+    <w:bookmarkStart w:id="73" w:name="peru-length-weight-relationship"/>
     <w:p>
       <w:pPr>
         <w:pStyle w:val="Heading3"/>
@@ -5649,7 +7482,7 @@
       <w:pPr>
         <w:pStyle w:val="FirstParagraph"/>
       </w:pPr>
-      <w:hyperlink r:id="rId69">
+      <w:hyperlink r:id="rId72">
         <w:r>
           <w:rPr>
             <w:rStyle w:val="Hyperlink"/>
@@ -5672,8 +7505,8 @@
         <w:t xml:space="preserve">Key report use: evaluate whether Peru-specific length-weight information affects biomass conversion, biological assumptions, or regional differences in assessment inputs.</w:t>
       </w:r>
     </w:p>
-    <w:bookmarkEnd w:id="70"/>
-    <w:bookmarkStart w:id="72" w:name="peru-length-frequency-update"/>
+    <w:bookmarkEnd w:id="73"/>
+    <w:bookmarkStart w:id="75" w:name="peru-length-frequency-update"/>
     <w:p>
       <w:pPr>
         <w:pStyle w:val="Heading3"/>
@@ -5686,7 +7519,7 @@
       <w:pPr>
         <w:pStyle w:val="FirstParagraph"/>
       </w:pPr>
-      <w:hyperlink r:id="rId71">
+      <w:hyperlink r:id="rId74">
         <w:r>
           <w:rPr>
             <w:rStyle w:val="Hyperlink"/>
@@ -5709,9 +7542,9 @@
         <w:t xml:space="preserve">Key report use: document the composition-data evidence available for the far-north stock and decide how it should be used in assessment and stock-structure discussions.</w:t>
       </w:r>
     </w:p>
-    <w:bookmarkEnd w:id="72"/>
-    <w:bookmarkEnd w:id="73"/>
-    <w:bookmarkStart w:id="76" w:name="data-quality-and-supporting-evidence"/>
+    <w:bookmarkEnd w:id="75"/>
+    <w:bookmarkEnd w:id="76"/>
+    <w:bookmarkStart w:id="79" w:name="data-quality-and-supporting-evidence"/>
     <w:p>
       <w:pPr>
         <w:pStyle w:val="Heading2"/>
@@ -5720,7 +7553,7 @@
         <w:t xml:space="preserve">Data Quality and Supporting Evidence</w:t>
       </w:r>
     </w:p>
-    <w:bookmarkStart w:id="75" w:name="catchfishery-data-quality-checks"/>
+    <w:bookmarkStart w:id="78" w:name="catchfishery-data-quality-checks"/>
     <w:p>
       <w:pPr>
         <w:pStyle w:val="Heading3"/>
@@ -5733,7 +7566,7 @@
       <w:pPr>
         <w:pStyle w:val="FirstParagraph"/>
       </w:pPr>
-      <w:hyperlink r:id="rId74">
+      <w:hyperlink r:id="rId77">
         <w:r>
           <w:rPr>
             <w:rStyle w:val="Hyperlink"/>
@@ -5756,10 +7589,10 @@
         <w:t xml:space="preserve">Key report use: use as a support screen for catch- and fishery-dependent indices, and document any data-quality issues that affect benchmark decisions.</w:t>
       </w:r>
     </w:p>
-    <w:bookmarkEnd w:id="75"/>
-    <w:bookmarkEnd w:id="76"/>
-    <w:bookmarkEnd w:id="77"/>
-    <w:bookmarkStart w:id="87" w:name="appendix-d.-day-1-presentations"/>
+    <w:bookmarkEnd w:id="78"/>
+    <w:bookmarkEnd w:id="79"/>
+    <w:bookmarkEnd w:id="80"/>
+    <w:bookmarkStart w:id="90" w:name="appendix-d.-day-1-presentations"/>
     <w:p>
       <w:pPr>
         <w:pStyle w:val="Heading1"/>
@@ -5857,7 +7690,7 @@
             <w:pPr>
               <w:pStyle w:val="Compact"/>
             </w:pPr>
-            <w:hyperlink r:id="rId78">
+            <w:hyperlink r:id="rId81">
               <w:r>
                 <w:rPr>
                   <w:rStyle w:val="Hyperlink"/>
@@ -5908,7 +7741,7 @@
             <w:pPr>
               <w:pStyle w:val="Compact"/>
             </w:pPr>
-            <w:hyperlink r:id="rId79">
+            <w:hyperlink r:id="rId82">
               <w:r>
                 <w:rPr>
                   <w:rStyle w:val="Hyperlink"/>
@@ -5959,7 +7792,7 @@
             <w:pPr>
               <w:pStyle w:val="Compact"/>
             </w:pPr>
-            <w:hyperlink r:id="rId80">
+            <w:hyperlink r:id="rId83">
               <w:r>
                 <w:rPr>
                   <w:rStyle w:val="Hyperlink"/>
@@ -6010,7 +7843,7 @@
             <w:pPr>
               <w:pStyle w:val="Compact"/>
             </w:pPr>
-            <w:hyperlink r:id="rId81">
+            <w:hyperlink r:id="rId84">
               <w:r>
                 <w:rPr>
                   <w:rStyle w:val="Hyperlink"/>
@@ -6038,7 +7871,7 @@
             <w:pPr>
               <w:pStyle w:val="Compact"/>
             </w:pPr>
-            <w:hyperlink r:id="rId62">
+            <w:hyperlink r:id="rId65">
               <w:r>
                 <w:rPr>
                   <w:rStyle w:val="Hyperlink"/>
@@ -6078,7 +7911,7 @@
             <w:pPr>
               <w:pStyle w:val="Compact"/>
             </w:pPr>
-            <w:hyperlink r:id="rId82">
+            <w:hyperlink r:id="rId85">
               <w:r>
                 <w:rPr>
                   <w:rStyle w:val="Hyperlink"/>
@@ -6094,7 +7927,7 @@
             <w:pPr>
               <w:pStyle w:val="Compact"/>
             </w:pPr>
-            <w:hyperlink r:id="rId58">
+            <w:hyperlink r:id="rId61">
               <w:r>
                 <w:rPr>
                   <w:rStyle w:val="Hyperlink"/>
@@ -6134,7 +7967,7 @@
             <w:pPr>
               <w:pStyle w:val="Compact"/>
             </w:pPr>
-            <w:hyperlink r:id="rId83">
+            <w:hyperlink r:id="rId86">
               <w:r>
                 <w:rPr>
                   <w:rStyle w:val="Hyperlink"/>
@@ -6150,7 +7983,7 @@
             <w:pPr>
               <w:pStyle w:val="Compact"/>
             </w:pPr>
-            <w:hyperlink r:id="rId60">
+            <w:hyperlink r:id="rId63">
               <w:r>
                 <w:rPr>
                   <w:rStyle w:val="Hyperlink"/>
@@ -6190,7 +8023,7 @@
             <w:pPr>
               <w:pStyle w:val="Compact"/>
             </w:pPr>
-            <w:hyperlink r:id="rId84">
+            <w:hyperlink r:id="rId87">
               <w:r>
                 <w:rPr>
                   <w:rStyle w:val="Hyperlink"/>
@@ -6206,7 +8039,7 @@
             <w:pPr>
               <w:pStyle w:val="Compact"/>
             </w:pPr>
-            <w:hyperlink r:id="rId64">
+            <w:hyperlink r:id="rId67">
               <w:r>
                 <w:rPr>
                   <w:rStyle w:val="Hyperlink"/>
@@ -6246,7 +8079,7 @@
             <w:pPr>
               <w:pStyle w:val="Compact"/>
             </w:pPr>
-            <w:hyperlink r:id="rId85">
+            <w:hyperlink r:id="rId88">
               <w:r>
                 <w:rPr>
                   <w:rStyle w:val="Hyperlink"/>
@@ -6297,7 +8130,7 @@
             <w:pPr>
               <w:pStyle w:val="Compact"/>
             </w:pPr>
-            <w:hyperlink r:id="rId86">
+            <w:hyperlink r:id="rId89">
               <w:r>
                 <w:rPr>
                   <w:rStyle w:val="Hyperlink"/>
@@ -6485,7 +8318,7 @@
         </w:tc>
       </w:tr>
     </w:tbl>
-    <w:bookmarkEnd w:id="87"/>
+    <w:bookmarkEnd w:id="90"/>
     <w:sectPr>
       <w:footnotePr>
         <w:numRestart w:val="eachSect"/>

</xml_diff>

<commit_message>
Update benchmark report appendix and checklist
</commit_message>
<xml_diff>
--- a/docs/JMWG-Benchmark-Meeting-report-2026.docx
+++ b/docs/JMWG-Benchmark-Meeting-report-2026.docx
@@ -139,7 +139,7 @@
         <w:pStyle w:val="BodyText"/>
       </w:pPr>
       <w:r>
-        <w:t xml:space="preserve">19 May 2026</w:t>
+        <w:t xml:space="preserve">20 May 2026</w:t>
       </w:r>
     </w:p>
     <w:bookmarkStart w:id="12" w:name="summary"/>
@@ -536,7 +536,7 @@
       </w:r>
     </w:p>
     <w:bookmarkEnd w:id="18"/>
-    <w:bookmarkStart w:id="31" w:name="key-discussion-summary"/>
+    <w:bookmarkStart w:id="29" w:name="key-discussion-summary"/>
     <w:p>
       <w:pPr>
         <w:pStyle w:val="Heading1"/>
@@ -545,7 +545,7 @@
         <w:t xml:space="preserve">Key Discussion Summary</w:t>
       </w:r>
     </w:p>
-    <w:bookmarkStart w:id="23" w:name="acoustic-indices"/>
+    <w:bookmarkStart w:id="22" w:name="acoustic-indices"/>
     <w:p>
       <w:pPr>
         <w:pStyle w:val="Heading2"/>
@@ -575,7 +575,19 @@
         <w:pStyle w:val="BodyText"/>
       </w:pPr>
       <w:r>
-        <w:t xml:space="preserve">A Day 1 presentation crosswalk is provided in Appendix D. That table should be updated as presenters confirm titles, authors, and whether each presentation should be cited as a working paper, supporting presentation, or meeting-record item.</w:t>
+        <w:t xml:space="preserve">Presentation summaries are provided in Appendix D. Those tables should be updated</w:t>
+      </w:r>
+      <w:r>
+        <w:t xml:space="preserve"> </w:t>
+      </w:r>
+      <w:r>
+        <w:t xml:space="preserve">as presenters confirm titles, authors, and whether each presentation should be</w:t>
+      </w:r>
+      <w:r>
+        <w:t xml:space="preserve"> </w:t>
+      </w:r>
+      <w:r>
+        <w:t xml:space="preserve">cited as a working paper, supporting presentation, or meeting-record item.</w:t>
       </w:r>
     </w:p>
     <w:tbl>
@@ -1303,6 +1315,9 @@
             <w:pPr>
               <w:pStyle w:val="BodyText"/>
             </w:pPr>
+            <w:pPr>
+              <w:spacing w:after="16"/>
+            </w:pPr>
             <w:r>
               <w:t xml:space="preserve">The meeting identified a need for a dedicated analysis that compares acoustic</w:t>
             </w:r>
@@ -1349,559 +1364,12 @@
               <w:t xml:space="preserve">supporting context.</w:t>
             </w:r>
           </w:p>
-          <w:bookmarkStart w:id="22" w:name="day-1-requests"/>
-          <w:p>
-            <w:pPr>
-              <w:pStyle w:val="Heading3"/>
-            </w:pPr>
-            <w:r>
-              <w:t xml:space="preserve">Day 1 Requests</w:t>
-            </w:r>
-          </w:p>
-          <w:p>
-            <w:pPr>
-              <w:pStyle w:val="FirstParagraph"/>
-            </w:pPr>
-            <w:r>
-              <w:t xml:space="preserve">The following requests were identified during the Day 1 acoustic session and</w:t>
-            </w:r>
-            <w:r>
-              <w:t xml:space="preserve"> </w:t>
-            </w:r>
-            <w:r>
-              <w:t xml:space="preserve">should be tracked separately from general discussion notes.</w:t>
-            </w:r>
-          </w:p>
-          <w:tbl>
-            <w:tblPr>
-              <w:tblStyle w:val="Table"/>
-              <w:tblW w:type="pct" w:w="5000"/>
-              <w:tblLayout w:type="fixed"/>
-              <w:tblLook w:firstRow="1" w:lastRow="0" w:firstColumn="0" w:lastColumn="0" w:noHBand="0" w:noVBand="0" w:val="0020"/>
-            </w:tblPr>
-            <w:tblGrid>
-              <w:gridCol w:w="1980"/>
-              <w:gridCol w:w="1980"/>
-              <w:gridCol w:w="1980"/>
-              <w:gridCol w:w="1980"/>
-            </w:tblGrid>
-            <w:tr>
-              <w:trPr>
-                <w:tblHeader w:val="on"/>
-              </w:trPr>
-              <w:tc>
-                <w:tcPr/>
-                <w:p>
-                  <w:pPr>
-                    <w:pStyle w:val="Compact"/>
-                  </w:pPr>
-                  <w:r>
-                    <w:t xml:space="preserve">Request</w:t>
-                  </w:r>
-                </w:p>
-              </w:tc>
-              <w:tc>
-                <w:tcPr/>
-                <w:p>
-                  <w:pPr>
-                    <w:pStyle w:val="Compact"/>
-                  </w:pPr>
-                  <w:r>
-                    <w:t xml:space="preserve">Requested product</w:t>
-                  </w:r>
-                </w:p>
-              </w:tc>
-              <w:tc>
-                <w:tcPr/>
-                <w:p>
-                  <w:pPr>
-                    <w:pStyle w:val="Compact"/>
-                  </w:pPr>
-                  <w:r>
-                    <w:t xml:space="preserve">Lead / source</w:t>
-                  </w:r>
-                </w:p>
-              </w:tc>
-              <w:tc>
-                <w:tcPr/>
-                <w:p>
-                  <w:pPr>
-                    <w:pStyle w:val="Compact"/>
-                  </w:pPr>
-                  <w:r>
-                    <w:t xml:space="preserve">Purpose</w:t>
-                  </w:r>
-                </w:p>
-              </w:tc>
-            </w:tr>
-            <w:tr>
-              <w:tc>
-                <w:tcPr/>
-                <w:p>
-                  <w:pPr>
-                    <w:pStyle w:val="Compact"/>
-                  </w:pPr>
-                  <w:r>
-                    <w:t xml:space="preserve">Data extent for all index analyses</w:t>
-                  </w:r>
-                </w:p>
-              </w:tc>
-              <w:tc>
-                <w:tcPr/>
-                <w:p>
-                  <w:pPr>
-                    <w:pStyle w:val="Compact"/>
-                  </w:pPr>
-                  <w:r>
-                    <w:t xml:space="preserve">For each acoustic and CPUE analysis, provide years covered, spatial extent, fleet or survey coverage, observation unit, sample sizes, treatment of missing data, uncertainty, and expansion method.</w:t>
-                  </w:r>
-                </w:p>
-              </w:tc>
-              <w:tc>
-                <w:tcPr/>
-                <w:p>
-                  <w:pPr>
-                    <w:pStyle w:val="Compact"/>
-                  </w:pPr>
-                  <w:r>
-                    <w:t xml:space="preserve">All index contributors</w:t>
-                  </w:r>
-                </w:p>
-              </w:tc>
-              <w:tc>
-                <w:tcPr/>
-                <w:p>
-                  <w:pPr>
-                    <w:pStyle w:val="Compact"/>
-                  </w:pPr>
-                  <w:r>
-                    <w:t xml:space="preserve">Allow the benchmark to evaluate representativeness, data support, and suitability for assessment, OM conditioning, or MP use.</w:t>
-                  </w:r>
-                </w:p>
-              </w:tc>
-            </w:tr>
-            <w:tr>
-              <w:tc>
-                <w:tcPr/>
-                <w:p>
-                  <w:pPr>
-                    <w:pStyle w:val="Compact"/>
-                  </w:pPr>
-                  <w:r>
-                    <w:t xml:space="preserve">Presentation/report summaries</w:t>
-                  </w:r>
-                </w:p>
-              </w:tc>
-              <w:tc>
-                <w:tcPr/>
-                <w:p>
-                  <w:pPr>
-                    <w:pStyle w:val="Compact"/>
-                  </w:pPr>
-                  <w:r>
-                    <w:t xml:space="preserve">Each technical discussion should leave short report-ready text summarizing decisions, unresolved issues, data requests, and follow-up tasks.</w:t>
-                  </w:r>
-                </w:p>
-              </w:tc>
-              <w:tc>
-                <w:tcPr/>
-                <w:p>
-                  <w:pPr>
-                    <w:pStyle w:val="Compact"/>
-                  </w:pPr>
-                  <w:r>
-                    <w:t xml:space="preserve">Session leads / rapporteurs</w:t>
-                  </w:r>
-                </w:p>
-              </w:tc>
-              <w:tc>
-                <w:tcPr/>
-                <w:p>
-                  <w:pPr>
-                    <w:pStyle w:val="Compact"/>
-                  </w:pPr>
-                  <w:r>
-                    <w:t xml:space="preserve">Keep the benchmark report current enough to support intersessional Scientific Committee approval and the June MSE workshop.</w:t>
-                  </w:r>
-                </w:p>
-              </w:tc>
-            </w:tr>
-            <w:tr>
-              <w:tc>
-                <w:tcPr/>
-                <w:p>
-                  <w:pPr>
-                    <w:pStyle w:val="Compact"/>
-                  </w:pPr>
-                  <w:r>
-                    <w:t xml:space="preserve">Public access to presentations</w:t>
-                  </w:r>
-                </w:p>
-              </w:tc>
-              <w:tc>
-                <w:tcPr/>
-                <w:p>
-                  <w:pPr>
-                    <w:pStyle w:val="Compact"/>
-                  </w:pPr>
-                  <w:r>
-                    <w:t xml:space="preserve">Clarify whether presentations can be made available to the full Scientific Committee.</w:t>
-                  </w:r>
-                </w:p>
-              </w:tc>
-              <w:tc>
-                <w:tcPr/>
-                <w:p>
-                  <w:pPr>
-                    <w:pStyle w:val="Compact"/>
-                  </w:pPr>
-                  <w:r>
-                    <w:t xml:space="preserve">Secretariat / presenters</w:t>
-                  </w:r>
-                </w:p>
-              </w:tc>
-              <w:tc>
-                <w:tcPr/>
-                <w:p>
-                  <w:pPr>
-                    <w:pStyle w:val="Compact"/>
-                  </w:pPr>
-                  <w:r>
-                    <w:t xml:space="preserve">Ensure the Scientific Committee can review the evidence base supporting benchmark recommendations.</w:t>
-                  </w:r>
-                </w:p>
-              </w:tc>
-            </w:tr>
-            <w:tr>
-              <w:tc>
-                <w:tcPr/>
-                <w:p>
-                  <w:pPr>
-                    <w:pStyle w:val="Compact"/>
-                  </w:pPr>
-                  <w:r>
-                    <w:t xml:space="preserve">Chile north acoustic survey metadata</w:t>
-                  </w:r>
-                </w:p>
-              </w:tc>
-              <w:tc>
-                <w:tcPr/>
-                <w:p>
-                  <w:pPr>
-                    <w:pStyle w:val="Compact"/>
-                  </w:pPr>
-                  <w:r>
-                    <w:t xml:space="preserve">Provide a table by year, where possible, with number of transects, area covered, number of trawls or biological samples used for backscatter interpretation, length-frequency data, and expansion information.</w:t>
-                  </w:r>
-                </w:p>
-              </w:tc>
-              <w:tc>
-                <w:tcPr/>
-                <w:p>
-                  <w:pPr>
-                    <w:pStyle w:val="Compact"/>
-                  </w:pPr>
-                  <w:r>
-                    <w:t xml:space="preserve">Chile acoustic contributors</w:t>
-                  </w:r>
-                </w:p>
-              </w:tc>
-              <w:tc>
-                <w:tcPr/>
-                <w:p>
-                  <w:pPr>
-                    <w:pStyle w:val="Compact"/>
-                  </w:pPr>
-                  <w:r>
-                    <w:t xml:space="preserve">Compare 2024-2026 survey data extent with previous years and evaluate survey support for candidate acoustic indices.</w:t>
-                  </w:r>
-                </w:p>
-              </w:tc>
-            </w:tr>
-            <w:tr>
-              <w:tc>
-                <w:tcPr/>
-                <w:p>
-                  <w:pPr>
-                    <w:pStyle w:val="Compact"/>
-                  </w:pPr>
-                  <w:r>
-                    <w:t xml:space="preserve">Chile north acoustic table clarification</w:t>
-                  </w:r>
-                </w:p>
-              </w:tc>
-              <w:tc>
-                <w:tcPr/>
-                <w:p>
-                  <w:pPr>
-                    <w:pStyle w:val="Compact"/>
-                  </w:pPr>
-                  <w:r>
-                    <w:t xml:space="preserve">Clarify the distinction between total survey area, area containing jack mackerel, NASC density, and biomass-related quantities in the presented survey table.</w:t>
-                  </w:r>
-                </w:p>
-              </w:tc>
-              <w:tc>
-                <w:tcPr/>
-                <w:p>
-                  <w:pPr>
-                    <w:pStyle w:val="Compact"/>
-                  </w:pPr>
-                  <w:r>
-                    <w:t xml:space="preserve">Chile acoustic contributors</w:t>
-                  </w:r>
-                </w:p>
-              </w:tc>
-              <w:tc>
-                <w:tcPr/>
-                <w:p>
-                  <w:pPr>
-                    <w:pStyle w:val="Compact"/>
-                  </w:pPr>
-                  <w:r>
-                    <w:t xml:space="preserve">Avoid confusion between survey domain, occupied area, density, and biomass interpretation.</w:t>
-                  </w:r>
-                </w:p>
-              </w:tc>
-            </w:tr>
-            <w:tr>
-              <w:tc>
-                <w:tcPr/>
-                <w:p>
-                  <w:pPr>
-                    <w:pStyle w:val="Compact"/>
-                  </w:pPr>
-                  <w:r>
-                    <w:t xml:space="preserve">Chile central-south acoustic exclusion rationale</w:t>
-                  </w:r>
-                </w:p>
-              </w:tc>
-              <w:tc>
-                <w:tcPr/>
-                <w:p>
-                  <w:pPr>
-                    <w:pStyle w:val="Compact"/>
-                  </w:pPr>
-                  <w:r>
-                    <w:t xml:space="preserve">Draft a paragraph explaining why central-south acoustic data, including 2012, 2015, 2017, 2020, 2021, and 2023, have not been used in the assessment and whether a benchmark sensitivity is warranted.</w:t>
-                  </w:r>
-                </w:p>
-              </w:tc>
-              <w:tc>
-                <w:tcPr/>
-                <w:p>
-                  <w:pPr>
-                    <w:pStyle w:val="Compact"/>
-                  </w:pPr>
-                  <w:r>
-                    <w:t xml:space="preserve">Chile acoustic / assessment contributors</w:t>
-                  </w:r>
-                </w:p>
-              </w:tc>
-              <w:tc>
-                <w:tcPr/>
-                <w:p>
-                  <w:pPr>
-                    <w:pStyle w:val="Compact"/>
-                  </w:pPr>
-                  <w:r>
-                    <w:t xml:space="preserve">Document whether exclusion is due to survey design, representativeness, data quality, model behaviour, or insufficient documentation.</w:t>
-                  </w:r>
-                </w:p>
-              </w:tc>
-            </w:tr>
-            <w:tr>
-              <w:tc>
-                <w:tcPr/>
-                <w:p>
-                  <w:pPr>
-                    <w:pStyle w:val="Compact"/>
-                  </w:pPr>
-                  <w:r>
-                    <w:t xml:space="preserve">Cross-year acoustic data comparison</w:t>
-                  </w:r>
-                </w:p>
-              </w:tc>
-              <w:tc>
-                <w:tcPr/>
-                <w:p>
-                  <w:pPr>
-                    <w:pStyle w:val="Compact"/>
-                  </w:pPr>
-                  <w:r>
-                    <w:t xml:space="preserve">Prepare a dedicated analysis comparing survey extent, backscatter, biological sampling, length-frequency data, and numbers-at-age across years and regions.</w:t>
-                  </w:r>
-                </w:p>
-              </w:tc>
-              <w:tc>
-                <w:tcPr/>
-                <w:p>
-                  <w:pPr>
-                    <w:pStyle w:val="Compact"/>
-                  </w:pPr>
-                  <w:r>
-                    <w:t xml:space="preserve">Acoustic/index subgroup</w:t>
-                  </w:r>
-                </w:p>
-              </w:tc>
-              <w:tc>
-                <w:tcPr/>
-                <w:p>
-                  <w:pPr>
-                    <w:pStyle w:val="Compact"/>
-                  </w:pPr>
-                  <w:r>
-                    <w:t xml:space="preserve">Put northern Chile, central-south Chile, Peru, and fishery-dependent acoustic products on a common evidence basis.</w:t>
-                  </w:r>
-                </w:p>
-              </w:tc>
-            </w:tr>
-            <w:tr>
-              <w:tc>
-                <w:tcPr/>
-                <w:p>
-                  <w:pPr>
-                    <w:pStyle w:val="Compact"/>
-                  </w:pPr>
-                  <w:r>
-                    <w:t xml:space="preserve">Peru acoustic backscatter and length composition</w:t>
-                  </w:r>
-                </w:p>
-              </w:tc>
-              <w:tc>
-                <w:tcPr/>
-                <w:p>
-                  <w:pPr>
-                    <w:pStyle w:val="Compact"/>
-                  </w:pPr>
-                  <w:r>
-                    <w:t xml:space="preserve">Provide acoustic survey backscatter and associated length-composition data, with metadata on survey timing, spatial extent, transect coverage, biological sampling, length type, and uncertainty.</w:t>
-                  </w:r>
-                </w:p>
-              </w:tc>
-              <w:tc>
-                <w:tcPr/>
-                <w:p>
-                  <w:pPr>
-                    <w:pStyle w:val="Compact"/>
-                  </w:pPr>
-                  <w:r>
-                    <w:t xml:space="preserve">Peru acoustic contributors</w:t>
-                  </w:r>
-                </w:p>
-              </w:tc>
-              <w:tc>
-                <w:tcPr/>
-                <w:p>
-                  <w:pPr>
-                    <w:pStyle w:val="Compact"/>
-                  </w:pPr>
-                  <w:r>
-                    <w:t xml:space="preserve">Evaluate whether Peru acoustic information can be used as an index, sensitivity, OM input, or diagnostic.</w:t>
-                  </w:r>
-                </w:p>
-              </w:tc>
-            </w:tr>
-            <w:tr>
-              <w:tc>
-                <w:tcPr/>
-                <w:p>
-                  <w:pPr>
-                    <w:pStyle w:val="Compact"/>
-                  </w:pPr>
-                  <w:r>
-                    <w:t xml:space="preserve">Peru acoustic assessment treatment check</w:t>
-                  </w:r>
-                </w:p>
-              </w:tc>
-              <w:tc>
-                <w:tcPr/>
-                <w:p>
-                  <w:pPr>
-                    <w:pStyle w:val="Compact"/>
-                  </w:pPr>
-                  <w:r>
-                    <w:t xml:space="preserve">Check current assessment treatment of the Peru acoustic index, including selectivity, catchability, CV assumptions, relationship to Peru CPUE, and possible pre-/post-1997/1998 treatment.</w:t>
-                  </w:r>
-                </w:p>
-              </w:tc>
-              <w:tc>
-                <w:tcPr/>
-                <w:p>
-                  <w:pPr>
-                    <w:pStyle w:val="Compact"/>
-                  </w:pPr>
-                  <w:r>
-                    <w:t xml:space="preserve">Assessment subgroup</w:t>
-                  </w:r>
-                </w:p>
-              </w:tc>
-              <w:tc>
-                <w:tcPr/>
-                <w:p>
-                  <w:pPr>
-                    <w:pStyle w:val="Compact"/>
-                  </w:pPr>
-                  <w:r>
-                    <w:t xml:space="preserve">Determine whether the current model treatment is defensible and whether reintroduction or split-index treatment should be tested.</w:t>
-                  </w:r>
-                </w:p>
-              </w:tc>
-            </w:tr>
-            <w:tr>
-              <w:tc>
-                <w:tcPr/>
-                <w:p>
-                  <w:pPr>
-                    <w:pStyle w:val="Compact"/>
-                  </w:pPr>
-                  <w:r>
-                    <w:t xml:space="preserve">Chile central-south acoustic sensitivity</w:t>
-                  </w:r>
-                </w:p>
-              </w:tc>
-              <w:tc>
-                <w:tcPr/>
-                <w:p>
-                  <w:pPr>
-                    <w:pStyle w:val="Compact"/>
-                  </w:pPr>
-                  <w:r>
-                    <w:t xml:space="preserve">Evaluate whether updated central-south acoustic data through 2023 should be included as a sensitivity or retained as diagnostic information.</w:t>
-                  </w:r>
-                </w:p>
-              </w:tc>
-              <w:tc>
-                <w:tcPr/>
-                <w:p>
-                  <w:pPr>
-                    <w:pStyle w:val="Compact"/>
-                  </w:pPr>
-                  <w:r>
-                    <w:t xml:space="preserve">Assessment subgroup / Chile contributors</w:t>
-                  </w:r>
-                </w:p>
-              </w:tc>
-              <w:tc>
-                <w:tcPr/>
-                <w:p>
-                  <w:pPr>
-                    <w:pStyle w:val="Compact"/>
-                  </w:pPr>
-                  <w:r>
-                    <w:t xml:space="preserve">Decide whether unused central-south acoustic information should be tested in the benchmark model set.</w:t>
-                  </w:r>
-                </w:p>
-              </w:tc>
-            </w:tr>
-          </w:tbl>
           <w:p/>
         </w:tc>
       </w:tr>
     </w:tbl>
     <w:bookmarkEnd w:id="22"/>
-    <w:bookmarkEnd w:id="23"/>
-    <w:bookmarkStart w:id="27" w:name="cpue-indices"/>
+    <w:bookmarkStart w:id="25" w:name="cpue-indices"/>
     <w:p>
       <w:pPr>
         <w:pStyle w:val="Heading2"/>
@@ -1998,12 +1466,12 @@
                 <wp:inline>
                   <wp:extent cx="152400" cy="152400"/>
                   <wp:effectExtent b="0" l="0" r="0" t="0"/>
-                  <wp:docPr descr="" title="" id="24" name="Picture"/>
+                  <wp:docPr descr="" title="" id="23" name="Picture"/>
                   <a:graphic>
                     <a:graphicData uri="http://schemas.openxmlformats.org/drawingml/2006/picture">
                       <pic:pic>
                         <pic:nvPicPr>
-                          <pic:cNvPr descr="/Applications/quarto/share/formats/docx/note.png" id="25" name="Picture"/>
+                          <pic:cNvPr descr="/Applications/quarto/share/formats/docx/note.png" id="24" name="Picture"/>
                           <pic:cNvPicPr>
                             <a:picLocks noChangeArrowheads="1" noChangeAspect="1"/>
                           </pic:cNvPicPr>
@@ -2509,6 +1977,9 @@
             <w:pPr>
               <w:pStyle w:val="BodyText"/>
             </w:pPr>
+            <w:pPr>
+              <w:spacing w:after="16"/>
+            </w:pPr>
             <w:r>
               <w:t xml:space="preserve">The offshore CPUE discussion included the treatment of a catchability break in</w:t>
             </w:r>
@@ -2543,687 +2014,54 @@
               <w:t xml:space="preserve">effects, or residual year effects.</w:t>
             </w:r>
           </w:p>
-          <w:bookmarkStart w:id="26" w:name="day-2-requests"/>
-          <w:p>
-            <w:pPr>
-              <w:pStyle w:val="Heading3"/>
-            </w:pPr>
-            <w:r>
-              <w:t xml:space="preserve">Day 2 Requests</w:t>
-            </w:r>
-          </w:p>
-          <w:p>
-            <w:pPr>
-              <w:pStyle w:val="FirstParagraph"/>
-            </w:pPr>
-            <w:r>
-              <w:t xml:space="preserve">The following requests were identified during the Day 2 CPUE and data-quality</w:t>
-            </w:r>
-            <w:r>
-              <w:t xml:space="preserve"> </w:t>
-            </w:r>
-            <w:r>
-              <w:t xml:space="preserve">session and should be tracked separately from general discussion notes.</w:t>
-            </w:r>
-          </w:p>
-          <w:tbl>
-            <w:tblPr>
-              <w:tblStyle w:val="Table"/>
-              <w:tblW w:type="pct" w:w="5000"/>
-              <w:tblLayout w:type="fixed"/>
-              <w:tblLook w:firstRow="1" w:lastRow="0" w:firstColumn="0" w:lastColumn="0" w:noHBand="0" w:noVBand="0" w:val="0020"/>
-            </w:tblPr>
-            <w:tblGrid>
-              <w:gridCol w:w="1980"/>
-              <w:gridCol w:w="1980"/>
-              <w:gridCol w:w="1980"/>
-              <w:gridCol w:w="1980"/>
-            </w:tblGrid>
-            <w:tr>
-              <w:trPr>
-                <w:tblHeader w:val="on"/>
-              </w:trPr>
-              <w:tc>
-                <w:tcPr/>
-                <w:p>
-                  <w:pPr>
-                    <w:pStyle w:val="Compact"/>
-                  </w:pPr>
-                  <w:r>
-                    <w:t xml:space="preserve">Request</w:t>
-                  </w:r>
-                </w:p>
-              </w:tc>
-              <w:tc>
-                <w:tcPr/>
-                <w:p>
-                  <w:pPr>
-                    <w:pStyle w:val="Compact"/>
-                  </w:pPr>
-                  <w:r>
-                    <w:t xml:space="preserve">Requested product</w:t>
-                  </w:r>
-                </w:p>
-              </w:tc>
-              <w:tc>
-                <w:tcPr/>
-                <w:p>
-                  <w:pPr>
-                    <w:pStyle w:val="Compact"/>
-                  </w:pPr>
-                  <w:r>
-                    <w:t xml:space="preserve">Lead / source</w:t>
-                  </w:r>
-                </w:p>
-              </w:tc>
-              <w:tc>
-                <w:tcPr/>
-                <w:p>
-                  <w:pPr>
-                    <w:pStyle w:val="Compact"/>
-                  </w:pPr>
-                  <w:r>
-                    <w:t xml:space="preserve">Purpose</w:t>
-                  </w:r>
-                </w:p>
-              </w:tc>
-            </w:tr>
-            <w:tr>
-              <w:tc>
-                <w:tcPr/>
-                <w:p>
-                  <w:pPr>
-                    <w:pStyle w:val="Compact"/>
-                  </w:pPr>
-                  <w:r>
-                    <w:t xml:space="preserve">Catch/fishery data workflow statement</w:t>
-                  </w:r>
-                </w:p>
-              </w:tc>
-              <w:tc>
-                <w:tcPr/>
-                <w:p>
-                  <w:pPr>
-                    <w:pStyle w:val="Compact"/>
-                  </w:pPr>
-                  <w:r>
-                    <w:t xml:space="preserve">Draft a paragraph explaining the JMWG’s compressed data schedule, the current template-based submission routine, and why database development alone will not resolve near-term benchmark data needs.</w:t>
-                  </w:r>
-                </w:p>
-              </w:tc>
-              <w:tc>
-                <w:tcPr/>
-                <w:p>
-                  <w:pPr>
-                    <w:pStyle w:val="Compact"/>
-                  </w:pPr>
-                  <w:r>
-                    <w:t xml:space="preserve">Data-quality subgroup / Chair / Secretariat</w:t>
-                  </w:r>
-                </w:p>
-              </w:tc>
-              <w:tc>
-                <w:tcPr/>
-                <w:p>
-                  <w:pPr>
-                    <w:pStyle w:val="Compact"/>
-                  </w:pPr>
-                  <w:r>
-                    <w:t xml:space="preserve">Document why the current workflow is used and what should be improved without disrupting immediate assessment preparation.</w:t>
-                  </w:r>
-                </w:p>
-              </w:tc>
-            </w:tr>
-            <w:tr>
-              <w:tc>
-                <w:tcPr/>
-                <w:p>
-                  <w:pPr>
-                    <w:pStyle w:val="Compact"/>
-                  </w:pPr>
-                  <w:r>
-                    <w:t xml:space="preserve">Post data-quality checks</w:t>
-                  </w:r>
-                </w:p>
-              </w:tc>
-              <w:tc>
-                <w:tcPr/>
-                <w:p>
-                  <w:pPr>
-                    <w:pStyle w:val="Compact"/>
-                  </w:pPr>
-                  <w:r>
-                    <w:t xml:space="preserve">Post the catch and fishery data quality-check material to the</w:t>
-                  </w:r>
-                  <w:r>
-                    <w:t xml:space="preserve"> </w:t>
-                  </w:r>
-                  <w:r>
-                    <w:rPr>
-                      <w:rStyle w:val="VerbatimChar"/>
-                    </w:rPr>
-                    <w:t xml:space="preserve">jjmData</w:t>
-                  </w:r>
-                  <w:r>
-                    <w:t xml:space="preserve"> </w:t>
-                  </w:r>
-                  <w:r>
-                    <w:t xml:space="preserve">GitHub repository.</w:t>
-                  </w:r>
-                </w:p>
-              </w:tc>
-              <w:tc>
-                <w:tcPr/>
-                <w:p>
-                  <w:pPr>
-                    <w:pStyle w:val="Compact"/>
-                  </w:pPr>
-                  <w:r>
-                    <w:t xml:space="preserve">Data-quality subgroup</w:t>
-                  </w:r>
-                </w:p>
-              </w:tc>
-              <w:tc>
-                <w:tcPr/>
-                <w:p>
-                  <w:pPr>
-                    <w:pStyle w:val="Compact"/>
-                  </w:pPr>
-                  <w:r>
-                    <w:t xml:space="preserve">Make diagnostics and checks visible to members working on assessment inputs.</w:t>
-                  </w:r>
-                </w:p>
-              </w:tc>
-            </w:tr>
-            <w:tr>
-              <w:tc>
-                <w:tcPr/>
-                <w:p>
-                  <w:pPr>
-                    <w:pStyle w:val="Compact"/>
-                  </w:pPr>
-                  <w:r>
-                    <w:t xml:space="preserve">Clarify sampling and ALK sample sizes</w:t>
-                  </w:r>
-                </w:p>
-              </w:tc>
-              <w:tc>
-                <w:tcPr/>
-                <w:p>
-                  <w:pPr>
-                    <w:pStyle w:val="Compact"/>
-                  </w:pPr>
-                  <w:r>
-                    <w:t xml:space="preserve">Investigate reported sample sizes in age-length-key and composition data, including discrepancies between numbers of ages and numbers of length measurements.</w:t>
-                  </w:r>
-                </w:p>
-              </w:tc>
-              <w:tc>
-                <w:tcPr/>
-                <w:p>
-                  <w:pPr>
-                    <w:pStyle w:val="Compact"/>
-                  </w:pPr>
-                  <w:r>
-                    <w:t xml:space="preserve">Data-quality subgroup / Members</w:t>
-                  </w:r>
-                </w:p>
-              </w:tc>
-              <w:tc>
-                <w:tcPr/>
-                <w:p>
-                  <w:pPr>
-                    <w:pStyle w:val="Compact"/>
-                  </w:pPr>
-                  <w:r>
-                    <w:t xml:space="preserve">Improve interpretation of sample size, coverage, and uncertainty in composition inputs.</w:t>
-                  </w:r>
-                </w:p>
-              </w:tc>
-            </w:tr>
-            <w:tr>
-              <w:tc>
-                <w:tcPr/>
-                <w:p>
-                  <w:pPr>
-                    <w:pStyle w:val="Compact"/>
-                  </w:pPr>
-                  <w:r>
-                    <w:t xml:space="preserve">Effort-creep diagnostic run</w:t>
-                  </w:r>
-                </w:p>
-              </w:tc>
-              <w:tc>
-                <w:tcPr/>
-                <w:p>
-                  <w:pPr>
-                    <w:pStyle w:val="Compact"/>
-                  </w:pPr>
-                  <w:r>
-                    <w:t xml:space="preserve">Run an assessment configuration with no creep correction but with a catchability step change in 2005.</w:t>
-                  </w:r>
-                </w:p>
-              </w:tc>
-              <w:tc>
-                <w:tcPr/>
-                <w:p>
-                  <w:pPr>
-                    <w:pStyle w:val="Compact"/>
-                  </w:pPr>
-                  <w:r>
-                    <w:t xml:space="preserve">Assessment subgroup / Chile CPUE contributors</w:t>
-                  </w:r>
-                </w:p>
-              </w:tc>
-              <w:tc>
-                <w:tcPr/>
-                <w:p>
-                  <w:pPr>
-                    <w:pStyle w:val="Compact"/>
-                  </w:pPr>
-                  <w:r>
-                    <w:t xml:space="preserve">Test whether the model estimates a large catchability shift without directly imposing the effort-creep correction.</w:t>
-                  </w:r>
-                </w:p>
-              </w:tc>
-            </w:tr>
-            <w:tr>
-              <w:tc>
-                <w:tcPr/>
-                <w:p>
-                  <w:pPr>
-                    <w:pStyle w:val="Compact"/>
-                  </w:pPr>
-                  <w:r>
-                    <w:t xml:space="preserve">Chile CPUE early-period explanation</w:t>
-                  </w:r>
-                </w:p>
-              </w:tc>
-              <w:tc>
-                <w:tcPr/>
-                <w:p>
-                  <w:pPr>
-                    <w:pStyle w:val="Compact"/>
-                  </w:pPr>
-                  <w:r>
-                    <w:t xml:space="preserve">Provide a clear explanation for why the new set-based CPUE series gives lower CPUE in earlier years with high catches than the current trip-based assessment index.</w:t>
-                  </w:r>
-                </w:p>
-              </w:tc>
-              <w:tc>
-                <w:tcPr/>
-                <w:p>
-                  <w:pPr>
-                    <w:pStyle w:val="Compact"/>
-                  </w:pPr>
-                  <w:r>
-                    <w:t xml:space="preserve">Chile CPUE contributors</w:t>
-                  </w:r>
-                </w:p>
-              </w:tc>
-              <w:tc>
-                <w:tcPr/>
-                <w:p>
-                  <w:pPr>
-                    <w:pStyle w:val="Compact"/>
-                  </w:pPr>
-                  <w:r>
-                    <w:t xml:space="preserve">Support any defensible recommendation to replace, supplement, or retain the current Chile CPUE index.</w:t>
-                  </w:r>
-                </w:p>
-              </w:tc>
-            </w:tr>
-            <w:tr>
-              <w:tc>
-                <w:tcPr/>
-                <w:p>
-                  <w:pPr>
-                    <w:pStyle w:val="Compact"/>
-                  </w:pPr>
-                  <w:r>
-                    <w:t xml:space="preserve">Chile CPUE set coverage</w:t>
-                  </w:r>
-                </w:p>
-              </w:tc>
-              <w:tc>
-                <w:tcPr/>
-                <w:p>
-                  <w:pPr>
-                    <w:pStyle w:val="Compact"/>
-                  </w:pPr>
-                  <w:r>
-                    <w:t xml:space="preserve">Add number and proportion of sets by year to the CPUE data-summary table.</w:t>
-                  </w:r>
-                </w:p>
-              </w:tc>
-              <w:tc>
-                <w:tcPr/>
-                <w:p>
-                  <w:pPr>
-                    <w:pStyle w:val="Compact"/>
-                  </w:pPr>
-                  <w:r>
-                    <w:t xml:space="preserve">Chile CPUE contributors</w:t>
-                  </w:r>
-                </w:p>
-              </w:tc>
-              <w:tc>
-                <w:tcPr/>
-                <w:p>
-                  <w:pPr>
-                    <w:pStyle w:val="Compact"/>
-                  </w:pPr>
-                  <w:r>
-                    <w:t xml:space="preserve">Document representativeness and low early-period coverage.</w:t>
-                  </w:r>
-                </w:p>
-              </w:tc>
-            </w:tr>
-            <w:tr>
-              <w:tc>
-                <w:tcPr/>
-                <w:p>
-                  <w:pPr>
-                    <w:pStyle w:val="Compact"/>
-                  </w:pPr>
-                  <w:r>
-                    <w:t xml:space="preserve">Chile CPUE model-comparison summary</w:t>
-                  </w:r>
-                </w:p>
-              </w:tc>
-              <w:tc>
-                <w:tcPr/>
-                <w:p>
-                  <w:pPr>
-                    <w:pStyle w:val="Compact"/>
-                  </w:pPr>
-                  <w:r>
-                    <w:t xml:space="preserve">Summarize the</w:t>
-                  </w:r>
-                  <w:r>
-                    <w:t xml:space="preserve"> </w:t>
-                  </w:r>
-                  <w:r>
-                    <w:rPr>
-                      <w:rStyle w:val="VerbatimChar"/>
-                    </w:rPr>
-                    <w:t xml:space="preserve">sdmTMB</w:t>
-                  </w:r>
-                  <w:r>
-                    <w:t xml:space="preserve"> </w:t>
-                  </w:r>
-                  <w:r>
-                    <w:t xml:space="preserve">and INLA model-comparison discussion, including year-effect treatment, mesh sensitivity, northern fishing activity, and annual uncertainty.</w:t>
-                  </w:r>
-                </w:p>
-              </w:tc>
-              <w:tc>
-                <w:tcPr/>
-                <w:p>
-                  <w:pPr>
-                    <w:pStyle w:val="Compact"/>
-                  </w:pPr>
-                  <w:r>
-                    <w:t xml:space="preserve">Sebastian / Ignacio / Niels</w:t>
-                  </w:r>
-                </w:p>
-              </w:tc>
-              <w:tc>
-                <w:tcPr/>
-                <w:p>
-                  <w:pPr>
-                    <w:pStyle w:val="Compact"/>
-                  </w:pPr>
-                  <w:r>
-                    <w:t xml:space="preserve">Provide report-ready text for deciding whether a new Chile CPUE index can be used in the assessment.</w:t>
-                  </w:r>
-                </w:p>
-              </w:tc>
-            </w:tr>
-            <w:tr>
-              <w:tc>
-                <w:tcPr/>
-                <w:p>
-                  <w:pPr>
-                    <w:pStyle w:val="Compact"/>
-                  </w:pPr>
-                  <w:r>
-                    <w:t xml:space="preserve">Days-at-sea coefficient check</w:t>
-                  </w:r>
-                </w:p>
-              </w:tc>
-              <w:tc>
-                <w:tcPr/>
-                <w:p>
-                  <w:pPr>
-                    <w:pStyle w:val="Compact"/>
-                  </w:pPr>
-                  <w:r>
-                    <w:t xml:space="preserve">Check the strength and interpretation of the days-at-sea or DFP coefficient in the INLA-based CPUE analysis.</w:t>
-                  </w:r>
-                </w:p>
-              </w:tc>
-              <w:tc>
-                <w:tcPr/>
-                <w:p>
-                  <w:pPr>
-                    <w:pStyle w:val="Compact"/>
-                  </w:pPr>
-                  <w:r>
-                    <w:t xml:space="preserve">Sebastian / Chile CPUE contributors</w:t>
-                  </w:r>
-                </w:p>
-              </w:tc>
-              <w:tc>
-                <w:tcPr/>
-                <w:p>
-                  <w:pPr>
-                    <w:pStyle w:val="Compact"/>
-                  </w:pPr>
-                  <w:r>
-                    <w:t xml:space="preserve">Determine whether this covariate reflects fishing effort, spatial availability, or movement effects that could bias the abundance signal.</w:t>
-                  </w:r>
-                </w:p>
-              </w:tc>
-            </w:tr>
-            <w:tr>
-              <w:tc>
-                <w:tcPr/>
-                <w:p>
-                  <w:pPr>
-                    <w:pStyle w:val="Compact"/>
-                  </w:pPr>
-                  <w:r>
-                    <w:t xml:space="preserve">True-zero CPUE records</w:t>
-                  </w:r>
-                </w:p>
-              </w:tc>
-              <w:tc>
-                <w:tcPr/>
-                <w:p>
-                  <w:pPr>
-                    <w:pStyle w:val="Compact"/>
-                  </w:pPr>
-                  <w:r>
-                    <w:t xml:space="preserve">Check whether zero CPUE records are true fishing zeroes or technical/non-fishing records, and whether they should be included in the CPUE standardization.</w:t>
-                  </w:r>
-                </w:p>
-              </w:tc>
-              <w:tc>
-                <w:tcPr/>
-                <w:p>
-                  <w:pPr>
-                    <w:pStyle w:val="Compact"/>
-                  </w:pPr>
-                  <w:r>
-                    <w:t xml:space="preserve">Chile CPUE contributors</w:t>
-                  </w:r>
-                </w:p>
-              </w:tc>
-              <w:tc>
-                <w:tcPr/>
-                <w:p>
-                  <w:pPr>
-                    <w:pStyle w:val="Compact"/>
-                  </w:pPr>
-                  <w:r>
-                    <w:t xml:space="preserve">Decide whether positive-only models are adequate or whether zero-inflated/delta treatment should be evaluated.</w:t>
-                  </w:r>
-                </w:p>
-              </w:tc>
-            </w:tr>
-            <w:tr>
-              <w:tc>
-                <w:tcPr/>
-                <w:p>
-                  <w:pPr>
-                    <w:pStyle w:val="Compact"/>
-                  </w:pPr>
-                  <w:r>
-                    <w:t xml:space="preserve">Peru CPUE full-series evaluation</w:t>
-                  </w:r>
-                </w:p>
-              </w:tc>
-              <w:tc>
-                <w:tcPr/>
-                <w:p>
-                  <w:pPr>
-                    <w:pStyle w:val="Compact"/>
-                  </w:pPr>
-                  <w:r>
-                    <w:t xml:space="preserve">Extend and evaluate the Peru CPUE time series before using it as an assessment or MSE input.</w:t>
-                  </w:r>
-                </w:p>
-              </w:tc>
-              <w:tc>
-                <w:tcPr/>
-                <w:p>
-                  <w:pPr>
-                    <w:pStyle w:val="Compact"/>
-                  </w:pPr>
-                  <w:r>
-                    <w:t xml:space="preserve">Peru CPUE contributors / Assessment subgroup</w:t>
-                  </w:r>
-                </w:p>
-              </w:tc>
-              <w:tc>
-                <w:tcPr/>
-                <w:p>
-                  <w:pPr>
-                    <w:pStyle w:val="Compact"/>
-                  </w:pPr>
-                  <w:r>
-                    <w:t xml:space="preserve">Avoid adopting a truncated recent series before its relationship to the historical series can be evaluated.</w:t>
-                  </w:r>
-                </w:p>
-              </w:tc>
-            </w:tr>
-            <w:tr>
-              <w:tc>
-                <w:tcPr/>
-                <w:p>
-                  <w:pPr>
-                    <w:pStyle w:val="Compact"/>
-                  </w:pPr>
-                  <w:r>
-                    <w:t xml:space="preserve">Peru CPUE year-interaction diagnostic</w:t>
-                  </w:r>
-                </w:p>
-              </w:tc>
-              <w:tc>
-                <w:tcPr/>
-                <w:p>
-                  <w:pPr>
-                    <w:pStyle w:val="Compact"/>
-                  </w:pPr>
-                  <w:r>
-                    <w:t xml:space="preserve">Provide the smoother or effect plot for the year interaction in the Peru CPUE model.</w:t>
-                  </w:r>
-                </w:p>
-              </w:tc>
-              <w:tc>
-                <w:tcPr/>
-                <w:p>
-                  <w:pPr>
-                    <w:pStyle w:val="Compact"/>
-                  </w:pPr>
-                  <w:r>
-                    <w:t xml:space="preserve">Peru CPUE contributors</w:t>
-                  </w:r>
-                </w:p>
-              </w:tc>
-              <w:tc>
-                <w:tcPr/>
-                <w:p>
-                  <w:pPr>
-                    <w:pStyle w:val="Compact"/>
-                  </w:pPr>
-                  <w:r>
-                    <w:t xml:space="preserve">Help evaluate whether spatial or fleet changes are being absorbed by model smoothers.</w:t>
-                  </w:r>
-                </w:p>
-              </w:tc>
-            </w:tr>
-            <w:tr>
-              <w:tc>
-                <w:tcPr/>
-                <w:p>
-                  <w:pPr>
-                    <w:pStyle w:val="Compact"/>
-                  </w:pPr>
-                  <w:r>
-                    <w:t xml:space="preserve">Offshore CPUE catchability treatment</w:t>
-                  </w:r>
-                </w:p>
-              </w:tc>
-              <w:tc>
-                <w:tcPr/>
-                <w:p>
-                  <w:pPr>
-                    <w:pStyle w:val="Compact"/>
-                  </w:pPr>
-                  <w:r>
-                    <w:t xml:space="preserve">Document the rationale for the 2021 offshore catchability break and the interpretation of El Nino effects relative to annual effects.</w:t>
-                  </w:r>
-                </w:p>
-              </w:tc>
-              <w:tc>
-                <w:tcPr/>
-                <w:p>
-                  <w:pPr>
-                    <w:pStyle w:val="Compact"/>
-                  </w:pPr>
-                  <w:r>
-                    <w:t xml:space="preserve">Offshore CPUE contributor / Assessment subgroup</w:t>
-                  </w:r>
-                </w:p>
-              </w:tc>
-              <w:tc>
-                <w:tcPr/>
-                <w:p>
-                  <w:pPr>
-                    <w:pStyle w:val="Compact"/>
-                  </w:pPr>
-                  <w:r>
-                    <w:t xml:space="preserve">Clarify whether offshore CPUE changes represent abundance, catchability, availability, or environmental effects.</w:t>
-                  </w:r>
-                </w:p>
-              </w:tc>
-            </w:tr>
-          </w:tbl>
           <w:p/>
         </w:tc>
       </w:tr>
     </w:tbl>
+    <w:bookmarkEnd w:id="25"/>
+    <w:bookmarkStart w:id="26" w:name="biological-inputs"/>
+    <w:p>
+      <w:pPr>
+        <w:pStyle w:val="Heading2"/>
+      </w:pPr>
+      <w:r>
+        <w:t xml:space="preserve">Biological Inputs</w:t>
+      </w:r>
+    </w:p>
+    <w:p>
+      <w:pPr>
+        <w:pStyle w:val="FirstParagraph"/>
+      </w:pPr>
+      <w:r>
+        <w:t xml:space="preserve">Text to be added during the meeting. This section should summarize biological assumptions and data inputs, including maturity, natural mortality, weight-at-age, length-weight relationships, length-frequency composition data, and implications for assessment and operating-model conditioning.</w:t>
+      </w:r>
+    </w:p>
     <w:bookmarkEnd w:id="26"/>
+    <w:bookmarkStart w:id="27" w:name="assessment-model-development"/>
+    <w:p>
+      <w:pPr>
+        <w:pStyle w:val="Heading2"/>
+      </w:pPr>
+      <w:r>
+        <w:t xml:space="preserve">Assessment Model Development</w:t>
+      </w:r>
+    </w:p>
+    <w:p>
+      <w:pPr>
+        <w:pStyle w:val="FirstParagraph"/>
+      </w:pPr>
+      <w:r>
+        <w:t xml:space="preserve">Text to be added during the meeting. This section should summarize the SC13 base-model developments, candidate simplifications, single-stock and two-stock alternatives, reduced-index configurations, selectivity assumptions, recruitment scenarios, and model diagnostics.</w:t>
+      </w:r>
+    </w:p>
     <w:bookmarkEnd w:id="27"/>
-    <w:bookmarkStart w:id="28" w:name="biological-inputs"/>
+    <w:bookmarkStart w:id="28" w:name="operating-models-and-mse-linkages"/>
     <w:p>
       <w:pPr>
         <w:pStyle w:val="Heading2"/>
       </w:pPr>
       <w:r>
-        <w:t xml:space="preserve">Biological Inputs</w:t>
+        <w:t xml:space="preserve">Operating Models and MSE Linkages</w:t>
       </w:r>
     </w:p>
     <w:p>
@@ -3231,48 +2069,12 @@
         <w:pStyle w:val="FirstParagraph"/>
       </w:pPr>
       <w:r>
-        <w:t xml:space="preserve">Text to be added during the meeting. This section should summarize biological assumptions and data inputs, including maturity, natural mortality, weight-at-age, length-weight relationships, length-frequency composition data, and implications for assessment and operating-model conditioning.</w:t>
+        <w:t xml:space="preserve">Text to be added during the meeting. This section should summarize operating-model specifications, reference-set and robustness-set uncertainties, MCMC feasibility, management-procedure input diagnostics, and workflow needs for the June 2026 MSE workshop.</w:t>
       </w:r>
     </w:p>
     <w:bookmarkEnd w:id="28"/>
-    <w:bookmarkStart w:id="29" w:name="assessment-model-development"/>
-    <w:p>
-      <w:pPr>
-        <w:pStyle w:val="Heading2"/>
-      </w:pPr>
-      <w:r>
-        <w:t xml:space="preserve">Assessment Model Development</w:t>
-      </w:r>
-    </w:p>
-    <w:p>
-      <w:pPr>
-        <w:pStyle w:val="FirstParagraph"/>
-      </w:pPr>
-      <w:r>
-        <w:t xml:space="preserve">Text to be added during the meeting. This section should summarize the SC13 base-model developments, candidate simplifications, single-stock and two-stock alternatives, reduced-index configurations, selectivity assumptions, recruitment scenarios, and model diagnostics.</w:t>
-      </w:r>
-    </w:p>
     <w:bookmarkEnd w:id="29"/>
-    <w:bookmarkStart w:id="30" w:name="operating-models-and-mse-linkages"/>
-    <w:p>
-      <w:pPr>
-        <w:pStyle w:val="Heading2"/>
-      </w:pPr>
-      <w:r>
-        <w:t xml:space="preserve">Operating Models and MSE Linkages</w:t>
-      </w:r>
-    </w:p>
-    <w:p>
-      <w:pPr>
-        <w:pStyle w:val="FirstParagraph"/>
-      </w:pPr>
-      <w:r>
-        <w:t xml:space="preserve">Text to be added during the meeting. This section should summarize operating-model specifications, reference-set and robustness-set uncertainties, MCMC feasibility, management-procedure input diagnostics, and workflow needs for the June 2026 MSE workshop.</w:t>
-      </w:r>
-    </w:p>
-    <w:bookmarkEnd w:id="30"/>
-    <w:bookmarkEnd w:id="31"/>
-    <w:bookmarkStart w:id="32" w:name="decisions-and-agreements"/>
+    <w:bookmarkStart w:id="30" w:name="decisions-and-agreements"/>
     <w:p>
       <w:pPr>
         <w:pStyle w:val="Heading1"/>
@@ -3399,8 +2201,8 @@
         </w:tc>
       </w:tr>
     </w:tbl>
-    <w:bookmarkEnd w:id="32"/>
-    <w:bookmarkStart w:id="33" w:name="action-items"/>
+    <w:bookmarkEnd w:id="30"/>
+    <w:bookmarkStart w:id="31" w:name="action-items"/>
     <w:p>
       <w:pPr>
         <w:pStyle w:val="Heading1"/>
@@ -4461,8 +3263,8 @@
         </w:tc>
       </w:tr>
     </w:tbl>
-    <w:bookmarkEnd w:id="33"/>
-    <w:bookmarkStart w:id="34" w:name="open-issues-risks-to-track"/>
+    <w:bookmarkEnd w:id="31"/>
+    <w:bookmarkStart w:id="32" w:name="open-issues-risks-to-track"/>
     <w:p>
       <w:pPr>
         <w:pStyle w:val="Heading1"/>
@@ -4627,8 +3429,8 @@
         <w:t xml:space="preserve">Offshore CPUE catchability breaks and environmental effects need clear interpretation so that abundance, availability, and fishing-behaviour changes are not conflated.</w:t>
       </w:r>
     </w:p>
-    <w:bookmarkEnd w:id="34"/>
-    <w:bookmarkStart w:id="40" w:name="appendix-a.-shortened-draft-agenda"/>
+    <w:bookmarkEnd w:id="32"/>
+    <w:bookmarkStart w:id="38" w:name="appendix-a.-shortened-draft-agenda"/>
     <w:p>
       <w:pPr>
         <w:pStyle w:val="Heading1"/>
@@ -4645,7 +3447,7 @@
         <w:t xml:space="preserve">This appendix summarizes the draft agenda from SCW16-Doc00. It should be updated if the adopted meeting agenda differs materially.</w:t>
       </w:r>
     </w:p>
-    <w:bookmarkStart w:id="35" w:name="day-1-acoustic-session"/>
+    <w:bookmarkStart w:id="33" w:name="day-1-acoustic-session"/>
     <w:p>
       <w:pPr>
         <w:pStyle w:val="Heading2"/>
@@ -4786,8 +3588,8 @@
         <w:t xml:space="preserve">General discussion and technical recommendations.</w:t>
       </w:r>
     </w:p>
-    <w:bookmarkEnd w:id="35"/>
-    <w:bookmarkStart w:id="36" w:name="day-2-cpue-session"/>
+    <w:bookmarkEnd w:id="33"/>
+    <w:bookmarkStart w:id="34" w:name="day-2-cpue-session"/>
     <w:p>
       <w:pPr>
         <w:pStyle w:val="Heading2"/>
@@ -4892,8 +3694,8 @@
         <w:t xml:space="preserve">Separate versus combined index products for HCR or management-procedure use.</w:t>
       </w:r>
     </w:p>
-    <w:bookmarkEnd w:id="36"/>
-    <w:bookmarkStart w:id="37" w:name="Xe19488a9e250f8a1b1acbf6bd27cb1809ccf6dd"/>
+    <w:bookmarkEnd w:id="34"/>
+    <w:bookmarkStart w:id="35" w:name="Xe19488a9e250f8a1b1acbf6bd27cb1809ccf6dd"/>
     <w:p>
       <w:pPr>
         <w:pStyle w:val="Heading2"/>
@@ -4962,8 +3764,8 @@
         <w:t xml:space="preserve">Review of Peru length-weight and length-frequency information, including SCW16-Doc13 and SCW16-Doc14.</w:t>
       </w:r>
     </w:p>
-    <w:bookmarkEnd w:id="37"/>
-    <w:bookmarkStart w:id="38" w:name="X093770a539d959c93333ac261f9d7f2c82f1662"/>
+    <w:bookmarkEnd w:id="35"/>
+    <w:bookmarkStart w:id="36" w:name="X093770a539d959c93333ac261f9d7f2c82f1662"/>
     <w:p>
       <w:pPr>
         <w:pStyle w:val="Heading2"/>
@@ -5020,8 +3822,8 @@
         <w:t xml:space="preserve">MCMC evaluations, convergence diagnostics, run-time constraints, and feasibility.</w:t>
       </w:r>
     </w:p>
-    <w:bookmarkEnd w:id="38"/>
-    <w:bookmarkStart w:id="39" w:name="X0e50bbd5976cb17edeb25ef5bfa4ced02afb38c"/>
+    <w:bookmarkEnd w:id="36"/>
+    <w:bookmarkStart w:id="37" w:name="X0e50bbd5976cb17edeb25ef5bfa4ced02afb38c"/>
     <w:p>
       <w:pPr>
         <w:pStyle w:val="Heading2"/>
@@ -5066,9 +3868,9 @@
         <w:t xml:space="preserve">Report drafting, review, and adoption.</w:t>
       </w:r>
     </w:p>
-    <w:bookmarkEnd w:id="39"/>
-    <w:bookmarkEnd w:id="40"/>
-    <w:bookmarkStart w:id="41" w:name="appendix-b.-participants"/>
+    <w:bookmarkEnd w:id="37"/>
+    <w:bookmarkEnd w:id="38"/>
+    <w:bookmarkStart w:id="39" w:name="appendix-b.-participants"/>
     <w:p>
       <w:pPr>
         <w:pStyle w:val="Heading1"/>
@@ -6882,8 +5684,8 @@
         </w:tc>
       </w:tr>
     </w:tbl>
-    <w:bookmarkEnd w:id="41"/>
-    <w:bookmarkStart w:id="80" w:name="appendix-c.-document-summary-by-topic"/>
+    <w:bookmarkEnd w:id="39"/>
+    <w:bookmarkStart w:id="78" w:name="appendix-c.-document-summary-by-topic"/>
     <w:p>
       <w:pPr>
         <w:pStyle w:val="Heading1"/>
@@ -6900,7 +5702,7 @@
         <w:t xml:space="preserve">This appendix summarizes SCW16-Doc01 through SCW16-Doc16. The organization is by topic rather than document number so that related evidence can be reviewed together.</w:t>
       </w:r>
     </w:p>
-    <w:bookmarkStart w:id="44" w:name="assessment-and-model-structure"/>
+    <w:bookmarkStart w:id="42" w:name="assessment-and-model-structure"/>
     <w:p>
       <w:pPr>
         <w:pStyle w:val="Heading2"/>
@@ -6909,7 +5711,7 @@
         <w:t xml:space="preserve">Assessment and Model Structure</w:t>
       </w:r>
     </w:p>
-    <w:bookmarkStart w:id="43" w:name="developments-of-the-base-sc13-model"/>
+    <w:bookmarkStart w:id="41" w:name="developments-of-the-base-sc13-model"/>
     <w:p>
       <w:pPr>
         <w:pStyle w:val="Heading3"/>
@@ -6922,7 +5724,7 @@
       <w:pPr>
         <w:pStyle w:val="FirstParagraph"/>
       </w:pPr>
-      <w:hyperlink r:id="rId42">
+      <w:hyperlink r:id="rId40">
         <w:r>
           <w:rPr>
             <w:rStyle w:val="Hyperlink"/>
@@ -6945,9 +5747,9 @@
         <w:t xml:space="preserve">Key report use: summarize accepted base-model structure, candidate simplifications, retained sensitivities, and any model configurations to carry into OM conditioning.</w:t>
       </w:r>
     </w:p>
-    <w:bookmarkEnd w:id="43"/>
-    <w:bookmarkEnd w:id="44"/>
-    <w:bookmarkStart w:id="47" w:name="operating-models-and-mse"/>
+    <w:bookmarkEnd w:id="41"/>
+    <w:bookmarkEnd w:id="42"/>
+    <w:bookmarkStart w:id="45" w:name="operating-models-and-mse"/>
     <w:p>
       <w:pPr>
         <w:pStyle w:val="Heading2"/>
@@ -6956,7 +5758,7 @@
         <w:t xml:space="preserve">Operating Models and MSE</w:t>
       </w:r>
     </w:p>
-    <w:bookmarkStart w:id="46" w:name="operating-models-for-jack-mackerel-mse"/>
+    <w:bookmarkStart w:id="44" w:name="operating-models-for-jack-mackerel-mse"/>
     <w:p>
       <w:pPr>
         <w:pStyle w:val="Heading3"/>
@@ -6969,7 +5771,7 @@
       <w:pPr>
         <w:pStyle w:val="FirstParagraph"/>
       </w:pPr>
-      <w:hyperlink r:id="rId45">
+      <w:hyperlink r:id="rId43">
         <w:r>
           <w:rPr>
             <w:rStyle w:val="Hyperlink"/>
@@ -6992,9 +5794,9 @@
         <w:t xml:space="preserve">Key report use: define the operating-model grid or equivalent uncertainty table that will feed the June 2026 MSE workshop.</w:t>
       </w:r>
     </w:p>
-    <w:bookmarkEnd w:id="46"/>
-    <w:bookmarkEnd w:id="47"/>
-    <w:bookmarkStart w:id="60" w:name="cpue"/>
+    <w:bookmarkEnd w:id="44"/>
+    <w:bookmarkEnd w:id="45"/>
+    <w:bookmarkStart w:id="58" w:name="cpue"/>
     <w:p>
       <w:pPr>
         <w:pStyle w:val="Heading2"/>
@@ -7003,7 +5805,7 @@
         <w:t xml:space="preserve">CPUE</w:t>
       </w:r>
     </w:p>
-    <w:bookmarkStart w:id="49" w:name="X78655e90d273c2174e3dc08eb7d53678355183a"/>
+    <w:bookmarkStart w:id="47" w:name="X78655e90d273c2174e3dc08eb7d53678355183a"/>
     <w:p>
       <w:pPr>
         <w:pStyle w:val="Heading3"/>
@@ -7016,7 +5818,7 @@
       <w:pPr>
         <w:pStyle w:val="FirstParagraph"/>
       </w:pPr>
-      <w:hyperlink r:id="rId48">
+      <w:hyperlink r:id="rId46">
         <w:r>
           <w:rPr>
             <w:rStyle w:val="Hyperlink"/>
@@ -7039,8 +5841,8 @@
         <w:t xml:space="preserve">Key report use: structure the CPUE session and make sure each candidate CPUE product is classified for assessment, OM conditioning, MP input, diagnostic use, or hold.</w:t>
       </w:r>
     </w:p>
-    <w:bookmarkEnd w:id="49"/>
-    <w:bookmarkStart w:id="51" w:name="X55aa1326c783fdba0a32cb00d5dd3d2612f78d5"/>
+    <w:bookmarkEnd w:id="47"/>
+    <w:bookmarkStart w:id="49" w:name="X55aa1326c783fdba0a32cb00d5dd3d2612f78d5"/>
     <w:p>
       <w:pPr>
         <w:pStyle w:val="Heading3"/>
@@ -7053,7 +5855,7 @@
       <w:pPr>
         <w:pStyle w:val="FirstParagraph"/>
       </w:pPr>
-      <w:hyperlink r:id="rId50">
+      <w:hyperlink r:id="rId48">
         <w:r>
           <w:rPr>
             <w:rStyle w:val="Hyperlink"/>
@@ -7076,8 +5878,8 @@
         <w:t xml:space="preserve">Key report use: provide background for interpreting new CPUE papers and avoid repeating previously identified unresolved issues.</w:t>
       </w:r>
     </w:p>
-    <w:bookmarkEnd w:id="51"/>
-    <w:bookmarkStart w:id="53" w:name="chile-cpue-effort-creep"/>
+    <w:bookmarkEnd w:id="49"/>
+    <w:bookmarkStart w:id="51" w:name="chile-cpue-effort-creep"/>
     <w:p>
       <w:pPr>
         <w:pStyle w:val="Heading3"/>
@@ -7090,7 +5892,7 @@
       <w:pPr>
         <w:pStyle w:val="FirstParagraph"/>
       </w:pPr>
-      <w:hyperlink r:id="rId52">
+      <w:hyperlink r:id="rId50">
         <w:r>
           <w:rPr>
             <w:rStyle w:val="Hyperlink"/>
@@ -7113,8 +5915,8 @@
         <w:t xml:space="preserve">Key report use: document whether effort-creep treatment is accepted, treated as a sensitivity, or deferred pending additional diagnostics.</w:t>
       </w:r>
     </w:p>
-    <w:bookmarkEnd w:id="53"/>
-    <w:bookmarkStart w:id="55" w:name="chile-cpue-with-sdmtmbspde"/>
+    <w:bookmarkEnd w:id="51"/>
+    <w:bookmarkStart w:id="53" w:name="chile-cpue-with-sdmtmbspde"/>
     <w:p>
       <w:pPr>
         <w:pStyle w:val="Heading3"/>
@@ -7127,7 +5929,7 @@
       <w:pPr>
         <w:pStyle w:val="FirstParagraph"/>
       </w:pPr>
-      <w:hyperlink r:id="rId54">
+      <w:hyperlink r:id="rId52">
         <w:r>
           <w:rPr>
             <w:rStyle w:val="Hyperlink"/>
@@ -7162,8 +5964,8 @@
         <w:t xml:space="preserve">Key report use: evaluate whether the spatio-temporal CPUE product should replace, supplement, or diagnose the current assessment CPUE series.</w:t>
       </w:r>
     </w:p>
-    <w:bookmarkEnd w:id="55"/>
-    <w:bookmarkStart w:id="57" w:name="chile-cpue-with-inla"/>
+    <w:bookmarkEnd w:id="53"/>
+    <w:bookmarkStart w:id="55" w:name="chile-cpue-with-inla"/>
     <w:p>
       <w:pPr>
         <w:pStyle w:val="Heading3"/>
@@ -7176,7 +5978,7 @@
       <w:pPr>
         <w:pStyle w:val="FirstParagraph"/>
       </w:pPr>
-      <w:hyperlink r:id="rId56">
+      <w:hyperlink r:id="rId54">
         <w:r>
           <w:rPr>
             <w:rStyle w:val="Hyperlink"/>
@@ -7214,8 +6016,8 @@
         <w:t xml:space="preserve">CPUE product.</w:t>
       </w:r>
     </w:p>
-    <w:bookmarkEnd w:id="57"/>
-    <w:bookmarkStart w:id="59" w:name="peru-cpue"/>
+    <w:bookmarkEnd w:id="55"/>
+    <w:bookmarkStart w:id="57" w:name="peru-cpue"/>
     <w:p>
       <w:pPr>
         <w:pStyle w:val="Heading3"/>
@@ -7228,7 +6030,7 @@
       <w:pPr>
         <w:pStyle w:val="FirstParagraph"/>
       </w:pPr>
-      <w:hyperlink r:id="rId58">
+      <w:hyperlink r:id="rId56">
         <w:r>
           <w:rPr>
             <w:rStyle w:val="Hyperlink"/>
@@ -7251,9 +6053,9 @@
         <w:t xml:space="preserve">Key report use: evaluate whether the Peruvian CPUE product is suitable as a far-north abundance index, an assessment sensitivity, an OM-conditioning input, or a diagnostic series.</w:t>
       </w:r>
     </w:p>
-    <w:bookmarkEnd w:id="59"/>
-    <w:bookmarkEnd w:id="60"/>
-    <w:bookmarkStart w:id="69" w:name="acoustic-indices-1"/>
+    <w:bookmarkEnd w:id="57"/>
+    <w:bookmarkEnd w:id="58"/>
+    <w:bookmarkStart w:id="67" w:name="acoustic-indices-1"/>
     <w:p>
       <w:pPr>
         <w:pStyle w:val="Heading2"/>
@@ -7262,7 +6064,7 @@
         <w:t xml:space="preserve">Acoustic Indices</w:t>
       </w:r>
     </w:p>
-    <w:bookmarkStart w:id="62" w:name="Xb04805d959d92db344062f23c1d5fc65220cd11"/>
+    <w:bookmarkStart w:id="60" w:name="Xb04805d959d92db344062f23c1d5fc65220cd11"/>
     <w:p>
       <w:pPr>
         <w:pStyle w:val="Heading3"/>
@@ -7275,7 +6077,7 @@
       <w:pPr>
         <w:pStyle w:val="FirstParagraph"/>
       </w:pPr>
-      <w:hyperlink r:id="rId61">
+      <w:hyperlink r:id="rId59">
         <w:r>
           <w:rPr>
             <w:rStyle w:val="Hyperlink"/>
@@ -7298,8 +6100,8 @@
         <w:t xml:space="preserve">Key report use: evaluate acoustic index representativeness, uncertainty, spatial coverage, and suitability for assessment and OM use.</w:t>
       </w:r>
     </w:p>
-    <w:bookmarkEnd w:id="62"/>
-    <w:bookmarkStart w:id="64" w:name="fishery-dependent-acoustics"/>
+    <w:bookmarkEnd w:id="60"/>
+    <w:bookmarkStart w:id="62" w:name="fishery-dependent-acoustics"/>
     <w:p>
       <w:pPr>
         <w:pStyle w:val="Heading3"/>
@@ -7312,7 +6114,7 @@
       <w:pPr>
         <w:pStyle w:val="FirstParagraph"/>
       </w:pPr>
-      <w:hyperlink r:id="rId63">
+      <w:hyperlink r:id="rId61">
         <w:r>
           <w:rPr>
             <w:rStyle w:val="Hyperlink"/>
@@ -7335,8 +6137,8 @@
         <w:t xml:space="preserve">Key report use: decide whether fishery-dependent acoustic products provide a usable abundance signal or primarily diagnostic/context information.</w:t>
       </w:r>
     </w:p>
-    <w:bookmarkEnd w:id="64"/>
-    <w:bookmarkStart w:id="66" w:name="X8dcc86fd1c77a21ecd4bd2be0d11cc79550cb59"/>
+    <w:bookmarkEnd w:id="62"/>
+    <w:bookmarkStart w:id="64" w:name="X8dcc86fd1c77a21ecd4bd2be0d11cc79550cb59"/>
     <w:p>
       <w:pPr>
         <w:pStyle w:val="Heading3"/>
@@ -7349,7 +6151,7 @@
       <w:pPr>
         <w:pStyle w:val="FirstParagraph"/>
       </w:pPr>
-      <w:hyperlink r:id="rId65">
+      <w:hyperlink r:id="rId63">
         <w:r>
           <w:rPr>
             <w:rStyle w:val="Hyperlink"/>
@@ -7384,8 +6186,8 @@
         <w:t xml:space="preserve">Key report use: compare with Doc06 and other acoustic products to determine whether indices are complementary, redundant, or conflicting.</w:t>
       </w:r>
     </w:p>
-    <w:bookmarkEnd w:id="66"/>
-    <w:bookmarkStart w:id="68" w:name="peru-acoustic-index-considerations"/>
+    <w:bookmarkEnd w:id="64"/>
+    <w:bookmarkStart w:id="66" w:name="peru-acoustic-index-considerations"/>
     <w:p>
       <w:pPr>
         <w:pStyle w:val="Heading3"/>
@@ -7398,7 +6200,7 @@
       <w:pPr>
         <w:pStyle w:val="FirstParagraph"/>
       </w:pPr>
-      <w:hyperlink r:id="rId67">
+      <w:hyperlink r:id="rId65">
         <w:r>
           <w:rPr>
             <w:rStyle w:val="Hyperlink"/>
@@ -7421,9 +6223,9 @@
         <w:t xml:space="preserve">Key report use: classify the Peru acoustic information as a candidate index, supporting interpretation, or diagnostic evidence, depending on data extent, uncertainty, and assessment compatibility.</w:t>
       </w:r>
     </w:p>
-    <w:bookmarkEnd w:id="68"/>
-    <w:bookmarkEnd w:id="69"/>
-    <w:bookmarkStart w:id="76" w:name="biology-and-composition-inputs"/>
+    <w:bookmarkEnd w:id="66"/>
+    <w:bookmarkEnd w:id="67"/>
+    <w:bookmarkStart w:id="74" w:name="biology-and-composition-inputs"/>
     <w:p>
       <w:pPr>
         <w:pStyle w:val="Heading2"/>
@@ -7432,7 +6234,7 @@
         <w:t xml:space="preserve">Biology and Composition Inputs</w:t>
       </w:r>
     </w:p>
-    <w:bookmarkStart w:id="71" w:name="biology"/>
+    <w:bookmarkStart w:id="69" w:name="biology"/>
     <w:p>
       <w:pPr>
         <w:pStyle w:val="Heading3"/>
@@ -7445,7 +6247,7 @@
       <w:pPr>
         <w:pStyle w:val="FirstParagraph"/>
       </w:pPr>
-      <w:hyperlink r:id="rId70">
+      <w:hyperlink r:id="rId68">
         <w:r>
           <w:rPr>
             <w:rStyle w:val="Hyperlink"/>
@@ -7468,8 +6270,8 @@
         <w:t xml:space="preserve">Key report use: document accepted biological assumptions and identify sensitivity tests that should be carried into assessment or OM conditioning.</w:t>
       </w:r>
     </w:p>
-    <w:bookmarkEnd w:id="71"/>
-    <w:bookmarkStart w:id="73" w:name="peru-length-weight-relationship"/>
+    <w:bookmarkEnd w:id="69"/>
+    <w:bookmarkStart w:id="71" w:name="peru-length-weight-relationship"/>
     <w:p>
       <w:pPr>
         <w:pStyle w:val="Heading3"/>
@@ -7482,7 +6284,7 @@
       <w:pPr>
         <w:pStyle w:val="FirstParagraph"/>
       </w:pPr>
-      <w:hyperlink r:id="rId72">
+      <w:hyperlink r:id="rId70">
         <w:r>
           <w:rPr>
             <w:rStyle w:val="Hyperlink"/>
@@ -7505,8 +6307,8 @@
         <w:t xml:space="preserve">Key report use: evaluate whether Peru-specific length-weight information affects biomass conversion, biological assumptions, or regional differences in assessment inputs.</w:t>
       </w:r>
     </w:p>
-    <w:bookmarkEnd w:id="73"/>
-    <w:bookmarkStart w:id="75" w:name="peru-length-frequency-update"/>
+    <w:bookmarkEnd w:id="71"/>
+    <w:bookmarkStart w:id="73" w:name="peru-length-frequency-update"/>
     <w:p>
       <w:pPr>
         <w:pStyle w:val="Heading3"/>
@@ -7519,7 +6321,7 @@
       <w:pPr>
         <w:pStyle w:val="FirstParagraph"/>
       </w:pPr>
-      <w:hyperlink r:id="rId74">
+      <w:hyperlink r:id="rId72">
         <w:r>
           <w:rPr>
             <w:rStyle w:val="Hyperlink"/>
@@ -7542,9 +6344,9 @@
         <w:t xml:space="preserve">Key report use: document the composition-data evidence available for the far-north stock and decide how it should be used in assessment and stock-structure discussions.</w:t>
       </w:r>
     </w:p>
-    <w:bookmarkEnd w:id="75"/>
-    <w:bookmarkEnd w:id="76"/>
-    <w:bookmarkStart w:id="79" w:name="data-quality-and-supporting-evidence"/>
+    <w:bookmarkEnd w:id="73"/>
+    <w:bookmarkEnd w:id="74"/>
+    <w:bookmarkStart w:id="77" w:name="data-quality-and-supporting-evidence"/>
     <w:p>
       <w:pPr>
         <w:pStyle w:val="Heading2"/>
@@ -7553,7 +6355,7 @@
         <w:t xml:space="preserve">Data Quality and Supporting Evidence</w:t>
       </w:r>
     </w:p>
-    <w:bookmarkStart w:id="78" w:name="catchfishery-data-quality-checks"/>
+    <w:bookmarkStart w:id="76" w:name="catchfishery-data-quality-checks"/>
     <w:p>
       <w:pPr>
         <w:pStyle w:val="Heading3"/>
@@ -7566,7 +6368,7 @@
       <w:pPr>
         <w:pStyle w:val="FirstParagraph"/>
       </w:pPr>
-      <w:hyperlink r:id="rId77">
+      <w:hyperlink r:id="rId75">
         <w:r>
           <w:rPr>
             <w:rStyle w:val="Hyperlink"/>
@@ -7589,16 +6391,16 @@
         <w:t xml:space="preserve">Key report use: use as a support screen for catch- and fishery-dependent indices, and document any data-quality issues that affect benchmark decisions.</w:t>
       </w:r>
     </w:p>
+    <w:bookmarkEnd w:id="76"/>
+    <w:bookmarkEnd w:id="77"/>
     <w:bookmarkEnd w:id="78"/>
-    <w:bookmarkEnd w:id="79"/>
-    <w:bookmarkEnd w:id="80"/>
-    <w:bookmarkStart w:id="90" w:name="appendix-d.-day-1-presentations"/>
+    <w:bookmarkStart w:id="94" w:name="appendix-d.-presentation-summaries"/>
     <w:p>
       <w:pPr>
         <w:pStyle w:val="Heading1"/>
       </w:pPr>
       <w:r>
-        <w:t xml:space="preserve">Appendix D. Day 1 Presentations</w:t>
+        <w:t xml:space="preserve">Appendix D. Presentation summaries</w:t>
       </w:r>
     </w:p>
     <w:p>
@@ -7606,7 +6408,42 @@
         <w:pStyle w:val="FirstParagraph"/>
       </w:pPr>
       <w:r>
-        <w:t xml:space="preserve">This appendix records the Day 1 presentation files available in</w:t>
+        <w:t xml:space="preserve">This appendix records presentation files available for the benchmark meeting. It</w:t>
+      </w:r>
+      <w:r>
+        <w:t xml:space="preserve"> </w:t>
+      </w:r>
+      <w:r>
+        <w:t xml:space="preserve">is intended as a crosswalk between the meeting agenda, formal SCW16 papers,</w:t>
+      </w:r>
+      <w:r>
+        <w:t xml:space="preserve"> </w:t>
+      </w:r>
+      <w:r>
+        <w:t xml:space="preserve">presentation-only material, and how each item should be used in the meeting</w:t>
+      </w:r>
+      <w:r>
+        <w:t xml:space="preserve"> </w:t>
+      </w:r>
+      <w:r>
+        <w:t xml:space="preserve">report.</w:t>
+      </w:r>
+    </w:p>
+    <w:bookmarkStart w:id="88" w:name="day-1-presentations"/>
+    <w:p>
+      <w:pPr>
+        <w:pStyle w:val="Heading2"/>
+      </w:pPr>
+      <w:r>
+        <w:t xml:space="preserve">Day 1 Presentations</w:t>
+      </w:r>
+    </w:p>
+    <w:p>
+      <w:pPr>
+        <w:pStyle w:val="FirstParagraph"/>
+      </w:pPr>
+      <w:r>
+        <w:t xml:space="preserve">The Day 1 presentation files are available in</w:t>
       </w:r>
       <w:r>
         <w:t xml:space="preserve"> </w:t>
@@ -7618,7 +6455,16 @@
         <w:t xml:space="preserve">docs/day1</w:t>
       </w:r>
       <w:r>
-        <w:t xml:space="preserve">. It is intended as a crosswalk between the acoustic-session agenda, formal SCW16 papers, presentation-only material, and how each item should be used in the meeting report.</w:t>
+        <w:t xml:space="preserve"> </w:t>
+      </w:r>
+      <w:r>
+        <w:t xml:space="preserve">and are organized</w:t>
+      </w:r>
+      <w:r>
+        <w:t xml:space="preserve"> </w:t>
+      </w:r>
+      <w:r>
+        <w:t xml:space="preserve">around the acoustic-session agenda.</w:t>
       </w:r>
     </w:p>
     <w:tbl>
@@ -7690,7 +6536,7 @@
             <w:pPr>
               <w:pStyle w:val="Compact"/>
             </w:pPr>
-            <w:hyperlink r:id="rId81">
+            <w:hyperlink r:id="rId79">
               <w:r>
                 <w:rPr>
                   <w:rStyle w:val="Hyperlink"/>
@@ -7741,7 +6587,7 @@
             <w:pPr>
               <w:pStyle w:val="Compact"/>
             </w:pPr>
-            <w:hyperlink r:id="rId82">
+            <w:hyperlink r:id="rId80">
               <w:r>
                 <w:rPr>
                   <w:rStyle w:val="Hyperlink"/>
@@ -7792,7 +6638,7 @@
             <w:pPr>
               <w:pStyle w:val="Compact"/>
             </w:pPr>
-            <w:hyperlink r:id="rId83">
+            <w:hyperlink r:id="rId81">
               <w:r>
                 <w:rPr>
                   <w:rStyle w:val="Hyperlink"/>
@@ -7843,7 +6689,7 @@
             <w:pPr>
               <w:pStyle w:val="Compact"/>
             </w:pPr>
-            <w:hyperlink r:id="rId84">
+            <w:hyperlink r:id="rId82">
               <w:r>
                 <w:rPr>
                   <w:rStyle w:val="Hyperlink"/>
@@ -7871,7 +6717,7 @@
             <w:pPr>
               <w:pStyle w:val="Compact"/>
             </w:pPr>
-            <w:hyperlink r:id="rId65">
+            <w:hyperlink r:id="rId63">
               <w:r>
                 <w:rPr>
                   <w:rStyle w:val="Hyperlink"/>
@@ -7911,7 +6757,7 @@
             <w:pPr>
               <w:pStyle w:val="Compact"/>
             </w:pPr>
-            <w:hyperlink r:id="rId85">
+            <w:hyperlink r:id="rId83">
               <w:r>
                 <w:rPr>
                   <w:rStyle w:val="Hyperlink"/>
@@ -7927,7 +6773,7 @@
             <w:pPr>
               <w:pStyle w:val="Compact"/>
             </w:pPr>
-            <w:hyperlink r:id="rId61">
+            <w:hyperlink r:id="rId59">
               <w:r>
                 <w:rPr>
                   <w:rStyle w:val="Hyperlink"/>
@@ -7967,7 +6813,7 @@
             <w:pPr>
               <w:pStyle w:val="Compact"/>
             </w:pPr>
-            <w:hyperlink r:id="rId86">
+            <w:hyperlink r:id="rId84">
               <w:r>
                 <w:rPr>
                   <w:rStyle w:val="Hyperlink"/>
@@ -7983,7 +6829,7 @@
             <w:pPr>
               <w:pStyle w:val="Compact"/>
             </w:pPr>
-            <w:hyperlink r:id="rId63">
+            <w:hyperlink r:id="rId61">
               <w:r>
                 <w:rPr>
                   <w:rStyle w:val="Hyperlink"/>
@@ -8023,7 +6869,7 @@
             <w:pPr>
               <w:pStyle w:val="Compact"/>
             </w:pPr>
-            <w:hyperlink r:id="rId87">
+            <w:hyperlink r:id="rId85">
               <w:r>
                 <w:rPr>
                   <w:rStyle w:val="Hyperlink"/>
@@ -8039,7 +6885,7 @@
             <w:pPr>
               <w:pStyle w:val="Compact"/>
             </w:pPr>
-            <w:hyperlink r:id="rId67">
+            <w:hyperlink r:id="rId65">
               <w:r>
                 <w:rPr>
                   <w:rStyle w:val="Hyperlink"/>
@@ -8079,7 +6925,7 @@
             <w:pPr>
               <w:pStyle w:val="Compact"/>
             </w:pPr>
-            <w:hyperlink r:id="rId88">
+            <w:hyperlink r:id="rId86">
               <w:r>
                 <w:rPr>
                   <w:rStyle w:val="Hyperlink"/>
@@ -8130,7 +6976,7 @@
             <w:pPr>
               <w:pStyle w:val="Compact"/>
             </w:pPr>
-            <w:hyperlink r:id="rId89">
+            <w:hyperlink r:id="rId87">
               <w:r>
                 <w:rPr>
                   <w:rStyle w:val="Hyperlink"/>
@@ -8170,6 +7016,327 @@
             </w:pPr>
             <w:r>
               <w:t xml:space="preserve">Context / supporting methods</w:t>
+            </w:r>
+          </w:p>
+        </w:tc>
+      </w:tr>
+    </w:tbl>
+    <w:bookmarkEnd w:id="88"/>
+    <w:bookmarkStart w:id="93" w:name="day-2-presentations"/>
+    <w:p>
+      <w:pPr>
+        <w:pStyle w:val="Heading2"/>
+      </w:pPr>
+      <w:r>
+        <w:t xml:space="preserve">Day 2 Presentations</w:t>
+      </w:r>
+    </w:p>
+    <w:p>
+      <w:pPr>
+        <w:pStyle w:val="FirstParagraph"/>
+      </w:pPr>
+      <w:r>
+        <w:t xml:space="preserve">The Day 2 presentation files currently available in</w:t>
+      </w:r>
+      <w:r>
+        <w:t xml:space="preserve"> </w:t>
+      </w:r>
+      <w:r>
+        <w:rPr>
+          <w:rStyle w:val="VerbatimChar"/>
+        </w:rPr>
+        <w:t xml:space="preserve">docs/day2</w:t>
+      </w:r>
+      <w:r>
+        <w:t xml:space="preserve"> </w:t>
+      </w:r>
+      <w:r>
+        <w:t xml:space="preserve">are organized</w:t>
+      </w:r>
+      <w:r>
+        <w:t xml:space="preserve"> </w:t>
+      </w:r>
+      <w:r>
+        <w:t xml:space="preserve">around the CPUE and data-quality session.</w:t>
+      </w:r>
+    </w:p>
+    <w:tbl>
+      <w:tblPr>
+        <w:tblStyle w:val="Table"/>
+        <w:tblW w:type="pct" w:w="5000"/>
+        <w:tblLayout w:type="fixed"/>
+        <w:tblLook w:firstRow="1" w:lastRow="0" w:firstColumn="0" w:lastColumn="0" w:noHBand="0" w:noVBand="0" w:val="0020"/>
+      </w:tblPr>
+      <w:tblGrid>
+        <w:gridCol w:w="1980"/>
+        <w:gridCol w:w="1980"/>
+        <w:gridCol w:w="1980"/>
+        <w:gridCol w:w="1980"/>
+      </w:tblGrid>
+      <w:tr>
+        <w:trPr>
+          <w:tblHeader w:val="on"/>
+        </w:trPr>
+        <w:tc>
+          <w:tcPr/>
+          <w:p>
+            <w:pPr>
+              <w:pStyle w:val="Compact"/>
+            </w:pPr>
+            <w:r>
+              <w:t xml:space="preserve">Presentation topic</w:t>
+            </w:r>
+          </w:p>
+        </w:tc>
+        <w:tc>
+          <w:tcPr/>
+          <w:p>
+            <w:pPr>
+              <w:pStyle w:val="Compact"/>
+            </w:pPr>
+            <w:r>
+              <w:t xml:space="preserve">Linked paper</w:t>
+            </w:r>
+          </w:p>
+        </w:tc>
+        <w:tc>
+          <w:tcPr/>
+          <w:p>
+            <w:pPr>
+              <w:pStyle w:val="Compact"/>
+            </w:pPr>
+            <w:r>
+              <w:t xml:space="preserve">Main contribution</w:t>
+            </w:r>
+          </w:p>
+        </w:tc>
+        <w:tc>
+          <w:tcPr/>
+          <w:p>
+            <w:pPr>
+              <w:pStyle w:val="Compact"/>
+            </w:pPr>
+            <w:r>
+              <w:t xml:space="preserve">Report use</w:t>
+            </w:r>
+          </w:p>
+        </w:tc>
+      </w:tr>
+      <w:tr>
+        <w:tc>
+          <w:tcPr/>
+          <w:p>
+            <w:pPr>
+              <w:pStyle w:val="Compact"/>
+            </w:pPr>
+            <w:hyperlink r:id="rId89">
+              <w:r>
+                <w:rPr>
+                  <w:rStyle w:val="Hyperlink"/>
+                </w:rPr>
+                <w:t xml:space="preserve">Implementation of an informed creep correction into the Chile Jack Mackerel CPUE Index</w:t>
+              </w:r>
+            </w:hyperlink>
+          </w:p>
+        </w:tc>
+        <w:tc>
+          <w:tcPr/>
+          <w:p>
+            <w:pPr>
+              <w:pStyle w:val="Compact"/>
+            </w:pPr>
+            <w:hyperlink r:id="rId50">
+              <w:r>
+                <w:rPr>
+                  <w:rStyle w:val="Hyperlink"/>
+                </w:rPr>
+                <w:t xml:space="preserve">SCW16-Doc07</w:t>
+              </w:r>
+            </w:hyperlink>
+          </w:p>
+        </w:tc>
+        <w:tc>
+          <w:tcPr/>
+          <w:p>
+            <w:pPr>
+              <w:pStyle w:val="Compact"/>
+            </w:pPr>
+            <w:r>
+              <w:t xml:space="preserve">Industrial-vessel fishing-power and effort-creep correction for the Chilean jack mackerel CPUE index.</w:t>
+            </w:r>
+          </w:p>
+        </w:tc>
+        <w:tc>
+          <w:tcPr/>
+          <w:p>
+            <w:pPr>
+              <w:pStyle w:val="Compact"/>
+            </w:pPr>
+            <w:r>
+              <w:t xml:space="preserve">Formal paper / candidate base or sensitivity treatment</w:t>
+            </w:r>
+          </w:p>
+        </w:tc>
+      </w:tr>
+      <w:tr>
+        <w:tc>
+          <w:tcPr/>
+          <w:p>
+            <w:pPr>
+              <w:pStyle w:val="Compact"/>
+            </w:pPr>
+            <w:hyperlink r:id="rId90">
+              <w:r>
+                <w:rPr>
+                  <w:rStyle w:val="Hyperlink"/>
+                </w:rPr>
+                <w:t xml:space="preserve">Standardization of Chilean jack mackerel CPUE fishery in central-southern Chile using Hierarchical Bayesian Models</w:t>
+              </w:r>
+            </w:hyperlink>
+          </w:p>
+        </w:tc>
+        <w:tc>
+          <w:tcPr/>
+          <w:p>
+            <w:pPr>
+              <w:pStyle w:val="Compact"/>
+            </w:pPr>
+            <w:hyperlink r:id="rId54">
+              <w:r>
+                <w:rPr>
+                  <w:rStyle w:val="Hyperlink"/>
+                </w:rPr>
+                <w:t xml:space="preserve">SCW16-Doc12</w:t>
+              </w:r>
+            </w:hyperlink>
+          </w:p>
+        </w:tc>
+        <w:tc>
+          <w:tcPr/>
+          <w:p>
+            <w:pPr>
+              <w:pStyle w:val="Compact"/>
+            </w:pPr>
+            <w:r>
+              <w:t xml:space="preserve">INLA-based spatio-temporal standardization of the central-southern Chile CPUE fishery.</w:t>
+            </w:r>
+          </w:p>
+        </w:tc>
+        <w:tc>
+          <w:tcPr/>
+          <w:p>
+            <w:pPr>
+              <w:pStyle w:val="Compact"/>
+            </w:pPr>
+            <w:r>
+              <w:t xml:space="preserve">Formal paper / candidate index</w:t>
+            </w:r>
+          </w:p>
+        </w:tc>
+      </w:tr>
+      <w:tr>
+        <w:tc>
+          <w:tcPr/>
+          <w:p>
+            <w:pPr>
+              <w:pStyle w:val="Compact"/>
+            </w:pPr>
+            <w:hyperlink r:id="rId91">
+              <w:r>
+                <w:rPr>
+                  <w:rStyle w:val="Hyperlink"/>
+                </w:rPr>
+                <w:t xml:space="preserve">Standardization of CPUE for jack mackerel in Peru</w:t>
+              </w:r>
+            </w:hyperlink>
+          </w:p>
+        </w:tc>
+        <w:tc>
+          <w:tcPr/>
+          <w:p>
+            <w:pPr>
+              <w:pStyle w:val="Compact"/>
+            </w:pPr>
+            <w:hyperlink r:id="rId56">
+              <w:r>
+                <w:rPr>
+                  <w:rStyle w:val="Hyperlink"/>
+                </w:rPr>
+                <w:t xml:space="preserve">SCW16-Doc15</w:t>
+              </w:r>
+            </w:hyperlink>
+          </w:p>
+        </w:tc>
+        <w:tc>
+          <w:tcPr/>
+          <w:p>
+            <w:pPr>
+              <w:pStyle w:val="Compact"/>
+            </w:pPr>
+            <w:r>
+              <w:t xml:space="preserve">Updated Peruvian CPUE standardization for 2015-2025 using industrial and artisanal fleet information.</w:t>
+            </w:r>
+          </w:p>
+        </w:tc>
+        <w:tc>
+          <w:tcPr/>
+          <w:p>
+            <w:pPr>
+              <w:pStyle w:val="Compact"/>
+            </w:pPr>
+            <w:r>
+              <w:t xml:space="preserve">Formal paper / candidate diagnostic or future index</w:t>
+            </w:r>
+          </w:p>
+        </w:tc>
+      </w:tr>
+      <w:tr>
+        <w:tc>
+          <w:tcPr/>
+          <w:p>
+            <w:pPr>
+              <w:pStyle w:val="Compact"/>
+            </w:pPr>
+            <w:hyperlink r:id="rId92">
+              <w:r>
+                <w:rPr>
+                  <w:rStyle w:val="Hyperlink"/>
+                </w:rPr>
+                <w:t xml:space="preserve">CPUE standardisation offshore fleet</w:t>
+              </w:r>
+            </w:hyperlink>
+          </w:p>
+        </w:tc>
+        <w:tc>
+          <w:tcPr/>
+          <w:p>
+            <w:pPr>
+              <w:pStyle w:val="Compact"/>
+            </w:pPr>
+            <w:r>
+              <w:t xml:space="preserve">Presentation only; related to offshore CPUE assessment treatment</w:t>
+            </w:r>
+          </w:p>
+        </w:tc>
+        <w:tc>
+          <w:tcPr/>
+          <w:p>
+            <w:pPr>
+              <w:pStyle w:val="Compact"/>
+            </w:pPr>
+            <w:r>
+              <w:t xml:space="preserve">Offshore fleet CPUE standardization, including treatment of a 2021 catchability break and environmental or catchability interpretation.</w:t>
+            </w:r>
+          </w:p>
+        </w:tc>
+        <w:tc>
+          <w:tcPr/>
+          <w:p>
+            <w:pPr>
+              <w:pStyle w:val="Compact"/>
+            </w:pPr>
+            <w:r>
+              <w:t xml:space="preserve">Presentation only / model-treatment diagnostic</w:t>
             </w:r>
           </w:p>
         </w:tc>
@@ -8318,7 +7485,8 @@
         </w:tc>
       </w:tr>
     </w:tbl>
-    <w:bookmarkEnd w:id="90"/>
+    <w:bookmarkEnd w:id="93"/>
+    <w:bookmarkEnd w:id="94"/>
     <w:sectPr>
       <w:footnotePr>
         <w:numRestart w:val="eachSect"/>

</xml_diff>

<commit_message>
Add paragraph numbers to benchmark report
</commit_message>
<xml_diff>
--- a/docs/JMWG-Benchmark-Meeting-report-2026.docx
+++ b/docs/JMWG-Benchmark-Meeting-report-2026.docx
@@ -128,6 +128,16 @@
       </w:pPr>
       <w:r>
         <w:rPr>
+          <w:b/>
+          <w:bCs/>
+        </w:rPr>
+        <w:t xml:space="preserve">1.</w:t>
+      </w:r>
+      <w:r>
+        <w:t xml:space="preserve"> </w:t>
+      </w:r>
+      <w:r>
+        <w:rPr>
           <w:i/>
           <w:iCs/>
         </w:rPr>
@@ -156,6 +166,16 @@
         <w:pStyle w:val="FirstParagraph"/>
       </w:pPr>
       <w:r>
+        <w:rPr>
+          <w:b/>
+          <w:bCs/>
+        </w:rPr>
+        <w:t xml:space="preserve">2.</w:t>
+      </w:r>
+      <w:r>
+        <w:t xml:space="preserve"> </w:t>
+      </w:r>
+      <w:r>
         <w:t xml:space="preserve">This is a starter draft for the 2026 Jack Mackerel Working Group benchmark meeting report. It is structured to capture the main workshop decisions, agreed recommendations, unresolved technical issues, and follow-up tasks needed to support the June 2026 management strategy evaluation workshop and subsequent Scientific Committee review.</w:t>
       </w:r>
     </w:p>
@@ -163,6 +183,16 @@
       <w:pPr>
         <w:pStyle w:val="BodyText"/>
       </w:pPr>
+      <w:r>
+        <w:rPr>
+          <w:b/>
+          <w:bCs/>
+        </w:rPr>
+        <w:t xml:space="preserve">3.</w:t>
+      </w:r>
+      <w:r>
+        <w:t xml:space="preserve"> </w:t>
+      </w:r>
       <w:r>
         <w:t xml:space="preserve">The benchmark meeting is expected to focus on assessment inputs, abundance-index evaluation, biological data and assumptions, assessment-model simplification, operating-model conditioning, and priorities for the MSE work programme. This draft should be updated during the workshop as sessions conclude, with short decision text and action items added while technical discussions are still current.</w:t>
       </w:r>
@@ -288,6 +318,16 @@
         <w:pStyle w:val="FirstParagraph"/>
       </w:pPr>
       <w:r>
+        <w:rPr>
+          <w:b/>
+          <w:bCs/>
+        </w:rPr>
+        <w:t xml:space="preserve">4.</w:t>
+      </w:r>
+      <w:r>
+        <w:t xml:space="preserve"> </w:t>
+      </w:r>
+      <w:r>
         <w:t xml:space="preserve">The Chair opened the meeting and welcomed participants to the 2026 benchmark workshop. The Chair noted that the workshop has a practical purpose: to convert a large set of technical contributions into clear benchmark priorities, model-input decisions, and follow-up tasks for the JMWG and MSE process.</w:t>
       </w:r>
     </w:p>
@@ -296,6 +336,16 @@
         <w:pStyle w:val="BodyText"/>
       </w:pPr>
       <w:r>
+        <w:rPr>
+          <w:b/>
+          <w:bCs/>
+        </w:rPr>
+        <w:t xml:space="preserve">5.</w:t>
+      </w:r>
+      <w:r>
+        <w:t xml:space="preserve"> </w:t>
+      </w:r>
+      <w:r>
         <w:t xml:space="preserve">The Chair emphasized that the benchmark material contains many sensitivities, including stock structure, index selection, catchability and availability, effort creep, selectivity, recruitment assumptions, biological inputs, and operating-model conditioning. The workshop should focus on which sensitivities materially affect advice, operating-model conditioning, and MSE readiness.</w:t>
       </w:r>
     </w:p>
@@ -304,6 +354,16 @@
         <w:pStyle w:val="BodyText"/>
       </w:pPr>
       <w:r>
+        <w:rPr>
+          <w:b/>
+          <w:bCs/>
+        </w:rPr>
+        <w:t xml:space="preserve">6.</w:t>
+      </w:r>
+      <w:r>
+        <w:t xml:space="preserve"> </w:t>
+      </w:r>
+      <w:r>
         <w:t xml:space="preserve">Members were encouraged, to the extent practical, to supplement technical presentations with concise information on data extent, including years covered, spatial coverage, fleet or survey coverage, observation unit, sample sizes, treatment of missing data, and whether uncertainty is available for assessment use.</w:t>
       </w:r>
     </w:p>
@@ -311,6 +371,16 @@
       <w:pPr>
         <w:pStyle w:val="BodyText"/>
       </w:pPr>
+      <w:r>
+        <w:rPr>
+          <w:b/>
+          <w:bCs/>
+        </w:rPr>
+        <w:t xml:space="preserve">7.</w:t>
+      </w:r>
+      <w:r>
+        <w:t xml:space="preserve"> </w:t>
+      </w:r>
       <w:r>
         <w:t xml:space="preserve">The Chair also noted that work sessions and report-writing time are part of the technical work of the meeting. Each session should aim to leave behind short text on decisions, unresolved issues, data requests, and recommended follow-up.</w:t>
       </w:r>
@@ -330,6 +400,16 @@
         <w:pStyle w:val="FirstParagraph"/>
       </w:pPr>
       <w:r>
+        <w:rPr>
+          <w:b/>
+          <w:bCs/>
+        </w:rPr>
+        <w:t xml:space="preserve">8.</w:t>
+      </w:r>
+      <w:r>
+        <w:t xml:space="preserve"> </w:t>
+      </w:r>
+      <w:r>
         <w:t xml:space="preserve">The meeting reviewed the draft agenda and agreed to organize the week around acoustic indices, CPUE indices, biological inputs, assessment-model development, projections, operating-model specifications, and final report adoption. A shortened agenda is provided in Appendix A.</w:t>
       </w:r>
     </w:p>
@@ -347,6 +427,16 @@
       <w:pPr>
         <w:pStyle w:val="FirstParagraph"/>
       </w:pPr>
+      <w:r>
+        <w:rPr>
+          <w:b/>
+          <w:bCs/>
+        </w:rPr>
+        <w:t xml:space="preserve">9.</w:t>
+      </w:r>
+      <w:r>
+        <w:t xml:space="preserve"> </w:t>
+      </w:r>
       <w:r>
         <w:t xml:space="preserve">The main objectives of the benchmark meeting are to:</w:t>
       </w:r>
@@ -438,6 +528,16 @@
         <w:pStyle w:val="FirstParagraph"/>
       </w:pPr>
       <w:r>
+        <w:rPr>
+          <w:b/>
+          <w:bCs/>
+        </w:rPr>
+        <w:t xml:space="preserve">10.</w:t>
+      </w:r>
+      <w:r>
+        <w:t xml:space="preserve"> </w:t>
+      </w:r>
+      <w:r>
         <w:t xml:space="preserve">The meeting work should be organized around technical sessions and smaller drafting or analysis groups. Where possible, each major topic should produce:</w:t>
       </w:r>
     </w:p>
@@ -505,6 +605,16 @@
       <w:pPr>
         <w:pStyle w:val="FirstParagraph"/>
       </w:pPr>
+      <w:r>
+        <w:rPr>
+          <w:b/>
+          <w:bCs/>
+        </w:rPr>
+        <w:t xml:space="preserve">11.</w:t>
+      </w:r>
+      <w:r>
+        <w:t xml:space="preserve"> </w:t>
+      </w:r>
       <w:r>
         <w:t xml:space="preserve">For contributors who are not working directly in GitHub, use Google Docs as the</w:t>
       </w:r>
@@ -559,6 +669,16 @@
         <w:pStyle w:val="FirstParagraph"/>
       </w:pPr>
       <w:r>
+        <w:rPr>
+          <w:b/>
+          <w:bCs/>
+        </w:rPr>
+        <w:t xml:space="preserve">12.</w:t>
+      </w:r>
+      <w:r>
+        <w:t xml:space="preserve"> </w:t>
+      </w:r>
+      <w:r>
         <w:t xml:space="preserve">The Day 1 acoustic session combined formal SCW16 working papers with presentation-only material. The presentations covered the history of the north-central Chile acoustic survey programme, preliminary 2026 survey results, oceanographic conditions during the 2026 survey, spatio-temporal standardization of acoustic backscatter, fishery-dependent acoustic information, Peruvian acoustic assessment information, sonar applications relevant to jack mackerel and anchoveta fisheries, and acoustic information collected by fishing vessels in Peru.</w:t>
       </w:r>
     </w:p>
@@ -567,6 +687,16 @@
         <w:pStyle w:val="BodyText"/>
       </w:pPr>
       <w:r>
+        <w:rPr>
+          <w:b/>
+          <w:bCs/>
+        </w:rPr>
+        <w:t xml:space="preserve">13.</w:t>
+      </w:r>
+      <w:r>
+        <w:t xml:space="preserve"> </w:t>
+      </w:r>
+      <w:r>
         <w:t xml:space="preserve">For reporting purposes, the presentation material should be separated into four categories: formal papers tied to numbered SCW16 documents, presentation-only background, new 2026 evidence, and context or supporting methods. This distinction is important because not all Day 1 material is intended to become a direct assessment input. Some presentations provide candidate abundance indices, while others provide survey context, environmental interpretation, diagnostic information, or methodological background.</w:t>
       </w:r>
     </w:p>
@@ -574,6 +704,16 @@
       <w:pPr>
         <w:pStyle w:val="BodyText"/>
       </w:pPr>
+      <w:r>
+        <w:rPr>
+          <w:b/>
+          <w:bCs/>
+        </w:rPr>
+        <w:t xml:space="preserve">14.</w:t>
+      </w:r>
+      <w:r>
+        <w:t xml:space="preserve"> </w:t>
+      </w:r>
       <w:r>
         <w:t xml:space="preserve">Presentation summaries are provided in Appendix D. Those tables should be updated</w:t>
       </w:r>
@@ -699,6 +839,16 @@
               <w:spacing w:before="16"/>
             </w:pPr>
             <w:r>
+              <w:rPr>
+                <w:b/>
+                <w:bCs/>
+              </w:rPr>
+              <w:t xml:space="preserve">15.</w:t>
+            </w:r>
+            <w:r>
+              <w:t xml:space="preserve"> </w:t>
+            </w:r>
+            <w:r>
               <w:t xml:space="preserve">The meeting noted that many working papers and presentations analysed important</w:t>
             </w:r>
             <w:r>
@@ -761,6 +911,16 @@
               <w:pStyle w:val="BodyText"/>
             </w:pPr>
             <w:r>
+              <w:rPr>
+                <w:b/>
+                <w:bCs/>
+              </w:rPr>
+              <w:t xml:space="preserve">16.</w:t>
+            </w:r>
+            <w:r>
+              <w:t xml:space="preserve"> </w:t>
+            </w:r>
+            <w:r>
               <w:t xml:space="preserve">For the north-central Chile acoustic survey programme, the meeting requested a</w:t>
             </w:r>
             <w:r>
@@ -817,6 +977,16 @@
               <w:pStyle w:val="BodyText"/>
             </w:pPr>
             <w:r>
+              <w:rPr>
+                <w:b/>
+                <w:bCs/>
+              </w:rPr>
+              <w:t xml:space="preserve">17.</w:t>
+            </w:r>
+            <w:r>
+              <w:t xml:space="preserve"> </w:t>
+            </w:r>
+            <w:r>
               <w:t xml:space="preserve">The historical review of hydroacoustic surveys in north-central Chile emphasized</w:t>
             </w:r>
             <w:r>
@@ -873,6 +1043,16 @@
               <w:pStyle w:val="BodyText"/>
             </w:pPr>
             <w:r>
+              <w:rPr>
+                <w:b/>
+                <w:bCs/>
+              </w:rPr>
+              <w:t xml:space="preserve">18.</w:t>
+            </w:r>
+            <w:r>
+              <w:t xml:space="preserve"> </w:t>
+            </w:r>
+            <w:r>
               <w:t xml:space="preserve">The preliminary 2026 Chile acoustic results raised questions about vertical</w:t>
             </w:r>
             <w:r>
@@ -929,6 +1109,16 @@
               <w:pStyle w:val="BodyText"/>
             </w:pPr>
             <w:r>
+              <w:rPr>
+                <w:b/>
+                <w:bCs/>
+              </w:rPr>
+              <w:t xml:space="preserve">19.</w:t>
+            </w:r>
+            <w:r>
+              <w:t xml:space="preserve"> </w:t>
+            </w:r>
+            <w:r>
               <w:t xml:space="preserve">The oceanographic presentation proposed that large jack mackerel may have moved</w:t>
             </w:r>
             <w:r>
@@ -984,6 +1174,16 @@
             <w:pPr>
               <w:pStyle w:val="BodyText"/>
             </w:pPr>
+            <w:r>
+              <w:rPr>
+                <w:b/>
+                <w:bCs/>
+              </w:rPr>
+              <w:t xml:space="preserve">20.</w:t>
+            </w:r>
+            <w:r>
+              <w:t xml:space="preserve"> </w:t>
+            </w:r>
             <w:r>
               <w:t xml:space="preserve">Two spatio-temporal acoustic standardization approaches for northern Chile were</w:t>
             </w:r>
@@ -1086,6 +1286,16 @@
               <w:pStyle w:val="BodyText"/>
             </w:pPr>
             <w:r>
+              <w:rPr>
+                <w:b/>
+                <w:bCs/>
+              </w:rPr>
+              <w:t xml:space="preserve">21.</w:t>
+            </w:r>
+            <w:r>
+              <w:t xml:space="preserve"> </w:t>
+            </w:r>
+            <w:r>
               <w:t xml:space="preserve">The fishery-dependent acoustic presentation for south-central Chile was viewed as</w:t>
             </w:r>
             <w:r>
@@ -1148,6 +1358,16 @@
               <w:pStyle w:val="BodyText"/>
             </w:pPr>
             <w:r>
+              <w:rPr>
+                <w:b/>
+                <w:bCs/>
+              </w:rPr>
+              <w:t xml:space="preserve">22.</w:t>
+            </w:r>
+            <w:r>
+              <w:t xml:space="preserve"> </w:t>
+            </w:r>
+            <w:r>
               <w:t xml:space="preserve">For the Chile central-south acoustic survey series, participants requested a</w:t>
             </w:r>
             <w:r>
@@ -1198,6 +1418,16 @@
               <w:pStyle w:val="BodyText"/>
             </w:pPr>
             <w:r>
+              <w:rPr>
+                <w:b/>
+                <w:bCs/>
+              </w:rPr>
+              <w:t xml:space="preserve">23.</w:t>
+            </w:r>
+            <w:r>
+              <w:t xml:space="preserve"> </w:t>
+            </w:r>
+            <w:r>
               <w:t xml:space="preserve">The Peruvian acoustic discussion emphasized that the acoustic survey programme</w:t>
             </w:r>
             <w:r>
@@ -1266,6 +1496,16 @@
               <w:pStyle w:val="BodyText"/>
             </w:pPr>
             <w:r>
+              <w:rPr>
+                <w:b/>
+                <w:bCs/>
+              </w:rPr>
+              <w:t xml:space="preserve">24.</w:t>
+            </w:r>
+            <w:r>
+              <w:t xml:space="preserve"> </w:t>
+            </w:r>
+            <w:r>
               <w:t xml:space="preserve">The sonar and fishing-vessel acoustic presentations provided methodological</w:t>
             </w:r>
             <w:r>
@@ -1318,6 +1558,16 @@
             <w:pPr>
               <w:spacing w:after="16"/>
             </w:pPr>
+            <w:r>
+              <w:rPr>
+                <w:b/>
+                <w:bCs/>
+              </w:rPr>
+              <w:t xml:space="preserve">25.</w:t>
+            </w:r>
+            <w:r>
+              <w:t xml:space="preserve"> </w:t>
+            </w:r>
             <w:r>
               <w:t xml:space="preserve">The meeting identified a need for a dedicated analysis that compares acoustic</w:t>
             </w:r>
@@ -1382,6 +1632,16 @@
       <w:pPr>
         <w:pStyle w:val="FirstParagraph"/>
       </w:pPr>
+      <w:r>
+        <w:rPr>
+          <w:b/>
+          <w:bCs/>
+        </w:rPr>
+        <w:t xml:space="preserve">26.</w:t>
+      </w:r>
+      <w:r>
+        <w:t xml:space="preserve"> </w:t>
+      </w:r>
       <w:r>
         <w:t xml:space="preserve">The Day 2 CPUE session reviewed catch and fishery data quality checks, Chilean</w:t>
       </w:r>
@@ -1534,6 +1794,16 @@
               <w:spacing w:before="16"/>
             </w:pPr>
             <w:r>
+              <w:rPr>
+                <w:b/>
+                <w:bCs/>
+              </w:rPr>
+              <w:t xml:space="preserve">27.</w:t>
+            </w:r>
+            <w:r>
+              <w:t xml:space="preserve"> </w:t>
+            </w:r>
+            <w:r>
               <w:t xml:space="preserve">The catch and fishery data quality-check presentation emphasized that the JMWG</w:t>
             </w:r>
             <w:r>
@@ -1611,6 +1881,16 @@
               <w:pStyle w:val="BodyText"/>
             </w:pPr>
             <w:r>
+              <w:rPr>
+                <w:b/>
+                <w:bCs/>
+              </w:rPr>
+              <w:t xml:space="preserve">28.</w:t>
+            </w:r>
+            <w:r>
+              <w:t xml:space="preserve"> </w:t>
+            </w:r>
+            <w:r>
               <w:t xml:space="preserve">The Chilean effort-creep presentation showed that the number of active</w:t>
             </w:r>
             <w:r>
@@ -1672,6 +1952,16 @@
             <w:pPr>
               <w:pStyle w:val="BodyText"/>
             </w:pPr>
+            <w:r>
+              <w:rPr>
+                <w:b/>
+                <w:bCs/>
+              </w:rPr>
+              <w:t xml:space="preserve">29.</w:t>
+            </w:r>
+            <w:r>
+              <w:t xml:space="preserve"> </w:t>
+            </w:r>
             <w:r>
               <w:t xml:space="preserve">For the Chilean</w:t>
             </w:r>
@@ -1756,6 +2046,16 @@
               <w:pStyle w:val="BodyText"/>
             </w:pPr>
             <w:r>
+              <w:rPr>
+                <w:b/>
+                <w:bCs/>
+              </w:rPr>
+              <w:t xml:space="preserve">30.</w:t>
+            </w:r>
+            <w:r>
+              <w:t xml:space="preserve"> </w:t>
+            </w:r>
+            <w:r>
               <w:t xml:space="preserve">The INLA-based Chilean CPUE analysis provided a complementary spatio-temporal</w:t>
             </w:r>
             <w:r>
@@ -1842,6 +2142,16 @@
               <w:pStyle w:val="BodyText"/>
             </w:pPr>
             <w:r>
+              <w:rPr>
+                <w:b/>
+                <w:bCs/>
+              </w:rPr>
+              <w:t xml:space="preserve">31.</w:t>
+            </w:r>
+            <w:r>
+              <w:t xml:space="preserve"> </w:t>
+            </w:r>
+            <w:r>
               <w:t xml:space="preserve">The meeting did not reach a final decision on replacing the current Chilean CPUE</w:t>
             </w:r>
             <w:r>
@@ -1886,6 +2196,16 @@
               <w:pStyle w:val="BodyText"/>
             </w:pPr>
             <w:r>
+              <w:rPr>
+                <w:b/>
+                <w:bCs/>
+              </w:rPr>
+              <w:t xml:space="preserve">32.</w:t>
+            </w:r>
+            <w:r>
+              <w:t xml:space="preserve"> </w:t>
+            </w:r>
+            <w:r>
               <w:t xml:space="preserve">The Peruvian CPUE presentation covered a standardized CPUE series for 2015-2025</w:t>
             </w:r>
             <w:r>
@@ -1980,6 +2300,16 @@
             <w:pPr>
               <w:spacing w:after="16"/>
             </w:pPr>
+            <w:r>
+              <w:rPr>
+                <w:b/>
+                <w:bCs/>
+              </w:rPr>
+              <w:t xml:space="preserve">33.</w:t>
+            </w:r>
+            <w:r>
+              <w:t xml:space="preserve"> </w:t>
+            </w:r>
             <w:r>
               <w:t xml:space="preserve">The offshore CPUE discussion included the treatment of a catchability break in</w:t>
             </w:r>
@@ -2033,6 +2363,16 @@
         <w:pStyle w:val="FirstParagraph"/>
       </w:pPr>
       <w:r>
+        <w:rPr>
+          <w:b/>
+          <w:bCs/>
+        </w:rPr>
+        <w:t xml:space="preserve">34.</w:t>
+      </w:r>
+      <w:r>
+        <w:t xml:space="preserve"> </w:t>
+      </w:r>
+      <w:r>
         <w:t xml:space="preserve">Text to be added during the meeting. This section should summarize biological assumptions and data inputs, including maturity, natural mortality, weight-at-age, length-weight relationships, length-frequency composition data, and implications for assessment and operating-model conditioning.</w:t>
       </w:r>
     </w:p>
@@ -2051,6 +2391,16 @@
         <w:pStyle w:val="FirstParagraph"/>
       </w:pPr>
       <w:r>
+        <w:rPr>
+          <w:b/>
+          <w:bCs/>
+        </w:rPr>
+        <w:t xml:space="preserve">35.</w:t>
+      </w:r>
+      <w:r>
+        <w:t xml:space="preserve"> </w:t>
+      </w:r>
+      <w:r>
         <w:t xml:space="preserve">Text to be added during the meeting. This section should summarize the SC13 base-model developments, candidate simplifications, single-stock and two-stock alternatives, reduced-index configurations, selectivity assumptions, recruitment scenarios, and model diagnostics.</w:t>
       </w:r>
     </w:p>
@@ -2068,6 +2418,16 @@
       <w:pPr>
         <w:pStyle w:val="FirstParagraph"/>
       </w:pPr>
+      <w:r>
+        <w:rPr>
+          <w:b/>
+          <w:bCs/>
+        </w:rPr>
+        <w:t xml:space="preserve">36.</w:t>
+      </w:r>
+      <w:r>
+        <w:t xml:space="preserve"> </w:t>
+      </w:r>
       <w:r>
         <w:t xml:space="preserve">Text to be added during the meeting. This section should summarize operating-model specifications, reference-set and robustness-set uncertainties, MCMC feasibility, management-procedure input diagnostics, and workflow needs for the June 2026 MSE workshop.</w:t>
       </w:r>
@@ -2087,6 +2447,16 @@
       <w:pPr>
         <w:pStyle w:val="FirstParagraph"/>
       </w:pPr>
+      <w:r>
+        <w:rPr>
+          <w:b/>
+          <w:bCs/>
+        </w:rPr>
+        <w:t xml:space="preserve">37.</w:t>
+      </w:r>
+      <w:r>
+        <w:t xml:space="preserve"> </w:t>
+      </w:r>
       <w:r>
         <w:t xml:space="preserve">Add agreed decisions here as the meeting proceeds.</w:t>
       </w:r>
@@ -2215,6 +2585,16 @@
       <w:pPr>
         <w:pStyle w:val="FirstParagraph"/>
       </w:pPr>
+      <w:r>
+        <w:rPr>
+          <w:b/>
+          <w:bCs/>
+        </w:rPr>
+        <w:t xml:space="preserve">38.</w:t>
+      </w:r>
+      <w:r>
+        <w:t xml:space="preserve"> </w:t>
+      </w:r>
       <w:r>
         <w:t xml:space="preserve">Add actions here as the meeting proceeds.</w:t>
       </w:r>

</xml_diff>

<commit_message>
Add Day 3 CPUE and biology decisions
</commit_message>
<xml_diff>
--- a/docs/JMWG-Benchmark-Meeting-report-2026.docx
+++ b/docs/JMWG-Benchmark-Meeting-report-2026.docx
@@ -1891,61 +1891,61 @@
               <w:t xml:space="preserve"> </w:t>
             </w:r>
             <w:r>
-              <w:t xml:space="preserve">The Chilean effort-creep presentation showed that the number of active</w:t>
-            </w:r>
-            <w:r>
-              <w:t xml:space="preserve"> </w:t>
-            </w:r>
-            <w:r>
-              <w:t xml:space="preserve">industrial vessels has declined while average hold capacity has increased over</w:t>
-            </w:r>
-            <w:r>
-              <w:t xml:space="preserve"> </w:t>
-            </w:r>
-            <w:r>
-              <w:t xml:space="preserve">time. Participants discussed whether applying the creep factor as an effort</w:t>
-            </w:r>
-            <w:r>
-              <w:t xml:space="preserve"> </w:t>
-            </w:r>
-            <w:r>
-              <w:t xml:space="preserve">correction is equivalent to imposing a catchability change, and whether the</w:t>
-            </w:r>
-            <w:r>
-              <w:t xml:space="preserve"> </w:t>
-            </w:r>
-            <w:r>
-              <w:t xml:space="preserve">survey/interview information used to estimate creep can be maintained regularly.</w:t>
-            </w:r>
-            <w:r>
-              <w:t xml:space="preserve"> </w:t>
-            </w:r>
-            <w:r>
-              <w:t xml:space="preserve">The meeting also noted that the artisanal fleet now accounts for a larger share</w:t>
-            </w:r>
-            <w:r>
-              <w:t xml:space="preserve"> </w:t>
-            </w:r>
-            <w:r>
-              <w:t xml:space="preserve">of Chilean catch and may need to be considered in future effort-creep work. As a</w:t>
-            </w:r>
-            <w:r>
-              <w:t xml:space="preserve"> </w:t>
-            </w:r>
-            <w:r>
-              <w:t xml:space="preserve">diagnostic, the meeting requested a model run with no creep correction but with a</w:t>
-            </w:r>
-            <w:r>
-              <w:t xml:space="preserve"> </w:t>
-            </w:r>
-            <w:r>
-              <w:t xml:space="preserve">catchability step change in 2005, to evaluate whether the assessment estimates a</w:t>
-            </w:r>
-            <w:r>
-              <w:t xml:space="preserve"> </w:t>
-            </w:r>
-            <w:r>
-              <w:t xml:space="preserve">large catchability shift without imposing the creep correction directly.</w:t>
+              <w:t xml:space="preserve">During the evaluation of the modelling procedure for the Chilean South-Central</w:t>
+            </w:r>
+            <w:r>
+              <w:t xml:space="preserve"> </w:t>
+            </w:r>
+            <w:r>
+              <w:t xml:space="preserve">(SC) fleet abundance index, benchmark participants deliberated on the most</w:t>
+            </w:r>
+            <w:r>
+              <w:t xml:space="preserve"> </w:t>
+            </w:r>
+            <w:r>
+              <w:t xml:space="preserve">robust method to account for effort creep. Initial positions diverged, with</w:t>
+            </w:r>
+            <w:r>
+              <w:t xml:space="preserve"> </w:t>
+            </w:r>
+            <w:r>
+              <w:t xml:space="preserve">Chile proposing to apply an informed correction factor from 2005 onwards,</w:t>
+            </w:r>
+            <w:r>
+              <w:t xml:space="preserve"> </w:t>
+            </w:r>
+            <w:r>
+              <w:t xml:space="preserve">whereas the EU advocated for maintaining a fixed 1% compounded factor across the</w:t>
+            </w:r>
+            <w:r>
+              <w:t xml:space="preserve"> </w:t>
+            </w:r>
+            <w:r>
+              <w:t xml:space="preserve">entire time series. After extensive discussion, the majority of members agreed</w:t>
+            </w:r>
+            <w:r>
+              <w:t xml:space="preserve"> </w:t>
+            </w:r>
+            <w:r>
+              <w:t xml:space="preserve">to proceed with an alternative approach: applying a 1% compounded increase creep</w:t>
+            </w:r>
+            <w:r>
+              <w:t xml:space="preserve"> </w:t>
+            </w:r>
+            <w:r>
+              <w:t xml:space="preserve">factor up to 2004, followed by a transition to the p10 correction factor from</w:t>
+            </w:r>
+            <w:r>
+              <w:t xml:space="preserve"> </w:t>
+            </w:r>
+            <w:r>
+              <w:t xml:space="preserve">2005 onward, where a fixed multiplicative factor of 0.669 is applied to the</w:t>
+            </w:r>
+            <w:r>
+              <w:t xml:space="preserve"> </w:t>
+            </w:r>
+            <w:r>
+              <w:t xml:space="preserve">abundance index, as proposed by Zenteno and Paya (2026).</w:t>
             </w:r>
           </w:p>
           <w:p>
@@ -1963,82 +1963,55 @@
               <w:t xml:space="preserve"> </w:t>
             </w:r>
             <w:r>
-              <w:t xml:space="preserve">For the Chilean</w:t>
-            </w:r>
-            <w:r>
-              <w:t xml:space="preserve"> </w:t>
-            </w:r>
-            <w:r>
-              <w:rPr>
-                <w:rStyle w:val="VerbatimChar"/>
-              </w:rPr>
-              <w:t xml:space="preserve">sdmTMB</w:t>
-            </w:r>
-            <w:r>
-              <w:t xml:space="preserve"> </w:t>
-            </w:r>
-            <w:r>
-              <w:t xml:space="preserve">CPUE analysis, the meeting noted that the index was</w:t>
-            </w:r>
-            <w:r>
-              <w:t xml:space="preserve"> </w:t>
-            </w:r>
-            <w:r>
-              <w:t xml:space="preserve">updated through 2026 and is based on set-level data. Discussion focused on haul</w:t>
-            </w:r>
-            <w:r>
-              <w:t xml:space="preserve"> </w:t>
-            </w:r>
-            <w:r>
-              <w:t xml:space="preserve">capacity treatment, the use of a spline smoother versus vessel categories, the</w:t>
-            </w:r>
-            <w:r>
-              <w:t xml:space="preserve"> </w:t>
-            </w:r>
-            <w:r>
-              <w:t xml:space="preserve">large imbalance in early-year data coverage, and whether true zero catches are</w:t>
-            </w:r>
-            <w:r>
-              <w:t xml:space="preserve"> </w:t>
-            </w:r>
-            <w:r>
-              <w:t xml:space="preserve">available and should be incorporated. Participants noted that the early part of</w:t>
-            </w:r>
-            <w:r>
-              <w:t xml:space="preserve"> </w:t>
-            </w:r>
-            <w:r>
-              <w:t xml:space="preserve">the set-level data may represent a very small fraction of total catch, raising</w:t>
-            </w:r>
-            <w:r>
-              <w:t xml:space="preserve"> </w:t>
-            </w:r>
-            <w:r>
-              <w:t xml:space="preserve">questions about representativeness before about 2005. The meeting requested that</w:t>
-            </w:r>
-            <w:r>
-              <w:t xml:space="preserve"> </w:t>
-            </w:r>
-            <w:r>
-              <w:t xml:space="preserve">the data table include the number and proportion of sets by year, and that the</w:t>
-            </w:r>
-            <w:r>
-              <w:t xml:space="preserve"> </w:t>
-            </w:r>
-            <w:r>
-              <w:t xml:space="preserve">authors provide a clear explanation for why the new set-based CPUE series gives</w:t>
-            </w:r>
-            <w:r>
-              <w:t xml:space="preserve"> </w:t>
-            </w:r>
-            <w:r>
-              <w:t xml:space="preserve">lower CPUE in earlier years with high catches than the current trip-based</w:t>
-            </w:r>
-            <w:r>
-              <w:t xml:space="preserve"> </w:t>
-            </w:r>
-            <w:r>
-              <w:t xml:space="preserve">assessment series.</w:t>
+              <w:t xml:space="preserve">The technical rationale supporting this methodological update is grounded in</w:t>
+            </w:r>
+            <w:r>
+              <w:t xml:space="preserve"> </w:t>
+            </w:r>
+            <w:r>
+              <w:t xml:space="preserve">both empirical data and historical fleet dynamics. First, this approach directly</w:t>
+            </w:r>
+            <w:r>
+              <w:t xml:space="preserve"> </w:t>
+            </w:r>
+            <w:r>
+              <w:t xml:space="preserve">incorporates operational feedback from the Chilean SC fleet captains, who</w:t>
+            </w:r>
+            <w:r>
+              <w:t xml:space="preserve"> </w:t>
+            </w:r>
+            <w:r>
+              <w:t xml:space="preserve">identified 2005 as an inflection point for changes in fishing efficiency.</w:t>
+            </w:r>
+            <w:r>
+              <w:t xml:space="preserve"> </w:t>
+            </w:r>
+            <w:r>
+              <w:t xml:space="preserve">Second, acknowledging this shift, the majority of members concurred that</w:t>
+            </w:r>
+            <w:r>
+              <w:t xml:space="preserve"> </w:t>
+            </w:r>
+            <w:r>
+              <w:t xml:space="preserve">applying a continuously increasing efficiency correction after that period is</w:t>
+            </w:r>
+            <w:r>
+              <w:t xml:space="preserve"> </w:t>
+            </w:r>
+            <w:r>
+              <w:t xml:space="preserve">largely unnecessary. Finally, retaining the 1% factor prior to 2005 effectively</w:t>
+            </w:r>
+            <w:r>
+              <w:t xml:space="preserve"> </w:t>
+            </w:r>
+            <w:r>
+              <w:t xml:space="preserve">anchors the earlier time series, avoiding the substantial jump in historical</w:t>
+            </w:r>
+            <w:r>
+              <w:t xml:space="preserve"> </w:t>
+            </w:r>
+            <w:r>
+              <w:t xml:space="preserve">efficiency that was the primary concern with the initial proposal.</w:t>
             </w:r>
           </w:p>
           <w:p>
@@ -2056,85 +2029,49 @@
               <w:t xml:space="preserve"> </w:t>
             </w:r>
             <w:r>
-              <w:t xml:space="preserve">The INLA-based Chilean CPUE analysis provided a complementary spatio-temporal</w:t>
-            </w:r>
-            <w:r>
-              <w:t xml:space="preserve"> </w:t>
-            </w:r>
-            <w:r>
-              <w:t xml:space="preserve">standardization. Participants discussed mesh resolution, the treatment of</w:t>
-            </w:r>
-            <w:r>
-              <w:t xml:space="preserve"> </w:t>
-            </w:r>
-            <w:r>
-              <w:t xml:space="preserve">northern fishing activity, whether assessment fleets should be defined primarily</w:t>
-            </w:r>
-            <w:r>
-              <w:t xml:space="preserve"> </w:t>
-            </w:r>
-            <w:r>
-              <w:t xml:space="preserve">by area or vessel behaviour, and whether CPUE weighting should be based on catch</w:t>
-            </w:r>
-            <w:r>
-              <w:t xml:space="preserve"> </w:t>
-            </w:r>
-            <w:r>
-              <w:t xml:space="preserve">rates rather than catch. The meeting noted that the model appeared sensitive to</w:t>
-            </w:r>
-            <w:r>
-              <w:t xml:space="preserve"> </w:t>
-            </w:r>
-            <w:r>
-              <w:t xml:space="preserve">data updates, with inclusion of 2026 data changing earlier predictions, and that</w:t>
-            </w:r>
-            <w:r>
-              <w:t xml:space="preserve"> </w:t>
-            </w:r>
-            <w:r>
-              <w:t xml:space="preserve">this sensitivity needs to be explained before replacing the existing assessment</w:t>
-            </w:r>
-            <w:r>
-              <w:t xml:space="preserve"> </w:t>
-            </w:r>
-            <w:r>
-              <w:t xml:space="preserve">index. Participants also discussed fixed versus random year effects, AR(1)</w:t>
-            </w:r>
-            <w:r>
-              <w:t xml:space="preserve"> </w:t>
-            </w:r>
-            <w:r>
-              <w:t xml:space="preserve">versus independent year effects, and the interpretation of the days-at-sea or</w:t>
-            </w:r>
-            <w:r>
-              <w:t xml:space="preserve"> </w:t>
-            </w:r>
-            <w:r>
-              <w:t xml:space="preserve">DFP coefficient. Because offshore movement can increase days at sea without</w:t>
-            </w:r>
-            <w:r>
-              <w:t xml:space="preserve"> </w:t>
-            </w:r>
-            <w:r>
-              <w:t xml:space="preserve">necessarily indicating reduced abundance, the meeting requested that the strength</w:t>
-            </w:r>
-            <w:r>
-              <w:t xml:space="preserve"> </w:t>
-            </w:r>
-            <w:r>
-              <w:t xml:space="preserve">and interpretation of this coefficient be checked, and that Sebastian, Ignacio,</w:t>
-            </w:r>
-            <w:r>
-              <w:t xml:space="preserve"> </w:t>
-            </w:r>
-            <w:r>
-              <w:t xml:space="preserve">and Niels summarize the model-comparison and year-effect discussion for the</w:t>
-            </w:r>
-            <w:r>
-              <w:t xml:space="preserve"> </w:t>
-            </w:r>
-            <w:r>
-              <w:t xml:space="preserve">report.</w:t>
+              <w:t xml:space="preserve">Participants also discussed whether applying the creep factor as an effort</w:t>
+            </w:r>
+            <w:r>
+              <w:t xml:space="preserve"> </w:t>
+            </w:r>
+            <w:r>
+              <w:t xml:space="preserve">correction is equivalent to imposing a catchability change, and whether the</w:t>
+            </w:r>
+            <w:r>
+              <w:t xml:space="preserve"> </w:t>
+            </w:r>
+            <w:r>
+              <w:t xml:space="preserve">survey/interview information used to estimate creep can be maintained regularly.</w:t>
+            </w:r>
+            <w:r>
+              <w:t xml:space="preserve"> </w:t>
+            </w:r>
+            <w:r>
+              <w:t xml:space="preserve">The meeting noted that the artisanal fleet now accounts for a larger share of</w:t>
+            </w:r>
+            <w:r>
+              <w:t xml:space="preserve"> </w:t>
+            </w:r>
+            <w:r>
+              <w:t xml:space="preserve">Chilean catch and may need to be considered in future effort-creep work. As a</w:t>
+            </w:r>
+            <w:r>
+              <w:t xml:space="preserve"> </w:t>
+            </w:r>
+            <w:r>
+              <w:t xml:space="preserve">diagnostic, the meeting requested a model run with no creep correction but with a</w:t>
+            </w:r>
+            <w:r>
+              <w:t xml:space="preserve"> </w:t>
+            </w:r>
+            <w:r>
+              <w:t xml:space="preserve">catchability step change in 2005, to evaluate whether the assessment estimates a</w:t>
+            </w:r>
+            <w:r>
+              <w:t xml:space="preserve"> </w:t>
+            </w:r>
+            <w:r>
+              <w:t xml:space="preserve">large catchability shift without imposing the creep correction directly.</w:t>
             </w:r>
           </w:p>
           <w:p>
@@ -2152,43 +2089,82 @@
               <w:t xml:space="preserve"> </w:t>
             </w:r>
             <w:r>
-              <w:t xml:space="preserve">The meeting did not reach a final decision on replacing the current Chilean CPUE</w:t>
-            </w:r>
-            <w:r>
-              <w:t xml:space="preserve"> </w:t>
-            </w:r>
-            <w:r>
-              <w:t xml:space="preserve">series. The group needs a defensible explanation for any move from the current</w:t>
-            </w:r>
-            <w:r>
-              <w:t xml:space="preserve"> </w:t>
-            </w:r>
-            <w:r>
-              <w:t xml:space="preserve">trip-based index to a new spatio-temporal set-based index, including how early</w:t>
-            </w:r>
-            <w:r>
-              <w:t xml:space="preserve"> </w:t>
-            </w:r>
-            <w:r>
-              <w:t xml:space="preserve">low coverage, model sensitivity, year-effect treatment, northern fishing</w:t>
-            </w:r>
-            <w:r>
-              <w:t xml:space="preserve"> </w:t>
-            </w:r>
-            <w:r>
-              <w:t xml:space="preserve">activity, catchability, and annual standard errors would be handled in the stock</w:t>
-            </w:r>
-            <w:r>
-              <w:t xml:space="preserve"> </w:t>
-            </w:r>
-            <w:r>
-              <w:t xml:space="preserve">assessment. If a new Chilean CPUE product is carried forward, the assessment</w:t>
-            </w:r>
-            <w:r>
-              <w:t xml:space="preserve"> </w:t>
-            </w:r>
-            <w:r>
-              <w:t xml:space="preserve">model should use the annual uncertainty estimates from that analysis.</w:t>
+              <w:t xml:space="preserve">For the Chilean</w:t>
+            </w:r>
+            <w:r>
+              <w:t xml:space="preserve"> </w:t>
+            </w:r>
+            <w:r>
+              <w:rPr>
+                <w:rStyle w:val="VerbatimChar"/>
+              </w:rPr>
+              <w:t xml:space="preserve">sdmTMB</w:t>
+            </w:r>
+            <w:r>
+              <w:t xml:space="preserve"> </w:t>
+            </w:r>
+            <w:r>
+              <w:t xml:space="preserve">CPUE analysis, the meeting noted that the index was</w:t>
+            </w:r>
+            <w:r>
+              <w:t xml:space="preserve"> </w:t>
+            </w:r>
+            <w:r>
+              <w:t xml:space="preserve">updated through 2026 and is based on set-level data. Discussion focused on haul</w:t>
+            </w:r>
+            <w:r>
+              <w:t xml:space="preserve"> </w:t>
+            </w:r>
+            <w:r>
+              <w:t xml:space="preserve">capacity treatment, the use of a spline smoother versus vessel categories, the</w:t>
+            </w:r>
+            <w:r>
+              <w:t xml:space="preserve"> </w:t>
+            </w:r>
+            <w:r>
+              <w:t xml:space="preserve">large imbalance in early-year data coverage, and whether true zero catches are</w:t>
+            </w:r>
+            <w:r>
+              <w:t xml:space="preserve"> </w:t>
+            </w:r>
+            <w:r>
+              <w:t xml:space="preserve">available and should be incorporated. Participants noted that the early part of</w:t>
+            </w:r>
+            <w:r>
+              <w:t xml:space="preserve"> </w:t>
+            </w:r>
+            <w:r>
+              <w:t xml:space="preserve">the set-level data may represent a very small fraction of total catch, raising</w:t>
+            </w:r>
+            <w:r>
+              <w:t xml:space="preserve"> </w:t>
+            </w:r>
+            <w:r>
+              <w:t xml:space="preserve">questions about representativeness before about 2005. The meeting requested that</w:t>
+            </w:r>
+            <w:r>
+              <w:t xml:space="preserve"> </w:t>
+            </w:r>
+            <w:r>
+              <w:t xml:space="preserve">the data table include the number and proportion of sets by year, and that the</w:t>
+            </w:r>
+            <w:r>
+              <w:t xml:space="preserve"> </w:t>
+            </w:r>
+            <w:r>
+              <w:t xml:space="preserve">authors provide a clear explanation for why the new set-based CPUE series gives</w:t>
+            </w:r>
+            <w:r>
+              <w:t xml:space="preserve"> </w:t>
+            </w:r>
+            <w:r>
+              <w:t xml:space="preserve">lower CPUE in earlier years with high catches than the current trip-based</w:t>
+            </w:r>
+            <w:r>
+              <w:t xml:space="preserve"> </w:t>
+            </w:r>
+            <w:r>
+              <w:t xml:space="preserve">assessment series.</w:t>
             </w:r>
           </w:p>
           <w:p>
@@ -2206,99 +2182,90 @@
               <w:t xml:space="preserve"> </w:t>
             </w:r>
             <w:r>
-              <w:t xml:space="preserve">The Peruvian CPUE presentation covered a standardized CPUE series for 2015-2025</w:t>
-            </w:r>
-            <w:r>
-              <w:t xml:space="preserve"> </w:t>
-            </w:r>
-            <w:r>
-              <w:t xml:space="preserve">that combines industrial and artisanal fleets. The meeting noted this combined</w:t>
-            </w:r>
-            <w:r>
-              <w:t xml:space="preserve"> </w:t>
-            </w:r>
-            <w:r>
-              <w:t xml:space="preserve">fleet treatment as a strength, but also discussed the interpretation of trip</w:t>
-            </w:r>
-            <w:r>
-              <w:t xml:space="preserve"> </w:t>
-            </w:r>
-            <w:r>
-              <w:t xml:space="preserve">locations, haul-capacity and distance-to-coast smoothers, possible differences</w:t>
-            </w:r>
-            <w:r>
-              <w:t xml:space="preserve"> </w:t>
-            </w:r>
-            <w:r>
-              <w:t xml:space="preserve">between industrial and artisanal fleet effects, and changes in Peruvian fishing</w:t>
-            </w:r>
-            <w:r>
-              <w:t xml:space="preserve"> </w:t>
-            </w:r>
-            <w:r>
-              <w:t xml:space="preserve">operations. Members noted that jack mackerel has been used for direct human</w:t>
-            </w:r>
-            <w:r>
-              <w:t xml:space="preserve"> </w:t>
-            </w:r>
-            <w:r>
-              <w:t xml:space="preserve">consumption in Peru since 2002, and that the artisanal fishery has accounted for</w:t>
-            </w:r>
-            <w:r>
-              <w:t xml:space="preserve"> </w:t>
-            </w:r>
-            <w:r>
-              <w:t xml:space="preserve">a larger share of the quota since 2019. The updated CPUE series does not yet</w:t>
-            </w:r>
-            <w:r>
-              <w:t xml:space="preserve"> </w:t>
-            </w:r>
-            <w:r>
-              <w:t xml:space="preserve">extend back far enough to evaluate the full historical period, and extension to</w:t>
-            </w:r>
-            <w:r>
-              <w:t xml:space="preserve"> </w:t>
-            </w:r>
-            <w:r>
-              <w:t xml:space="preserve">earlier years is expected later in 2026. The meeting therefore noted that the</w:t>
-            </w:r>
-            <w:r>
-              <w:t xml:space="preserve"> </w:t>
-            </w:r>
-            <w:r>
-              <w:t xml:space="preserve">benchmark cannot make a final decision on using the new Peru CPUE series for the</w:t>
-            </w:r>
-            <w:r>
-              <w:t xml:space="preserve"> </w:t>
-            </w:r>
-            <w:r>
-              <w:t xml:space="preserve">June 2026 MSE work, because the full time series will not be available for</w:t>
-            </w:r>
-            <w:r>
-              <w:t xml:space="preserve"> </w:t>
-            </w:r>
-            <w:r>
-              <w:t xml:space="preserve">evaluation until later. The meeting requested additional diagnostics, including</w:t>
-            </w:r>
-            <w:r>
-              <w:t xml:space="preserve"> </w:t>
-            </w:r>
-            <w:r>
-              <w:t xml:space="preserve">the smoother on the year interaction, before deciding whether and how the new</w:t>
-            </w:r>
-            <w:r>
-              <w:t xml:space="preserve"> </w:t>
-            </w:r>
-            <w:r>
-              <w:t xml:space="preserve">series could be linked with the older Peru CPUE and acoustic information.</w:t>
+              <w:t xml:space="preserve">The INLA-based Chilean CPUE analysis provided a complementary spatio-temporal</w:t>
+            </w:r>
+            <w:r>
+              <w:t xml:space="preserve"> </w:t>
+            </w:r>
+            <w:r>
+              <w:t xml:space="preserve">standardization. Participants discussed mesh resolution, the treatment of</w:t>
+            </w:r>
+            <w:r>
+              <w:t xml:space="preserve"> </w:t>
+            </w:r>
+            <w:r>
+              <w:t xml:space="preserve">northern fishing activity, whether assessment fleets should be defined primarily</w:t>
+            </w:r>
+            <w:r>
+              <w:t xml:space="preserve"> </w:t>
+            </w:r>
+            <w:r>
+              <w:t xml:space="preserve">by area or vessel behaviour, and whether CPUE weighting should be based on catch</w:t>
+            </w:r>
+            <w:r>
+              <w:t xml:space="preserve"> </w:t>
+            </w:r>
+            <w:r>
+              <w:t xml:space="preserve">rates rather than catch. The meeting noted that the model appeared sensitive to</w:t>
+            </w:r>
+            <w:r>
+              <w:t xml:space="preserve"> </w:t>
+            </w:r>
+            <w:r>
+              <w:t xml:space="preserve">data updates, with inclusion of 2026 data changing earlier predictions, and that</w:t>
+            </w:r>
+            <w:r>
+              <w:t xml:space="preserve"> </w:t>
+            </w:r>
+            <w:r>
+              <w:t xml:space="preserve">this sensitivity needs to be explained before replacing the existing assessment</w:t>
+            </w:r>
+            <w:r>
+              <w:t xml:space="preserve"> </w:t>
+            </w:r>
+            <w:r>
+              <w:t xml:space="preserve">index. Participants also discussed fixed versus random year effects, AR(1)</w:t>
+            </w:r>
+            <w:r>
+              <w:t xml:space="preserve"> </w:t>
+            </w:r>
+            <w:r>
+              <w:t xml:space="preserve">versus independent year effects, and the interpretation of the days-at-sea or</w:t>
+            </w:r>
+            <w:r>
+              <w:t xml:space="preserve"> </w:t>
+            </w:r>
+            <w:r>
+              <w:t xml:space="preserve">DFP coefficient. Because offshore movement can increase days at sea without</w:t>
+            </w:r>
+            <w:r>
+              <w:t xml:space="preserve"> </w:t>
+            </w:r>
+            <w:r>
+              <w:t xml:space="preserve">necessarily indicating reduced abundance, the meeting requested that the strength</w:t>
+            </w:r>
+            <w:r>
+              <w:t xml:space="preserve"> </w:t>
+            </w:r>
+            <w:r>
+              <w:t xml:space="preserve">and interpretation of this coefficient be checked, and that Sebastian, Ignacio,</w:t>
+            </w:r>
+            <w:r>
+              <w:t xml:space="preserve"> </w:t>
+            </w:r>
+            <w:r>
+              <w:t xml:space="preserve">and Niels summarize the model-comparison and year-effect discussion for the</w:t>
+            </w:r>
+            <w:r>
+              <w:t xml:space="preserve"> </w:t>
+            </w:r>
+            <w:r>
+              <w:t xml:space="preserve">report.</w:t>
             </w:r>
           </w:p>
           <w:p>
             <w:pPr>
               <w:pStyle w:val="BodyText"/>
-            </w:pPr>
-            <w:pPr>
-              <w:spacing w:after="16"/>
             </w:pPr>
             <w:r>
               <w:rPr>
@@ -2311,6 +2278,147 @@
               <w:t xml:space="preserve"> </w:t>
             </w:r>
             <w:r>
+              <w:t xml:space="preserve">The Day 3 discussion agreed to move forward with a new Chilean CPUE treatment</w:t>
+            </w:r>
+            <w:r>
+              <w:t xml:space="preserve"> </w:t>
+            </w:r>
+            <w:r>
+              <w:t xml:space="preserve">starting in 1998, using the agreed effort-creep treatment described above.</w:t>
+            </w:r>
+            <w:r>
+              <w:t xml:space="preserve"> </w:t>
+            </w:r>
+            <w:r>
+              <w:t xml:space="preserve">Annual CVs should be weighted by percentage coverage and should incorporate</w:t>
+            </w:r>
+            <w:r>
+              <w:t xml:space="preserve"> </w:t>
+            </w:r>
+            <w:r>
+              <w:t xml:space="preserve">standard errors from the INLA analysis. The previous Chilean CPUE index should</w:t>
+            </w:r>
+            <w:r>
+              <w:t xml:space="preserve"> </w:t>
+            </w:r>
+            <w:r>
+              <w:t xml:space="preserve">be removed from the base model. A sensitivity run should be retained that uses</w:t>
+            </w:r>
+            <w:r>
+              <w:t xml:space="preserve"> </w:t>
+            </w:r>
+            <w:r>
+              <w:t xml:space="preserve">the old CPUE information piecemeal before 1998, to evaluate the consequence of</w:t>
+            </w:r>
+            <w:r>
+              <w:t xml:space="preserve"> </w:t>
+            </w:r>
+            <w:r>
+              <w:t xml:space="preserve">preserving historical contrast before the new CPUE series begins.</w:t>
+            </w:r>
+          </w:p>
+          <w:p>
+            <w:pPr>
+              <w:pStyle w:val="BodyText"/>
+            </w:pPr>
+            <w:r>
+              <w:rPr>
+                <w:b/>
+                <w:bCs/>
+              </w:rPr>
+              <w:t xml:space="preserve">34.</w:t>
+            </w:r>
+            <w:r>
+              <w:t xml:space="preserve"> </w:t>
+            </w:r>
+            <w:r>
+              <w:t xml:space="preserve">The Peruvian CPUE presentation covered a standardized CPUE series for 2015-2025</w:t>
+            </w:r>
+            <w:r>
+              <w:t xml:space="preserve"> </w:t>
+            </w:r>
+            <w:r>
+              <w:t xml:space="preserve">that combines industrial and artisanal fleets. The meeting noted this combined</w:t>
+            </w:r>
+            <w:r>
+              <w:t xml:space="preserve"> </w:t>
+            </w:r>
+            <w:r>
+              <w:t xml:space="preserve">fleet treatment as a strength, but also discussed the interpretation of trip</w:t>
+            </w:r>
+            <w:r>
+              <w:t xml:space="preserve"> </w:t>
+            </w:r>
+            <w:r>
+              <w:t xml:space="preserve">locations, haul-capacity and distance-to-coast smoothers, possible differences</w:t>
+            </w:r>
+            <w:r>
+              <w:t xml:space="preserve"> </w:t>
+            </w:r>
+            <w:r>
+              <w:t xml:space="preserve">between industrial and artisanal fleet effects, and changes in Peruvian fishing</w:t>
+            </w:r>
+            <w:r>
+              <w:t xml:space="preserve"> </w:t>
+            </w:r>
+            <w:r>
+              <w:t xml:space="preserve">operations. Members noted that jack mackerel has been used for direct human</w:t>
+            </w:r>
+            <w:r>
+              <w:t xml:space="preserve"> </w:t>
+            </w:r>
+            <w:r>
+              <w:t xml:space="preserve">consumption in Peru since 2002, and that the artisanal fishery has accounted for</w:t>
+            </w:r>
+            <w:r>
+              <w:t xml:space="preserve"> </w:t>
+            </w:r>
+            <w:r>
+              <w:t xml:space="preserve">a larger share of the quota since 2019. The Day 3 discussion agreed that the new</w:t>
+            </w:r>
+            <w:r>
+              <w:t xml:space="preserve"> </w:t>
+            </w:r>
+            <w:r>
+              <w:t xml:space="preserve">Peruvian CPUE series starts later than the historical assessment CPUE treatment</w:t>
+            </w:r>
+            <w:r>
+              <w:t xml:space="preserve"> </w:t>
+            </w:r>
+            <w:r>
+              <w:t xml:space="preserve">and should replace the previous Peru CPUE index rather than be appended to it in</w:t>
+            </w:r>
+            <w:r>
+              <w:t xml:space="preserve"> </w:t>
+            </w:r>
+            <w:r>
+              <w:t xml:space="preserve">the base model. The previous Peru CPUE index should therefore be removed from the</w:t>
+            </w:r>
+            <w:r>
+              <w:t xml:space="preserve"> </w:t>
+            </w:r>
+            <w:r>
+              <w:t xml:space="preserve">base configuration.</w:t>
+            </w:r>
+          </w:p>
+          <w:p>
+            <w:pPr>
+              <w:pStyle w:val="BodyText"/>
+            </w:pPr>
+            <w:pPr>
+              <w:spacing w:after="16"/>
+            </w:pPr>
+            <w:r>
+              <w:rPr>
+                <w:b/>
+                <w:bCs/>
+              </w:rPr>
+              <w:t xml:space="preserve">35.</w:t>
+            </w:r>
+            <w:r>
+              <w:t xml:space="preserve"> </w:t>
+            </w:r>
+            <w:r>
               <w:t xml:space="preserve">The offshore CPUE discussion included the treatment of a catchability break in</w:t>
             </w:r>
             <w:r>
@@ -2356,62 +2464,6 @@
       </w:pPr>
       <w:r>
         <w:t xml:space="preserve">Biological Inputs</w:t>
-      </w:r>
-    </w:p>
-    <w:p>
-      <w:pPr>
-        <w:pStyle w:val="FirstParagraph"/>
-      </w:pPr>
-      <w:r>
-        <w:rPr>
-          <w:b/>
-          <w:bCs/>
-        </w:rPr>
-        <w:t xml:space="preserve">34.</w:t>
-      </w:r>
-      <w:r>
-        <w:t xml:space="preserve"> </w:t>
-      </w:r>
-      <w:r>
-        <w:t xml:space="preserve">Text to be added during the meeting. This section should summarize biological assumptions and data inputs, including maturity, natural mortality, weight-at-age, length-weight relationships, length-frequency composition data, and implications for assessment and operating-model conditioning.</w:t>
-      </w:r>
-    </w:p>
-    <w:bookmarkEnd w:id="26"/>
-    <w:bookmarkStart w:id="27" w:name="assessment-model-development"/>
-    <w:p>
-      <w:pPr>
-        <w:pStyle w:val="Heading2"/>
-      </w:pPr>
-      <w:r>
-        <w:t xml:space="preserve">Assessment Model Development</w:t>
-      </w:r>
-    </w:p>
-    <w:p>
-      <w:pPr>
-        <w:pStyle w:val="FirstParagraph"/>
-      </w:pPr>
-      <w:r>
-        <w:rPr>
-          <w:b/>
-          <w:bCs/>
-        </w:rPr>
-        <w:t xml:space="preserve">35.</w:t>
-      </w:r>
-      <w:r>
-        <w:t xml:space="preserve"> </w:t>
-      </w:r>
-      <w:r>
-        <w:t xml:space="preserve">Text to be added during the meeting. This section should summarize the SC13 base-model developments, candidate simplifications, single-stock and two-stock alternatives, reduced-index configurations, selectivity assumptions, recruitment scenarios, and model diagnostics.</w:t>
-      </w:r>
-    </w:p>
-    <w:bookmarkEnd w:id="27"/>
-    <w:bookmarkStart w:id="28" w:name="operating-models-and-mse-linkages"/>
-    <w:p>
-      <w:pPr>
-        <w:pStyle w:val="Heading2"/>
-      </w:pPr>
-      <w:r>
-        <w:t xml:space="preserve">Operating Models and MSE Linkages</w:t>
       </w:r>
     </w:p>
     <w:p>
@@ -2429,23 +2481,42 @@
         <w:t xml:space="preserve"> </w:t>
       </w:r>
       <w:r>
-        <w:t xml:space="preserve">Text to be added during the meeting. This section should summarize operating-model specifications, reference-set and robustness-set uncertainties, MCMC feasibility, management-procedure input diagnostics, and workflow needs for the June 2026 MSE workshop.</w:t>
-      </w:r>
-    </w:p>
-    <w:bookmarkEnd w:id="28"/>
-    <w:bookmarkEnd w:id="29"/>
-    <w:bookmarkStart w:id="30" w:name="decisions-and-agreements"/>
-    <w:p>
-      <w:pPr>
-        <w:pStyle w:val="Heading1"/>
-      </w:pPr>
-      <w:r>
-        <w:t xml:space="preserve">Decisions and Agreements</w:t>
-      </w:r>
-    </w:p>
-    <w:p>
-      <w:pPr>
-        <w:pStyle w:val="FirstParagraph"/>
+        <w:t xml:space="preserve">The Day 3 biological-input discussion reviewed the Peruvian length-weight and</w:t>
+      </w:r>
+      <w:r>
+        <w:t xml:space="preserve"> </w:t>
+      </w:r>
+      <w:r>
+        <w:t xml:space="preserve">length-frequency material and agreed that the Peruvian length frequencies should</w:t>
+      </w:r>
+      <w:r>
+        <w:t xml:space="preserve"> </w:t>
+      </w:r>
+      <w:r>
+        <w:t xml:space="preserve">be treated as fork length. Growth parameters used with those data should</w:t>
+      </w:r>
+      <w:r>
+        <w:t xml:space="preserve"> </w:t>
+      </w:r>
+      <w:r>
+        <w:t xml:space="preserve">therefore also be in fork length. The assessment should also increase the plus</w:t>
+      </w:r>
+      <w:r>
+        <w:t xml:space="preserve"> </w:t>
+      </w:r>
+      <w:r>
+        <w:t xml:space="preserve">group so the Peruvian length-frequency information and growth assumptions are</w:t>
+      </w:r>
+      <w:r>
+        <w:t xml:space="preserve"> </w:t>
+      </w:r>
+      <w:r>
+        <w:t xml:space="preserve">handled consistently in the model.</w:t>
+      </w:r>
+    </w:p>
+    <w:p>
+      <w:pPr>
+        <w:pStyle w:val="BodyText"/>
       </w:pPr>
       <w:r>
         <w:rPr>
@@ -2458,20 +2529,118 @@
         <w:t xml:space="preserve"> </w:t>
       </w:r>
       <w:r>
-        <w:t xml:space="preserve">Add agreed decisions here as the meeting proceeds.</w:t>
+        <w:t xml:space="preserve">For Peru acoustic information, the meeting agreed to move to the new Peruvian</w:t>
+      </w:r>
+      <w:r>
+        <w:t xml:space="preserve"> </w:t>
+      </w:r>
+      <w:r>
+        <w:t xml:space="preserve">acoustic indices and remove the previous Peru acoustic index from the base</w:t>
+      </w:r>
+      <w:r>
+        <w:t xml:space="preserve"> </w:t>
+      </w:r>
+      <w:r>
+        <w:t xml:space="preserve">configuration. The associated Peruvian length-frequency information should be</w:t>
+      </w:r>
+      <w:r>
+        <w:t xml:space="preserve"> </w:t>
+      </w:r>
+      <w:r>
+        <w:t xml:space="preserve">carried forward with the new acoustic treatment. No new Chilean Acoustic North</w:t>
+      </w:r>
+      <w:r>
+        <w:t xml:space="preserve"> </w:t>
+      </w:r>
+      <w:r>
+        <w:t xml:space="preserve">or Chilean Acoustic South-Central index treatment was selected for the base model</w:t>
+      </w:r>
+      <w:r>
+        <w:t xml:space="preserve"> </w:t>
+      </w:r>
+      <w:r>
+        <w:t xml:space="preserve">at this stage.</w:t>
+      </w:r>
+    </w:p>
+    <w:bookmarkEnd w:id="26"/>
+    <w:bookmarkStart w:id="27" w:name="assessment-model-development"/>
+    <w:p>
+      <w:pPr>
+        <w:pStyle w:val="Heading2"/>
+      </w:pPr>
+      <w:r>
+        <w:t xml:space="preserve">Assessment Model Development</w:t>
+      </w:r>
+    </w:p>
+    <w:p>
+      <w:pPr>
+        <w:pStyle w:val="FirstParagraph"/>
+      </w:pPr>
+      <w:r>
+        <w:rPr>
+          <w:b/>
+          <w:bCs/>
+        </w:rPr>
+        <w:t xml:space="preserve">38.</w:t>
+      </w:r>
+      <w:r>
+        <w:t xml:space="preserve"> </w:t>
+      </w:r>
+      <w:r>
+        <w:t xml:space="preserve">Text to be added during the meeting. This section should summarize the SC13 base-model developments, candidate simplifications, single-stock and two-stock alternatives, reduced-index configurations, selectivity assumptions, recruitment scenarios, and model diagnostics.</w:t>
+      </w:r>
+    </w:p>
+    <w:bookmarkEnd w:id="27"/>
+    <w:bookmarkStart w:id="28" w:name="operating-models-and-mse-linkages"/>
+    <w:p>
+      <w:pPr>
+        <w:pStyle w:val="Heading2"/>
+      </w:pPr>
+      <w:r>
+        <w:t xml:space="preserve">Operating Models and MSE Linkages</w:t>
+      </w:r>
+    </w:p>
+    <w:p>
+      <w:pPr>
+        <w:pStyle w:val="FirstParagraph"/>
+      </w:pPr>
+      <w:r>
+        <w:rPr>
+          <w:b/>
+          <w:bCs/>
+        </w:rPr>
+        <w:t xml:space="preserve">39.</w:t>
+      </w:r>
+      <w:r>
+        <w:t xml:space="preserve"> </w:t>
+      </w:r>
+      <w:r>
+        <w:t xml:space="preserve">Text to be added during the meeting. This section should summarize operating-model specifications, reference-set and robustness-set uncertainties, MCMC feasibility, management-procedure input diagnostics, and workflow needs for the June 2026 MSE workshop.</w:t>
+      </w:r>
+    </w:p>
+    <w:bookmarkEnd w:id="28"/>
+    <w:bookmarkEnd w:id="29"/>
+    <w:bookmarkStart w:id="30" w:name="decisions-and-agreements"/>
+    <w:p>
+      <w:pPr>
+        <w:pStyle w:val="Heading1"/>
+      </w:pPr>
+      <w:r>
+        <w:t xml:space="preserve">Decisions and Agreements</w:t>
       </w:r>
     </w:p>
     <w:tbl>
       <w:tblPr>
         <w:tblStyle w:val="Table"/>
-        <w:tblW w:type="auto" w:w="0"/>
+        <w:tblW w:type="pct" w:w="5000"/>
+        <w:tblLayout w:type="fixed"/>
         <w:tblLook w:firstRow="1" w:lastRow="0" w:firstColumn="0" w:lastColumn="0" w:noHBand="0" w:noVBand="0" w:val="0020"/>
       </w:tblPr>
       <w:tblGrid>
-        <w:gridCol w:w="1980"/>
-        <w:gridCol w:w="1980"/>
-        <w:gridCol w:w="1980"/>
-        <w:gridCol w:w="1980"/>
+        <w:gridCol w:w="2436"/>
+        <w:gridCol w:w="1827"/>
+        <w:gridCol w:w="1827"/>
+        <w:gridCol w:w="1827"/>
       </w:tblGrid>
       <w:tr>
         <w:trPr>
@@ -2543,29 +2712,405 @@
               <w:pStyle w:val="Compact"/>
             </w:pPr>
             <w:r>
-              <w:t xml:space="preserve">TBD</w:t>
-            </w:r>
-          </w:p>
-        </w:tc>
-        <w:tc>
-          <w:tcPr/>
-          <w:p>
-            <w:pPr>
-              <w:pStyle w:val="Compact"/>
-            </w:pPr>
-            <w:r>
-              <w:t xml:space="preserve">TBD</w:t>
-            </w:r>
-          </w:p>
-        </w:tc>
-        <w:tc>
-          <w:tcPr/>
-          <w:p>
-            <w:pPr>
-              <w:pStyle w:val="Compact"/>
-            </w:pPr>
-            <w:r>
-              <w:t xml:space="preserve">TBD</w:t>
+              <w:t xml:space="preserve">Use the new Chilean CPUE series beginning in 1998.</w:t>
+            </w:r>
+          </w:p>
+        </w:tc>
+        <w:tc>
+          <w:tcPr/>
+          <w:p>
+            <w:pPr>
+              <w:pStyle w:val="Compact"/>
+            </w:pPr>
+            <w:r>
+              <w:t xml:space="preserve">Chile CPUE</w:t>
+            </w:r>
+          </w:p>
+        </w:tc>
+        <w:tc>
+          <w:tcPr/>
+          <w:p>
+            <w:pPr>
+              <w:pStyle w:val="Compact"/>
+            </w:pPr>
+            <w:r>
+              <w:t xml:space="preserve">Implement in the base model and remove the previous Chilean CPUE index.</w:t>
+            </w:r>
+          </w:p>
+        </w:tc>
+      </w:tr>
+      <w:tr>
+        <w:tc>
+          <w:tcPr/>
+          <w:p>
+            <w:pPr>
+              <w:pStyle w:val="Compact"/>
+              <w:jc w:val="right"/>
+            </w:pPr>
+            <w:r>
+              <w:t xml:space="preserve">2</w:t>
+            </w:r>
+          </w:p>
+        </w:tc>
+        <w:tc>
+          <w:tcPr/>
+          <w:p>
+            <w:pPr>
+              <w:pStyle w:val="Compact"/>
+            </w:pPr>
+            <w:r>
+              <w:t xml:space="preserve">Apply the Chilean effort-creep treatment with 1% annual creep through 2004 and the 0.669 adjustment beginning in 2005.</w:t>
+            </w:r>
+          </w:p>
+        </w:tc>
+        <w:tc>
+          <w:tcPr/>
+          <w:p>
+            <w:pPr>
+              <w:pStyle w:val="Compact"/>
+            </w:pPr>
+            <w:r>
+              <w:t xml:space="preserve">Chile CPUE / effort creep</w:t>
+            </w:r>
+          </w:p>
+        </w:tc>
+        <w:tc>
+          <w:tcPr/>
+          <w:p>
+            <w:pPr>
+              <w:pStyle w:val="Compact"/>
+            </w:pPr>
+            <w:r>
+              <w:t xml:space="preserve">Confirm the exact implementation in the model input and control files.</w:t>
+            </w:r>
+          </w:p>
+        </w:tc>
+      </w:tr>
+      <w:tr>
+        <w:tc>
+          <w:tcPr/>
+          <w:p>
+            <w:pPr>
+              <w:pStyle w:val="Compact"/>
+              <w:jc w:val="right"/>
+            </w:pPr>
+            <w:r>
+              <w:t xml:space="preserve">3</w:t>
+            </w:r>
+          </w:p>
+        </w:tc>
+        <w:tc>
+          <w:tcPr/>
+          <w:p>
+            <w:pPr>
+              <w:pStyle w:val="Compact"/>
+            </w:pPr>
+            <w:r>
+              <w:t xml:space="preserve">Weight Chilean CPUE CVs by percentage coverage and include standard errors from the INLA analysis.</w:t>
+            </w:r>
+          </w:p>
+        </w:tc>
+        <w:tc>
+          <w:tcPr/>
+          <w:p>
+            <w:pPr>
+              <w:pStyle w:val="Compact"/>
+            </w:pPr>
+            <w:r>
+              <w:t xml:space="preserve">Chile CPUE uncertainty</w:t>
+            </w:r>
+          </w:p>
+        </w:tc>
+        <w:tc>
+          <w:tcPr/>
+          <w:p>
+            <w:pPr>
+              <w:pStyle w:val="Compact"/>
+            </w:pPr>
+            <w:r>
+              <w:t xml:space="preserve">Prepare the annual uncertainty vector for assessment input.</w:t>
+            </w:r>
+          </w:p>
+        </w:tc>
+      </w:tr>
+      <w:tr>
+        <w:tc>
+          <w:tcPr/>
+          <w:p>
+            <w:pPr>
+              <w:pStyle w:val="Compact"/>
+              <w:jc w:val="right"/>
+            </w:pPr>
+            <w:r>
+              <w:t xml:space="preserve">4</w:t>
+            </w:r>
+          </w:p>
+        </w:tc>
+        <w:tc>
+          <w:tcPr/>
+          <w:p>
+            <w:pPr>
+              <w:pStyle w:val="Compact"/>
+            </w:pPr>
+            <w:r>
+              <w:t xml:space="preserve">Retain a sensitivity with piecemeal use of the old Chilean CPUE before 1998.</w:t>
+            </w:r>
+          </w:p>
+        </w:tc>
+        <w:tc>
+          <w:tcPr/>
+          <w:p>
+            <w:pPr>
+              <w:pStyle w:val="Compact"/>
+            </w:pPr>
+            <w:r>
+              <w:t xml:space="preserve">Chile CPUE sensitivity</w:t>
+            </w:r>
+          </w:p>
+        </w:tc>
+        <w:tc>
+          <w:tcPr/>
+          <w:p>
+            <w:pPr>
+              <w:pStyle w:val="Compact"/>
+            </w:pPr>
+            <w:r>
+              <w:t xml:space="preserve">Add to the candidate sensitivity-run list.</w:t>
+            </w:r>
+          </w:p>
+        </w:tc>
+      </w:tr>
+      <w:tr>
+        <w:tc>
+          <w:tcPr/>
+          <w:p>
+            <w:pPr>
+              <w:pStyle w:val="Compact"/>
+              <w:jc w:val="right"/>
+            </w:pPr>
+            <w:r>
+              <w:t xml:space="preserve">5</w:t>
+            </w:r>
+          </w:p>
+        </w:tc>
+        <w:tc>
+          <w:tcPr/>
+          <w:p>
+            <w:pPr>
+              <w:pStyle w:val="Compact"/>
+            </w:pPr>
+            <w:r>
+              <w:t xml:space="preserve">Use the new Peruvian CPUE series as a later-starting replacement and remove the previous Peru CPUE index.</w:t>
+            </w:r>
+          </w:p>
+        </w:tc>
+        <w:tc>
+          <w:tcPr/>
+          <w:p>
+            <w:pPr>
+              <w:pStyle w:val="Compact"/>
+            </w:pPr>
+            <w:r>
+              <w:t xml:space="preserve">Peru CPUE</w:t>
+            </w:r>
+          </w:p>
+        </w:tc>
+        <w:tc>
+          <w:tcPr/>
+          <w:p>
+            <w:pPr>
+              <w:pStyle w:val="Compact"/>
+            </w:pPr>
+            <w:r>
+              <w:t xml:space="preserve">Implement the replacement in the base model.</w:t>
+            </w:r>
+          </w:p>
+        </w:tc>
+      </w:tr>
+      <w:tr>
+        <w:tc>
+          <w:tcPr/>
+          <w:p>
+            <w:pPr>
+              <w:pStyle w:val="Compact"/>
+              <w:jc w:val="right"/>
+            </w:pPr>
+            <w:r>
+              <w:t xml:space="preserve">6</w:t>
+            </w:r>
+          </w:p>
+        </w:tc>
+        <w:tc>
+          <w:tcPr/>
+          <w:p>
+            <w:pPr>
+              <w:pStyle w:val="Compact"/>
+            </w:pPr>
+            <w:r>
+              <w:t xml:space="preserve">Treat Peruvian length frequencies as fork length and use growth parameters in fork length.</w:t>
+            </w:r>
+          </w:p>
+        </w:tc>
+        <w:tc>
+          <w:tcPr/>
+          <w:p>
+            <w:pPr>
+              <w:pStyle w:val="Compact"/>
+            </w:pPr>
+            <w:r>
+              <w:t xml:space="preserve">Peru biology / composition</w:t>
+            </w:r>
+          </w:p>
+        </w:tc>
+        <w:tc>
+          <w:tcPr/>
+          <w:p>
+            <w:pPr>
+              <w:pStyle w:val="Compact"/>
+            </w:pPr>
+            <w:r>
+              <w:t xml:space="preserve">Check consistency of growth, length-frequency bins, and length-weight inputs.</w:t>
+            </w:r>
+          </w:p>
+        </w:tc>
+      </w:tr>
+      <w:tr>
+        <w:tc>
+          <w:tcPr/>
+          <w:p>
+            <w:pPr>
+              <w:pStyle w:val="Compact"/>
+              <w:jc w:val="right"/>
+            </w:pPr>
+            <w:r>
+              <w:t xml:space="preserve">7</w:t>
+            </w:r>
+          </w:p>
+        </w:tc>
+        <w:tc>
+          <w:tcPr/>
+          <w:p>
+            <w:pPr>
+              <w:pStyle w:val="Compact"/>
+            </w:pPr>
+            <w:r>
+              <w:t xml:space="preserve">Increase the plus group for the Peruvian length-frequency and growth treatment.</w:t>
+            </w:r>
+          </w:p>
+        </w:tc>
+        <w:tc>
+          <w:tcPr/>
+          <w:p>
+            <w:pPr>
+              <w:pStyle w:val="Compact"/>
+            </w:pPr>
+            <w:r>
+              <w:t xml:space="preserve">Peru biology / composition</w:t>
+            </w:r>
+          </w:p>
+        </w:tc>
+        <w:tc>
+          <w:tcPr/>
+          <w:p>
+            <w:pPr>
+              <w:pStyle w:val="Compact"/>
+            </w:pPr>
+            <w:r>
+              <w:t xml:space="preserve">Specify the plus-group age in the candidate model configuration.</w:t>
+            </w:r>
+          </w:p>
+        </w:tc>
+      </w:tr>
+      <w:tr>
+        <w:tc>
+          <w:tcPr/>
+          <w:p>
+            <w:pPr>
+              <w:pStyle w:val="Compact"/>
+              <w:jc w:val="right"/>
+            </w:pPr>
+            <w:r>
+              <w:t xml:space="preserve">8</w:t>
+            </w:r>
+          </w:p>
+        </w:tc>
+        <w:tc>
+          <w:tcPr/>
+          <w:p>
+            <w:pPr>
+              <w:pStyle w:val="Compact"/>
+            </w:pPr>
+            <w:r>
+              <w:t xml:space="preserve">Use the new Peruvian acoustic indices and remove the previous Peru acoustic index.</w:t>
+            </w:r>
+          </w:p>
+        </w:tc>
+        <w:tc>
+          <w:tcPr/>
+          <w:p>
+            <w:pPr>
+              <w:pStyle w:val="Compact"/>
+            </w:pPr>
+            <w:r>
+              <w:t xml:space="preserve">Peru acoustic index</w:t>
+            </w:r>
+          </w:p>
+        </w:tc>
+        <w:tc>
+          <w:tcPr/>
+          <w:p>
+            <w:pPr>
+              <w:pStyle w:val="Compact"/>
+            </w:pPr>
+            <w:r>
+              <w:t xml:space="preserve">Carry forward associated length-frequency information with the new acoustic treatment.</w:t>
+            </w:r>
+          </w:p>
+        </w:tc>
+      </w:tr>
+      <w:tr>
+        <w:tc>
+          <w:tcPr/>
+          <w:p>
+            <w:pPr>
+              <w:pStyle w:val="Compact"/>
+              <w:jc w:val="right"/>
+            </w:pPr>
+            <w:r>
+              <w:t xml:space="preserve">9</w:t>
+            </w:r>
+          </w:p>
+        </w:tc>
+        <w:tc>
+          <w:tcPr/>
+          <w:p>
+            <w:pPr>
+              <w:pStyle w:val="Compact"/>
+            </w:pPr>
+            <w:r>
+              <w:t xml:space="preserve">Do not add a new base-model treatment for Chilean Acoustic North or Chilean Acoustic South-Central at this stage.</w:t>
+            </w:r>
+          </w:p>
+        </w:tc>
+        <w:tc>
+          <w:tcPr/>
+          <w:p>
+            <w:pPr>
+              <w:pStyle w:val="Compact"/>
+            </w:pPr>
+            <w:r>
+              <w:t xml:space="preserve">Chile acoustic indices</w:t>
+            </w:r>
+          </w:p>
+        </w:tc>
+        <w:tc>
+          <w:tcPr/>
+          <w:p>
+            <w:pPr>
+              <w:pStyle w:val="Compact"/>
+            </w:pPr>
+            <w:r>
+              <w:t xml:space="preserve">Retain as diagnostic or supporting information unless a later sensitivity is requested.</w:t>
             </w:r>
           </w:p>
         </w:tc>
@@ -2590,7 +3135,7 @@
           <w:b/>
           <w:bCs/>
         </w:rPr>
-        <w:t xml:space="preserve">38.</w:t>
+        <w:t xml:space="preserve">40.</w:t>
       </w:r>
       <w:r>
         <w:t xml:space="preserve"> </w:t>
@@ -3361,7 +3906,7 @@
               <w:pStyle w:val="Compact"/>
             </w:pPr>
             <w:r>
-              <w:t xml:space="preserve">Before CPUE index decisions</w:t>
+              <w:t xml:space="preserve">Before final model-run list</w:t>
             </w:r>
           </w:p>
         </w:tc>
@@ -3374,7 +3919,7 @@
               <w:pStyle w:val="Compact"/>
             </w:pPr>
             <w:r>
-              <w:t xml:space="preserve">Prepare report-ready text explaining differences between the current trip-based Chile CPUE and the new set-based spatio-temporal CPUE products, especially in early high-catch years</w:t>
+              <w:t xml:space="preserve">Prepare the new Chilean CPUE input beginning in 1998, including the agreed effort-creep adjustment and annual CVs weighted by percentage coverage with INLA standard errors</w:t>
             </w:r>
           </w:p>
         </w:tc>
@@ -3396,18 +3941,18 @@
               <w:pStyle w:val="Compact"/>
             </w:pPr>
             <w:r>
-              <w:t xml:space="preserve">Sebastian / Ignacio / Niels</w:t>
-            </w:r>
-          </w:p>
-        </w:tc>
-        <w:tc>
-          <w:tcPr/>
-          <w:p>
-            <w:pPr>
-              <w:pStyle w:val="Compact"/>
-            </w:pPr>
-            <w:r>
-              <w:t xml:space="preserve">Before CPUE index decisions</w:t>
+              <w:t xml:space="preserve">Assessment subgroup</w:t>
+            </w:r>
+          </w:p>
+        </w:tc>
+        <w:tc>
+          <w:tcPr/>
+          <w:p>
+            <w:pPr>
+              <w:pStyle w:val="Compact"/>
+            </w:pPr>
+            <w:r>
+              <w:t xml:space="preserve">Before final model-run list</w:t>
             </w:r>
           </w:p>
         </w:tc>
@@ -3420,7 +3965,18 @@
               <w:pStyle w:val="Compact"/>
             </w:pPr>
             <w:r>
-              <w:t xml:space="preserve">Check the strength and interpretation of the days-at-sea or DFP coefficient in the INLA-based Chile CPUE analysis</w:t>
+              <w:t xml:space="preserve">Add the sensitivity using piecemeal old Chilean CPUE before 1998</w:t>
+            </w:r>
+          </w:p>
+        </w:tc>
+        <w:tc>
+          <w:tcPr/>
+          <w:p>
+            <w:pPr>
+              <w:pStyle w:val="Compact"/>
+            </w:pPr>
+            <w:r>
+              <w:t xml:space="preserve">Assessment subgroup</w:t>
             </w:r>
           </w:p>
         </w:tc>
@@ -3442,18 +3998,7 @@
               <w:pStyle w:val="Compact"/>
             </w:pPr>
             <w:r>
-              <w:t xml:space="preserve">Assessment/index subgroup</w:t>
-            </w:r>
-          </w:p>
-        </w:tc>
-        <w:tc>
-          <w:tcPr/>
-          <w:p>
-            <w:pPr>
-              <w:pStyle w:val="Compact"/>
-            </w:pPr>
-            <w:r>
-              <w:t xml:space="preserve">Before CPUE index decisions</w:t>
+              <w:t xml:space="preserve">Before final model-run list</w:t>
             </w:r>
           </w:p>
         </w:tc>
@@ -3466,7 +4011,7 @@
               <w:pStyle w:val="Compact"/>
             </w:pPr>
             <w:r>
-              <w:t xml:space="preserve">Check whether zero CPUE records are true fishing zeroes or technical/non-fishing records and whether zeroes should be included in Chile CPUE standardization</w:t>
+              <w:t xml:space="preserve">Check the strength and interpretation of the days-at-sea or DFP coefficient in the INLA-based Chile CPUE analysis</w:t>
             </w:r>
           </w:p>
         </w:tc>
@@ -3499,7 +4044,7 @@
               <w:pStyle w:val="Compact"/>
             </w:pPr>
             <w:r>
-              <w:t xml:space="preserve">Before final model-run list</w:t>
+              <w:t xml:space="preserve">Before CPUE index decisions</w:t>
             </w:r>
           </w:p>
         </w:tc>
@@ -3512,40 +4057,40 @@
               <w:pStyle w:val="Compact"/>
             </w:pPr>
             <w:r>
-              <w:t xml:space="preserve">Extend and evaluate the Peru CPUE time series before deciding whether it can be used as an assessment or MSE input</w:t>
-            </w:r>
-          </w:p>
-        </w:tc>
-        <w:tc>
-          <w:tcPr/>
-          <w:p>
-            <w:pPr>
-              <w:pStyle w:val="Compact"/>
-            </w:pPr>
-            <w:r>
-              <w:t xml:space="preserve">Peru CPUE contributors</w:t>
-            </w:r>
-          </w:p>
-        </w:tc>
-        <w:tc>
-          <w:tcPr/>
-          <w:p>
-            <w:pPr>
-              <w:pStyle w:val="Compact"/>
-            </w:pPr>
-            <w:r>
-              <w:t xml:space="preserve">Assessment subgroup</w:t>
-            </w:r>
-          </w:p>
-        </w:tc>
-        <w:tc>
-          <w:tcPr/>
-          <w:p>
-            <w:pPr>
-              <w:pStyle w:val="Compact"/>
-            </w:pPr>
-            <w:r>
-              <w:t xml:space="preserve">Before future benchmark/model updates</w:t>
+              <w:t xml:space="preserve">Check whether zero CPUE records are true fishing zeroes or technical/non-fishing records and whether zeroes should be included in Chile CPUE standardization</w:t>
+            </w:r>
+          </w:p>
+        </w:tc>
+        <w:tc>
+          <w:tcPr/>
+          <w:p>
+            <w:pPr>
+              <w:pStyle w:val="Compact"/>
+            </w:pPr>
+            <w:r>
+              <w:t xml:space="preserve">Chile CPUE contributors</w:t>
+            </w:r>
+          </w:p>
+        </w:tc>
+        <w:tc>
+          <w:tcPr/>
+          <w:p>
+            <w:pPr>
+              <w:pStyle w:val="Compact"/>
+            </w:pPr>
+            <w:r>
+              <w:t xml:space="preserve">Assessment/index subgroup</w:t>
+            </w:r>
+          </w:p>
+        </w:tc>
+        <w:tc>
+          <w:tcPr/>
+          <w:p>
+            <w:pPr>
+              <w:pStyle w:val="Compact"/>
+            </w:pPr>
+            <w:r>
+              <w:t xml:space="preserve">Before final model-run list</w:t>
             </w:r>
           </w:p>
         </w:tc>
@@ -3558,7 +4103,18 @@
               <w:pStyle w:val="Compact"/>
             </w:pPr>
             <w:r>
-              <w:t xml:space="preserve">Provide the year-interaction smoother or effect plot for the Peru CPUE model</w:t>
+              <w:t xml:space="preserve">Replace the previous Peru CPUE index with the new later-starting Peruvian CPUE series</w:t>
+            </w:r>
+          </w:p>
+        </w:tc>
+        <w:tc>
+          <w:tcPr/>
+          <w:p>
+            <w:pPr>
+              <w:pStyle w:val="Compact"/>
+            </w:pPr>
+            <w:r>
+              <w:t xml:space="preserve">Assessment subgroup</w:t>
             </w:r>
           </w:p>
         </w:tc>
@@ -3580,18 +4136,99 @@
               <w:pStyle w:val="Compact"/>
             </w:pPr>
             <w:r>
-              <w:t xml:space="preserve">Assessment/index subgroup</w:t>
-            </w:r>
-          </w:p>
-        </w:tc>
-        <w:tc>
-          <w:tcPr/>
-          <w:p>
-            <w:pPr>
-              <w:pStyle w:val="Compact"/>
-            </w:pPr>
-            <w:r>
-              <w:t xml:space="preserve">Before final CPUE recommendations</w:t>
+              <w:t xml:space="preserve">Before final model-run list</w:t>
+            </w:r>
+          </w:p>
+        </w:tc>
+      </w:tr>
+      <w:tr>
+        <w:tc>
+          <w:tcPr/>
+          <w:p>
+            <w:pPr>
+              <w:pStyle w:val="Compact"/>
+            </w:pPr>
+            <w:r>
+              <w:t xml:space="preserve">Replace the previous Peru acoustic index with the new Peruvian acoustic indices and associated length-frequency information</w:t>
+            </w:r>
+          </w:p>
+        </w:tc>
+        <w:tc>
+          <w:tcPr/>
+          <w:p>
+            <w:pPr>
+              <w:pStyle w:val="Compact"/>
+            </w:pPr>
+            <w:r>
+              <w:t xml:space="preserve">Assessment subgroup</w:t>
+            </w:r>
+          </w:p>
+        </w:tc>
+        <w:tc>
+          <w:tcPr/>
+          <w:p>
+            <w:pPr>
+              <w:pStyle w:val="Compact"/>
+            </w:pPr>
+            <w:r>
+              <w:t xml:space="preserve">Peru acoustic contributors</w:t>
+            </w:r>
+          </w:p>
+        </w:tc>
+        <w:tc>
+          <w:tcPr/>
+          <w:p>
+            <w:pPr>
+              <w:pStyle w:val="Compact"/>
+            </w:pPr>
+            <w:r>
+              <w:t xml:space="preserve">Before final model-run list</w:t>
+            </w:r>
+          </w:p>
+        </w:tc>
+      </w:tr>
+      <w:tr>
+        <w:tc>
+          <w:tcPr/>
+          <w:p>
+            <w:pPr>
+              <w:pStyle w:val="Compact"/>
+            </w:pPr>
+            <w:r>
+              <w:t xml:space="preserve">Prepare Peruvian length-frequency inputs in fork length, with fork-length growth parameters and the agreed increased plus group</w:t>
+            </w:r>
+          </w:p>
+        </w:tc>
+        <w:tc>
+          <w:tcPr/>
+          <w:p>
+            <w:pPr>
+              <w:pStyle w:val="Compact"/>
+            </w:pPr>
+            <w:r>
+              <w:t xml:space="preserve">Assessment subgroup</w:t>
+            </w:r>
+          </w:p>
+        </w:tc>
+        <w:tc>
+          <w:tcPr/>
+          <w:p>
+            <w:pPr>
+              <w:pStyle w:val="Compact"/>
+            </w:pPr>
+            <w:r>
+              <w:t xml:space="preserve">Peru biology contributors</w:t>
+            </w:r>
+          </w:p>
+        </w:tc>
+        <w:tc>
+          <w:tcPr/>
+          <w:p>
+            <w:pPr>
+              <w:pStyle w:val="Compact"/>
+            </w:pPr>
+            <w:r>
+              <w:t xml:space="preserve">Before final model-run list</w:t>
             </w:r>
           </w:p>
         </w:tc>
@@ -3770,7 +4407,7 @@
         </w:numPr>
       </w:pPr>
       <w:r>
-        <w:t xml:space="preserve">The Chilean effort-creep correction may be confounded with catchability changes, and the assessment consequence should be tested before accepting the correction as a base input.</w:t>
+        <w:t xml:space="preserve">The Chilean effort-creep correction may be confounded with catchability changes, and the assessment consequence should be tested alongside the agreed base treatment.</w:t>
       </w:r>
     </w:p>
     <w:p>
@@ -3782,7 +4419,7 @@
         </w:numPr>
       </w:pPr>
       <w:r>
-        <w:t xml:space="preserve">A switch from the current trip-based Chile CPUE series to a set-based spatio-temporal series requires a clear explanation of early-period coverage, model sensitivity, year-effect treatment, northern fishing activity, and annual uncertainty.</w:t>
+        <w:t xml:space="preserve">The new Chile CPUE base treatment begins in 1998; the old pre-1998 CPUE sensitivity is needed to evaluate the effect of retaining earlier historical contrast.</w:t>
       </w:r>
     </w:p>
     <w:p>
@@ -3794,7 +4431,7 @@
         </w:numPr>
       </w:pPr>
       <w:r>
-        <w:t xml:space="preserve">The Peru CPUE series is currently too short for June 2026 MSE use because the full historical extension has not yet been evaluated.</w:t>
+        <w:t xml:space="preserve">The new Peru CPUE and Peru acoustic treatments remove previous assessment indices, so the implementation should document exactly which historical series have been dropped.</w:t>
       </w:r>
     </w:p>
     <w:p>

</xml_diff>

<commit_message>
Incorporate Day 3 notes into benchmark report
</commit_message>
<xml_diff>
--- a/docs/JMWG-Benchmark-Meeting-report-2026.docx
+++ b/docs/JMWG-Benchmark-Meeting-report-2026.docx
@@ -1296,61 +1296,49 @@
               <w:t xml:space="preserve"> </w:t>
             </w:r>
             <w:r>
-              <w:t xml:space="preserve">The fishery-dependent acoustic presentation for south-central Chile was viewed as</w:t>
-            </w:r>
-            <w:r>
-              <w:t xml:space="preserve"> </w:t>
-            </w:r>
-            <w:r>
-              <w:t xml:space="preserve">potentially useful but not yet ready for direct assessment use without further</w:t>
-            </w:r>
-            <w:r>
-              <w:t xml:space="preserve"> </w:t>
-            </w:r>
-            <w:r>
-              <w:t xml:space="preserve">work. Participants noted the high temporal resolution and lower cost of</w:t>
-            </w:r>
-            <w:r>
-              <w:t xml:space="preserve"> </w:t>
-            </w:r>
-            <w:r>
-              <w:t xml:space="preserve">commercial-vessel acoustic information, but also discussed preferential sampling,</w:t>
-            </w:r>
-            <w:r>
-              <w:t xml:space="preserve"> </w:t>
-            </w:r>
-            <w:r>
-              <w:t xml:space="preserve">changes in fishing behaviour, possible technology effects, seasonal shifts, and</w:t>
-            </w:r>
-            <w:r>
-              <w:t xml:space="preserve"> </w:t>
-            </w:r>
-            <w:r>
-              <w:t xml:space="preserve">correlation with CPUE from the same fleet. The meeting discussed whether</w:t>
-            </w:r>
-            <w:r>
-              <w:t xml:space="preserve"> </w:t>
-            </w:r>
-            <w:r>
-              <w:t xml:space="preserve">fishery-dependent and fishery-independent acoustic data could eventually be</w:t>
-            </w:r>
-            <w:r>
-              <w:t xml:space="preserve"> </w:t>
-            </w:r>
-            <w:r>
-              <w:t xml:space="preserve">combined, but noted that the fishery-dependent product may be more appropriate as</w:t>
-            </w:r>
-            <w:r>
-              <w:t xml:space="preserve"> </w:t>
-            </w:r>
-            <w:r>
-              <w:t xml:space="preserve">a diagnostic or future sensitivity until the effects of seasonality, vessel</w:t>
-            </w:r>
-            <w:r>
-              <w:t xml:space="preserve"> </w:t>
-            </w:r>
-            <w:r>
-              <w:t xml:space="preserve">coverage, fleet behaviour, and sampling design are better understood.</w:t>
+              <w:t xml:space="preserve">On Day 3, the meeting revisited the Chile Acoustic North survey treatment.</w:t>
+            </w:r>
+            <w:r>
+              <w:t xml:space="preserve"> </w:t>
+            </w:r>
+            <w:r>
+              <w:t xml:space="preserve">Participants noted that the spatio-temporal modelling work by INPESCA is a</w:t>
+            </w:r>
+            <w:r>
+              <w:t xml:space="preserve"> </w:t>
+            </w:r>
+            <w:r>
+              <w:t xml:space="preserve">substantial contribution and should be acknowledged in the report. The group</w:t>
+            </w:r>
+            <w:r>
+              <w:t xml:space="preserve"> </w:t>
+            </w:r>
+            <w:r>
+              <w:t xml:space="preserve">also discussed the distinction between model-based indicators for CPUE and</w:t>
+            </w:r>
+            <w:r>
+              <w:t xml:space="preserve"> </w:t>
+            </w:r>
+            <w:r>
+              <w:t xml:space="preserve">design-based indicators for surveys. The Day 3 decision was to retain the raw or</w:t>
+            </w:r>
+            <w:r>
+              <w:t xml:space="preserve"> </w:t>
+            </w:r>
+            <w:r>
+              <w:t xml:space="preserve">design-based acoustic biomass treatment for assessment use at this stage, while</w:t>
+            </w:r>
+            <w:r>
+              <w:t xml:space="preserve"> </w:t>
+            </w:r>
+            <w:r>
+              <w:t xml:space="preserve">using the spatio-temporal acoustic modelling as research and diagnostic</w:t>
+            </w:r>
+            <w:r>
+              <w:t xml:space="preserve"> </w:t>
+            </w:r>
+            <w:r>
+              <w:t xml:space="preserve">information rather than as a replacement base-model index.</w:t>
             </w:r>
           </w:p>
           <w:p>
@@ -1368,49 +1356,61 @@
               <w:t xml:space="preserve"> </w:t>
             </w:r>
             <w:r>
-              <w:t xml:space="preserve">For the Chile central-south acoustic survey series, participants requested a</w:t>
-            </w:r>
-            <w:r>
-              <w:t xml:space="preserve"> </w:t>
-            </w:r>
-            <w:r>
-              <w:t xml:space="preserve">short paragraph explaining why the historical central-south acoustic data have</w:t>
-            </w:r>
-            <w:r>
-              <w:t xml:space="preserve"> </w:t>
-            </w:r>
-            <w:r>
-              <w:t xml:space="preserve">not been used in the assessment in recent years, including specific reference to</w:t>
-            </w:r>
-            <w:r>
-              <w:t xml:space="preserve"> </w:t>
-            </w:r>
-            <w:r>
-              <w:t xml:space="preserve">available survey years such as 2012, 2015, 2017, 2020, 2021, and 2023. The</w:t>
-            </w:r>
-            <w:r>
-              <w:t xml:space="preserve"> </w:t>
-            </w:r>
-            <w:r>
-              <w:t xml:space="preserve">paragraph should state whether the exclusion is due to survey design, data</w:t>
-            </w:r>
-            <w:r>
-              <w:t xml:space="preserve"> </w:t>
-            </w:r>
-            <w:r>
-              <w:t xml:space="preserve">quality, representativeness, inconsistency with other indices, model behaviour,</w:t>
-            </w:r>
-            <w:r>
-              <w:t xml:space="preserve"> </w:t>
-            </w:r>
-            <w:r>
-              <w:t xml:space="preserve">or lack of documentation, and whether any sensitivity run should be considered</w:t>
-            </w:r>
-            <w:r>
-              <w:t xml:space="preserve"> </w:t>
-            </w:r>
-            <w:r>
-              <w:t xml:space="preserve">for the benchmark.</w:t>
+              <w:t xml:space="preserve">The fishery-dependent acoustic presentation for south-central Chile was viewed as</w:t>
+            </w:r>
+            <w:r>
+              <w:t xml:space="preserve"> </w:t>
+            </w:r>
+            <w:r>
+              <w:t xml:space="preserve">potentially useful but not yet ready for direct assessment use without further</w:t>
+            </w:r>
+            <w:r>
+              <w:t xml:space="preserve"> </w:t>
+            </w:r>
+            <w:r>
+              <w:t xml:space="preserve">work. Participants noted the high temporal resolution and lower cost of</w:t>
+            </w:r>
+            <w:r>
+              <w:t xml:space="preserve"> </w:t>
+            </w:r>
+            <w:r>
+              <w:t xml:space="preserve">commercial-vessel acoustic information, but also discussed preferential sampling,</w:t>
+            </w:r>
+            <w:r>
+              <w:t xml:space="preserve"> </w:t>
+            </w:r>
+            <w:r>
+              <w:t xml:space="preserve">changes in fishing behaviour, possible technology effects, seasonal shifts, and</w:t>
+            </w:r>
+            <w:r>
+              <w:t xml:space="preserve"> </w:t>
+            </w:r>
+            <w:r>
+              <w:t xml:space="preserve">correlation with CPUE from the same fleet. The meeting discussed whether</w:t>
+            </w:r>
+            <w:r>
+              <w:t xml:space="preserve"> </w:t>
+            </w:r>
+            <w:r>
+              <w:t xml:space="preserve">fishery-dependent and fishery-independent acoustic data could eventually be</w:t>
+            </w:r>
+            <w:r>
+              <w:t xml:space="preserve"> </w:t>
+            </w:r>
+            <w:r>
+              <w:t xml:space="preserve">combined, but noted that the fishery-dependent product may be more appropriate as</w:t>
+            </w:r>
+            <w:r>
+              <w:t xml:space="preserve"> </w:t>
+            </w:r>
+            <w:r>
+              <w:t xml:space="preserve">a diagnostic or future sensitivity until the effects of seasonality, vessel</w:t>
+            </w:r>
+            <w:r>
+              <w:t xml:space="preserve"> </w:t>
+            </w:r>
+            <w:r>
+              <w:t xml:space="preserve">coverage, fleet behaviour, and sampling design are better understood.</w:t>
             </w:r>
           </w:p>
           <w:p>
@@ -1428,67 +1428,49 @@
               <w:t xml:space="preserve"> </w:t>
             </w:r>
             <w:r>
-              <w:t xml:space="preserve">The Peruvian acoustic discussion emphasized that the acoustic survey programme</w:t>
-            </w:r>
-            <w:r>
-              <w:t xml:space="preserve"> </w:t>
-            </w:r>
-            <w:r>
-              <w:t xml:space="preserve">was primarily designed for anchovy, and that jack mackerel may occur outside the</w:t>
-            </w:r>
-            <w:r>
-              <w:t xml:space="preserve"> </w:t>
-            </w:r>
-            <w:r>
-              <w:t xml:space="preserve">surveyed area in some years. Participants discussed the large decline after the</w:t>
-            </w:r>
-            <w:r>
-              <w:t xml:space="preserve"> </w:t>
-            </w:r>
-            <w:r>
-              <w:t xml:space="preserve">1997/1998 El Nino event, possible ecological regime changes, changes in spatial</w:t>
-            </w:r>
-            <w:r>
-              <w:t xml:space="preserve"> </w:t>
-            </w:r>
-            <w:r>
-              <w:t xml:space="preserve">distribution from nearshore to more offshore areas, and whether the existing Peru</w:t>
-            </w:r>
-            <w:r>
-              <w:t xml:space="preserve"> </w:t>
-            </w:r>
-            <w:r>
-              <w:t xml:space="preserve">acoustic series in the assessment adequately reflects those changes. The meeting</w:t>
-            </w:r>
-            <w:r>
-              <w:t xml:space="preserve"> </w:t>
-            </w:r>
-            <w:r>
-              <w:t xml:space="preserve">requested Peruvian acoustic survey backscatter data and associated length</w:t>
-            </w:r>
-            <w:r>
-              <w:t xml:space="preserve"> </w:t>
-            </w:r>
-            <w:r>
-              <w:t xml:space="preserve">composition data, including survey timing, spatial extent, transect coverage,</w:t>
-            </w:r>
-            <w:r>
-              <w:t xml:space="preserve"> </w:t>
-            </w:r>
-            <w:r>
-              <w:t xml:space="preserve">biological sampling, length type, and uncertainty. The meeting also noted that</w:t>
-            </w:r>
-            <w:r>
-              <w:t xml:space="preserve"> </w:t>
-            </w:r>
-            <w:r>
-              <w:t xml:space="preserve">summer and winter surveys may need to be treated separately because seasonal</w:t>
-            </w:r>
-            <w:r>
-              <w:t xml:space="preserve"> </w:t>
-            </w:r>
-            <w:r>
-              <w:t xml:space="preserve">differences and contrasting within-year values may contain useful information.</w:t>
+              <w:t xml:space="preserve">For the Chile central-south acoustic survey series, participants requested a</w:t>
+            </w:r>
+            <w:r>
+              <w:t xml:space="preserve"> </w:t>
+            </w:r>
+            <w:r>
+              <w:t xml:space="preserve">short paragraph explaining why the historical central-south acoustic data have</w:t>
+            </w:r>
+            <w:r>
+              <w:t xml:space="preserve"> </w:t>
+            </w:r>
+            <w:r>
+              <w:t xml:space="preserve">not been used in the assessment in recent years, including specific reference to</w:t>
+            </w:r>
+            <w:r>
+              <w:t xml:space="preserve"> </w:t>
+            </w:r>
+            <w:r>
+              <w:t xml:space="preserve">available survey years such as 2012, 2015, 2017, 2020, 2021, and 2023. The</w:t>
+            </w:r>
+            <w:r>
+              <w:t xml:space="preserve"> </w:t>
+            </w:r>
+            <w:r>
+              <w:t xml:space="preserve">paragraph should state whether the exclusion is due to survey design, data</w:t>
+            </w:r>
+            <w:r>
+              <w:t xml:space="preserve"> </w:t>
+            </w:r>
+            <w:r>
+              <w:t xml:space="preserve">quality, representativeness, inconsistency with other indices, model behaviour,</w:t>
+            </w:r>
+            <w:r>
+              <w:t xml:space="preserve"> </w:t>
+            </w:r>
+            <w:r>
+              <w:t xml:space="preserve">or lack of documentation, and whether any sensitivity run should be considered</w:t>
+            </w:r>
+            <w:r>
+              <w:t xml:space="preserve"> </w:t>
+            </w:r>
+            <w:r>
+              <w:t xml:space="preserve">for the benchmark.</w:t>
             </w:r>
           </w:p>
           <w:p>
@@ -1506,57 +1488,96 @@
               <w:t xml:space="preserve"> </w:t>
             </w:r>
             <w:r>
-              <w:t xml:space="preserve">The sonar and fishing-vessel acoustic presentations provided methodological</w:t>
-            </w:r>
-            <w:r>
-              <w:t xml:space="preserve"> </w:t>
-            </w:r>
-            <w:r>
-              <w:t xml:space="preserve">context rather than immediate assessment inputs. Sonar may improve information on</w:t>
-            </w:r>
-            <w:r>
-              <w:t xml:space="preserve"> </w:t>
-            </w:r>
-            <w:r>
-              <w:t xml:space="preserve">presence, school behaviour, swimming direction, and fish outside the echosounder</w:t>
-            </w:r>
-            <w:r>
-              <w:t xml:space="preserve"> </w:t>
-            </w:r>
-            <w:r>
-              <w:t xml:space="preserve">beam, but was not considered ready to provide quantitative biomass estimates for</w:t>
-            </w:r>
-            <w:r>
-              <w:t xml:space="preserve"> </w:t>
-            </w:r>
-            <w:r>
-              <w:t xml:space="preserve">jack mackerel. Fishing-vessel acoustic data in Peru may provide useful context,</w:t>
-            </w:r>
-            <w:r>
-              <w:t xml:space="preserve"> </w:t>
-            </w:r>
-            <w:r>
-              <w:t xml:space="preserve">but additional work is needed to understand juvenile avoidance, vessel behaviour,</w:t>
-            </w:r>
-            <w:r>
-              <w:t xml:space="preserve"> </w:t>
-            </w:r>
-            <w:r>
-              <w:t xml:space="preserve">calibration, and how fishery-dependent acoustic observations relate to</w:t>
-            </w:r>
-            <w:r>
-              <w:t xml:space="preserve"> </w:t>
-            </w:r>
-            <w:r>
-              <w:t xml:space="preserve">fishery-independent survey information.</w:t>
+              <w:t xml:space="preserve">The Peruvian acoustic discussion emphasized that the acoustic survey programme</w:t>
+            </w:r>
+            <w:r>
+              <w:t xml:space="preserve"> </w:t>
+            </w:r>
+            <w:r>
+              <w:t xml:space="preserve">was primarily designed for anchovy, and that jack mackerel may occur outside the</w:t>
+            </w:r>
+            <w:r>
+              <w:t xml:space="preserve"> </w:t>
+            </w:r>
+            <w:r>
+              <w:t xml:space="preserve">surveyed area in some years. Participants discussed the large decline after the</w:t>
+            </w:r>
+            <w:r>
+              <w:t xml:space="preserve"> </w:t>
+            </w:r>
+            <w:r>
+              <w:t xml:space="preserve">1997/1998 El Nino event, possible ecological regime changes, changes in spatial</w:t>
+            </w:r>
+            <w:r>
+              <w:t xml:space="preserve"> </w:t>
+            </w:r>
+            <w:r>
+              <w:t xml:space="preserve">distribution from nearshore to more offshore areas, and whether the existing Peru</w:t>
+            </w:r>
+            <w:r>
+              <w:t xml:space="preserve"> </w:t>
+            </w:r>
+            <w:r>
+              <w:t xml:space="preserve">acoustic series in the assessment adequately reflects those changes. The meeting</w:t>
+            </w:r>
+            <w:r>
+              <w:t xml:space="preserve"> </w:t>
+            </w:r>
+            <w:r>
+              <w:t xml:space="preserve">requested Peruvian acoustic survey backscatter data and associated length</w:t>
+            </w:r>
+            <w:r>
+              <w:t xml:space="preserve"> </w:t>
+            </w:r>
+            <w:r>
+              <w:t xml:space="preserve">composition data, including survey timing, spatial extent, transect coverage,</w:t>
+            </w:r>
+            <w:r>
+              <w:t xml:space="preserve"> </w:t>
+            </w:r>
+            <w:r>
+              <w:t xml:space="preserve">biological sampling, length type, and uncertainty. The meeting also noted that</w:t>
+            </w:r>
+            <w:r>
+              <w:t xml:space="preserve"> </w:t>
+            </w:r>
+            <w:r>
+              <w:t xml:space="preserve">summer and winter surveys may need to be treated separately because seasonal</w:t>
+            </w:r>
+            <w:r>
+              <w:t xml:space="preserve"> </w:t>
+            </w:r>
+            <w:r>
+              <w:t xml:space="preserve">differences and contrasting within-year values may contain useful information.</w:t>
+            </w:r>
+            <w:r>
+              <w:t xml:space="preserve"> </w:t>
+            </w:r>
+            <w:r>
+              <w:t xml:space="preserve">Day 3 follow-up items included checking that the average survey month and</w:t>
+            </w:r>
+            <w:r>
+              <w:t xml:space="preserve"> </w:t>
+            </w:r>
+            <w:r>
+              <w:t xml:space="preserve">seasonal assignment were implemented correctly in the model runs, reviewing fits</w:t>
+            </w:r>
+            <w:r>
+              <w:t xml:space="preserve"> </w:t>
+            </w:r>
+            <w:r>
+              <w:t xml:space="preserve">to zero observations, and obtaining survey length frequencies as soon as</w:t>
+            </w:r>
+            <w:r>
+              <w:t xml:space="preserve"> </w:t>
+            </w:r>
+            <w:r>
+              <w:t xml:space="preserve">possible.</w:t>
             </w:r>
           </w:p>
           <w:p>
             <w:pPr>
               <w:pStyle w:val="BodyText"/>
-            </w:pPr>
-            <w:pPr>
-              <w:spacing w:after="16"/>
             </w:pPr>
             <w:r>
               <w:rPr>
@@ -1569,6 +1590,69 @@
               <w:t xml:space="preserve"> </w:t>
             </w:r>
             <w:r>
+              <w:t xml:space="preserve">The sonar and fishing-vessel acoustic presentations provided methodological</w:t>
+            </w:r>
+            <w:r>
+              <w:t xml:space="preserve"> </w:t>
+            </w:r>
+            <w:r>
+              <w:t xml:space="preserve">context rather than immediate assessment inputs. Sonar may improve information on</w:t>
+            </w:r>
+            <w:r>
+              <w:t xml:space="preserve"> </w:t>
+            </w:r>
+            <w:r>
+              <w:t xml:space="preserve">presence, school behaviour, swimming direction, and fish outside the echosounder</w:t>
+            </w:r>
+            <w:r>
+              <w:t xml:space="preserve"> </w:t>
+            </w:r>
+            <w:r>
+              <w:t xml:space="preserve">beam, but was not considered ready to provide quantitative biomass estimates for</w:t>
+            </w:r>
+            <w:r>
+              <w:t xml:space="preserve"> </w:t>
+            </w:r>
+            <w:r>
+              <w:t xml:space="preserve">jack mackerel. Fishing-vessel acoustic data in Peru may provide useful context,</w:t>
+            </w:r>
+            <w:r>
+              <w:t xml:space="preserve"> </w:t>
+            </w:r>
+            <w:r>
+              <w:t xml:space="preserve">but additional work is needed to understand juvenile avoidance, vessel behaviour,</w:t>
+            </w:r>
+            <w:r>
+              <w:t xml:space="preserve"> </w:t>
+            </w:r>
+            <w:r>
+              <w:t xml:space="preserve">calibration, and how fishery-dependent acoustic observations relate to</w:t>
+            </w:r>
+            <w:r>
+              <w:t xml:space="preserve"> </w:t>
+            </w:r>
+            <w:r>
+              <w:t xml:space="preserve">fishery-independent survey information.</w:t>
+            </w:r>
+          </w:p>
+          <w:p>
+            <w:pPr>
+              <w:pStyle w:val="BodyText"/>
+            </w:pPr>
+            <w:pPr>
+              <w:spacing w:after="16"/>
+            </w:pPr>
+            <w:r>
+              <w:rPr>
+                <w:b/>
+                <w:bCs/>
+              </w:rPr>
+              <w:t xml:space="preserve">26.</w:t>
+            </w:r>
+            <w:r>
+              <w:t xml:space="preserve"> </w:t>
+            </w:r>
+            <w:r>
               <w:t xml:space="preserve">The meeting identified a need for a dedicated analysis that compares acoustic</w:t>
             </w:r>
             <w:r>
@@ -1637,7 +1721,7 @@
           <w:b/>
           <w:bCs/>
         </w:rPr>
-        <w:t xml:space="preserve">26.</w:t>
+        <w:t xml:space="preserve">27.</w:t>
       </w:r>
       <w:r>
         <w:t xml:space="preserve"> </w:t>
@@ -1798,7 +1882,7 @@
                 <w:b/>
                 <w:bCs/>
               </w:rPr>
-              <w:t xml:space="preserve">27.</w:t>
+              <w:t xml:space="preserve">28.</w:t>
             </w:r>
             <w:r>
               <w:t xml:space="preserve"> </w:t>
@@ -1874,78 +1958,6 @@
             </w:r>
             <w:r>
               <w:t xml:space="preserve">between reported numbers of ages and numbers of length measurements.</w:t>
-            </w:r>
-          </w:p>
-          <w:p>
-            <w:pPr>
-              <w:pStyle w:val="BodyText"/>
-            </w:pPr>
-            <w:r>
-              <w:rPr>
-                <w:b/>
-                <w:bCs/>
-              </w:rPr>
-              <w:t xml:space="preserve">28.</w:t>
-            </w:r>
-            <w:r>
-              <w:t xml:space="preserve"> </w:t>
-            </w:r>
-            <w:r>
-              <w:t xml:space="preserve">During the evaluation of the modelling procedure for the Chilean South-Central</w:t>
-            </w:r>
-            <w:r>
-              <w:t xml:space="preserve"> </w:t>
-            </w:r>
-            <w:r>
-              <w:t xml:space="preserve">(SC) fleet abundance index, benchmark participants deliberated on the most</w:t>
-            </w:r>
-            <w:r>
-              <w:t xml:space="preserve"> </w:t>
-            </w:r>
-            <w:r>
-              <w:t xml:space="preserve">robust method to account for effort creep. Initial positions diverged, with</w:t>
-            </w:r>
-            <w:r>
-              <w:t xml:space="preserve"> </w:t>
-            </w:r>
-            <w:r>
-              <w:t xml:space="preserve">Chile proposing to apply an informed correction factor from 2005 onwards,</w:t>
-            </w:r>
-            <w:r>
-              <w:t xml:space="preserve"> </w:t>
-            </w:r>
-            <w:r>
-              <w:t xml:space="preserve">whereas the EU advocated for maintaining a fixed 1% compounded factor across the</w:t>
-            </w:r>
-            <w:r>
-              <w:t xml:space="preserve"> </w:t>
-            </w:r>
-            <w:r>
-              <w:t xml:space="preserve">entire time series. After extensive discussion, the majority of members agreed</w:t>
-            </w:r>
-            <w:r>
-              <w:t xml:space="preserve"> </w:t>
-            </w:r>
-            <w:r>
-              <w:t xml:space="preserve">to proceed with an alternative approach: applying a 1% compounded increase creep</w:t>
-            </w:r>
-            <w:r>
-              <w:t xml:space="preserve"> </w:t>
-            </w:r>
-            <w:r>
-              <w:t xml:space="preserve">factor up to 2004, followed by a transition to the p10 correction factor from</w:t>
-            </w:r>
-            <w:r>
-              <w:t xml:space="preserve"> </w:t>
-            </w:r>
-            <w:r>
-              <w:t xml:space="preserve">2005 onward, where a fixed multiplicative factor of 0.669 is applied to the</w:t>
-            </w:r>
-            <w:r>
-              <w:t xml:space="preserve"> </w:t>
-            </w:r>
-            <w:r>
-              <w:t xml:space="preserve">abundance index, as proposed by Zenteno and Paya (2026).</w:t>
             </w:r>
           </w:p>
           <w:p>
@@ -1963,55 +1975,73 @@
               <w:t xml:space="preserve"> </w:t>
             </w:r>
             <w:r>
-              <w:t xml:space="preserve">The technical rationale supporting this methodological update is grounded in</w:t>
-            </w:r>
-            <w:r>
-              <w:t xml:space="preserve"> </w:t>
-            </w:r>
-            <w:r>
-              <w:t xml:space="preserve">both empirical data and historical fleet dynamics. First, this approach directly</w:t>
-            </w:r>
-            <w:r>
-              <w:t xml:space="preserve"> </w:t>
-            </w:r>
-            <w:r>
-              <w:t xml:space="preserve">incorporates operational feedback from the Chilean SC fleet captains, who</w:t>
-            </w:r>
-            <w:r>
-              <w:t xml:space="preserve"> </w:t>
-            </w:r>
-            <w:r>
-              <w:t xml:space="preserve">identified 2005 as an inflection point for changes in fishing efficiency.</w:t>
-            </w:r>
-            <w:r>
-              <w:t xml:space="preserve"> </w:t>
-            </w:r>
-            <w:r>
-              <w:t xml:space="preserve">Second, acknowledging this shift, the majority of members concurred that</w:t>
-            </w:r>
-            <w:r>
-              <w:t xml:space="preserve"> </w:t>
-            </w:r>
-            <w:r>
-              <w:t xml:space="preserve">applying a continuously increasing efficiency correction after that period is</w:t>
-            </w:r>
-            <w:r>
-              <w:t xml:space="preserve"> </w:t>
-            </w:r>
-            <w:r>
-              <w:t xml:space="preserve">largely unnecessary. Finally, retaining the 1% factor prior to 2005 effectively</w:t>
-            </w:r>
-            <w:r>
-              <w:t xml:space="preserve"> </w:t>
-            </w:r>
-            <w:r>
-              <w:t xml:space="preserve">anchors the earlier time series, avoiding the substantial jump in historical</w:t>
-            </w:r>
-            <w:r>
-              <w:t xml:space="preserve"> </w:t>
-            </w:r>
-            <w:r>
-              <w:t xml:space="preserve">efficiency that was the primary concern with the initial proposal.</w:t>
+              <w:t xml:space="preserve">During the evaluation of the modelling procedure for the Chilean South-Central</w:t>
+            </w:r>
+            <w:r>
+              <w:t xml:space="preserve"> </w:t>
+            </w:r>
+            <w:r>
+              <w:t xml:space="preserve">(SC) fleet abundance index, benchmark participants deliberated on the most</w:t>
+            </w:r>
+            <w:r>
+              <w:t xml:space="preserve"> </w:t>
+            </w:r>
+            <w:r>
+              <w:t xml:space="preserve">robust method to account for effort creep. Initial positions diverged, with</w:t>
+            </w:r>
+            <w:r>
+              <w:t xml:space="preserve"> </w:t>
+            </w:r>
+            <w:r>
+              <w:t xml:space="preserve">Chile proposing to apply an informed correction factor from 2005 onwards,</w:t>
+            </w:r>
+            <w:r>
+              <w:t xml:space="preserve"> </w:t>
+            </w:r>
+            <w:r>
+              <w:t xml:space="preserve">whereas the EU advocated for maintaining a fixed 1% compounded factor across the</w:t>
+            </w:r>
+            <w:r>
+              <w:t xml:space="preserve"> </w:t>
+            </w:r>
+            <w:r>
+              <w:t xml:space="preserve">entire time series. After extensive discussion, the members agreed</w:t>
+            </w:r>
+            <w:r>
+              <w:t xml:space="preserve"> </w:t>
+            </w:r>
+            <w:r>
+              <w:t xml:space="preserve">to proceed with Chile’s proposal and apply a 1% compounded increase creep</w:t>
+            </w:r>
+            <w:r>
+              <w:t xml:space="preserve"> </w:t>
+            </w:r>
+            <w:r>
+              <w:t xml:space="preserve">factor up to 2004, followed by a transition to the p10 correction factor from</w:t>
+            </w:r>
+            <w:r>
+              <w:t xml:space="preserve"> </w:t>
+            </w:r>
+            <w:r>
+              <w:t xml:space="preserve">2005 onward, where a fixed multiplicative factor of 0.669 is applied to the</w:t>
+            </w:r>
+            <w:r>
+              <w:t xml:space="preserve"> </w:t>
+            </w:r>
+            <w:r>
+              <w:t xml:space="preserve">abundance index, as proposed by Zenteno and Paya (2026). The EU objected and the</w:t>
+            </w:r>
+            <w:r>
+              <w:t xml:space="preserve"> </w:t>
+            </w:r>
+            <w:r>
+              <w:t xml:space="preserve">Chair noted that it could be raised again at SC but should not have a large effect</w:t>
+            </w:r>
+            <w:r>
+              <w:t xml:space="preserve"> </w:t>
+            </w:r>
+            <w:r>
+              <w:t xml:space="preserve">on making progress with the MSE.</w:t>
             </w:r>
           </w:p>
           <w:p>
@@ -2029,49 +2059,55 @@
               <w:t xml:space="preserve"> </w:t>
             </w:r>
             <w:r>
-              <w:t xml:space="preserve">Participants also discussed whether applying the creep factor as an effort</w:t>
-            </w:r>
-            <w:r>
-              <w:t xml:space="preserve"> </w:t>
-            </w:r>
-            <w:r>
-              <w:t xml:space="preserve">correction is equivalent to imposing a catchability change, and whether the</w:t>
-            </w:r>
-            <w:r>
-              <w:t xml:space="preserve"> </w:t>
-            </w:r>
-            <w:r>
-              <w:t xml:space="preserve">survey/interview information used to estimate creep can be maintained regularly.</w:t>
-            </w:r>
-            <w:r>
-              <w:t xml:space="preserve"> </w:t>
-            </w:r>
-            <w:r>
-              <w:t xml:space="preserve">The meeting noted that the artisanal fleet now accounts for a larger share of</w:t>
-            </w:r>
-            <w:r>
-              <w:t xml:space="preserve"> </w:t>
-            </w:r>
-            <w:r>
-              <w:t xml:space="preserve">Chilean catch and may need to be considered in future effort-creep work. As a</w:t>
-            </w:r>
-            <w:r>
-              <w:t xml:space="preserve"> </w:t>
-            </w:r>
-            <w:r>
-              <w:t xml:space="preserve">diagnostic, the meeting requested a model run with no creep correction but with a</w:t>
-            </w:r>
-            <w:r>
-              <w:t xml:space="preserve"> </w:t>
-            </w:r>
-            <w:r>
-              <w:t xml:space="preserve">catchability step change in 2005, to evaluate whether the assessment estimates a</w:t>
-            </w:r>
-            <w:r>
-              <w:t xml:space="preserve"> </w:t>
-            </w:r>
-            <w:r>
-              <w:t xml:space="preserve">large catchability shift without imposing the creep correction directly.</w:t>
+              <w:t xml:space="preserve">The technical rationale supporting this methodological update is grounded in</w:t>
+            </w:r>
+            <w:r>
+              <w:t xml:space="preserve"> </w:t>
+            </w:r>
+            <w:r>
+              <w:t xml:space="preserve">both empirical data and historical fleet dynamics. First, this approach directly</w:t>
+            </w:r>
+            <w:r>
+              <w:t xml:space="preserve"> </w:t>
+            </w:r>
+            <w:r>
+              <w:t xml:space="preserve">incorporates operational feedback from the Chilean SC fleet captains, who</w:t>
+            </w:r>
+            <w:r>
+              <w:t xml:space="preserve"> </w:t>
+            </w:r>
+            <w:r>
+              <w:t xml:space="preserve">identified 2005 as an inflection point for changes in fishing efficiency.</w:t>
+            </w:r>
+            <w:r>
+              <w:t xml:space="preserve"> </w:t>
+            </w:r>
+            <w:r>
+              <w:t xml:space="preserve">Second, acknowledging this shift, the majority of members concurred that</w:t>
+            </w:r>
+            <w:r>
+              <w:t xml:space="preserve"> </w:t>
+            </w:r>
+            <w:r>
+              <w:t xml:space="preserve">applying a continuously increasing efficiency correction after that period is</w:t>
+            </w:r>
+            <w:r>
+              <w:t xml:space="preserve"> </w:t>
+            </w:r>
+            <w:r>
+              <w:t xml:space="preserve">largely unnecessary. Finally, retaining the 1% factor prior to 2005 effectively</w:t>
+            </w:r>
+            <w:r>
+              <w:t xml:space="preserve"> </w:t>
+            </w:r>
+            <w:r>
+              <w:t xml:space="preserve">anchors the earlier time series, avoiding the substantial jump in historical</w:t>
+            </w:r>
+            <w:r>
+              <w:t xml:space="preserve"> </w:t>
+            </w:r>
+            <w:r>
+              <w:t xml:space="preserve">efficiency that was the primary concern with the initial proposal.</w:t>
             </w:r>
           </w:p>
           <w:p>
@@ -2089,82 +2125,49 @@
               <w:t xml:space="preserve"> </w:t>
             </w:r>
             <w:r>
-              <w:t xml:space="preserve">For the Chilean</w:t>
-            </w:r>
-            <w:r>
-              <w:t xml:space="preserve"> </w:t>
-            </w:r>
-            <w:r>
-              <w:rPr>
-                <w:rStyle w:val="VerbatimChar"/>
-              </w:rPr>
-              <w:t xml:space="preserve">sdmTMB</w:t>
-            </w:r>
-            <w:r>
-              <w:t xml:space="preserve"> </w:t>
-            </w:r>
-            <w:r>
-              <w:t xml:space="preserve">CPUE analysis, the meeting noted that the index was</w:t>
-            </w:r>
-            <w:r>
-              <w:t xml:space="preserve"> </w:t>
-            </w:r>
-            <w:r>
-              <w:t xml:space="preserve">updated through 2026 and is based on set-level data. Discussion focused on haul</w:t>
-            </w:r>
-            <w:r>
-              <w:t xml:space="preserve"> </w:t>
-            </w:r>
-            <w:r>
-              <w:t xml:space="preserve">capacity treatment, the use of a spline smoother versus vessel categories, the</w:t>
-            </w:r>
-            <w:r>
-              <w:t xml:space="preserve"> </w:t>
-            </w:r>
-            <w:r>
-              <w:t xml:space="preserve">large imbalance in early-year data coverage, and whether true zero catches are</w:t>
-            </w:r>
-            <w:r>
-              <w:t xml:space="preserve"> </w:t>
-            </w:r>
-            <w:r>
-              <w:t xml:space="preserve">available and should be incorporated. Participants noted that the early part of</w:t>
-            </w:r>
-            <w:r>
-              <w:t xml:space="preserve"> </w:t>
-            </w:r>
-            <w:r>
-              <w:t xml:space="preserve">the set-level data may represent a very small fraction of total catch, raising</w:t>
-            </w:r>
-            <w:r>
-              <w:t xml:space="preserve"> </w:t>
-            </w:r>
-            <w:r>
-              <w:t xml:space="preserve">questions about representativeness before about 2005. The meeting requested that</w:t>
-            </w:r>
-            <w:r>
-              <w:t xml:space="preserve"> </w:t>
-            </w:r>
-            <w:r>
-              <w:t xml:space="preserve">the data table include the number and proportion of sets by year, and that the</w:t>
-            </w:r>
-            <w:r>
-              <w:t xml:space="preserve"> </w:t>
-            </w:r>
-            <w:r>
-              <w:t xml:space="preserve">authors provide a clear explanation for why the new set-based CPUE series gives</w:t>
-            </w:r>
-            <w:r>
-              <w:t xml:space="preserve"> </w:t>
-            </w:r>
-            <w:r>
-              <w:t xml:space="preserve">lower CPUE in earlier years with high catches than the current trip-based</w:t>
-            </w:r>
-            <w:r>
-              <w:t xml:space="preserve"> </w:t>
-            </w:r>
-            <w:r>
-              <w:t xml:space="preserve">assessment series.</w:t>
+              <w:t xml:space="preserve">Participants also discussed whether applying the creep factor as an effort</w:t>
+            </w:r>
+            <w:r>
+              <w:t xml:space="preserve"> </w:t>
+            </w:r>
+            <w:r>
+              <w:t xml:space="preserve">correction is equivalent to imposing a catchability change, and whether the</w:t>
+            </w:r>
+            <w:r>
+              <w:t xml:space="preserve"> </w:t>
+            </w:r>
+            <w:r>
+              <w:t xml:space="preserve">survey/interview information used to estimate creep can be maintained regularly.</w:t>
+            </w:r>
+            <w:r>
+              <w:t xml:space="preserve"> </w:t>
+            </w:r>
+            <w:r>
+              <w:t xml:space="preserve">The meeting noted that the artisanal fleet now accounts for a larger share of</w:t>
+            </w:r>
+            <w:r>
+              <w:t xml:space="preserve"> </w:t>
+            </w:r>
+            <w:r>
+              <w:t xml:space="preserve">Chilean catch and may need to be considered in future effort-creep work. As a</w:t>
+            </w:r>
+            <w:r>
+              <w:t xml:space="preserve"> </w:t>
+            </w:r>
+            <w:r>
+              <w:t xml:space="preserve">diagnostic, the meeting requested a model run with no creep correction but with a</w:t>
+            </w:r>
+            <w:r>
+              <w:t xml:space="preserve"> </w:t>
+            </w:r>
+            <w:r>
+              <w:t xml:space="preserve">catchability step change in 2005, to evaluate whether the assessment estimates a</w:t>
+            </w:r>
+            <w:r>
+              <w:t xml:space="preserve"> </w:t>
+            </w:r>
+            <w:r>
+              <w:t xml:space="preserve">large catchability shift without imposing the creep correction directly.</w:t>
             </w:r>
           </w:p>
           <w:p>
@@ -2182,85 +2185,82 @@
               <w:t xml:space="preserve"> </w:t>
             </w:r>
             <w:r>
-              <w:t xml:space="preserve">The INLA-based Chilean CPUE analysis provided a complementary spatio-temporal</w:t>
-            </w:r>
-            <w:r>
-              <w:t xml:space="preserve"> </w:t>
-            </w:r>
-            <w:r>
-              <w:t xml:space="preserve">standardization. Participants discussed mesh resolution, the treatment of</w:t>
-            </w:r>
-            <w:r>
-              <w:t xml:space="preserve"> </w:t>
-            </w:r>
-            <w:r>
-              <w:t xml:space="preserve">northern fishing activity, whether assessment fleets should be defined primarily</w:t>
-            </w:r>
-            <w:r>
-              <w:t xml:space="preserve"> </w:t>
-            </w:r>
-            <w:r>
-              <w:t xml:space="preserve">by area or vessel behaviour, and whether CPUE weighting should be based on catch</w:t>
-            </w:r>
-            <w:r>
-              <w:t xml:space="preserve"> </w:t>
-            </w:r>
-            <w:r>
-              <w:t xml:space="preserve">rates rather than catch. The meeting noted that the model appeared sensitive to</w:t>
-            </w:r>
-            <w:r>
-              <w:t xml:space="preserve"> </w:t>
-            </w:r>
-            <w:r>
-              <w:t xml:space="preserve">data updates, with inclusion of 2026 data changing earlier predictions, and that</w:t>
-            </w:r>
-            <w:r>
-              <w:t xml:space="preserve"> </w:t>
-            </w:r>
-            <w:r>
-              <w:t xml:space="preserve">this sensitivity needs to be explained before replacing the existing assessment</w:t>
-            </w:r>
-            <w:r>
-              <w:t xml:space="preserve"> </w:t>
-            </w:r>
-            <w:r>
-              <w:t xml:space="preserve">index. Participants also discussed fixed versus random year effects, AR(1)</w:t>
-            </w:r>
-            <w:r>
-              <w:t xml:space="preserve"> </w:t>
-            </w:r>
-            <w:r>
-              <w:t xml:space="preserve">versus independent year effects, and the interpretation of the days-at-sea or</w:t>
-            </w:r>
-            <w:r>
-              <w:t xml:space="preserve"> </w:t>
-            </w:r>
-            <w:r>
-              <w:t xml:space="preserve">DFP coefficient. Because offshore movement can increase days at sea without</w:t>
-            </w:r>
-            <w:r>
-              <w:t xml:space="preserve"> </w:t>
-            </w:r>
-            <w:r>
-              <w:t xml:space="preserve">necessarily indicating reduced abundance, the meeting requested that the strength</w:t>
-            </w:r>
-            <w:r>
-              <w:t xml:space="preserve"> </w:t>
-            </w:r>
-            <w:r>
-              <w:t xml:space="preserve">and interpretation of this coefficient be checked, and that Sebastian, Ignacio,</w:t>
-            </w:r>
-            <w:r>
-              <w:t xml:space="preserve"> </w:t>
-            </w:r>
-            <w:r>
-              <w:t xml:space="preserve">and Niels summarize the model-comparison and year-effect discussion for the</w:t>
-            </w:r>
-            <w:r>
-              <w:t xml:space="preserve"> </w:t>
-            </w:r>
-            <w:r>
-              <w:t xml:space="preserve">report.</w:t>
+              <w:t xml:space="preserve">For the Chilean</w:t>
+            </w:r>
+            <w:r>
+              <w:t xml:space="preserve"> </w:t>
+            </w:r>
+            <w:r>
+              <w:rPr>
+                <w:rStyle w:val="VerbatimChar"/>
+              </w:rPr>
+              <w:t xml:space="preserve">sdmTMB</w:t>
+            </w:r>
+            <w:r>
+              <w:t xml:space="preserve"> </w:t>
+            </w:r>
+            <w:r>
+              <w:t xml:space="preserve">CPUE analysis, the meeting noted that the index was</w:t>
+            </w:r>
+            <w:r>
+              <w:t xml:space="preserve"> </w:t>
+            </w:r>
+            <w:r>
+              <w:t xml:space="preserve">updated through 2026 and is based on set-level data. Discussion focused on haul</w:t>
+            </w:r>
+            <w:r>
+              <w:t xml:space="preserve"> </w:t>
+            </w:r>
+            <w:r>
+              <w:t xml:space="preserve">capacity treatment, the use of a spline smoother versus vessel categories, the</w:t>
+            </w:r>
+            <w:r>
+              <w:t xml:space="preserve"> </w:t>
+            </w:r>
+            <w:r>
+              <w:t xml:space="preserve">large imbalance in early-year data coverage, and whether true zero catches are</w:t>
+            </w:r>
+            <w:r>
+              <w:t xml:space="preserve"> </w:t>
+            </w:r>
+            <w:r>
+              <w:t xml:space="preserve">available and should be incorporated. Participants noted that the early part of</w:t>
+            </w:r>
+            <w:r>
+              <w:t xml:space="preserve"> </w:t>
+            </w:r>
+            <w:r>
+              <w:t xml:space="preserve">the set-level data may represent a very small fraction of total catch, raising</w:t>
+            </w:r>
+            <w:r>
+              <w:t xml:space="preserve"> </w:t>
+            </w:r>
+            <w:r>
+              <w:t xml:space="preserve">questions about representativeness before about 2005. The meeting requested that</w:t>
+            </w:r>
+            <w:r>
+              <w:t xml:space="preserve"> </w:t>
+            </w:r>
+            <w:r>
+              <w:t xml:space="preserve">the data table include the number and proportion of sets by year, and that the</w:t>
+            </w:r>
+            <w:r>
+              <w:t xml:space="preserve"> </w:t>
+            </w:r>
+            <w:r>
+              <w:t xml:space="preserve">authors provide a clear explanation for why the new set-based CPUE series gives</w:t>
+            </w:r>
+            <w:r>
+              <w:t xml:space="preserve"> </w:t>
+            </w:r>
+            <w:r>
+              <w:t xml:space="preserve">lower CPUE in earlier years with high catches than the current trip-based</w:t>
+            </w:r>
+            <w:r>
+              <w:t xml:space="preserve"> </w:t>
+            </w:r>
+            <w:r>
+              <w:t xml:space="preserve">assessment series.</w:t>
             </w:r>
           </w:p>
           <w:p>
@@ -2278,43 +2278,85 @@
               <w:t xml:space="preserve"> </w:t>
             </w:r>
             <w:r>
-              <w:t xml:space="preserve">The Day 3 discussion agreed to move forward with a new Chilean CPUE treatment</w:t>
-            </w:r>
-            <w:r>
-              <w:t xml:space="preserve"> </w:t>
-            </w:r>
-            <w:r>
-              <w:t xml:space="preserve">starting in 1998, using the agreed effort-creep treatment described above.</w:t>
-            </w:r>
-            <w:r>
-              <w:t xml:space="preserve"> </w:t>
-            </w:r>
-            <w:r>
-              <w:t xml:space="preserve">Annual CVs should be weighted by percentage coverage and should incorporate</w:t>
-            </w:r>
-            <w:r>
-              <w:t xml:space="preserve"> </w:t>
-            </w:r>
-            <w:r>
-              <w:t xml:space="preserve">standard errors from the INLA analysis. The previous Chilean CPUE index should</w:t>
-            </w:r>
-            <w:r>
-              <w:t xml:space="preserve"> </w:t>
-            </w:r>
-            <w:r>
-              <w:t xml:space="preserve">be removed from the base model. A sensitivity run should be retained that uses</w:t>
-            </w:r>
-            <w:r>
-              <w:t xml:space="preserve"> </w:t>
-            </w:r>
-            <w:r>
-              <w:t xml:space="preserve">the old CPUE information piecemeal before 1998, to evaluate the consequence of</w:t>
-            </w:r>
-            <w:r>
-              <w:t xml:space="preserve"> </w:t>
-            </w:r>
-            <w:r>
-              <w:t xml:space="preserve">preserving historical contrast before the new CPUE series begins.</w:t>
+              <w:t xml:space="preserve">The INLA-based Chilean CPUE analysis provided a complementary spatio-temporal</w:t>
+            </w:r>
+            <w:r>
+              <w:t xml:space="preserve"> </w:t>
+            </w:r>
+            <w:r>
+              <w:t xml:space="preserve">standardization. Participants discussed mesh resolution, the treatment of</w:t>
+            </w:r>
+            <w:r>
+              <w:t xml:space="preserve"> </w:t>
+            </w:r>
+            <w:r>
+              <w:t xml:space="preserve">northern fishing activity, whether assessment fleets should be defined primarily</w:t>
+            </w:r>
+            <w:r>
+              <w:t xml:space="preserve"> </w:t>
+            </w:r>
+            <w:r>
+              <w:t xml:space="preserve">by area or vessel behaviour, and whether CPUE weighting should be based on catch</w:t>
+            </w:r>
+            <w:r>
+              <w:t xml:space="preserve"> </w:t>
+            </w:r>
+            <w:r>
+              <w:t xml:space="preserve">rates rather than catch. The meeting noted that the model appeared sensitive to</w:t>
+            </w:r>
+            <w:r>
+              <w:t xml:space="preserve"> </w:t>
+            </w:r>
+            <w:r>
+              <w:t xml:space="preserve">data updates, with inclusion of 2026 data changing earlier predictions, and that</w:t>
+            </w:r>
+            <w:r>
+              <w:t xml:space="preserve"> </w:t>
+            </w:r>
+            <w:r>
+              <w:t xml:space="preserve">this sensitivity needs to be explained before replacing the existing assessment</w:t>
+            </w:r>
+            <w:r>
+              <w:t xml:space="preserve"> </w:t>
+            </w:r>
+            <w:r>
+              <w:t xml:space="preserve">index. Participants also discussed fixed versus random year effects, AR(1)</w:t>
+            </w:r>
+            <w:r>
+              <w:t xml:space="preserve"> </w:t>
+            </w:r>
+            <w:r>
+              <w:t xml:space="preserve">versus independent year effects, and the interpretation of the days-at-sea or</w:t>
+            </w:r>
+            <w:r>
+              <w:t xml:space="preserve"> </w:t>
+            </w:r>
+            <w:r>
+              <w:t xml:space="preserve">DFP coefficient. Because offshore movement can increase days at sea without</w:t>
+            </w:r>
+            <w:r>
+              <w:t xml:space="preserve"> </w:t>
+            </w:r>
+            <w:r>
+              <w:t xml:space="preserve">necessarily indicating reduced abundance, the meeting requested that the strength</w:t>
+            </w:r>
+            <w:r>
+              <w:t xml:space="preserve"> </w:t>
+            </w:r>
+            <w:r>
+              <w:t xml:space="preserve">and interpretation of this coefficient be checked, and that Sebastian, Ignacio,</w:t>
+            </w:r>
+            <w:r>
+              <w:t xml:space="preserve"> </w:t>
+            </w:r>
+            <w:r>
+              <w:t xml:space="preserve">and Niels summarize the model-comparison and year-effect discussion for the</w:t>
+            </w:r>
+            <w:r>
+              <w:t xml:space="preserve"> </w:t>
+            </w:r>
+            <w:r>
+              <w:t xml:space="preserve">report.</w:t>
             </w:r>
           </w:p>
           <w:p>
@@ -2332,81 +2374,48 @@
               <w:t xml:space="preserve"> </w:t>
             </w:r>
             <w:r>
-              <w:t xml:space="preserve">The Peruvian CPUE presentation covered a standardized CPUE series for 2015-2025</w:t>
-            </w:r>
-            <w:r>
-              <w:t xml:space="preserve"> </w:t>
-            </w:r>
-            <w:r>
-              <w:t xml:space="preserve">that combines industrial and artisanal fleets. The meeting noted this combined</w:t>
-            </w:r>
-            <w:r>
-              <w:t xml:space="preserve"> </w:t>
-            </w:r>
-            <w:r>
-              <w:t xml:space="preserve">fleet treatment as a strength, but also discussed the interpretation of trip</w:t>
-            </w:r>
-            <w:r>
-              <w:t xml:space="preserve"> </w:t>
-            </w:r>
-            <w:r>
-              <w:t xml:space="preserve">locations, haul-capacity and distance-to-coast smoothers, possible differences</w:t>
-            </w:r>
-            <w:r>
-              <w:t xml:space="preserve"> </w:t>
-            </w:r>
-            <w:r>
-              <w:t xml:space="preserve">between industrial and artisanal fleet effects, and changes in Peruvian fishing</w:t>
-            </w:r>
-            <w:r>
-              <w:t xml:space="preserve"> </w:t>
-            </w:r>
-            <w:r>
-              <w:t xml:space="preserve">operations. Members noted that jack mackerel has been used for direct human</w:t>
-            </w:r>
-            <w:r>
-              <w:t xml:space="preserve"> </w:t>
-            </w:r>
-            <w:r>
-              <w:t xml:space="preserve">consumption in Peru since 2002, and that the artisanal fishery has accounted for</w:t>
-            </w:r>
-            <w:r>
-              <w:t xml:space="preserve"> </w:t>
-            </w:r>
-            <w:r>
-              <w:t xml:space="preserve">a larger share of the quota since 2019. The Day 3 discussion agreed that the new</w:t>
-            </w:r>
-            <w:r>
-              <w:t xml:space="preserve"> </w:t>
-            </w:r>
-            <w:r>
-              <w:t xml:space="preserve">Peruvian CPUE series starts later than the historical assessment CPUE treatment</w:t>
-            </w:r>
-            <w:r>
-              <w:t xml:space="preserve"> </w:t>
-            </w:r>
-            <w:r>
-              <w:t xml:space="preserve">and should replace the previous Peru CPUE index rather than be appended to it in</w:t>
-            </w:r>
-            <w:r>
-              <w:t xml:space="preserve"> </w:t>
-            </w:r>
-            <w:r>
-              <w:t xml:space="preserve">the base model. The previous Peru CPUE index should therefore be removed from the</w:t>
-            </w:r>
-            <w:r>
-              <w:t xml:space="preserve"> </w:t>
-            </w:r>
-            <w:r>
-              <w:t xml:space="preserve">base configuration.</w:t>
+              <w:t xml:space="preserve">The Day 3 discussion agreed to move forward with a new Chilean CPUE treatment</w:t>
+            </w:r>
+            <w:r>
+              <w:t xml:space="preserve"> </w:t>
+            </w:r>
+            <w:r>
+              <w:t xml:space="preserve">starting in 1998, using the agreed effort-creep treatment described above.</w:t>
+            </w:r>
+            <w:r>
+              <w:t xml:space="preserve"> </w:t>
+            </w:r>
+            <w:r>
+              <w:t xml:space="preserve">Annual CVs should be weighted by percentage coverage and should incorporate</w:t>
+            </w:r>
+            <w:r>
+              <w:t xml:space="preserve"> </w:t>
+            </w:r>
+            <w:r>
+              <w:t xml:space="preserve">standard errors from the INLA analysis. The previous Chilean CPUE index should</w:t>
+            </w:r>
+            <w:r>
+              <w:t xml:space="preserve"> </w:t>
+            </w:r>
+            <w:r>
+              <w:t xml:space="preserve">be removed from the base model. A sensitivity run should be retained that uses</w:t>
+            </w:r>
+            <w:r>
+              <w:t xml:space="preserve"> </w:t>
+            </w:r>
+            <w:r>
+              <w:t xml:space="preserve">the old CPUE information piecemeal before 1998, to evaluate the consequence of</w:t>
+            </w:r>
+            <w:r>
+              <w:t xml:space="preserve"> </w:t>
+            </w:r>
+            <w:r>
+              <w:t xml:space="preserve">preserving historical contrast before the new CPUE series begins.</w:t>
             </w:r>
           </w:p>
           <w:p>
             <w:pPr>
               <w:pStyle w:val="BodyText"/>
-            </w:pPr>
-            <w:pPr>
-              <w:spacing w:after="16"/>
             </w:pPr>
             <w:r>
               <w:rPr>
@@ -2419,6 +2428,165 @@
               <w:t xml:space="preserve"> </w:t>
             </w:r>
             <w:r>
+              <w:t xml:space="preserve">The 1998 start year was selected because earlier set-level coverage was poor and</w:t>
+            </w:r>
+            <w:r>
+              <w:t xml:space="preserve"> </w:t>
+            </w:r>
+            <w:r>
+              <w:t xml:space="preserve">may not be representative of the fishery, particularly in years when catches were</w:t>
+            </w:r>
+            <w:r>
+              <w:t xml:space="preserve"> </w:t>
+            </w:r>
+            <w:r>
+              <w:t xml:space="preserve">large but the proportion of catch represented in the CPUE data was low. The</w:t>
+            </w:r>
+            <w:r>
+              <w:t xml:space="preserve"> </w:t>
+            </w:r>
+            <w:r>
+              <w:t xml:space="preserve">meeting noted that the behaviour of the fleet and the amount of data collected</w:t>
+            </w:r>
+            <w:r>
+              <w:t xml:space="preserve"> </w:t>
+            </w:r>
+            <w:r>
+              <w:t xml:space="preserve">changed substantially after 1997, coincident with the major 1997/1998 El Nino</w:t>
+            </w:r>
+            <w:r>
+              <w:t xml:space="preserve"> </w:t>
+            </w:r>
+            <w:r>
+              <w:t xml:space="preserve">event. For the benchmark, the base model should therefore use the new INLA</w:t>
+            </w:r>
+            <w:r>
+              <w:t xml:space="preserve"> </w:t>
+            </w:r>
+            <w:r>
+              <w:t xml:space="preserve">set-based Chilean CPUE series truncated to start in 1998. Future updates to this</w:t>
+            </w:r>
+            <w:r>
+              <w:t xml:space="preserve"> </w:t>
+            </w:r>
+            <w:r>
+              <w:t xml:space="preserve">index should be documented carefully, because substantial changes to CPUE</w:t>
+            </w:r>
+            <w:r>
+              <w:t xml:space="preserve"> </w:t>
+            </w:r>
+            <w:r>
+              <w:t xml:space="preserve">treatment between the benchmark and MSE implementation could affect perceptions</w:t>
+            </w:r>
+            <w:r>
+              <w:t xml:space="preserve"> </w:t>
+            </w:r>
+            <w:r>
+              <w:t xml:space="preserve">of the MSE results.</w:t>
+            </w:r>
+          </w:p>
+          <w:p>
+            <w:pPr>
+              <w:pStyle w:val="BodyText"/>
+            </w:pPr>
+            <w:r>
+              <w:rPr>
+                <w:b/>
+                <w:bCs/>
+              </w:rPr>
+              <w:t xml:space="preserve">36.</w:t>
+            </w:r>
+            <w:r>
+              <w:t xml:space="preserve"> </w:t>
+            </w:r>
+            <w:r>
+              <w:t xml:space="preserve">The Peruvian CPUE presentation covered a standardized CPUE series for 2015-2025</w:t>
+            </w:r>
+            <w:r>
+              <w:t xml:space="preserve"> </w:t>
+            </w:r>
+            <w:r>
+              <w:t xml:space="preserve">that combines industrial and artisanal fleets. The meeting noted this combined</w:t>
+            </w:r>
+            <w:r>
+              <w:t xml:space="preserve"> </w:t>
+            </w:r>
+            <w:r>
+              <w:t xml:space="preserve">fleet treatment as a strength, but also discussed the interpretation of trip</w:t>
+            </w:r>
+            <w:r>
+              <w:t xml:space="preserve"> </w:t>
+            </w:r>
+            <w:r>
+              <w:t xml:space="preserve">locations, haul-capacity and distance-to-coast smoothers, possible differences</w:t>
+            </w:r>
+            <w:r>
+              <w:t xml:space="preserve"> </w:t>
+            </w:r>
+            <w:r>
+              <w:t xml:space="preserve">between industrial and artisanal fleet effects, and changes in Peruvian fishing</w:t>
+            </w:r>
+            <w:r>
+              <w:t xml:space="preserve"> </w:t>
+            </w:r>
+            <w:r>
+              <w:t xml:space="preserve">operations. Members noted that jack mackerel has been used for direct human</w:t>
+            </w:r>
+            <w:r>
+              <w:t xml:space="preserve"> </w:t>
+            </w:r>
+            <w:r>
+              <w:t xml:space="preserve">consumption in Peru since 2002, and that the artisanal fishery has accounted for</w:t>
+            </w:r>
+            <w:r>
+              <w:t xml:space="preserve"> </w:t>
+            </w:r>
+            <w:r>
+              <w:t xml:space="preserve">a larger share of the quota since 2019. The Day 3 discussion agreed that the new</w:t>
+            </w:r>
+            <w:r>
+              <w:t xml:space="preserve"> </w:t>
+            </w:r>
+            <w:r>
+              <w:t xml:space="preserve">Peruvian CPUE series starts later than the historical assessment CPUE treatment</w:t>
+            </w:r>
+            <w:r>
+              <w:t xml:space="preserve"> </w:t>
+            </w:r>
+            <w:r>
+              <w:t xml:space="preserve">and should replace the previous Peru CPUE index rather than be appended to it in</w:t>
+            </w:r>
+            <w:r>
+              <w:t xml:space="preserve"> </w:t>
+            </w:r>
+            <w:r>
+              <w:t xml:space="preserve">the base model. The previous Peru CPUE index should therefore be removed from the</w:t>
+            </w:r>
+            <w:r>
+              <w:t xml:space="preserve"> </w:t>
+            </w:r>
+            <w:r>
+              <w:t xml:space="preserve">base configuration.</w:t>
+            </w:r>
+          </w:p>
+          <w:p>
+            <w:pPr>
+              <w:pStyle w:val="BodyText"/>
+            </w:pPr>
+            <w:pPr>
+              <w:spacing w:after="16"/>
+            </w:pPr>
+            <w:r>
+              <w:rPr>
+                <w:b/>
+                <w:bCs/>
+              </w:rPr>
+              <w:t xml:space="preserve">37.</w:t>
+            </w:r>
+            <w:r>
+              <w:t xml:space="preserve"> </w:t>
+            </w:r>
+            <w:r>
               <w:t xml:space="preserve">The offshore CPUE discussion included the treatment of a catchability break in</w:t>
             </w:r>
             <w:r>
@@ -2464,112 +2632,6 @@
       </w:pPr>
       <w:r>
         <w:t xml:space="preserve">Biological Inputs</w:t>
-      </w:r>
-    </w:p>
-    <w:p>
-      <w:pPr>
-        <w:pStyle w:val="FirstParagraph"/>
-      </w:pPr>
-      <w:r>
-        <w:rPr>
-          <w:b/>
-          <w:bCs/>
-        </w:rPr>
-        <w:t xml:space="preserve">36.</w:t>
-      </w:r>
-      <w:r>
-        <w:t xml:space="preserve"> </w:t>
-      </w:r>
-      <w:r>
-        <w:t xml:space="preserve">The Day 3 biological-input discussion reviewed the Peruvian length-weight and</w:t>
-      </w:r>
-      <w:r>
-        <w:t xml:space="preserve"> </w:t>
-      </w:r>
-      <w:r>
-        <w:t xml:space="preserve">length-frequency material and agreed that the Peruvian length frequencies should</w:t>
-      </w:r>
-      <w:r>
-        <w:t xml:space="preserve"> </w:t>
-      </w:r>
-      <w:r>
-        <w:t xml:space="preserve">be treated as fork length. Growth parameters used with those data should</w:t>
-      </w:r>
-      <w:r>
-        <w:t xml:space="preserve"> </w:t>
-      </w:r>
-      <w:r>
-        <w:t xml:space="preserve">therefore also be in fork length. The assessment should also increase the plus</w:t>
-      </w:r>
-      <w:r>
-        <w:t xml:space="preserve"> </w:t>
-      </w:r>
-      <w:r>
-        <w:t xml:space="preserve">group so the Peruvian length-frequency information and growth assumptions are</w:t>
-      </w:r>
-      <w:r>
-        <w:t xml:space="preserve"> </w:t>
-      </w:r>
-      <w:r>
-        <w:t xml:space="preserve">handled consistently in the model.</w:t>
-      </w:r>
-    </w:p>
-    <w:p>
-      <w:pPr>
-        <w:pStyle w:val="BodyText"/>
-      </w:pPr>
-      <w:r>
-        <w:rPr>
-          <w:b/>
-          <w:bCs/>
-        </w:rPr>
-        <w:t xml:space="preserve">37.</w:t>
-      </w:r>
-      <w:r>
-        <w:t xml:space="preserve"> </w:t>
-      </w:r>
-      <w:r>
-        <w:t xml:space="preserve">For Peru acoustic information, the meeting agreed to move to the new Peruvian</w:t>
-      </w:r>
-      <w:r>
-        <w:t xml:space="preserve"> </w:t>
-      </w:r>
-      <w:r>
-        <w:t xml:space="preserve">acoustic indices and remove the previous Peru acoustic index from the base</w:t>
-      </w:r>
-      <w:r>
-        <w:t xml:space="preserve"> </w:t>
-      </w:r>
-      <w:r>
-        <w:t xml:space="preserve">configuration. The associated Peruvian length-frequency information should be</w:t>
-      </w:r>
-      <w:r>
-        <w:t xml:space="preserve"> </w:t>
-      </w:r>
-      <w:r>
-        <w:t xml:space="preserve">carried forward with the new acoustic treatment. No new Chilean Acoustic North</w:t>
-      </w:r>
-      <w:r>
-        <w:t xml:space="preserve"> </w:t>
-      </w:r>
-      <w:r>
-        <w:t xml:space="preserve">or Chilean Acoustic South-Central index treatment was selected for the base model</w:t>
-      </w:r>
-      <w:r>
-        <w:t xml:space="preserve"> </w:t>
-      </w:r>
-      <w:r>
-        <w:t xml:space="preserve">at this stage.</w:t>
-      </w:r>
-    </w:p>
-    <w:bookmarkEnd w:id="26"/>
-    <w:bookmarkStart w:id="27" w:name="assessment-model-development"/>
-    <w:p>
-      <w:pPr>
-        <w:pStyle w:val="Heading2"/>
-      </w:pPr>
-      <w:r>
-        <w:t xml:space="preserve">Assessment Model Development</w:t>
       </w:r>
     </w:p>
     <w:p>
@@ -2587,22 +2649,42 @@
         <w:t xml:space="preserve"> </w:t>
       </w:r>
       <w:r>
-        <w:t xml:space="preserve">Text to be added during the meeting. This section should summarize the SC13 base-model developments, candidate simplifications, single-stock and two-stock alternatives, reduced-index configurations, selectivity assumptions, recruitment scenarios, and model diagnostics.</w:t>
-      </w:r>
-    </w:p>
-    <w:bookmarkEnd w:id="27"/>
-    <w:bookmarkStart w:id="28" w:name="operating-models-and-mse-linkages"/>
-    <w:p>
-      <w:pPr>
-        <w:pStyle w:val="Heading2"/>
-      </w:pPr>
-      <w:r>
-        <w:t xml:space="preserve">Operating Models and MSE Linkages</w:t>
-      </w:r>
-    </w:p>
-    <w:p>
-      <w:pPr>
-        <w:pStyle w:val="FirstParagraph"/>
+        <w:t xml:space="preserve">The Day 3 biological-input discussion reviewed the Peruvian length-weight and</w:t>
+      </w:r>
+      <w:r>
+        <w:t xml:space="preserve"> </w:t>
+      </w:r>
+      <w:r>
+        <w:t xml:space="preserve">length-frequency material and agreed that the Peruvian length frequencies should</w:t>
+      </w:r>
+      <w:r>
+        <w:t xml:space="preserve"> </w:t>
+      </w:r>
+      <w:r>
+        <w:t xml:space="preserve">be treated as fork length. Growth parameters used with those data should</w:t>
+      </w:r>
+      <w:r>
+        <w:t xml:space="preserve"> </w:t>
+      </w:r>
+      <w:r>
+        <w:t xml:space="preserve">therefore also be in fork length. The assessment should also increase the plus</w:t>
+      </w:r>
+      <w:r>
+        <w:t xml:space="preserve"> </w:t>
+      </w:r>
+      <w:r>
+        <w:t xml:space="preserve">group so the Peruvian length-frequency information and growth assumptions are</w:t>
+      </w:r>
+      <w:r>
+        <w:t xml:space="preserve"> </w:t>
+      </w:r>
+      <w:r>
+        <w:t xml:space="preserve">handled consistently in the model.</w:t>
+      </w:r>
+    </w:p>
+    <w:p>
+      <w:pPr>
+        <w:pStyle w:val="BodyText"/>
       </w:pPr>
       <w:r>
         <w:rPr>
@@ -2610,6 +2692,140 @@
           <w:bCs/>
         </w:rPr>
         <w:t xml:space="preserve">39.</w:t>
+      </w:r>
+      <w:r>
+        <w:t xml:space="preserve"> </w:t>
+      </w:r>
+      <w:r>
+        <w:t xml:space="preserve">The meeting also requested that Peru provide sample-size information for the</w:t>
+      </w:r>
+      <w:r>
+        <w:t xml:space="preserve"> </w:t>
+      </w:r>
+      <w:r>
+        <w:t xml:space="preserve">composition data in a form that can be translated into assessment input sample</w:t>
+      </w:r>
+      <w:r>
+        <w:t xml:space="preserve"> </w:t>
+      </w:r>
+      <w:r>
+        <w:t xml:space="preserve">sizes. Members noted that the number of fish measured would be useful in</w:t>
+      </w:r>
+      <w:r>
+        <w:t xml:space="preserve"> </w:t>
+      </w:r>
+      <w:r>
+        <w:t xml:space="preserve">addition to the current reporting of sampling events such as boxes or trips. The</w:t>
+      </w:r>
+      <w:r>
+        <w:t xml:space="preserve"> </w:t>
+      </w:r>
+      <w:r>
+        <w:t xml:space="preserve">group also discussed whether the SPRFMO length-bin range should be expanded to</w:t>
+      </w:r>
+      <w:r>
+        <w:t xml:space="preserve"> </w:t>
+      </w:r>
+      <w:r>
+        <w:t xml:space="preserve">match the Peruvian 5-90 cm length bins.</w:t>
+      </w:r>
+    </w:p>
+    <w:p>
+      <w:pPr>
+        <w:pStyle w:val="BodyText"/>
+      </w:pPr>
+      <w:r>
+        <w:rPr>
+          <w:b/>
+          <w:bCs/>
+        </w:rPr>
+        <w:t xml:space="preserve">40.</w:t>
+      </w:r>
+      <w:r>
+        <w:t xml:space="preserve"> </w:t>
+      </w:r>
+      <w:r>
+        <w:t xml:space="preserve">For Peru acoustic information, the meeting agreed to move to the new Peruvian</w:t>
+      </w:r>
+      <w:r>
+        <w:t xml:space="preserve"> </w:t>
+      </w:r>
+      <w:r>
+        <w:t xml:space="preserve">acoustic indices and remove the previous Peru acoustic index from the base</w:t>
+      </w:r>
+      <w:r>
+        <w:t xml:space="preserve"> </w:t>
+      </w:r>
+      <w:r>
+        <w:t xml:space="preserve">configuration. The associated Peruvian length-frequency information should be</w:t>
+      </w:r>
+      <w:r>
+        <w:t xml:space="preserve"> </w:t>
+      </w:r>
+      <w:r>
+        <w:t xml:space="preserve">carried forward with the new acoustic treatment. No new Chilean Acoustic North</w:t>
+      </w:r>
+      <w:r>
+        <w:t xml:space="preserve"> </w:t>
+      </w:r>
+      <w:r>
+        <w:t xml:space="preserve">or Chilean Acoustic South-Central index treatment was selected for the base model</w:t>
+      </w:r>
+      <w:r>
+        <w:t xml:space="preserve"> </w:t>
+      </w:r>
+      <w:r>
+        <w:t xml:space="preserve">at this stage.</w:t>
+      </w:r>
+    </w:p>
+    <w:bookmarkEnd w:id="26"/>
+    <w:bookmarkStart w:id="27" w:name="assessment-model-development"/>
+    <w:p>
+      <w:pPr>
+        <w:pStyle w:val="Heading2"/>
+      </w:pPr>
+      <w:r>
+        <w:t xml:space="preserve">Assessment Model Development</w:t>
+      </w:r>
+    </w:p>
+    <w:p>
+      <w:pPr>
+        <w:pStyle w:val="FirstParagraph"/>
+      </w:pPr>
+      <w:r>
+        <w:rPr>
+          <w:b/>
+          <w:bCs/>
+        </w:rPr>
+        <w:t xml:space="preserve">41.</w:t>
+      </w:r>
+      <w:r>
+        <w:t xml:space="preserve"> </w:t>
+      </w:r>
+      <w:r>
+        <w:t xml:space="preserve">Text to be added during the meeting. This section should summarize the SC13 base-model developments, candidate simplifications, single-stock and two-stock alternatives, reduced-index configurations, selectivity assumptions, recruitment scenarios, and model diagnostics.</w:t>
+      </w:r>
+    </w:p>
+    <w:bookmarkEnd w:id="27"/>
+    <w:bookmarkStart w:id="28" w:name="operating-models-and-mse-linkages"/>
+    <w:p>
+      <w:pPr>
+        <w:pStyle w:val="Heading2"/>
+      </w:pPr>
+      <w:r>
+        <w:t xml:space="preserve">Operating Models and MSE Linkages</w:t>
+      </w:r>
+    </w:p>
+    <w:p>
+      <w:pPr>
+        <w:pStyle w:val="FirstParagraph"/>
+      </w:pPr>
+      <w:r>
+        <w:rPr>
+          <w:b/>
+          <w:bCs/>
+        </w:rPr>
+        <w:t xml:space="preserve">42.</w:t>
       </w:r>
       <w:r>
         <w:t xml:space="preserve"> </w:t>
@@ -3088,7 +3304,54 @@
               <w:pStyle w:val="Compact"/>
             </w:pPr>
             <w:r>
-              <w:t xml:space="preserve">Do not add a new base-model treatment for Chilean Acoustic North or Chilean Acoustic South-Central at this stage.</w:t>
+              <w:t xml:space="preserve">Retain raw/design-based Chile Acoustic North biomass for assessment use and keep spatio-temporal acoustic modelling as research and diagnostic information.</w:t>
+            </w:r>
+          </w:p>
+        </w:tc>
+        <w:tc>
+          <w:tcPr/>
+          <w:p>
+            <w:pPr>
+              <w:pStyle w:val="Compact"/>
+            </w:pPr>
+            <w:r>
+              <w:t xml:space="preserve">Chile acoustic indices</w:t>
+            </w:r>
+          </w:p>
+        </w:tc>
+        <w:tc>
+          <w:tcPr/>
+          <w:p>
+            <w:pPr>
+              <w:pStyle w:val="Compact"/>
+            </w:pPr>
+            <w:r>
+              <w:t xml:space="preserve">Acknowledge INPESCA’s modelling contribution and document why model-based CPUE indicators and design-based survey indicators are treated differently.</w:t>
+            </w:r>
+          </w:p>
+        </w:tc>
+      </w:tr>
+      <w:tr>
+        <w:tc>
+          <w:tcPr/>
+          <w:p>
+            <w:pPr>
+              <w:pStyle w:val="Compact"/>
+              <w:jc w:val="right"/>
+            </w:pPr>
+            <w:r>
+              <w:t xml:space="preserve">10</w:t>
+            </w:r>
+          </w:p>
+        </w:tc>
+        <w:tc>
+          <w:tcPr/>
+          <w:p>
+            <w:pPr>
+              <w:pStyle w:val="Compact"/>
+            </w:pPr>
+            <w:r>
+              <w:t xml:space="preserve">Do not add a new base-model treatment for Chilean Acoustic South-Central at this stage.</w:t>
             </w:r>
           </w:p>
         </w:tc>
@@ -3135,7 +3398,7 @@
           <w:b/>
           <w:bCs/>
         </w:rPr>
-        <w:t xml:space="preserve">40.</w:t>
+        <w:t xml:space="preserve">43.</w:t>
       </w:r>
       <w:r>
         <w:t xml:space="preserve"> </w:t>
@@ -3490,7 +3753,7 @@
               <w:pStyle w:val="Compact"/>
             </w:pPr>
             <w:r>
-              <w:t xml:space="preserve">Draft a paragraph explaining why the Chile central-south acoustic survey series has not been used in the assessment, and whether any benchmark sensitivity should be run</w:t>
+              <w:t xml:space="preserve">Add report text acknowledging the INPESCA spatio-temporal Chile Acoustic North modelling contribution and explaining why model-based CPUE indicators and design-based survey indicators are treated differently</w:t>
             </w:r>
           </w:p>
         </w:tc>
@@ -3512,7 +3775,7 @@
               <w:pStyle w:val="Compact"/>
             </w:pPr>
             <w:r>
-              <w:t xml:space="preserve">Assessment subgroup</w:t>
+              <w:t xml:space="preserve">Assessment/index subgroup</w:t>
             </w:r>
           </w:p>
         </w:tc>
@@ -3536,6 +3799,52 @@
               <w:pStyle w:val="Compact"/>
             </w:pPr>
             <w:r>
+              <w:t xml:space="preserve">Draft a paragraph explaining why the Chile central-south acoustic survey series has not been used in the assessment, and whether any benchmark sensitivity should be run</w:t>
+            </w:r>
+          </w:p>
+        </w:tc>
+        <w:tc>
+          <w:tcPr/>
+          <w:p>
+            <w:pPr>
+              <w:pStyle w:val="Compact"/>
+            </w:pPr>
+            <w:r>
+              <w:t xml:space="preserve">Chile acoustic contributors</w:t>
+            </w:r>
+          </w:p>
+        </w:tc>
+        <w:tc>
+          <w:tcPr/>
+          <w:p>
+            <w:pPr>
+              <w:pStyle w:val="Compact"/>
+            </w:pPr>
+            <w:r>
+              <w:t xml:space="preserve">Assessment subgroup</w:t>
+            </w:r>
+          </w:p>
+        </w:tc>
+        <w:tc>
+          <w:tcPr/>
+          <w:p>
+            <w:pPr>
+              <w:pStyle w:val="Compact"/>
+            </w:pPr>
+            <w:r>
+              <w:t xml:space="preserve">Before report adoption</w:t>
+            </w:r>
+          </w:p>
+        </w:tc>
+      </w:tr>
+      <w:tr>
+        <w:tc>
+          <w:tcPr/>
+          <w:p>
+            <w:pPr>
+              <w:pStyle w:val="Compact"/>
+            </w:pPr>
+            <w:r>
               <w:t xml:space="preserve">Provide Peru acoustic backscatter and associated length-composition metadata, including survey timing, spatial extent, length type, biological sampling, and uncertainty</w:t>
             </w:r>
           </w:p>
@@ -3570,6 +3879,98 @@
             </w:pPr>
             <w:r>
               <w:t xml:space="preserve">Before report adoption</w:t>
+            </w:r>
+          </w:p>
+        </w:tc>
+      </w:tr>
+      <w:tr>
+        <w:tc>
+          <w:tcPr/>
+          <w:p>
+            <w:pPr>
+              <w:pStyle w:val="Compact"/>
+            </w:pPr>
+            <w:r>
+              <w:t xml:space="preserve">Provide Peru acoustic survey length frequencies as soon as possible</w:t>
+            </w:r>
+          </w:p>
+        </w:tc>
+        <w:tc>
+          <w:tcPr/>
+          <w:p>
+            <w:pPr>
+              <w:pStyle w:val="Compact"/>
+            </w:pPr>
+            <w:r>
+              <w:t xml:space="preserve">Peru acoustic contributors</w:t>
+            </w:r>
+          </w:p>
+        </w:tc>
+        <w:tc>
+          <w:tcPr/>
+          <w:p>
+            <w:pPr>
+              <w:pStyle w:val="Compact"/>
+            </w:pPr>
+            <w:r>
+              <w:t xml:space="preserve">Assessment/index subgroup</w:t>
+            </w:r>
+          </w:p>
+        </w:tc>
+        <w:tc>
+          <w:tcPr/>
+          <w:p>
+            <w:pPr>
+              <w:pStyle w:val="Compact"/>
+            </w:pPr>
+            <w:r>
+              <w:t xml:space="preserve">Before final model-run list</w:t>
+            </w:r>
+          </w:p>
+        </w:tc>
+      </w:tr>
+      <w:tr>
+        <w:tc>
+          <w:tcPr/>
+          <w:p>
+            <w:pPr>
+              <w:pStyle w:val="Compact"/>
+            </w:pPr>
+            <w:r>
+              <w:t xml:space="preserve">Check average month, seasonal assignment, and fits to zero observations for the new Peru acoustic index runs</w:t>
+            </w:r>
+          </w:p>
+        </w:tc>
+        <w:tc>
+          <w:tcPr/>
+          <w:p>
+            <w:pPr>
+              <w:pStyle w:val="Compact"/>
+            </w:pPr>
+            <w:r>
+              <w:t xml:space="preserve">Assessment subgroup</w:t>
+            </w:r>
+          </w:p>
+        </w:tc>
+        <w:tc>
+          <w:tcPr/>
+          <w:p>
+            <w:pPr>
+              <w:pStyle w:val="Compact"/>
+            </w:pPr>
+            <w:r>
+              <w:t xml:space="preserve">Peru acoustic contributors</w:t>
+            </w:r>
+          </w:p>
+        </w:tc>
+        <w:tc>
+          <w:tcPr/>
+          <w:p>
+            <w:pPr>
+              <w:pStyle w:val="Compact"/>
+            </w:pPr>
+            <w:r>
+              <w:t xml:space="preserve">Before final model-run list</w:t>
             </w:r>
           </w:p>
         </w:tc>
@@ -3965,7 +4366,18 @@
               <w:pStyle w:val="Compact"/>
             </w:pPr>
             <w:r>
-              <w:t xml:space="preserve">Add the sensitivity using piecemeal old Chilean CPUE before 1998</w:t>
+              <w:t xml:space="preserve">Draft a paragraph explaining the criteria for starting the new Chilean CPUE series in 1998, including data coverage, representativeness, catch history, and fleet-behaviour changes after 1997</w:t>
+            </w:r>
+          </w:p>
+        </w:tc>
+        <w:tc>
+          <w:tcPr/>
+          <w:p>
+            <w:pPr>
+              <w:pStyle w:val="Compact"/>
+            </w:pPr>
+            <w:r>
+              <w:t xml:space="preserve">Chile CPUE contributors</w:t>
             </w:r>
           </w:p>
         </w:tc>
@@ -3987,18 +4399,7 @@
               <w:pStyle w:val="Compact"/>
             </w:pPr>
             <w:r>
-              <w:t xml:space="preserve">Chile CPUE contributors</w:t>
-            </w:r>
-          </w:p>
-        </w:tc>
-        <w:tc>
-          <w:tcPr/>
-          <w:p>
-            <w:pPr>
-              <w:pStyle w:val="Compact"/>
-            </w:pPr>
-            <w:r>
-              <w:t xml:space="preserve">Before final model-run list</w:t>
+              <w:t xml:space="preserve">Before report adoption</w:t>
             </w:r>
           </w:p>
         </w:tc>
@@ -4011,40 +4412,40 @@
               <w:pStyle w:val="Compact"/>
             </w:pPr>
             <w:r>
-              <w:t xml:space="preserve">Check the strength and interpretation of the days-at-sea or DFP coefficient in the INLA-based Chile CPUE analysis</w:t>
-            </w:r>
-          </w:p>
-        </w:tc>
-        <w:tc>
-          <w:tcPr/>
-          <w:p>
-            <w:pPr>
-              <w:pStyle w:val="Compact"/>
-            </w:pPr>
-            <w:r>
-              <w:t xml:space="preserve">Chile CPUE contributors</w:t>
-            </w:r>
-          </w:p>
-        </w:tc>
-        <w:tc>
-          <w:tcPr/>
-          <w:p>
-            <w:pPr>
-              <w:pStyle w:val="Compact"/>
-            </w:pPr>
-            <w:r>
-              <w:t xml:space="preserve">Assessment/index subgroup</w:t>
-            </w:r>
-          </w:p>
-        </w:tc>
-        <w:tc>
-          <w:tcPr/>
-          <w:p>
-            <w:pPr>
-              <w:pStyle w:val="Compact"/>
-            </w:pPr>
-            <w:r>
-              <w:t xml:space="preserve">Before CPUE index decisions</w:t>
+              <w:t xml:space="preserve">Define what CPUE model or data changes will be allowed between the benchmark and subsequent assessment or MSE implementation</w:t>
+            </w:r>
+          </w:p>
+        </w:tc>
+        <w:tc>
+          <w:tcPr/>
+          <w:p>
+            <w:pPr>
+              <w:pStyle w:val="Compact"/>
+            </w:pPr>
+            <w:r>
+              <w:t xml:space="preserve">Chair / Assessment subgroup</w:t>
+            </w:r>
+          </w:p>
+        </w:tc>
+        <w:tc>
+          <w:tcPr/>
+          <w:p>
+            <w:pPr>
+              <w:pStyle w:val="Compact"/>
+            </w:pPr>
+            <w:r>
+              <w:t xml:space="preserve">Members</w:t>
+            </w:r>
+          </w:p>
+        </w:tc>
+        <w:tc>
+          <w:tcPr/>
+          <w:p>
+            <w:pPr>
+              <w:pStyle w:val="Compact"/>
+            </w:pPr>
+            <w:r>
+              <w:t xml:space="preserve">Before final report adoption</w:t>
             </w:r>
           </w:p>
         </w:tc>
@@ -4057,7 +4458,18 @@
               <w:pStyle w:val="Compact"/>
             </w:pPr>
             <w:r>
-              <w:t xml:space="preserve">Check whether zero CPUE records are true fishing zeroes or technical/non-fishing records and whether zeroes should be included in Chile CPUE standardization</w:t>
+              <w:t xml:space="preserve">Add the sensitivity using piecemeal old Chilean CPUE before 1998</w:t>
+            </w:r>
+          </w:p>
+        </w:tc>
+        <w:tc>
+          <w:tcPr/>
+          <w:p>
+            <w:pPr>
+              <w:pStyle w:val="Compact"/>
+            </w:pPr>
+            <w:r>
+              <w:t xml:space="preserve">Assessment subgroup</w:t>
             </w:r>
           </w:p>
         </w:tc>
@@ -4069,17 +4481,6 @@
             </w:pPr>
             <w:r>
               <w:t xml:space="preserve">Chile CPUE contributors</w:t>
-            </w:r>
-          </w:p>
-        </w:tc>
-        <w:tc>
-          <w:tcPr/>
-          <w:p>
-            <w:pPr>
-              <w:pStyle w:val="Compact"/>
-            </w:pPr>
-            <w:r>
-              <w:t xml:space="preserve">Assessment/index subgroup</w:t>
             </w:r>
           </w:p>
         </w:tc>
@@ -4103,40 +4504,40 @@
               <w:pStyle w:val="Compact"/>
             </w:pPr>
             <w:r>
-              <w:t xml:space="preserve">Replace the previous Peru CPUE index with the new later-starting Peruvian CPUE series</w:t>
-            </w:r>
-          </w:p>
-        </w:tc>
-        <w:tc>
-          <w:tcPr/>
-          <w:p>
-            <w:pPr>
-              <w:pStyle w:val="Compact"/>
-            </w:pPr>
-            <w:r>
-              <w:t xml:space="preserve">Assessment subgroup</w:t>
-            </w:r>
-          </w:p>
-        </w:tc>
-        <w:tc>
-          <w:tcPr/>
-          <w:p>
-            <w:pPr>
-              <w:pStyle w:val="Compact"/>
-            </w:pPr>
-            <w:r>
-              <w:t xml:space="preserve">Peru CPUE contributors</w:t>
-            </w:r>
-          </w:p>
-        </w:tc>
-        <w:tc>
-          <w:tcPr/>
-          <w:p>
-            <w:pPr>
-              <w:pStyle w:val="Compact"/>
-            </w:pPr>
-            <w:r>
-              <w:t xml:space="preserve">Before final model-run list</w:t>
+              <w:t xml:space="preserve">Check the strength and interpretation of the days-at-sea or DFP coefficient in the INLA-based Chile CPUE analysis</w:t>
+            </w:r>
+          </w:p>
+        </w:tc>
+        <w:tc>
+          <w:tcPr/>
+          <w:p>
+            <w:pPr>
+              <w:pStyle w:val="Compact"/>
+            </w:pPr>
+            <w:r>
+              <w:t xml:space="preserve">Chile CPUE contributors</w:t>
+            </w:r>
+          </w:p>
+        </w:tc>
+        <w:tc>
+          <w:tcPr/>
+          <w:p>
+            <w:pPr>
+              <w:pStyle w:val="Compact"/>
+            </w:pPr>
+            <w:r>
+              <w:t xml:space="preserve">Assessment/index subgroup</w:t>
+            </w:r>
+          </w:p>
+        </w:tc>
+        <w:tc>
+          <w:tcPr/>
+          <w:p>
+            <w:pPr>
+              <w:pStyle w:val="Compact"/>
+            </w:pPr>
+            <w:r>
+              <w:t xml:space="preserve">Before CPUE index decisions</w:t>
             </w:r>
           </w:p>
         </w:tc>
@@ -4149,29 +4550,29 @@
               <w:pStyle w:val="Compact"/>
             </w:pPr>
             <w:r>
-              <w:t xml:space="preserve">Replace the previous Peru acoustic index with the new Peruvian acoustic indices and associated length-frequency information</w:t>
-            </w:r>
-          </w:p>
-        </w:tc>
-        <w:tc>
-          <w:tcPr/>
-          <w:p>
-            <w:pPr>
-              <w:pStyle w:val="Compact"/>
-            </w:pPr>
-            <w:r>
-              <w:t xml:space="preserve">Assessment subgroup</w:t>
-            </w:r>
-          </w:p>
-        </w:tc>
-        <w:tc>
-          <w:tcPr/>
-          <w:p>
-            <w:pPr>
-              <w:pStyle w:val="Compact"/>
-            </w:pPr>
-            <w:r>
-              <w:t xml:space="preserve">Peru acoustic contributors</w:t>
+              <w:t xml:space="preserve">Check whether zero CPUE records are true fishing zeroes or technical/non-fishing records and whether zeroes should be included in Chile CPUE standardization</w:t>
+            </w:r>
+          </w:p>
+        </w:tc>
+        <w:tc>
+          <w:tcPr/>
+          <w:p>
+            <w:pPr>
+              <w:pStyle w:val="Compact"/>
+            </w:pPr>
+            <w:r>
+              <w:t xml:space="preserve">Chile CPUE contributors</w:t>
+            </w:r>
+          </w:p>
+        </w:tc>
+        <w:tc>
+          <w:tcPr/>
+          <w:p>
+            <w:pPr>
+              <w:pStyle w:val="Compact"/>
+            </w:pPr>
+            <w:r>
+              <w:t xml:space="preserve">Assessment/index subgroup</w:t>
             </w:r>
           </w:p>
         </w:tc>
@@ -4195,6 +4596,98 @@
               <w:pStyle w:val="Compact"/>
             </w:pPr>
             <w:r>
+              <w:t xml:space="preserve">Replace the previous Peru CPUE index with the new later-starting Peruvian CPUE series</w:t>
+            </w:r>
+          </w:p>
+        </w:tc>
+        <w:tc>
+          <w:tcPr/>
+          <w:p>
+            <w:pPr>
+              <w:pStyle w:val="Compact"/>
+            </w:pPr>
+            <w:r>
+              <w:t xml:space="preserve">Assessment subgroup</w:t>
+            </w:r>
+          </w:p>
+        </w:tc>
+        <w:tc>
+          <w:tcPr/>
+          <w:p>
+            <w:pPr>
+              <w:pStyle w:val="Compact"/>
+            </w:pPr>
+            <w:r>
+              <w:t xml:space="preserve">Peru CPUE contributors</w:t>
+            </w:r>
+          </w:p>
+        </w:tc>
+        <w:tc>
+          <w:tcPr/>
+          <w:p>
+            <w:pPr>
+              <w:pStyle w:val="Compact"/>
+            </w:pPr>
+            <w:r>
+              <w:t xml:space="preserve">Before final model-run list</w:t>
+            </w:r>
+          </w:p>
+        </w:tc>
+      </w:tr>
+      <w:tr>
+        <w:tc>
+          <w:tcPr/>
+          <w:p>
+            <w:pPr>
+              <w:pStyle w:val="Compact"/>
+            </w:pPr>
+            <w:r>
+              <w:t xml:space="preserve">Replace the previous Peru acoustic index with the new Peruvian acoustic indices and associated length-frequency information</w:t>
+            </w:r>
+          </w:p>
+        </w:tc>
+        <w:tc>
+          <w:tcPr/>
+          <w:p>
+            <w:pPr>
+              <w:pStyle w:val="Compact"/>
+            </w:pPr>
+            <w:r>
+              <w:t xml:space="preserve">Assessment subgroup</w:t>
+            </w:r>
+          </w:p>
+        </w:tc>
+        <w:tc>
+          <w:tcPr/>
+          <w:p>
+            <w:pPr>
+              <w:pStyle w:val="Compact"/>
+            </w:pPr>
+            <w:r>
+              <w:t xml:space="preserve">Peru acoustic contributors</w:t>
+            </w:r>
+          </w:p>
+        </w:tc>
+        <w:tc>
+          <w:tcPr/>
+          <w:p>
+            <w:pPr>
+              <w:pStyle w:val="Compact"/>
+            </w:pPr>
+            <w:r>
+              <w:t xml:space="preserve">Before final model-run list</w:t>
+            </w:r>
+          </w:p>
+        </w:tc>
+      </w:tr>
+      <w:tr>
+        <w:tc>
+          <w:tcPr/>
+          <w:p>
+            <w:pPr>
+              <w:pStyle w:val="Compact"/>
+            </w:pPr>
+            <w:r>
               <w:t xml:space="preserve">Prepare Peruvian length-frequency inputs in fork length, with fork-length growth parameters and the agreed increased plus group</w:t>
             </w:r>
           </w:p>
@@ -4229,6 +4722,98 @@
             </w:pPr>
             <w:r>
               <w:t xml:space="preserve">Before final model-run list</w:t>
+            </w:r>
+          </w:p>
+        </w:tc>
+      </w:tr>
+      <w:tr>
+        <w:tc>
+          <w:tcPr/>
+          <w:p>
+            <w:pPr>
+              <w:pStyle w:val="Compact"/>
+            </w:pPr>
+            <w:r>
+              <w:t xml:space="preserve">Provide Peru composition sample-size information in terms of numbers of fish where available, in addition to sampling-event counts</w:t>
+            </w:r>
+          </w:p>
+        </w:tc>
+        <w:tc>
+          <w:tcPr/>
+          <w:p>
+            <w:pPr>
+              <w:pStyle w:val="Compact"/>
+            </w:pPr>
+            <w:r>
+              <w:t xml:space="preserve">Peru biology contributors</w:t>
+            </w:r>
+          </w:p>
+        </w:tc>
+        <w:tc>
+          <w:tcPr/>
+          <w:p>
+            <w:pPr>
+              <w:pStyle w:val="Compact"/>
+            </w:pPr>
+            <w:r>
+              <w:t xml:space="preserve">Assessment subgroup</w:t>
+            </w:r>
+          </w:p>
+        </w:tc>
+        <w:tc>
+          <w:tcPr/>
+          <w:p>
+            <w:pPr>
+              <w:pStyle w:val="Compact"/>
+            </w:pPr>
+            <w:r>
+              <w:t xml:space="preserve">Before biological-input finalization</w:t>
+            </w:r>
+          </w:p>
+        </w:tc>
+      </w:tr>
+      <w:tr>
+        <w:tc>
+          <w:tcPr/>
+          <w:p>
+            <w:pPr>
+              <w:pStyle w:val="Compact"/>
+            </w:pPr>
+            <w:r>
+              <w:t xml:space="preserve">Evaluate whether the SPRFMO length-bin range should be expanded to match Peru’s 5-90 cm length bins</w:t>
+            </w:r>
+          </w:p>
+        </w:tc>
+        <w:tc>
+          <w:tcPr/>
+          <w:p>
+            <w:pPr>
+              <w:pStyle w:val="Compact"/>
+            </w:pPr>
+            <w:r>
+              <w:t xml:space="preserve">Assessment subgroup</w:t>
+            </w:r>
+          </w:p>
+        </w:tc>
+        <w:tc>
+          <w:tcPr/>
+          <w:p>
+            <w:pPr>
+              <w:pStyle w:val="Compact"/>
+            </w:pPr>
+            <w:r>
+              <w:t xml:space="preserve">Peru biology contributors</w:t>
+            </w:r>
+          </w:p>
+        </w:tc>
+        <w:tc>
+          <w:tcPr/>
+          <w:p>
+            <w:pPr>
+              <w:pStyle w:val="Compact"/>
+            </w:pPr>
+            <w:r>
+              <w:t xml:space="preserve">Before biological-input finalization</w:t>
             </w:r>
           </w:p>
         </w:tc>

</xml_diff>

<commit_message>
Update benchmark report links
</commit_message>
<xml_diff>
--- a/docs/JMWG-Benchmark-Meeting-report-2026.docx
+++ b/docs/JMWG-Benchmark-Meeting-report-2026.docx
@@ -149,13 +149,13 @@
         <w:pStyle w:val="BodyText"/>
       </w:pPr>
       <w:r>
-        <w:t xml:space="preserve">05 June 2026</w:t>
-      </w:r>
-      <w:r>
-        <w:t xml:space="preserve"> </w:t>
-      </w:r>
-      <w:r>
-        <w:t xml:space="preserve">21:06 PDT</w:t>
+        <w:t xml:space="preserve">07 June 2026</w:t>
+      </w:r>
+      <w:r>
+        <w:t xml:space="preserve"> </w:t>
+      </w:r>
+      <w:r>
+        <w:t xml:space="preserve">22:39 PDT</w:t>
       </w:r>
     </w:p>
     <w:bookmarkStart w:id="12" w:name="summary"/>

</xml_diff>